<commit_message>
Record and write up the motor-neuron readout study (6 of 7 registered predictions pass)
Same seeds as the male-CNS replication, read at the proboscis, front-leg
and all-motor pools. The interneuron readouts reproduce exactly; the pools
carry feeding, its bitter gate and antennal grooming; GABA block releases
the gate and ACh block silences motor output; the chip tracks motor
disruption (Spearman 0.892). The chip-is-late prediction fails narrowly:
late in 3 families, tied in 2, never earlier. Written into §25, the
executive summary, §26, the changes log (entry 10) and the app; the
report and changes log rebuilt to Word and PDF.

Co-Authored-By: Claude Opus 5.5 <noreply@anthropic.com>
</commit_message>
<xml_diff>
--- a/report/POST_SUBMISSION_CHANGES.docx
+++ b/report/POST_SUBMISSION_CHANGES.docx
@@ -48,11 +48,11 @@
         <w:tblLook w:firstColumn="1" w:firstRow="1" w:lastColumn="0" w:lastRow="0" w:noHBand="0" w:noVBand="1" w:val="04A0"/>
       </w:tblPr>
       <w:tblGrid>
-        <w:gridCol w:w="319"/>
-        <w:gridCol w:w="1729"/>
-        <w:gridCol w:w="2562"/>
-        <w:gridCol w:w="2459"/>
-        <w:gridCol w:w="1426"/>
+        <w:gridCol w:w="435"/>
+        <w:gridCol w:w="1719"/>
+        <w:gridCol w:w="2506"/>
+        <w:gridCol w:w="2421"/>
+        <w:gridCol w:w="1415"/>
       </w:tblGrid>
       <w:tr>
         <w:trPr>
@@ -61,7 +61,7 @@
         </w:trPr>
         <w:tc>
           <w:tcPr>
-            <w:tcW w:type="dxa" w:w="319"/>
+            <w:tcW w:type="dxa" w:w="435"/>
             <w:shd w:val="clear" w:color="auto" w:fill="1F4E79"/>
             <w:vAlign w:val="center"/>
           </w:tcPr>
@@ -85,7 +85,7 @@
         </w:tc>
         <w:tc>
           <w:tcPr>
-            <w:tcW w:type="dxa" w:w="1729"/>
+            <w:tcW w:type="dxa" w:w="1719"/>
             <w:shd w:val="clear" w:color="auto" w:fill="1F4E79"/>
             <w:vAlign w:val="center"/>
           </w:tcPr>
@@ -109,7 +109,7 @@
         </w:tc>
         <w:tc>
           <w:tcPr>
-            <w:tcW w:type="dxa" w:w="2562"/>
+            <w:tcW w:type="dxa" w:w="2506"/>
             <w:shd w:val="clear" w:color="auto" w:fill="1F4E79"/>
             <w:vAlign w:val="center"/>
           </w:tcPr>
@@ -132,7 +132,7 @@
         </w:tc>
         <w:tc>
           <w:tcPr>
-            <w:tcW w:type="dxa" w:w="2459"/>
+            <w:tcW w:type="dxa" w:w="2421"/>
             <w:shd w:val="clear" w:color="auto" w:fill="1F4E79"/>
             <w:vAlign w:val="center"/>
           </w:tcPr>
@@ -155,7 +155,7 @@
         </w:tc>
         <w:tc>
           <w:tcPr>
-            <w:tcW w:type="dxa" w:w="1426"/>
+            <w:tcW w:type="dxa" w:w="1415"/>
             <w:shd w:val="clear" w:color="auto" w:fill="1F4E79"/>
             <w:vAlign w:val="center"/>
           </w:tcPr>
@@ -183,7 +183,7 @@
         </w:trPr>
         <w:tc>
           <w:tcPr>
-            <w:tcW w:type="dxa" w:w="319"/>
+            <w:tcW w:type="dxa" w:w="435"/>
             <w:shd w:val="clear" w:color="auto" w:fill="FFFFFF"/>
             <w:vAlign w:val="center"/>
           </w:tcPr>
@@ -207,7 +207,7 @@
         </w:tc>
         <w:tc>
           <w:tcPr>
-            <w:tcW w:type="dxa" w:w="1729"/>
+            <w:tcW w:type="dxa" w:w="1719"/>
             <w:shd w:val="clear" w:color="auto" w:fill="FFFFFF"/>
             <w:vAlign w:val="center"/>
           </w:tcPr>
@@ -231,7 +231,7 @@
         </w:tc>
         <w:tc>
           <w:tcPr>
-            <w:tcW w:type="dxa" w:w="2562"/>
+            <w:tcW w:type="dxa" w:w="2506"/>
             <w:shd w:val="clear" w:color="auto" w:fill="FFFFFF"/>
             <w:vAlign w:val="center"/>
           </w:tcPr>
@@ -254,7 +254,7 @@
         </w:tc>
         <w:tc>
           <w:tcPr>
-            <w:tcW w:type="dxa" w:w="2459"/>
+            <w:tcW w:type="dxa" w:w="2421"/>
             <w:shd w:val="clear" w:color="auto" w:fill="FFFFFF"/>
             <w:vAlign w:val="center"/>
           </w:tcPr>
@@ -277,7 +277,7 @@
         </w:tc>
         <w:tc>
           <w:tcPr>
-            <w:tcW w:type="dxa" w:w="1426"/>
+            <w:tcW w:type="dxa" w:w="1415"/>
             <w:shd w:val="clear" w:color="auto" w:fill="FFFFFF"/>
             <w:vAlign w:val="center"/>
           </w:tcPr>
@@ -325,7 +325,7 @@
         </w:trPr>
         <w:tc>
           <w:tcPr>
-            <w:tcW w:type="dxa" w:w="319"/>
+            <w:tcW w:type="dxa" w:w="435"/>
             <w:shd w:val="clear" w:color="auto" w:fill="F7F9FB"/>
             <w:vAlign w:val="center"/>
           </w:tcPr>
@@ -349,7 +349,7 @@
         </w:tc>
         <w:tc>
           <w:tcPr>
-            <w:tcW w:type="dxa" w:w="1729"/>
+            <w:tcW w:type="dxa" w:w="1719"/>
             <w:shd w:val="clear" w:color="auto" w:fill="F7F9FB"/>
             <w:vAlign w:val="center"/>
           </w:tcPr>
@@ -373,7 +373,7 @@
         </w:tc>
         <w:tc>
           <w:tcPr>
-            <w:tcW w:type="dxa" w:w="2562"/>
+            <w:tcW w:type="dxa" w:w="2506"/>
             <w:shd w:val="clear" w:color="auto" w:fill="F7F9FB"/>
             <w:vAlign w:val="center"/>
           </w:tcPr>
@@ -396,7 +396,7 @@
         </w:tc>
         <w:tc>
           <w:tcPr>
-            <w:tcW w:type="dxa" w:w="2459"/>
+            <w:tcW w:type="dxa" w:w="2421"/>
             <w:shd w:val="clear" w:color="auto" w:fill="F7F9FB"/>
             <w:vAlign w:val="center"/>
           </w:tcPr>
@@ -419,7 +419,7 @@
         </w:tc>
         <w:tc>
           <w:tcPr>
-            <w:tcW w:type="dxa" w:w="1426"/>
+            <w:tcW w:type="dxa" w:w="1415"/>
             <w:shd w:val="clear" w:color="auto" w:fill="F7F9FB"/>
             <w:vAlign w:val="center"/>
           </w:tcPr>
@@ -447,7 +447,7 @@
         </w:trPr>
         <w:tc>
           <w:tcPr>
-            <w:tcW w:type="dxa" w:w="319"/>
+            <w:tcW w:type="dxa" w:w="435"/>
             <w:shd w:val="clear" w:color="auto" w:fill="FFFFFF"/>
             <w:vAlign w:val="center"/>
           </w:tcPr>
@@ -471,7 +471,7 @@
         </w:tc>
         <w:tc>
           <w:tcPr>
-            <w:tcW w:type="dxa" w:w="1729"/>
+            <w:tcW w:type="dxa" w:w="1719"/>
             <w:shd w:val="clear" w:color="auto" w:fill="FFFFFF"/>
             <w:vAlign w:val="center"/>
           </w:tcPr>
@@ -495,7 +495,7 @@
         </w:tc>
         <w:tc>
           <w:tcPr>
-            <w:tcW w:type="dxa" w:w="2562"/>
+            <w:tcW w:type="dxa" w:w="2506"/>
             <w:shd w:val="clear" w:color="auto" w:fill="FFFFFF"/>
             <w:vAlign w:val="center"/>
           </w:tcPr>
@@ -518,7 +518,7 @@
         </w:tc>
         <w:tc>
           <w:tcPr>
-            <w:tcW w:type="dxa" w:w="2459"/>
+            <w:tcW w:type="dxa" w:w="2421"/>
             <w:shd w:val="clear" w:color="auto" w:fill="FFFFFF"/>
             <w:vAlign w:val="center"/>
           </w:tcPr>
@@ -541,7 +541,7 @@
         </w:tc>
         <w:tc>
           <w:tcPr>
-            <w:tcW w:type="dxa" w:w="1426"/>
+            <w:tcW w:type="dxa" w:w="1415"/>
             <w:shd w:val="clear" w:color="auto" w:fill="FFFFFF"/>
             <w:vAlign w:val="center"/>
           </w:tcPr>
@@ -569,7 +569,7 @@
         </w:trPr>
         <w:tc>
           <w:tcPr>
-            <w:tcW w:type="dxa" w:w="319"/>
+            <w:tcW w:type="dxa" w:w="435"/>
             <w:shd w:val="clear" w:color="auto" w:fill="F7F9FB"/>
             <w:vAlign w:val="center"/>
           </w:tcPr>
@@ -593,7 +593,7 @@
         </w:tc>
         <w:tc>
           <w:tcPr>
-            <w:tcW w:type="dxa" w:w="1729"/>
+            <w:tcW w:type="dxa" w:w="1719"/>
             <w:shd w:val="clear" w:color="auto" w:fill="F7F9FB"/>
             <w:vAlign w:val="center"/>
           </w:tcPr>
@@ -617,7 +617,7 @@
         </w:tc>
         <w:tc>
           <w:tcPr>
-            <w:tcW w:type="dxa" w:w="2562"/>
+            <w:tcW w:type="dxa" w:w="2506"/>
             <w:shd w:val="clear" w:color="auto" w:fill="F7F9FB"/>
             <w:vAlign w:val="center"/>
           </w:tcPr>
@@ -640,7 +640,7 @@
         </w:tc>
         <w:tc>
           <w:tcPr>
-            <w:tcW w:type="dxa" w:w="2459"/>
+            <w:tcW w:type="dxa" w:w="2421"/>
             <w:shd w:val="clear" w:color="auto" w:fill="F7F9FB"/>
             <w:vAlign w:val="center"/>
           </w:tcPr>
@@ -663,7 +663,7 @@
         </w:tc>
         <w:tc>
           <w:tcPr>
-            <w:tcW w:type="dxa" w:w="1426"/>
+            <w:tcW w:type="dxa" w:w="1415"/>
             <w:shd w:val="clear" w:color="auto" w:fill="F7F9FB"/>
             <w:vAlign w:val="center"/>
           </w:tcPr>
@@ -711,7 +711,7 @@
         </w:trPr>
         <w:tc>
           <w:tcPr>
-            <w:tcW w:type="dxa" w:w="319"/>
+            <w:tcW w:type="dxa" w:w="435"/>
             <w:shd w:val="clear" w:color="auto" w:fill="FFFFFF"/>
             <w:vAlign w:val="center"/>
           </w:tcPr>
@@ -735,7 +735,7 @@
         </w:tc>
         <w:tc>
           <w:tcPr>
-            <w:tcW w:type="dxa" w:w="1729"/>
+            <w:tcW w:type="dxa" w:w="1719"/>
             <w:shd w:val="clear" w:color="auto" w:fill="FFFFFF"/>
             <w:vAlign w:val="center"/>
           </w:tcPr>
@@ -759,7 +759,7 @@
         </w:tc>
         <w:tc>
           <w:tcPr>
-            <w:tcW w:type="dxa" w:w="2562"/>
+            <w:tcW w:type="dxa" w:w="2506"/>
             <w:shd w:val="clear" w:color="auto" w:fill="FFFFFF"/>
             <w:vAlign w:val="center"/>
           </w:tcPr>
@@ -782,7 +782,7 @@
         </w:tc>
         <w:tc>
           <w:tcPr>
-            <w:tcW w:type="dxa" w:w="2459"/>
+            <w:tcW w:type="dxa" w:w="2421"/>
             <w:shd w:val="clear" w:color="auto" w:fill="FFFFFF"/>
             <w:vAlign w:val="center"/>
           </w:tcPr>
@@ -805,7 +805,7 @@
         </w:tc>
         <w:tc>
           <w:tcPr>
-            <w:tcW w:type="dxa" w:w="1426"/>
+            <w:tcW w:type="dxa" w:w="1415"/>
             <w:shd w:val="clear" w:color="auto" w:fill="FFFFFF"/>
             <w:vAlign w:val="center"/>
           </w:tcPr>
@@ -833,7 +833,7 @@
         </w:trPr>
         <w:tc>
           <w:tcPr>
-            <w:tcW w:type="dxa" w:w="319"/>
+            <w:tcW w:type="dxa" w:w="435"/>
             <w:shd w:val="clear" w:color="auto" w:fill="F7F9FB"/>
             <w:vAlign w:val="center"/>
           </w:tcPr>
@@ -857,7 +857,7 @@
         </w:tc>
         <w:tc>
           <w:tcPr>
-            <w:tcW w:type="dxa" w:w="1729"/>
+            <w:tcW w:type="dxa" w:w="1719"/>
             <w:shd w:val="clear" w:color="auto" w:fill="F7F9FB"/>
             <w:vAlign w:val="center"/>
           </w:tcPr>
@@ -881,7 +881,7 @@
         </w:tc>
         <w:tc>
           <w:tcPr>
-            <w:tcW w:type="dxa" w:w="2562"/>
+            <w:tcW w:type="dxa" w:w="2506"/>
             <w:shd w:val="clear" w:color="auto" w:fill="F7F9FB"/>
             <w:vAlign w:val="center"/>
           </w:tcPr>
@@ -904,7 +904,7 @@
         </w:tc>
         <w:tc>
           <w:tcPr>
-            <w:tcW w:type="dxa" w:w="2459"/>
+            <w:tcW w:type="dxa" w:w="2421"/>
             <w:shd w:val="clear" w:color="auto" w:fill="F7F9FB"/>
             <w:vAlign w:val="center"/>
           </w:tcPr>
@@ -927,7 +927,7 @@
         </w:tc>
         <w:tc>
           <w:tcPr>
-            <w:tcW w:type="dxa" w:w="1426"/>
+            <w:tcW w:type="dxa" w:w="1415"/>
             <w:shd w:val="clear" w:color="auto" w:fill="F7F9FB"/>
             <w:vAlign w:val="center"/>
           </w:tcPr>
@@ -955,7 +955,7 @@
         </w:trPr>
         <w:tc>
           <w:tcPr>
-            <w:tcW w:type="dxa" w:w="319"/>
+            <w:tcW w:type="dxa" w:w="435"/>
             <w:shd w:val="clear" w:color="auto" w:fill="FFFFFF"/>
             <w:vAlign w:val="center"/>
           </w:tcPr>
@@ -979,7 +979,7 @@
         </w:tc>
         <w:tc>
           <w:tcPr>
-            <w:tcW w:type="dxa" w:w="1729"/>
+            <w:tcW w:type="dxa" w:w="1719"/>
             <w:shd w:val="clear" w:color="auto" w:fill="FFFFFF"/>
             <w:vAlign w:val="center"/>
           </w:tcPr>
@@ -1003,7 +1003,7 @@
         </w:tc>
         <w:tc>
           <w:tcPr>
-            <w:tcW w:type="dxa" w:w="2562"/>
+            <w:tcW w:type="dxa" w:w="2506"/>
             <w:shd w:val="clear" w:color="auto" w:fill="FFFFFF"/>
             <w:vAlign w:val="center"/>
           </w:tcPr>
@@ -1026,7 +1026,7 @@
         </w:tc>
         <w:tc>
           <w:tcPr>
-            <w:tcW w:type="dxa" w:w="2459"/>
+            <w:tcW w:type="dxa" w:w="2421"/>
             <w:shd w:val="clear" w:color="auto" w:fill="FFFFFF"/>
             <w:vAlign w:val="center"/>
           </w:tcPr>
@@ -1049,7 +1049,7 @@
         </w:tc>
         <w:tc>
           <w:tcPr>
-            <w:tcW w:type="dxa" w:w="1426"/>
+            <w:tcW w:type="dxa" w:w="1415"/>
             <w:shd w:val="clear" w:color="auto" w:fill="FFFFFF"/>
             <w:vAlign w:val="center"/>
           </w:tcPr>
@@ -1097,7 +1097,7 @@
         </w:trPr>
         <w:tc>
           <w:tcPr>
-            <w:tcW w:type="dxa" w:w="319"/>
+            <w:tcW w:type="dxa" w:w="435"/>
             <w:shd w:val="clear" w:color="auto" w:fill="F7F9FB"/>
             <w:vAlign w:val="center"/>
           </w:tcPr>
@@ -1121,7 +1121,7 @@
         </w:tc>
         <w:tc>
           <w:tcPr>
-            <w:tcW w:type="dxa" w:w="1729"/>
+            <w:tcW w:type="dxa" w:w="1719"/>
             <w:shd w:val="clear" w:color="auto" w:fill="F7F9FB"/>
             <w:vAlign w:val="center"/>
           </w:tcPr>
@@ -1145,7 +1145,7 @@
         </w:tc>
         <w:tc>
           <w:tcPr>
-            <w:tcW w:type="dxa" w:w="2562"/>
+            <w:tcW w:type="dxa" w:w="2506"/>
             <w:shd w:val="clear" w:color="auto" w:fill="F7F9FB"/>
             <w:vAlign w:val="center"/>
           </w:tcPr>
@@ -1168,7 +1168,7 @@
         </w:tc>
         <w:tc>
           <w:tcPr>
-            <w:tcW w:type="dxa" w:w="2459"/>
+            <w:tcW w:type="dxa" w:w="2421"/>
             <w:shd w:val="clear" w:color="auto" w:fill="F7F9FB"/>
             <w:vAlign w:val="center"/>
           </w:tcPr>
@@ -1191,7 +1191,7 @@
         </w:tc>
         <w:tc>
           <w:tcPr>
-            <w:tcW w:type="dxa" w:w="1426"/>
+            <w:tcW w:type="dxa" w:w="1415"/>
             <w:shd w:val="clear" w:color="auto" w:fill="F7F9FB"/>
             <w:vAlign w:val="center"/>
           </w:tcPr>
@@ -1239,13 +1239,13 @@
         </w:trPr>
         <w:tc>
           <w:tcPr>
-            <w:tcW w:type="dxa" w:w="319"/>
+            <w:tcW w:type="dxa" w:w="435"/>
             <w:shd w:val="clear" w:color="auto" w:fill="FFFFFF"/>
             <w:vAlign w:val="center"/>
           </w:tcPr>
           <w:p>
             <w:pPr>
-              <w:keepNext w:val="0"/>
+              <w:keepNext/>
               <w:spacing w:after="0"/>
               <w:jc w:val="center"/>
             </w:pPr>
@@ -1263,13 +1263,13 @@
         </w:tc>
         <w:tc>
           <w:tcPr>
-            <w:tcW w:type="dxa" w:w="1729"/>
+            <w:tcW w:type="dxa" w:w="1719"/>
             <w:shd w:val="clear" w:color="auto" w:fill="FFFFFF"/>
             <w:vAlign w:val="center"/>
           </w:tcPr>
           <w:p>
             <w:pPr>
-              <w:keepNext w:val="0"/>
+              <w:keepNext/>
               <w:spacing w:after="0"/>
               <w:jc w:val="center"/>
             </w:pPr>
@@ -1287,13 +1287,13 @@
         </w:tc>
         <w:tc>
           <w:tcPr>
-            <w:tcW w:type="dxa" w:w="2562"/>
+            <w:tcW w:type="dxa" w:w="2506"/>
             <w:shd w:val="clear" w:color="auto" w:fill="FFFFFF"/>
             <w:vAlign w:val="center"/>
           </w:tcPr>
           <w:p>
             <w:pPr>
-              <w:keepNext w:val="0"/>
+              <w:keepNext/>
               <w:spacing w:after="0"/>
             </w:pPr>
             <w:r>
@@ -1310,13 +1310,13 @@
         </w:tc>
         <w:tc>
           <w:tcPr>
-            <w:tcW w:type="dxa" w:w="2459"/>
+            <w:tcW w:type="dxa" w:w="2421"/>
             <w:shd w:val="clear" w:color="auto" w:fill="FFFFFF"/>
             <w:vAlign w:val="center"/>
           </w:tcPr>
           <w:p>
             <w:pPr>
-              <w:keepNext w:val="0"/>
+              <w:keepNext/>
               <w:spacing w:after="0"/>
             </w:pPr>
             <w:r>
@@ -1333,13 +1333,13 @@
         </w:tc>
         <w:tc>
           <w:tcPr>
-            <w:tcW w:type="dxa" w:w="1426"/>
+            <w:tcW w:type="dxa" w:w="1415"/>
             <w:shd w:val="clear" w:color="auto" w:fill="FFFFFF"/>
             <w:vAlign w:val="center"/>
           </w:tcPr>
           <w:p>
             <w:pPr>
-              <w:keepNext w:val="0"/>
+              <w:keepNext/>
               <w:spacing w:after="0"/>
             </w:pPr>
             <w:r>
@@ -1375,6 +1375,138 @@
           </w:p>
         </w:tc>
       </w:tr>
+      <w:tr>
+        <w:trPr>
+          <w:cantSplit/>
+        </w:trPr>
+        <w:tc>
+          <w:tcPr>
+            <w:tcW w:type="dxa" w:w="435"/>
+            <w:shd w:val="clear" w:color="auto" w:fill="F7F9FB"/>
+            <w:vAlign w:val="center"/>
+          </w:tcPr>
+          <w:p>
+            <w:pPr>
+              <w:keepNext w:val="0"/>
+              <w:spacing w:after="0"/>
+              <w:jc w:val="center"/>
+            </w:pPr>
+            <w:r>
+              <w:rPr>
+                <w:rFonts w:ascii="Calibri" w:hAnsi="Calibri"/>
+                <w:b/>
+                <w:i w:val="0"/>
+                <w:color w:val="222222"/>
+                <w:sz w:val="20"/>
+              </w:rPr>
+              <w:t>10</w:t>
+            </w:r>
+          </w:p>
+        </w:tc>
+        <w:tc>
+          <w:tcPr>
+            <w:tcW w:type="dxa" w:w="1719"/>
+            <w:shd w:val="clear" w:color="auto" w:fill="F7F9FB"/>
+            <w:vAlign w:val="center"/>
+          </w:tcPr>
+          <w:p>
+            <w:pPr>
+              <w:keepNext w:val="0"/>
+              <w:spacing w:after="0"/>
+              <w:jc w:val="center"/>
+            </w:pPr>
+            <w:r>
+              <w:rPr>
+                <w:rFonts w:ascii="Calibri" w:hAnsi="Calibri"/>
+                <w:b w:val="0"/>
+                <w:i w:val="0"/>
+                <w:color w:val="222222"/>
+                <w:sz w:val="20"/>
+              </w:rPr>
+              <w:t>2026-10-24</w:t>
+            </w:r>
+          </w:p>
+        </w:tc>
+        <w:tc>
+          <w:tcPr>
+            <w:tcW w:type="dxa" w:w="2506"/>
+            <w:shd w:val="clear" w:color="auto" w:fill="F7F9FB"/>
+            <w:vAlign w:val="center"/>
+          </w:tcPr>
+          <w:p>
+            <w:pPr>
+              <w:keepNext w:val="0"/>
+              <w:spacing w:after="0"/>
+            </w:pPr>
+            <w:r>
+              <w:rPr>
+                <w:rFonts w:ascii="Calibri" w:hAnsi="Calibri"/>
+                <w:b w:val="0"/>
+                <w:i w:val="0"/>
+                <w:color w:val="222222"/>
+                <w:sz w:val="20"/>
+              </w:rPr>
+              <w:t>Behaviour read at the motor neurons of the male CNS</w:t>
+            </w:r>
+          </w:p>
+        </w:tc>
+        <w:tc>
+          <w:tcPr>
+            <w:tcW w:type="dxa" w:w="2421"/>
+            <w:shd w:val="clear" w:color="auto" w:fill="F7F9FB"/>
+            <w:vAlign w:val="center"/>
+          </w:tcPr>
+          <w:p>
+            <w:pPr>
+              <w:keepNext w:val="0"/>
+              <w:spacing w:after="0"/>
+            </w:pPr>
+            <w:r>
+              <w:rPr>
+                <w:rFonts w:ascii="Calibri" w:hAnsi="Calibri"/>
+                <w:b w:val="0"/>
+                <w:i w:val="0"/>
+                <w:color w:val="222222"/>
+                <w:sz w:val="20"/>
+              </w:rPr>
+              <w:t>6 of 7 registered predictions pass</w:t>
+            </w:r>
+          </w:p>
+        </w:tc>
+        <w:tc>
+          <w:tcPr>
+            <w:tcW w:type="dxa" w:w="1415"/>
+            <w:shd w:val="clear" w:color="auto" w:fill="F7F9FB"/>
+            <w:vAlign w:val="center"/>
+          </w:tcPr>
+          <w:p>
+            <w:pPr>
+              <w:keepNext w:val="0"/>
+              <w:spacing w:after="0"/>
+            </w:pPr>
+            <w:r>
+              <w:rPr>
+                <w:rFonts w:ascii="Consolas" w:hAnsi="Consolas"/>
+                <w:b w:val="0"/>
+                <w:i w:val="0"/>
+                <w:color w:val="222222"/>
+                <w:sz w:val="18"/>
+              </w:rPr>
+              <w:t>a1c5f27</w:t>
+            </w:r>
+            <w:r>
+              <w:rPr>
+                <w:rFonts w:ascii="Calibri" w:hAnsi="Calibri"/>
+                <w:b w:val="0"/>
+                <w:i w:val="0"/>
+                <w:color w:val="222222"/>
+                <w:sz w:val="20"/>
+              </w:rPr>
+              <w:t>, this merge</w:t>
+            </w:r>
+          </w:p>
+        </w:tc>
+      </w:tr>
     </w:tbl>
     <w:p>
       <w:pPr>
@@ -3592,6 +3724,265 @@
           <w:sz w:val="21"/>
         </w:rPr>
         <w:t xml:space="preserve"> Report §24 ("Where to put the electrode") and figure; §20, fifth area.</w:t>
+      </w:r>
+    </w:p>
+    <w:p>
+      <w:pPr>
+        <w:keepNext/>
+        <w:spacing w:before="240" w:after="60"/>
+      </w:pPr>
+      <w:r>
+        <w:rPr>
+          <w:rFonts w:ascii="Calibri" w:hAnsi="Calibri"/>
+          <w:b/>
+          <w:i w:val="0"/>
+          <w:color w:val="1F4E79"/>
+          <w:sz w:val="23"/>
+        </w:rPr>
+        <w:t>10. One step closer to behaviour: the motor neurons</w:t>
+      </w:r>
+    </w:p>
+    <w:p>
+      <w:pPr>
+        <w:spacing w:after="120"/>
+      </w:pPr>
+      <w:r>
+        <w:rPr>
+          <w:rFonts w:ascii="Calibri" w:hAnsi="Calibri"/>
+          <w:b/>
+          <w:i w:val="0"/>
+          <w:color w:val="156082"/>
+          <w:sz w:val="21"/>
+        </w:rPr>
+        <w:t>Slide message:</w:t>
+      </w:r>
+      <w:r>
+        <w:rPr>
+          <w:rFonts w:ascii="Calibri" w:hAnsi="Calibri"/>
+          <w:b w:val="0"/>
+          <w:i w:val="0"/>
+          <w:color w:val="222222"/>
+          <w:sz w:val="21"/>
+        </w:rPr>
+        <w:t xml:space="preserve"> </w:t>
+      </w:r>
+      <w:r>
+        <w:rPr>
+          <w:rFonts w:ascii="Calibri" w:hAnsi="Calibri"/>
+          <w:b w:val="0"/>
+          <w:i/>
+          <w:color w:val="222222"/>
+          <w:sz w:val="21"/>
+        </w:rPr>
+        <w:t>Read at the motor neurons that move the fly's mouthparts and legs, the chip is never ahead of behaviour: it is late in three drug families and level in two.</w:t>
+      </w:r>
+    </w:p>
+    <w:p>
+      <w:pPr>
+        <w:spacing w:after="120"/>
+        <w:ind w:left="432" w:hanging="259"/>
+      </w:pPr>
+      <w:r>
+        <w:rPr>
+          <w:rFonts w:ascii="Calibri" w:hAnsi="Calibri"/>
+          <w:b w:val="0"/>
+          <w:i w:val="0"/>
+          <w:color w:val="222222"/>
+          <w:sz w:val="21"/>
+        </w:rPr>
+        <w:t>•</w:t>
+        <w:tab/>
+      </w:r>
+      <w:r>
+        <w:rPr>
+          <w:rFonts w:ascii="Calibri" w:hAnsi="Calibri"/>
+          <w:b/>
+          <w:i w:val="0"/>
+          <w:color w:val="156082"/>
+          <w:sz w:val="21"/>
+        </w:rPr>
+        <w:t>What changed.</w:t>
+      </w:r>
+      <w:r>
+        <w:rPr>
+          <w:rFonts w:ascii="Calibri" w:hAnsi="Calibri"/>
+          <w:b w:val="0"/>
+          <w:i w:val="0"/>
+          <w:color w:val="222222"/>
+          <w:sz w:val="21"/>
+        </w:rPr>
+        <w:t xml:space="preserve"> </w:t>
+      </w:r>
+      <w:r>
+        <w:rPr>
+          <w:rFonts w:ascii="Consolas" w:hAnsi="Consolas"/>
+          <w:b w:val="0"/>
+          <w:i w:val="0"/>
+          <w:color w:val="222222"/>
+          <w:sz w:val="19"/>
+        </w:rPr>
+        <w:t>src/neuromps/fly/motor.py</w:t>
+      </w:r>
+      <w:r>
+        <w:rPr>
+          <w:rFonts w:ascii="Calibri" w:hAnsi="Calibri"/>
+          <w:b w:val="0"/>
+          <w:i w:val="0"/>
+          <w:color w:val="222222"/>
+          <w:sz w:val="21"/>
+        </w:rPr>
+        <w:t xml:space="preserve"> repeats the male-CNS replication's behaviour trials (same seeds) and reads them at the proboscis motor pool (feeding and its bitter gate), the front-leg motor pool (antennal grooming) and all motor neurons (recruitment). Registered before any drug condition was run (</w:t>
+      </w:r>
+      <w:r>
+        <w:rPr>
+          <w:rFonts w:ascii="Consolas" w:hAnsi="Consolas"/>
+          <w:b w:val="0"/>
+          <w:i w:val="0"/>
+          <w:color w:val="222222"/>
+          <w:sz w:val="19"/>
+        </w:rPr>
+        <w:t>preregistration/fly_motor_readout.json</w:t>
+      </w:r>
+      <w:r>
+        <w:rPr>
+          <w:rFonts w:ascii="Calibri" w:hAnsi="Calibri"/>
+          <w:b w:val="0"/>
+          <w:i w:val="0"/>
+          <w:color w:val="222222"/>
+          <w:sz w:val="21"/>
+        </w:rPr>
+        <w:t>).</w:t>
+      </w:r>
+    </w:p>
+    <w:p>
+      <w:pPr>
+        <w:spacing w:after="120"/>
+        <w:ind w:left="432" w:hanging="259"/>
+      </w:pPr>
+      <w:r>
+        <w:rPr>
+          <w:rFonts w:ascii="Calibri" w:hAnsi="Calibri"/>
+          <w:b w:val="0"/>
+          <w:i w:val="0"/>
+          <w:color w:val="222222"/>
+          <w:sz w:val="21"/>
+        </w:rPr>
+        <w:t>•</w:t>
+        <w:tab/>
+      </w:r>
+      <w:r>
+        <w:rPr>
+          <w:rFonts w:ascii="Calibri" w:hAnsi="Calibri"/>
+          <w:b/>
+          <w:i w:val="0"/>
+          <w:color w:val="156082"/>
+          <w:sz w:val="21"/>
+        </w:rPr>
+        <w:t>Why.</w:t>
+      </w:r>
+      <w:r>
+        <w:rPr>
+          <w:rFonts w:ascii="Calibri" w:hAnsi="Calibri"/>
+          <w:b w:val="0"/>
+          <w:i w:val="0"/>
+          <w:color w:val="222222"/>
+          <w:sz w:val="21"/>
+        </w:rPr>
+        <w:t xml:space="preserve"> The behaviour readouts were firing rates of interneurons; the male connectome includes the nerve cord, so behaviour can be read where it leaves the nervous system. This is the first step toward a closed-loop, embodied fly, which needs a body and sensory feedback on top.</w:t>
+      </w:r>
+    </w:p>
+    <w:p>
+      <w:pPr>
+        <w:spacing w:after="120"/>
+        <w:ind w:left="432" w:hanging="259"/>
+      </w:pPr>
+      <w:r>
+        <w:rPr>
+          <w:rFonts w:ascii="Calibri" w:hAnsi="Calibri"/>
+          <w:b w:val="0"/>
+          <w:i w:val="0"/>
+          <w:color w:val="222222"/>
+          <w:sz w:val="21"/>
+        </w:rPr>
+        <w:t>•</w:t>
+        <w:tab/>
+      </w:r>
+      <w:r>
+        <w:rPr>
+          <w:rFonts w:ascii="Calibri" w:hAnsi="Calibri"/>
+          <w:b/>
+          <w:i w:val="0"/>
+          <w:color w:val="156082"/>
+          <w:sz w:val="21"/>
+        </w:rPr>
+        <w:t>Effect.</w:t>
+      </w:r>
+      <w:r>
+        <w:rPr>
+          <w:rFonts w:ascii="Calibri" w:hAnsi="Calibri"/>
+          <w:b w:val="0"/>
+          <w:i w:val="0"/>
+          <w:color w:val="222222"/>
+          <w:sz w:val="21"/>
+        </w:rPr>
+        <w:t xml:space="preserve"> Six of seven predictions pass. The interneuron readouts reproduce exactly; sugar drives the proboscis pool at 31.405 Hz and bitter cuts it to 5.625; the chip tracks motor disruption (Spearman 0.8922). The chip-is-late prediction failed narrowly: late in 3, tied in 2, earlier in 0 (four late were needed). Motor output fails no later than the interneurons in every family.</w:t>
+      </w:r>
+    </w:p>
+    <w:p>
+      <w:pPr>
+        <w:spacing w:after="120"/>
+        <w:ind w:left="432" w:hanging="259"/>
+      </w:pPr>
+      <w:r>
+        <w:rPr>
+          <w:rFonts w:ascii="Calibri" w:hAnsi="Calibri"/>
+          <w:b w:val="0"/>
+          <w:i w:val="0"/>
+          <w:color w:val="222222"/>
+          <w:sz w:val="21"/>
+        </w:rPr>
+        <w:t>•</w:t>
+        <w:tab/>
+      </w:r>
+      <w:r>
+        <w:rPr>
+          <w:rFonts w:ascii="Calibri" w:hAnsi="Calibri"/>
+          <w:b/>
+          <w:i w:val="0"/>
+          <w:color w:val="156082"/>
+          <w:sz w:val="21"/>
+        </w:rPr>
+        <w:t>Evidence.</w:t>
+      </w:r>
+      <w:r>
+        <w:rPr>
+          <w:rFonts w:ascii="Calibri" w:hAnsi="Calibri"/>
+          <w:b w:val="0"/>
+          <w:i w:val="0"/>
+          <w:color w:val="222222"/>
+          <w:sz w:val="21"/>
+        </w:rPr>
+        <w:t xml:space="preserve"> Report §25 ("One step closer to behaviour") and figure; </w:t>
+      </w:r>
+      <w:r>
+        <w:rPr>
+          <w:rFonts w:ascii="Consolas" w:hAnsi="Consolas"/>
+          <w:b w:val="0"/>
+          <w:i w:val="0"/>
+          <w:color w:val="222222"/>
+          <w:sz w:val="19"/>
+        </w:rPr>
+        <w:t>outputs/fly/malecns_motor_SIMULATED.csv</w:t>
+      </w:r>
+      <w:r>
+        <w:rPr>
+          <w:rFonts w:ascii="Calibri" w:hAnsi="Calibri"/>
+          <w:b w:val="0"/>
+          <w:i w:val="0"/>
+          <w:color w:val="222222"/>
+          <w:sz w:val="21"/>
+        </w:rPr>
+        <w:t>.</w:t>
       </w:r>
     </w:p>
     <w:p>
@@ -3624,9 +4015,9 @@
         <w:tblLook w:firstColumn="1" w:firstRow="1" w:lastColumn="0" w:lastRow="0" w:noHBand="0" w:noVBand="1" w:val="04A0"/>
       </w:tblPr>
       <w:tblGrid>
-        <w:gridCol w:w="3842"/>
-        <w:gridCol w:w="3019"/>
-        <w:gridCol w:w="1635"/>
+        <w:gridCol w:w="3947"/>
+        <w:gridCol w:w="2955"/>
+        <w:gridCol w:w="1594"/>
       </w:tblGrid>
       <w:tr>
         <w:trPr>
@@ -3635,7 +4026,7 @@
         </w:trPr>
         <w:tc>
           <w:tcPr>
-            <w:tcW w:type="dxa" w:w="3842"/>
+            <w:tcW w:type="dxa" w:w="3947"/>
             <w:shd w:val="clear" w:color="auto" w:fill="1F4E79"/>
             <w:vAlign w:val="center"/>
           </w:tcPr>
@@ -3658,7 +4049,7 @@
         </w:tc>
         <w:tc>
           <w:tcPr>
-            <w:tcW w:type="dxa" w:w="3019"/>
+            <w:tcW w:type="dxa" w:w="2955"/>
             <w:shd w:val="clear" w:color="auto" w:fill="1F4E79"/>
             <w:vAlign w:val="center"/>
           </w:tcPr>
@@ -3681,7 +4072,7 @@
         </w:tc>
         <w:tc>
           <w:tcPr>
-            <w:tcW w:type="dxa" w:w="1635"/>
+            <w:tcW w:type="dxa" w:w="1594"/>
             <w:shd w:val="clear" w:color="auto" w:fill="1F4E79"/>
             <w:vAlign w:val="center"/>
           </w:tcPr>
@@ -3709,7 +4100,7 @@
         </w:trPr>
         <w:tc>
           <w:tcPr>
-            <w:tcW w:type="dxa" w:w="3842"/>
+            <w:tcW w:type="dxa" w:w="3947"/>
             <w:shd w:val="clear" w:color="auto" w:fill="FFFFFF"/>
             <w:vAlign w:val="center"/>
           </w:tcPr>
@@ -3732,7 +4123,7 @@
         </w:tc>
         <w:tc>
           <w:tcPr>
-            <w:tcW w:type="dxa" w:w="3019"/>
+            <w:tcW w:type="dxa" w:w="2955"/>
             <w:shd w:val="clear" w:color="auto" w:fill="FFFFFF"/>
             <w:vAlign w:val="center"/>
           </w:tcPr>
@@ -3755,7 +4146,7 @@
         </w:tc>
         <w:tc>
           <w:tcPr>
-            <w:tcW w:type="dxa" w:w="1635"/>
+            <w:tcW w:type="dxa" w:w="1594"/>
             <w:shd w:val="clear" w:color="auto" w:fill="FFFFFF"/>
             <w:vAlign w:val="center"/>
           </w:tcPr>
@@ -3783,7 +4174,7 @@
         </w:trPr>
         <w:tc>
           <w:tcPr>
-            <w:tcW w:type="dxa" w:w="3842"/>
+            <w:tcW w:type="dxa" w:w="3947"/>
             <w:shd w:val="clear" w:color="auto" w:fill="F7F9FB"/>
             <w:vAlign w:val="center"/>
           </w:tcPr>
@@ -3806,7 +4197,7 @@
         </w:tc>
         <w:tc>
           <w:tcPr>
-            <w:tcW w:type="dxa" w:w="3019"/>
+            <w:tcW w:type="dxa" w:w="2955"/>
             <w:shd w:val="clear" w:color="auto" w:fill="F7F9FB"/>
             <w:vAlign w:val="center"/>
           </w:tcPr>
@@ -3829,7 +4220,7 @@
         </w:tc>
         <w:tc>
           <w:tcPr>
-            <w:tcW w:type="dxa" w:w="1635"/>
+            <w:tcW w:type="dxa" w:w="1594"/>
             <w:shd w:val="clear" w:color="auto" w:fill="F7F9FB"/>
             <w:vAlign w:val="center"/>
           </w:tcPr>
@@ -3858,7 +4249,7 @@
         </w:trPr>
         <w:tc>
           <w:tcPr>
-            <w:tcW w:type="dxa" w:w="3842"/>
+            <w:tcW w:type="dxa" w:w="3947"/>
             <w:shd w:val="clear" w:color="auto" w:fill="FFFFFF"/>
             <w:vAlign w:val="center"/>
           </w:tcPr>
@@ -3881,7 +4272,7 @@
         </w:tc>
         <w:tc>
           <w:tcPr>
-            <w:tcW w:type="dxa" w:w="3019"/>
+            <w:tcW w:type="dxa" w:w="2955"/>
             <w:shd w:val="clear" w:color="auto" w:fill="FFFFFF"/>
             <w:vAlign w:val="center"/>
           </w:tcPr>
@@ -3904,7 +4295,7 @@
         </w:tc>
         <w:tc>
           <w:tcPr>
-            <w:tcW w:type="dxa" w:w="1635"/>
+            <w:tcW w:type="dxa" w:w="1594"/>
             <w:shd w:val="clear" w:color="auto" w:fill="FFFFFF"/>
             <w:vAlign w:val="center"/>
           </w:tcPr>
@@ -3932,7 +4323,7 @@
         </w:trPr>
         <w:tc>
           <w:tcPr>
-            <w:tcW w:type="dxa" w:w="3842"/>
+            <w:tcW w:type="dxa" w:w="3947"/>
             <w:shd w:val="clear" w:color="auto" w:fill="F7F9FB"/>
             <w:vAlign w:val="center"/>
           </w:tcPr>
@@ -3955,7 +4346,7 @@
         </w:tc>
         <w:tc>
           <w:tcPr>
-            <w:tcW w:type="dxa" w:w="3019"/>
+            <w:tcW w:type="dxa" w:w="2955"/>
             <w:shd w:val="clear" w:color="auto" w:fill="F7F9FB"/>
             <w:vAlign w:val="center"/>
           </w:tcPr>
@@ -3978,7 +4369,7 @@
         </w:tc>
         <w:tc>
           <w:tcPr>
-            <w:tcW w:type="dxa" w:w="1635"/>
+            <w:tcW w:type="dxa" w:w="1594"/>
             <w:shd w:val="clear" w:color="auto" w:fill="F7F9FB"/>
             <w:vAlign w:val="center"/>
           </w:tcPr>
@@ -4007,7 +4398,7 @@
         </w:trPr>
         <w:tc>
           <w:tcPr>
-            <w:tcW w:type="dxa" w:w="3842"/>
+            <w:tcW w:type="dxa" w:w="3947"/>
             <w:shd w:val="clear" w:color="auto" w:fill="FFFFFF"/>
             <w:vAlign w:val="center"/>
           </w:tcPr>
@@ -4030,7 +4421,7 @@
         </w:tc>
         <w:tc>
           <w:tcPr>
-            <w:tcW w:type="dxa" w:w="3019"/>
+            <w:tcW w:type="dxa" w:w="2955"/>
             <w:shd w:val="clear" w:color="auto" w:fill="FFFFFF"/>
             <w:vAlign w:val="center"/>
           </w:tcPr>
@@ -4053,7 +4444,7 @@
         </w:tc>
         <w:tc>
           <w:tcPr>
-            <w:tcW w:type="dxa" w:w="1635"/>
+            <w:tcW w:type="dxa" w:w="1594"/>
             <w:shd w:val="clear" w:color="auto" w:fill="FFFFFF"/>
             <w:vAlign w:val="center"/>
           </w:tcPr>
@@ -4081,13 +4472,13 @@
         </w:trPr>
         <w:tc>
           <w:tcPr>
-            <w:tcW w:type="dxa" w:w="3842"/>
+            <w:tcW w:type="dxa" w:w="3947"/>
             <w:shd w:val="clear" w:color="auto" w:fill="F7F9FB"/>
             <w:vAlign w:val="center"/>
           </w:tcPr>
           <w:p>
             <w:pPr>
-              <w:keepNext w:val="0"/>
+              <w:keepNext/>
               <w:spacing w:after="0"/>
             </w:pPr>
             <w:r>
@@ -4098,19 +4489,19 @@
                 <w:color w:val="222222"/>
                 <w:sz w:val="20"/>
               </w:rPr>
-              <w:t>Random-graph-to-connectome blend for organoids; embodied fly</w:t>
+              <w:t>Random-graph-to-connectome blend for organoids</w:t>
             </w:r>
           </w:p>
         </w:tc>
         <w:tc>
           <w:tcPr>
-            <w:tcW w:type="dxa" w:w="3019"/>
+            <w:tcW w:type="dxa" w:w="2955"/>
             <w:shd w:val="clear" w:color="auto" w:fill="F7F9FB"/>
             <w:vAlign w:val="center"/>
           </w:tcPr>
           <w:p>
             <w:pPr>
-              <w:keepNext w:val="0"/>
+              <w:keepNext/>
               <w:spacing w:after="0"/>
             </w:pPr>
             <w:r>
@@ -4127,8 +4518,83 @@
         </w:tc>
         <w:tc>
           <w:tcPr>
-            <w:tcW w:type="dxa" w:w="1635"/>
+            <w:tcW w:type="dxa" w:w="1594"/>
             <w:shd w:val="clear" w:color="auto" w:fill="F7F9FB"/>
+            <w:vAlign w:val="center"/>
+          </w:tcPr>
+          <w:p>
+            <w:pPr>
+              <w:keepNext/>
+              <w:spacing w:after="0"/>
+              <w:jc w:val="center"/>
+            </w:pPr>
+            <w:r>
+              <w:rPr>
+                <w:rFonts w:ascii="Calibri" w:hAnsi="Calibri"/>
+                <w:b w:val="0"/>
+                <w:i w:val="0"/>
+                <w:color w:val="222222"/>
+                <w:sz w:val="20"/>
+              </w:rPr>
+              <w:t>—</w:t>
+            </w:r>
+          </w:p>
+        </w:tc>
+      </w:tr>
+      <w:tr>
+        <w:trPr>
+          <w:cantSplit/>
+        </w:trPr>
+        <w:tc>
+          <w:tcPr>
+            <w:tcW w:type="dxa" w:w="3947"/>
+            <w:shd w:val="clear" w:color="auto" w:fill="FFFFFF"/>
+            <w:vAlign w:val="center"/>
+          </w:tcPr>
+          <w:p>
+            <w:pPr>
+              <w:keepNext w:val="0"/>
+              <w:spacing w:after="0"/>
+            </w:pPr>
+            <w:r>
+              <w:rPr>
+                <w:rFonts w:ascii="Calibri" w:hAnsi="Calibri"/>
+                <w:b/>
+                <w:i w:val="0"/>
+                <w:color w:val="222222"/>
+                <w:sz w:val="20"/>
+              </w:rPr>
+              <w:t>Embodied, closed-loop fly (body, nerve cord to muscles, sensory feedback)</w:t>
+            </w:r>
+          </w:p>
+        </w:tc>
+        <w:tc>
+          <w:tcPr>
+            <w:tcW w:type="dxa" w:w="2955"/>
+            <w:shd w:val="clear" w:color="auto" w:fill="FFFFFF"/>
+            <w:vAlign w:val="center"/>
+          </w:tcPr>
+          <w:p>
+            <w:pPr>
+              <w:keepNext w:val="0"/>
+              <w:spacing w:after="0"/>
+            </w:pPr>
+            <w:r>
+              <w:rPr>
+                <w:rFonts w:ascii="Calibri" w:hAnsi="Calibri"/>
+                <w:b w:val="0"/>
+                <w:i w:val="0"/>
+                <w:color w:val="222222"/>
+                <w:sz w:val="20"/>
+              </w:rPr>
+              <w:t>roadmap after the final; its first step, motor-neuron readouts, is entry 10</w:t>
+            </w:r>
+          </w:p>
+        </w:tc>
+        <w:tc>
+          <w:tcPr>
+            <w:tcW w:type="dxa" w:w="1594"/>
+            <w:shd w:val="clear" w:color="auto" w:fill="FFFFFF"/>
             <w:vAlign w:val="center"/>
           </w:tcPr>
           <w:p>
@@ -4168,7 +4634,7 @@
           <w:color w:val="222222"/>
           <w:sz w:val="21"/>
         </w:rPr>
-        <w:t>Why the last two were dropped: grafting fly wiring onto a model of a mammalian cortical culture has no biological basis, and organoid–monolayer differences have many confounds, so a match would prove nothing; an embodied (physics-simulated) fly is weeks of work for a question the behaviour neurons already answer.</w:t>
+        <w:t>Why the blend was dropped: grafting fly wiring onto a model of a mammalian cortical culture has no biological basis, and organoid–monolayer differences have many confounds, so a match would prove nothing. The embodied fly is not dropped but scheduled: it adds new information only with the loop closed (nerve cord to muscles, body, sensory feedback), which is a research project for after the final; reading the motor neurons (entry 10) is its first step.</w:t>
       </w:r>
     </w:p>
     <w:sectPr>

</xml_diff>

<commit_message>
Record and write up the tie-break follow-up (1 of 2 registered predictions pass)
Four finer doses inside each tied step, same seeds and references: the
tied levels reproduce exactly; the raised threshold resolves to chip later
(motor 0.32, chip 0.40), GABA potentiation stays tied at 0.60. MR5 stays
failed as registered; read beside the follow-up, the chip is later than
motor output in 4 families, level in 1, earlier in 0. In §25 with a
figure, the changes log (entry 11) and the app; Word and PDF rebuilt.

Co-Authored-By: Claude Opus 5.5 <noreply@anthropic.com>
</commit_message>
<xml_diff>
--- a/report/POST_SUBMISSION_CHANGES.docx
+++ b/report/POST_SUBMISSION_CHANGES.docx
@@ -48,11 +48,11 @@
         <w:tblLook w:firstColumn="1" w:firstRow="1" w:lastColumn="0" w:lastRow="0" w:noHBand="0" w:noVBand="1" w:val="04A0"/>
       </w:tblPr>
       <w:tblGrid>
-        <w:gridCol w:w="435"/>
-        <w:gridCol w:w="1719"/>
-        <w:gridCol w:w="2506"/>
-        <w:gridCol w:w="2421"/>
-        <w:gridCol w:w="1415"/>
+        <w:gridCol w:w="434"/>
+        <w:gridCol w:w="1715"/>
+        <w:gridCol w:w="2483"/>
+        <w:gridCol w:w="2455"/>
+        <w:gridCol w:w="1409"/>
       </w:tblGrid>
       <w:tr>
         <w:trPr>
@@ -61,7 +61,7 @@
         </w:trPr>
         <w:tc>
           <w:tcPr>
-            <w:tcW w:type="dxa" w:w="435"/>
+            <w:tcW w:type="dxa" w:w="434"/>
             <w:shd w:val="clear" w:color="auto" w:fill="1F4E79"/>
             <w:vAlign w:val="center"/>
           </w:tcPr>
@@ -85,7 +85,7 @@
         </w:tc>
         <w:tc>
           <w:tcPr>
-            <w:tcW w:type="dxa" w:w="1719"/>
+            <w:tcW w:type="dxa" w:w="1715"/>
             <w:shd w:val="clear" w:color="auto" w:fill="1F4E79"/>
             <w:vAlign w:val="center"/>
           </w:tcPr>
@@ -109,7 +109,7 @@
         </w:tc>
         <w:tc>
           <w:tcPr>
-            <w:tcW w:type="dxa" w:w="2506"/>
+            <w:tcW w:type="dxa" w:w="2483"/>
             <w:shd w:val="clear" w:color="auto" w:fill="1F4E79"/>
             <w:vAlign w:val="center"/>
           </w:tcPr>
@@ -132,7 +132,7 @@
         </w:tc>
         <w:tc>
           <w:tcPr>
-            <w:tcW w:type="dxa" w:w="2421"/>
+            <w:tcW w:type="dxa" w:w="2455"/>
             <w:shd w:val="clear" w:color="auto" w:fill="1F4E79"/>
             <w:vAlign w:val="center"/>
           </w:tcPr>
@@ -155,7 +155,7 @@
         </w:tc>
         <w:tc>
           <w:tcPr>
-            <w:tcW w:type="dxa" w:w="1415"/>
+            <w:tcW w:type="dxa" w:w="1409"/>
             <w:shd w:val="clear" w:color="auto" w:fill="1F4E79"/>
             <w:vAlign w:val="center"/>
           </w:tcPr>
@@ -183,7 +183,7 @@
         </w:trPr>
         <w:tc>
           <w:tcPr>
-            <w:tcW w:type="dxa" w:w="435"/>
+            <w:tcW w:type="dxa" w:w="434"/>
             <w:shd w:val="clear" w:color="auto" w:fill="FFFFFF"/>
             <w:vAlign w:val="center"/>
           </w:tcPr>
@@ -207,7 +207,7 @@
         </w:tc>
         <w:tc>
           <w:tcPr>
-            <w:tcW w:type="dxa" w:w="1719"/>
+            <w:tcW w:type="dxa" w:w="1715"/>
             <w:shd w:val="clear" w:color="auto" w:fill="FFFFFF"/>
             <w:vAlign w:val="center"/>
           </w:tcPr>
@@ -231,7 +231,7 @@
         </w:tc>
         <w:tc>
           <w:tcPr>
-            <w:tcW w:type="dxa" w:w="2506"/>
+            <w:tcW w:type="dxa" w:w="2483"/>
             <w:shd w:val="clear" w:color="auto" w:fill="FFFFFF"/>
             <w:vAlign w:val="center"/>
           </w:tcPr>
@@ -254,7 +254,7 @@
         </w:tc>
         <w:tc>
           <w:tcPr>
-            <w:tcW w:type="dxa" w:w="2421"/>
+            <w:tcW w:type="dxa" w:w="2455"/>
             <w:shd w:val="clear" w:color="auto" w:fill="FFFFFF"/>
             <w:vAlign w:val="center"/>
           </w:tcPr>
@@ -277,7 +277,7 @@
         </w:tc>
         <w:tc>
           <w:tcPr>
-            <w:tcW w:type="dxa" w:w="1415"/>
+            <w:tcW w:type="dxa" w:w="1409"/>
             <w:shd w:val="clear" w:color="auto" w:fill="FFFFFF"/>
             <w:vAlign w:val="center"/>
           </w:tcPr>
@@ -325,7 +325,7 @@
         </w:trPr>
         <w:tc>
           <w:tcPr>
-            <w:tcW w:type="dxa" w:w="435"/>
+            <w:tcW w:type="dxa" w:w="434"/>
             <w:shd w:val="clear" w:color="auto" w:fill="F7F9FB"/>
             <w:vAlign w:val="center"/>
           </w:tcPr>
@@ -349,7 +349,7 @@
         </w:tc>
         <w:tc>
           <w:tcPr>
-            <w:tcW w:type="dxa" w:w="1719"/>
+            <w:tcW w:type="dxa" w:w="1715"/>
             <w:shd w:val="clear" w:color="auto" w:fill="F7F9FB"/>
             <w:vAlign w:val="center"/>
           </w:tcPr>
@@ -373,7 +373,7 @@
         </w:tc>
         <w:tc>
           <w:tcPr>
-            <w:tcW w:type="dxa" w:w="2506"/>
+            <w:tcW w:type="dxa" w:w="2483"/>
             <w:shd w:val="clear" w:color="auto" w:fill="F7F9FB"/>
             <w:vAlign w:val="center"/>
           </w:tcPr>
@@ -396,7 +396,7 @@
         </w:tc>
         <w:tc>
           <w:tcPr>
-            <w:tcW w:type="dxa" w:w="2421"/>
+            <w:tcW w:type="dxa" w:w="2455"/>
             <w:shd w:val="clear" w:color="auto" w:fill="F7F9FB"/>
             <w:vAlign w:val="center"/>
           </w:tcPr>
@@ -419,7 +419,7 @@
         </w:tc>
         <w:tc>
           <w:tcPr>
-            <w:tcW w:type="dxa" w:w="1415"/>
+            <w:tcW w:type="dxa" w:w="1409"/>
             <w:shd w:val="clear" w:color="auto" w:fill="F7F9FB"/>
             <w:vAlign w:val="center"/>
           </w:tcPr>
@@ -447,7 +447,7 @@
         </w:trPr>
         <w:tc>
           <w:tcPr>
-            <w:tcW w:type="dxa" w:w="435"/>
+            <w:tcW w:type="dxa" w:w="434"/>
             <w:shd w:val="clear" w:color="auto" w:fill="FFFFFF"/>
             <w:vAlign w:val="center"/>
           </w:tcPr>
@@ -471,7 +471,7 @@
         </w:tc>
         <w:tc>
           <w:tcPr>
-            <w:tcW w:type="dxa" w:w="1719"/>
+            <w:tcW w:type="dxa" w:w="1715"/>
             <w:shd w:val="clear" w:color="auto" w:fill="FFFFFF"/>
             <w:vAlign w:val="center"/>
           </w:tcPr>
@@ -495,7 +495,7 @@
         </w:tc>
         <w:tc>
           <w:tcPr>
-            <w:tcW w:type="dxa" w:w="2506"/>
+            <w:tcW w:type="dxa" w:w="2483"/>
             <w:shd w:val="clear" w:color="auto" w:fill="FFFFFF"/>
             <w:vAlign w:val="center"/>
           </w:tcPr>
@@ -518,7 +518,7 @@
         </w:tc>
         <w:tc>
           <w:tcPr>
-            <w:tcW w:type="dxa" w:w="2421"/>
+            <w:tcW w:type="dxa" w:w="2455"/>
             <w:shd w:val="clear" w:color="auto" w:fill="FFFFFF"/>
             <w:vAlign w:val="center"/>
           </w:tcPr>
@@ -541,7 +541,7 @@
         </w:tc>
         <w:tc>
           <w:tcPr>
-            <w:tcW w:type="dxa" w:w="1415"/>
+            <w:tcW w:type="dxa" w:w="1409"/>
             <w:shd w:val="clear" w:color="auto" w:fill="FFFFFF"/>
             <w:vAlign w:val="center"/>
           </w:tcPr>
@@ -569,7 +569,7 @@
         </w:trPr>
         <w:tc>
           <w:tcPr>
-            <w:tcW w:type="dxa" w:w="435"/>
+            <w:tcW w:type="dxa" w:w="434"/>
             <w:shd w:val="clear" w:color="auto" w:fill="F7F9FB"/>
             <w:vAlign w:val="center"/>
           </w:tcPr>
@@ -593,7 +593,7 @@
         </w:tc>
         <w:tc>
           <w:tcPr>
-            <w:tcW w:type="dxa" w:w="1719"/>
+            <w:tcW w:type="dxa" w:w="1715"/>
             <w:shd w:val="clear" w:color="auto" w:fill="F7F9FB"/>
             <w:vAlign w:val="center"/>
           </w:tcPr>
@@ -617,7 +617,7 @@
         </w:tc>
         <w:tc>
           <w:tcPr>
-            <w:tcW w:type="dxa" w:w="2506"/>
+            <w:tcW w:type="dxa" w:w="2483"/>
             <w:shd w:val="clear" w:color="auto" w:fill="F7F9FB"/>
             <w:vAlign w:val="center"/>
           </w:tcPr>
@@ -640,7 +640,7 @@
         </w:tc>
         <w:tc>
           <w:tcPr>
-            <w:tcW w:type="dxa" w:w="2421"/>
+            <w:tcW w:type="dxa" w:w="2455"/>
             <w:shd w:val="clear" w:color="auto" w:fill="F7F9FB"/>
             <w:vAlign w:val="center"/>
           </w:tcPr>
@@ -663,7 +663,7 @@
         </w:tc>
         <w:tc>
           <w:tcPr>
-            <w:tcW w:type="dxa" w:w="1415"/>
+            <w:tcW w:type="dxa" w:w="1409"/>
             <w:shd w:val="clear" w:color="auto" w:fill="F7F9FB"/>
             <w:vAlign w:val="center"/>
           </w:tcPr>
@@ -711,7 +711,7 @@
         </w:trPr>
         <w:tc>
           <w:tcPr>
-            <w:tcW w:type="dxa" w:w="435"/>
+            <w:tcW w:type="dxa" w:w="434"/>
             <w:shd w:val="clear" w:color="auto" w:fill="FFFFFF"/>
             <w:vAlign w:val="center"/>
           </w:tcPr>
@@ -735,7 +735,7 @@
         </w:tc>
         <w:tc>
           <w:tcPr>
-            <w:tcW w:type="dxa" w:w="1719"/>
+            <w:tcW w:type="dxa" w:w="1715"/>
             <w:shd w:val="clear" w:color="auto" w:fill="FFFFFF"/>
             <w:vAlign w:val="center"/>
           </w:tcPr>
@@ -759,7 +759,7 @@
         </w:tc>
         <w:tc>
           <w:tcPr>
-            <w:tcW w:type="dxa" w:w="2506"/>
+            <w:tcW w:type="dxa" w:w="2483"/>
             <w:shd w:val="clear" w:color="auto" w:fill="FFFFFF"/>
             <w:vAlign w:val="center"/>
           </w:tcPr>
@@ -782,7 +782,7 @@
         </w:tc>
         <w:tc>
           <w:tcPr>
-            <w:tcW w:type="dxa" w:w="2421"/>
+            <w:tcW w:type="dxa" w:w="2455"/>
             <w:shd w:val="clear" w:color="auto" w:fill="FFFFFF"/>
             <w:vAlign w:val="center"/>
           </w:tcPr>
@@ -805,7 +805,7 @@
         </w:tc>
         <w:tc>
           <w:tcPr>
-            <w:tcW w:type="dxa" w:w="1415"/>
+            <w:tcW w:type="dxa" w:w="1409"/>
             <w:shd w:val="clear" w:color="auto" w:fill="FFFFFF"/>
             <w:vAlign w:val="center"/>
           </w:tcPr>
@@ -833,7 +833,7 @@
         </w:trPr>
         <w:tc>
           <w:tcPr>
-            <w:tcW w:type="dxa" w:w="435"/>
+            <w:tcW w:type="dxa" w:w="434"/>
             <w:shd w:val="clear" w:color="auto" w:fill="F7F9FB"/>
             <w:vAlign w:val="center"/>
           </w:tcPr>
@@ -857,7 +857,7 @@
         </w:tc>
         <w:tc>
           <w:tcPr>
-            <w:tcW w:type="dxa" w:w="1719"/>
+            <w:tcW w:type="dxa" w:w="1715"/>
             <w:shd w:val="clear" w:color="auto" w:fill="F7F9FB"/>
             <w:vAlign w:val="center"/>
           </w:tcPr>
@@ -881,7 +881,7 @@
         </w:tc>
         <w:tc>
           <w:tcPr>
-            <w:tcW w:type="dxa" w:w="2506"/>
+            <w:tcW w:type="dxa" w:w="2483"/>
             <w:shd w:val="clear" w:color="auto" w:fill="F7F9FB"/>
             <w:vAlign w:val="center"/>
           </w:tcPr>
@@ -904,7 +904,7 @@
         </w:tc>
         <w:tc>
           <w:tcPr>
-            <w:tcW w:type="dxa" w:w="2421"/>
+            <w:tcW w:type="dxa" w:w="2455"/>
             <w:shd w:val="clear" w:color="auto" w:fill="F7F9FB"/>
             <w:vAlign w:val="center"/>
           </w:tcPr>
@@ -927,7 +927,7 @@
         </w:tc>
         <w:tc>
           <w:tcPr>
-            <w:tcW w:type="dxa" w:w="1415"/>
+            <w:tcW w:type="dxa" w:w="1409"/>
             <w:shd w:val="clear" w:color="auto" w:fill="F7F9FB"/>
             <w:vAlign w:val="center"/>
           </w:tcPr>
@@ -955,7 +955,7 @@
         </w:trPr>
         <w:tc>
           <w:tcPr>
-            <w:tcW w:type="dxa" w:w="435"/>
+            <w:tcW w:type="dxa" w:w="434"/>
             <w:shd w:val="clear" w:color="auto" w:fill="FFFFFF"/>
             <w:vAlign w:val="center"/>
           </w:tcPr>
@@ -979,7 +979,7 @@
         </w:tc>
         <w:tc>
           <w:tcPr>
-            <w:tcW w:type="dxa" w:w="1719"/>
+            <w:tcW w:type="dxa" w:w="1715"/>
             <w:shd w:val="clear" w:color="auto" w:fill="FFFFFF"/>
             <w:vAlign w:val="center"/>
           </w:tcPr>
@@ -1003,7 +1003,7 @@
         </w:tc>
         <w:tc>
           <w:tcPr>
-            <w:tcW w:type="dxa" w:w="2506"/>
+            <w:tcW w:type="dxa" w:w="2483"/>
             <w:shd w:val="clear" w:color="auto" w:fill="FFFFFF"/>
             <w:vAlign w:val="center"/>
           </w:tcPr>
@@ -1026,7 +1026,7 @@
         </w:tc>
         <w:tc>
           <w:tcPr>
-            <w:tcW w:type="dxa" w:w="2421"/>
+            <w:tcW w:type="dxa" w:w="2455"/>
             <w:shd w:val="clear" w:color="auto" w:fill="FFFFFF"/>
             <w:vAlign w:val="center"/>
           </w:tcPr>
@@ -1049,7 +1049,7 @@
         </w:tc>
         <w:tc>
           <w:tcPr>
-            <w:tcW w:type="dxa" w:w="1415"/>
+            <w:tcW w:type="dxa" w:w="1409"/>
             <w:shd w:val="clear" w:color="auto" w:fill="FFFFFF"/>
             <w:vAlign w:val="center"/>
           </w:tcPr>
@@ -1097,7 +1097,7 @@
         </w:trPr>
         <w:tc>
           <w:tcPr>
-            <w:tcW w:type="dxa" w:w="435"/>
+            <w:tcW w:type="dxa" w:w="434"/>
             <w:shd w:val="clear" w:color="auto" w:fill="F7F9FB"/>
             <w:vAlign w:val="center"/>
           </w:tcPr>
@@ -1121,7 +1121,7 @@
         </w:tc>
         <w:tc>
           <w:tcPr>
-            <w:tcW w:type="dxa" w:w="1719"/>
+            <w:tcW w:type="dxa" w:w="1715"/>
             <w:shd w:val="clear" w:color="auto" w:fill="F7F9FB"/>
             <w:vAlign w:val="center"/>
           </w:tcPr>
@@ -1145,7 +1145,7 @@
         </w:tc>
         <w:tc>
           <w:tcPr>
-            <w:tcW w:type="dxa" w:w="2506"/>
+            <w:tcW w:type="dxa" w:w="2483"/>
             <w:shd w:val="clear" w:color="auto" w:fill="F7F9FB"/>
             <w:vAlign w:val="center"/>
           </w:tcPr>
@@ -1168,7 +1168,7 @@
         </w:tc>
         <w:tc>
           <w:tcPr>
-            <w:tcW w:type="dxa" w:w="2421"/>
+            <w:tcW w:type="dxa" w:w="2455"/>
             <w:shd w:val="clear" w:color="auto" w:fill="F7F9FB"/>
             <w:vAlign w:val="center"/>
           </w:tcPr>
@@ -1191,7 +1191,7 @@
         </w:tc>
         <w:tc>
           <w:tcPr>
-            <w:tcW w:type="dxa" w:w="1415"/>
+            <w:tcW w:type="dxa" w:w="1409"/>
             <w:shd w:val="clear" w:color="auto" w:fill="F7F9FB"/>
             <w:vAlign w:val="center"/>
           </w:tcPr>
@@ -1239,7 +1239,7 @@
         </w:trPr>
         <w:tc>
           <w:tcPr>
-            <w:tcW w:type="dxa" w:w="435"/>
+            <w:tcW w:type="dxa" w:w="434"/>
             <w:shd w:val="clear" w:color="auto" w:fill="FFFFFF"/>
             <w:vAlign w:val="center"/>
           </w:tcPr>
@@ -1263,7 +1263,7 @@
         </w:tc>
         <w:tc>
           <w:tcPr>
-            <w:tcW w:type="dxa" w:w="1719"/>
+            <w:tcW w:type="dxa" w:w="1715"/>
             <w:shd w:val="clear" w:color="auto" w:fill="FFFFFF"/>
             <w:vAlign w:val="center"/>
           </w:tcPr>
@@ -1287,7 +1287,7 @@
         </w:tc>
         <w:tc>
           <w:tcPr>
-            <w:tcW w:type="dxa" w:w="2506"/>
+            <w:tcW w:type="dxa" w:w="2483"/>
             <w:shd w:val="clear" w:color="auto" w:fill="FFFFFF"/>
             <w:vAlign w:val="center"/>
           </w:tcPr>
@@ -1310,7 +1310,7 @@
         </w:tc>
         <w:tc>
           <w:tcPr>
-            <w:tcW w:type="dxa" w:w="2421"/>
+            <w:tcW w:type="dxa" w:w="2455"/>
             <w:shd w:val="clear" w:color="auto" w:fill="FFFFFF"/>
             <w:vAlign w:val="center"/>
           </w:tcPr>
@@ -1333,7 +1333,7 @@
         </w:tc>
         <w:tc>
           <w:tcPr>
-            <w:tcW w:type="dxa" w:w="1415"/>
+            <w:tcW w:type="dxa" w:w="1409"/>
             <w:shd w:val="clear" w:color="auto" w:fill="FFFFFF"/>
             <w:vAlign w:val="center"/>
           </w:tcPr>
@@ -1381,13 +1381,13 @@
         </w:trPr>
         <w:tc>
           <w:tcPr>
-            <w:tcW w:type="dxa" w:w="435"/>
+            <w:tcW w:type="dxa" w:w="434"/>
             <w:shd w:val="clear" w:color="auto" w:fill="F7F9FB"/>
             <w:vAlign w:val="center"/>
           </w:tcPr>
           <w:p>
             <w:pPr>
-              <w:keepNext w:val="0"/>
+              <w:keepNext/>
               <w:spacing w:after="0"/>
               <w:jc w:val="center"/>
             </w:pPr>
@@ -1405,8 +1405,150 @@
         </w:tc>
         <w:tc>
           <w:tcPr>
-            <w:tcW w:type="dxa" w:w="1719"/>
+            <w:tcW w:type="dxa" w:w="1715"/>
             <w:shd w:val="clear" w:color="auto" w:fill="F7F9FB"/>
+            <w:vAlign w:val="center"/>
+          </w:tcPr>
+          <w:p>
+            <w:pPr>
+              <w:keepNext/>
+              <w:spacing w:after="0"/>
+              <w:jc w:val="center"/>
+            </w:pPr>
+            <w:r>
+              <w:rPr>
+                <w:rFonts w:ascii="Calibri" w:hAnsi="Calibri"/>
+                <w:b w:val="0"/>
+                <w:i w:val="0"/>
+                <w:color w:val="222222"/>
+                <w:sz w:val="20"/>
+              </w:rPr>
+              <w:t>2026-10-24</w:t>
+            </w:r>
+          </w:p>
+        </w:tc>
+        <w:tc>
+          <w:tcPr>
+            <w:tcW w:type="dxa" w:w="2483"/>
+            <w:shd w:val="clear" w:color="auto" w:fill="F7F9FB"/>
+            <w:vAlign w:val="center"/>
+          </w:tcPr>
+          <w:p>
+            <w:pPr>
+              <w:keepNext/>
+              <w:spacing w:after="0"/>
+            </w:pPr>
+            <w:r>
+              <w:rPr>
+                <w:rFonts w:ascii="Calibri" w:hAnsi="Calibri"/>
+                <w:b w:val="0"/>
+                <w:i w:val="0"/>
+                <w:color w:val="222222"/>
+                <w:sz w:val="20"/>
+              </w:rPr>
+              <w:t>Behaviour read at the motor neurons of the male CNS</w:t>
+            </w:r>
+          </w:p>
+        </w:tc>
+        <w:tc>
+          <w:tcPr>
+            <w:tcW w:type="dxa" w:w="2455"/>
+            <w:shd w:val="clear" w:color="auto" w:fill="F7F9FB"/>
+            <w:vAlign w:val="center"/>
+          </w:tcPr>
+          <w:p>
+            <w:pPr>
+              <w:keepNext/>
+              <w:spacing w:after="0"/>
+            </w:pPr>
+            <w:r>
+              <w:rPr>
+                <w:rFonts w:ascii="Calibri" w:hAnsi="Calibri"/>
+                <w:b w:val="0"/>
+                <w:i w:val="0"/>
+                <w:color w:val="222222"/>
+                <w:sz w:val="20"/>
+              </w:rPr>
+              <w:t>6 of 7 registered predictions pass</w:t>
+            </w:r>
+          </w:p>
+        </w:tc>
+        <w:tc>
+          <w:tcPr>
+            <w:tcW w:type="dxa" w:w="1409"/>
+            <w:shd w:val="clear" w:color="auto" w:fill="F7F9FB"/>
+            <w:vAlign w:val="center"/>
+          </w:tcPr>
+          <w:p>
+            <w:pPr>
+              <w:keepNext/>
+              <w:spacing w:after="0"/>
+            </w:pPr>
+            <w:r>
+              <w:rPr>
+                <w:rFonts w:ascii="Consolas" w:hAnsi="Consolas"/>
+                <w:b w:val="0"/>
+                <w:i w:val="0"/>
+                <w:color w:val="222222"/>
+                <w:sz w:val="18"/>
+              </w:rPr>
+              <w:t>a1c5f27</w:t>
+            </w:r>
+            <w:r>
+              <w:rPr>
+                <w:rFonts w:ascii="Calibri" w:hAnsi="Calibri"/>
+                <w:b w:val="0"/>
+                <w:i w:val="0"/>
+                <w:color w:val="222222"/>
+                <w:sz w:val="20"/>
+              </w:rPr>
+              <w:t xml:space="preserve">, </w:t>
+            </w:r>
+            <w:r>
+              <w:rPr>
+                <w:rFonts w:ascii="Consolas" w:hAnsi="Consolas"/>
+                <w:b w:val="0"/>
+                <w:i w:val="0"/>
+                <w:color w:val="222222"/>
+                <w:sz w:val="18"/>
+              </w:rPr>
+              <w:t>a2f4ee2</w:t>
+            </w:r>
+          </w:p>
+        </w:tc>
+      </w:tr>
+      <w:tr>
+        <w:trPr>
+          <w:cantSplit/>
+        </w:trPr>
+        <w:tc>
+          <w:tcPr>
+            <w:tcW w:type="dxa" w:w="434"/>
+            <w:shd w:val="clear" w:color="auto" w:fill="FFFFFF"/>
+            <w:vAlign w:val="center"/>
+          </w:tcPr>
+          <w:p>
+            <w:pPr>
+              <w:keepNext w:val="0"/>
+              <w:spacing w:after="0"/>
+              <w:jc w:val="center"/>
+            </w:pPr>
+            <w:r>
+              <w:rPr>
+                <w:rFonts w:ascii="Calibri" w:hAnsi="Calibri"/>
+                <w:b/>
+                <w:i w:val="0"/>
+                <w:color w:val="222222"/>
+                <w:sz w:val="20"/>
+              </w:rPr>
+              <w:t>11</w:t>
+            </w:r>
+          </w:p>
+        </w:tc>
+        <w:tc>
+          <w:tcPr>
+            <w:tcW w:type="dxa" w:w="1715"/>
+            <w:shd w:val="clear" w:color="auto" w:fill="FFFFFF"/>
             <w:vAlign w:val="center"/>
           </w:tcPr>
           <w:p>
@@ -1429,8 +1571,8 @@
         </w:tc>
         <w:tc>
           <w:tcPr>
-            <w:tcW w:type="dxa" w:w="2506"/>
-            <w:shd w:val="clear" w:color="auto" w:fill="F7F9FB"/>
+            <w:tcW w:type="dxa" w:w="2483"/>
+            <w:shd w:val="clear" w:color="auto" w:fill="FFFFFF"/>
             <w:vAlign w:val="center"/>
           </w:tcPr>
           <w:p>
@@ -1446,14 +1588,14 @@
                 <w:color w:val="222222"/>
                 <w:sz w:val="20"/>
               </w:rPr>
-              <w:t>Behaviour read at the motor neurons of the male CNS</w:t>
+              <w:t>The motor-level ties resolved on a finer dose grid</w:t>
             </w:r>
           </w:p>
         </w:tc>
         <w:tc>
           <w:tcPr>
-            <w:tcW w:type="dxa" w:w="2421"/>
-            <w:shd w:val="clear" w:color="auto" w:fill="F7F9FB"/>
+            <w:tcW w:type="dxa" w:w="2455"/>
+            <w:shd w:val="clear" w:color="auto" w:fill="FFFFFF"/>
             <w:vAlign w:val="center"/>
           </w:tcPr>
           <w:p>
@@ -1469,14 +1611,14 @@
                 <w:color w:val="222222"/>
                 <w:sz w:val="20"/>
               </w:rPr>
-              <w:t>6 of 7 registered predictions pass</w:t>
+              <w:t>1 of 2 registered predictions pass; one tie resolves</w:t>
             </w:r>
           </w:p>
         </w:tc>
         <w:tc>
           <w:tcPr>
-            <w:tcW w:type="dxa" w:w="1415"/>
-            <w:shd w:val="clear" w:color="auto" w:fill="F7F9FB"/>
+            <w:tcW w:type="dxa" w:w="1409"/>
+            <w:shd w:val="clear" w:color="auto" w:fill="FFFFFF"/>
             <w:vAlign w:val="center"/>
           </w:tcPr>
           <w:p>
@@ -1492,7 +1634,7 @@
                 <w:color w:val="222222"/>
                 <w:sz w:val="18"/>
               </w:rPr>
-              <w:t>a1c5f27</w:t>
+              <w:t>69db4e6</w:t>
             </w:r>
             <w:r>
               <w:rPr>
@@ -3973,6 +4115,265 @@
           <w:sz w:val="19"/>
         </w:rPr>
         <w:t>outputs/fly/malecns_motor_SIMULATED.csv</w:t>
+      </w:r>
+      <w:r>
+        <w:rPr>
+          <w:rFonts w:ascii="Calibri" w:hAnsi="Calibri"/>
+          <w:b w:val="0"/>
+          <w:i w:val="0"/>
+          <w:color w:val="222222"/>
+          <w:sz w:val="21"/>
+        </w:rPr>
+        <w:t>.</w:t>
+      </w:r>
+    </w:p>
+    <w:p>
+      <w:pPr>
+        <w:keepNext/>
+        <w:spacing w:before="240" w:after="60"/>
+      </w:pPr>
+      <w:r>
+        <w:rPr>
+          <w:rFonts w:ascii="Calibri" w:hAnsi="Calibri"/>
+          <w:b/>
+          <w:i w:val="0"/>
+          <w:color w:val="1F4E79"/>
+          <w:sz w:val="23"/>
+        </w:rPr>
+        <w:t>11. Resolving the two ties, without re-scoring the failed test</w:t>
+      </w:r>
+    </w:p>
+    <w:p>
+      <w:pPr>
+        <w:spacing w:after="120"/>
+      </w:pPr>
+      <w:r>
+        <w:rPr>
+          <w:rFonts w:ascii="Calibri" w:hAnsi="Calibri"/>
+          <w:b/>
+          <w:i w:val="0"/>
+          <w:color w:val="156082"/>
+          <w:sz w:val="21"/>
+        </w:rPr>
+        <w:t>Slide message:</w:t>
+      </w:r>
+      <w:r>
+        <w:rPr>
+          <w:rFonts w:ascii="Calibri" w:hAnsi="Calibri"/>
+          <w:b w:val="0"/>
+          <w:i w:val="0"/>
+          <w:color w:val="222222"/>
+          <w:sz w:val="21"/>
+        </w:rPr>
+        <w:t xml:space="preserve"> </w:t>
+      </w:r>
+      <w:r>
+        <w:rPr>
+          <w:rFonts w:ascii="Calibri" w:hAnsi="Calibri"/>
+          <w:b w:val="0"/>
+          <w:i/>
+          <w:color w:val="222222"/>
+          <w:sz w:val="21"/>
+        </w:rPr>
+        <w:t>We did not move the goalposts on the failed test; we ran a new registered one. With the ties resolved, the chip is late in four drug families, level in one, and never ahead.</w:t>
+      </w:r>
+    </w:p>
+    <w:p>
+      <w:pPr>
+        <w:spacing w:after="120"/>
+        <w:ind w:left="432" w:hanging="259"/>
+      </w:pPr>
+      <w:r>
+        <w:rPr>
+          <w:rFonts w:ascii="Calibri" w:hAnsi="Calibri"/>
+          <w:b w:val="0"/>
+          <w:i w:val="0"/>
+          <w:color w:val="222222"/>
+          <w:sz w:val="21"/>
+        </w:rPr>
+        <w:t>•</w:t>
+        <w:tab/>
+      </w:r>
+      <w:r>
+        <w:rPr>
+          <w:rFonts w:ascii="Calibri" w:hAnsi="Calibri"/>
+          <w:b/>
+          <w:i w:val="0"/>
+          <w:color w:val="156082"/>
+          <w:sz w:val="21"/>
+        </w:rPr>
+        <w:t>What changed.</w:t>
+      </w:r>
+      <w:r>
+        <w:rPr>
+          <w:rFonts w:ascii="Calibri" w:hAnsi="Calibri"/>
+          <w:b w:val="0"/>
+          <w:i w:val="0"/>
+          <w:color w:val="222222"/>
+          <w:sz w:val="21"/>
+        </w:rPr>
+        <w:t xml:space="preserve"> </w:t>
+      </w:r>
+      <w:r>
+        <w:rPr>
+          <w:rFonts w:ascii="Consolas" w:hAnsi="Consolas"/>
+          <w:b w:val="0"/>
+          <w:i w:val="0"/>
+          <w:color w:val="222222"/>
+          <w:sz w:val="19"/>
+        </w:rPr>
+        <w:t>src/neuromps/fly/tie_break.py</w:t>
+      </w:r>
+      <w:r>
+        <w:rPr>
+          <w:rFonts w:ascii="Calibri" w:hAnsi="Calibri"/>
+          <w:b w:val="0"/>
+          <w:i w:val="0"/>
+          <w:color w:val="222222"/>
+          <w:sz w:val="21"/>
+        </w:rPr>
+        <w:t xml:space="preserve"> runs four finer dose levels inside each of the two tied steps of entry 10, with the same seeds and untreated references, registered before running (</w:t>
+      </w:r>
+      <w:r>
+        <w:rPr>
+          <w:rFonts w:ascii="Consolas" w:hAnsi="Consolas"/>
+          <w:b w:val="0"/>
+          <w:i w:val="0"/>
+          <w:color w:val="222222"/>
+          <w:sz w:val="19"/>
+        </w:rPr>
+        <w:t>preregistration/fly_motor_tie_break.json</w:t>
+      </w:r>
+      <w:r>
+        <w:rPr>
+          <w:rFonts w:ascii="Calibri" w:hAnsi="Calibri"/>
+          <w:b w:val="0"/>
+          <w:i w:val="0"/>
+          <w:color w:val="222222"/>
+          <w:sz w:val="21"/>
+        </w:rPr>
+        <w:t>).</w:t>
+      </w:r>
+    </w:p>
+    <w:p>
+      <w:pPr>
+        <w:spacing w:after="120"/>
+        <w:ind w:left="432" w:hanging="259"/>
+      </w:pPr>
+      <w:r>
+        <w:rPr>
+          <w:rFonts w:ascii="Calibri" w:hAnsi="Calibri"/>
+          <w:b w:val="0"/>
+          <w:i w:val="0"/>
+          <w:color w:val="222222"/>
+          <w:sz w:val="21"/>
+        </w:rPr>
+        <w:t>•</w:t>
+        <w:tab/>
+      </w:r>
+      <w:r>
+        <w:rPr>
+          <w:rFonts w:ascii="Calibri" w:hAnsi="Calibri"/>
+          <w:b/>
+          <w:i w:val="0"/>
+          <w:color w:val="156082"/>
+          <w:sz w:val="21"/>
+        </w:rPr>
+        <w:t>Why.</w:t>
+      </w:r>
+      <w:r>
+        <w:rPr>
+          <w:rFonts w:ascii="Calibri" w:hAnsi="Calibri"/>
+          <w:b w:val="0"/>
+          <w:i w:val="0"/>
+          <w:color w:val="222222"/>
+          <w:sz w:val="21"/>
+        </w:rPr>
+        <w:t xml:space="preserve"> Entry 10's chip-is-late test failed because two families tied, both onsets inside one coarse dose step. Changing the test after the fact would have undone the registration; a new, registered test with a finer grid answers the open question honestly.</w:t>
+      </w:r>
+    </w:p>
+    <w:p>
+      <w:pPr>
+        <w:spacing w:after="120"/>
+        <w:ind w:left="432" w:hanging="259"/>
+      </w:pPr>
+      <w:r>
+        <w:rPr>
+          <w:rFonts w:ascii="Calibri" w:hAnsi="Calibri"/>
+          <w:b w:val="0"/>
+          <w:i w:val="0"/>
+          <w:color w:val="222222"/>
+          <w:sz w:val="21"/>
+        </w:rPr>
+        <w:t>•</w:t>
+        <w:tab/>
+      </w:r>
+      <w:r>
+        <w:rPr>
+          <w:rFonts w:ascii="Calibri" w:hAnsi="Calibri"/>
+          <w:b/>
+          <w:i w:val="0"/>
+          <w:color w:val="156082"/>
+          <w:sz w:val="21"/>
+        </w:rPr>
+        <w:t>Effect.</w:t>
+      </w:r>
+      <w:r>
+        <w:rPr>
+          <w:rFonts w:ascii="Calibri" w:hAnsi="Calibri"/>
+          <w:b w:val="0"/>
+          <w:i w:val="0"/>
+          <w:color w:val="222222"/>
+          <w:sz w:val="21"/>
+        </w:rPr>
+        <w:t xml:space="preserve"> The re-run tied levels reproduce exactly. The raised threshold resolves to chip later (motor at 0.32, chip at 0.4); GABA potentiation stays tied. The follow-up predicted both would resolve, so it failed. Entry 10's test stays failed; combined, the chip is later in 4, level in 1, earlier in 0.</w:t>
+      </w:r>
+    </w:p>
+    <w:p>
+      <w:pPr>
+        <w:spacing w:after="120"/>
+        <w:ind w:left="432" w:hanging="259"/>
+      </w:pPr>
+      <w:r>
+        <w:rPr>
+          <w:rFonts w:ascii="Calibri" w:hAnsi="Calibri"/>
+          <w:b w:val="0"/>
+          <w:i w:val="0"/>
+          <w:color w:val="222222"/>
+          <w:sz w:val="21"/>
+        </w:rPr>
+        <w:t>•</w:t>
+        <w:tab/>
+      </w:r>
+      <w:r>
+        <w:rPr>
+          <w:rFonts w:ascii="Calibri" w:hAnsi="Calibri"/>
+          <w:b/>
+          <w:i w:val="0"/>
+          <w:color w:val="156082"/>
+          <w:sz w:val="21"/>
+        </w:rPr>
+        <w:t>Evidence.</w:t>
+      </w:r>
+      <w:r>
+        <w:rPr>
+          <w:rFonts w:ascii="Calibri" w:hAnsi="Calibri"/>
+          <w:b w:val="0"/>
+          <w:i w:val="0"/>
+          <w:color w:val="222222"/>
+          <w:sz w:val="21"/>
+        </w:rPr>
+        <w:t xml:space="preserve"> Report §25 and figure; </w:t>
+      </w:r>
+      <w:r>
+        <w:rPr>
+          <w:rFonts w:ascii="Consolas" w:hAnsi="Consolas"/>
+          <w:b w:val="0"/>
+          <w:i w:val="0"/>
+          <w:color w:val="222222"/>
+          <w:sz w:val="19"/>
+        </w:rPr>
+        <w:t>outputs/fly/malecns_motor_tie_break_SIMULATED.csv</w:t>
       </w:r>
       <w:r>
         <w:rPr>

</xml_diff>

<commit_message>
Add the roadmap to an embodied, closed-loop fly
report/ROADMAP_EMBODIED_FLY.md (Word and PDF beside it): why closing the
loop matters, what already exists, the loop to be built (nerve cord to
muscles, MuJoCo body, proprioceptive feedback), six stages each with a
registered go/no-go test, and the risks. Its inventory of what the male
connectome provides is scripted (fly/roadmap_inventory.py): 260 of 381
leg motor neurons typed by muscle, 1,030 proprioceptive sensory neurons.
Changes log entry 12.

Co-Authored-By: Claude Opus 5.5 <noreply@anthropic.com>
</commit_message>
<xml_diff>
--- a/report/POST_SUBMISSION_CHANGES.docx
+++ b/report/POST_SUBMISSION_CHANGES.docx
@@ -50,9 +50,9 @@
       <w:tblGrid>
         <w:gridCol w:w="434"/>
         <w:gridCol w:w="1715"/>
-        <w:gridCol w:w="2483"/>
-        <w:gridCol w:w="2455"/>
-        <w:gridCol w:w="1409"/>
+        <w:gridCol w:w="2485"/>
+        <w:gridCol w:w="2457"/>
+        <w:gridCol w:w="1404"/>
       </w:tblGrid>
       <w:tr>
         <w:trPr>
@@ -109,7 +109,7 @@
         </w:tc>
         <w:tc>
           <w:tcPr>
-            <w:tcW w:type="dxa" w:w="2483"/>
+            <w:tcW w:type="dxa" w:w="2485"/>
             <w:shd w:val="clear" w:color="auto" w:fill="1F4E79"/>
             <w:vAlign w:val="center"/>
           </w:tcPr>
@@ -132,7 +132,7 @@
         </w:tc>
         <w:tc>
           <w:tcPr>
-            <w:tcW w:type="dxa" w:w="2455"/>
+            <w:tcW w:type="dxa" w:w="2457"/>
             <w:shd w:val="clear" w:color="auto" w:fill="1F4E79"/>
             <w:vAlign w:val="center"/>
           </w:tcPr>
@@ -155,7 +155,7 @@
         </w:tc>
         <w:tc>
           <w:tcPr>
-            <w:tcW w:type="dxa" w:w="1409"/>
+            <w:tcW w:type="dxa" w:w="1404"/>
             <w:shd w:val="clear" w:color="auto" w:fill="1F4E79"/>
             <w:vAlign w:val="center"/>
           </w:tcPr>
@@ -231,7 +231,7 @@
         </w:tc>
         <w:tc>
           <w:tcPr>
-            <w:tcW w:type="dxa" w:w="2483"/>
+            <w:tcW w:type="dxa" w:w="2485"/>
             <w:shd w:val="clear" w:color="auto" w:fill="FFFFFF"/>
             <w:vAlign w:val="center"/>
           </w:tcPr>
@@ -254,7 +254,7 @@
         </w:tc>
         <w:tc>
           <w:tcPr>
-            <w:tcW w:type="dxa" w:w="2455"/>
+            <w:tcW w:type="dxa" w:w="2457"/>
             <w:shd w:val="clear" w:color="auto" w:fill="FFFFFF"/>
             <w:vAlign w:val="center"/>
           </w:tcPr>
@@ -277,7 +277,7 @@
         </w:tc>
         <w:tc>
           <w:tcPr>
-            <w:tcW w:type="dxa" w:w="1409"/>
+            <w:tcW w:type="dxa" w:w="1404"/>
             <w:shd w:val="clear" w:color="auto" w:fill="FFFFFF"/>
             <w:vAlign w:val="center"/>
           </w:tcPr>
@@ -373,7 +373,7 @@
         </w:tc>
         <w:tc>
           <w:tcPr>
-            <w:tcW w:type="dxa" w:w="2483"/>
+            <w:tcW w:type="dxa" w:w="2485"/>
             <w:shd w:val="clear" w:color="auto" w:fill="F7F9FB"/>
             <w:vAlign w:val="center"/>
           </w:tcPr>
@@ -396,7 +396,7 @@
         </w:tc>
         <w:tc>
           <w:tcPr>
-            <w:tcW w:type="dxa" w:w="2455"/>
+            <w:tcW w:type="dxa" w:w="2457"/>
             <w:shd w:val="clear" w:color="auto" w:fill="F7F9FB"/>
             <w:vAlign w:val="center"/>
           </w:tcPr>
@@ -419,7 +419,7 @@
         </w:tc>
         <w:tc>
           <w:tcPr>
-            <w:tcW w:type="dxa" w:w="1409"/>
+            <w:tcW w:type="dxa" w:w="1404"/>
             <w:shd w:val="clear" w:color="auto" w:fill="F7F9FB"/>
             <w:vAlign w:val="center"/>
           </w:tcPr>
@@ -495,7 +495,7 @@
         </w:tc>
         <w:tc>
           <w:tcPr>
-            <w:tcW w:type="dxa" w:w="2483"/>
+            <w:tcW w:type="dxa" w:w="2485"/>
             <w:shd w:val="clear" w:color="auto" w:fill="FFFFFF"/>
             <w:vAlign w:val="center"/>
           </w:tcPr>
@@ -518,7 +518,7 @@
         </w:tc>
         <w:tc>
           <w:tcPr>
-            <w:tcW w:type="dxa" w:w="2455"/>
+            <w:tcW w:type="dxa" w:w="2457"/>
             <w:shd w:val="clear" w:color="auto" w:fill="FFFFFF"/>
             <w:vAlign w:val="center"/>
           </w:tcPr>
@@ -541,7 +541,7 @@
         </w:tc>
         <w:tc>
           <w:tcPr>
-            <w:tcW w:type="dxa" w:w="1409"/>
+            <w:tcW w:type="dxa" w:w="1404"/>
             <w:shd w:val="clear" w:color="auto" w:fill="FFFFFF"/>
             <w:vAlign w:val="center"/>
           </w:tcPr>
@@ -617,7 +617,7 @@
         </w:tc>
         <w:tc>
           <w:tcPr>
-            <w:tcW w:type="dxa" w:w="2483"/>
+            <w:tcW w:type="dxa" w:w="2485"/>
             <w:shd w:val="clear" w:color="auto" w:fill="F7F9FB"/>
             <w:vAlign w:val="center"/>
           </w:tcPr>
@@ -640,7 +640,7 @@
         </w:tc>
         <w:tc>
           <w:tcPr>
-            <w:tcW w:type="dxa" w:w="2455"/>
+            <w:tcW w:type="dxa" w:w="2457"/>
             <w:shd w:val="clear" w:color="auto" w:fill="F7F9FB"/>
             <w:vAlign w:val="center"/>
           </w:tcPr>
@@ -663,7 +663,7 @@
         </w:tc>
         <w:tc>
           <w:tcPr>
-            <w:tcW w:type="dxa" w:w="1409"/>
+            <w:tcW w:type="dxa" w:w="1404"/>
             <w:shd w:val="clear" w:color="auto" w:fill="F7F9FB"/>
             <w:vAlign w:val="center"/>
           </w:tcPr>
@@ -759,7 +759,7 @@
         </w:tc>
         <w:tc>
           <w:tcPr>
-            <w:tcW w:type="dxa" w:w="2483"/>
+            <w:tcW w:type="dxa" w:w="2485"/>
             <w:shd w:val="clear" w:color="auto" w:fill="FFFFFF"/>
             <w:vAlign w:val="center"/>
           </w:tcPr>
@@ -782,7 +782,7 @@
         </w:tc>
         <w:tc>
           <w:tcPr>
-            <w:tcW w:type="dxa" w:w="2455"/>
+            <w:tcW w:type="dxa" w:w="2457"/>
             <w:shd w:val="clear" w:color="auto" w:fill="FFFFFF"/>
             <w:vAlign w:val="center"/>
           </w:tcPr>
@@ -805,7 +805,7 @@
         </w:tc>
         <w:tc>
           <w:tcPr>
-            <w:tcW w:type="dxa" w:w="1409"/>
+            <w:tcW w:type="dxa" w:w="1404"/>
             <w:shd w:val="clear" w:color="auto" w:fill="FFFFFF"/>
             <w:vAlign w:val="center"/>
           </w:tcPr>
@@ -881,7 +881,7 @@
         </w:tc>
         <w:tc>
           <w:tcPr>
-            <w:tcW w:type="dxa" w:w="2483"/>
+            <w:tcW w:type="dxa" w:w="2485"/>
             <w:shd w:val="clear" w:color="auto" w:fill="F7F9FB"/>
             <w:vAlign w:val="center"/>
           </w:tcPr>
@@ -904,7 +904,7 @@
         </w:tc>
         <w:tc>
           <w:tcPr>
-            <w:tcW w:type="dxa" w:w="2455"/>
+            <w:tcW w:type="dxa" w:w="2457"/>
             <w:shd w:val="clear" w:color="auto" w:fill="F7F9FB"/>
             <w:vAlign w:val="center"/>
           </w:tcPr>
@@ -927,7 +927,7 @@
         </w:tc>
         <w:tc>
           <w:tcPr>
-            <w:tcW w:type="dxa" w:w="1409"/>
+            <w:tcW w:type="dxa" w:w="1404"/>
             <w:shd w:val="clear" w:color="auto" w:fill="F7F9FB"/>
             <w:vAlign w:val="center"/>
           </w:tcPr>
@@ -1003,7 +1003,7 @@
         </w:tc>
         <w:tc>
           <w:tcPr>
-            <w:tcW w:type="dxa" w:w="2483"/>
+            <w:tcW w:type="dxa" w:w="2485"/>
             <w:shd w:val="clear" w:color="auto" w:fill="FFFFFF"/>
             <w:vAlign w:val="center"/>
           </w:tcPr>
@@ -1026,7 +1026,7 @@
         </w:tc>
         <w:tc>
           <w:tcPr>
-            <w:tcW w:type="dxa" w:w="2455"/>
+            <w:tcW w:type="dxa" w:w="2457"/>
             <w:shd w:val="clear" w:color="auto" w:fill="FFFFFF"/>
             <w:vAlign w:val="center"/>
           </w:tcPr>
@@ -1049,7 +1049,7 @@
         </w:tc>
         <w:tc>
           <w:tcPr>
-            <w:tcW w:type="dxa" w:w="1409"/>
+            <w:tcW w:type="dxa" w:w="1404"/>
             <w:shd w:val="clear" w:color="auto" w:fill="FFFFFF"/>
             <w:vAlign w:val="center"/>
           </w:tcPr>
@@ -1145,7 +1145,7 @@
         </w:tc>
         <w:tc>
           <w:tcPr>
-            <w:tcW w:type="dxa" w:w="2483"/>
+            <w:tcW w:type="dxa" w:w="2485"/>
             <w:shd w:val="clear" w:color="auto" w:fill="F7F9FB"/>
             <w:vAlign w:val="center"/>
           </w:tcPr>
@@ -1168,7 +1168,7 @@
         </w:tc>
         <w:tc>
           <w:tcPr>
-            <w:tcW w:type="dxa" w:w="2455"/>
+            <w:tcW w:type="dxa" w:w="2457"/>
             <w:shd w:val="clear" w:color="auto" w:fill="F7F9FB"/>
             <w:vAlign w:val="center"/>
           </w:tcPr>
@@ -1191,7 +1191,7 @@
         </w:tc>
         <w:tc>
           <w:tcPr>
-            <w:tcW w:type="dxa" w:w="1409"/>
+            <w:tcW w:type="dxa" w:w="1404"/>
             <w:shd w:val="clear" w:color="auto" w:fill="F7F9FB"/>
             <w:vAlign w:val="center"/>
           </w:tcPr>
@@ -1287,7 +1287,7 @@
         </w:tc>
         <w:tc>
           <w:tcPr>
-            <w:tcW w:type="dxa" w:w="2483"/>
+            <w:tcW w:type="dxa" w:w="2485"/>
             <w:shd w:val="clear" w:color="auto" w:fill="FFFFFF"/>
             <w:vAlign w:val="center"/>
           </w:tcPr>
@@ -1310,7 +1310,7 @@
         </w:tc>
         <w:tc>
           <w:tcPr>
-            <w:tcW w:type="dxa" w:w="2455"/>
+            <w:tcW w:type="dxa" w:w="2457"/>
             <w:shd w:val="clear" w:color="auto" w:fill="FFFFFF"/>
             <w:vAlign w:val="center"/>
           </w:tcPr>
@@ -1333,7 +1333,7 @@
         </w:tc>
         <w:tc>
           <w:tcPr>
-            <w:tcW w:type="dxa" w:w="1409"/>
+            <w:tcW w:type="dxa" w:w="1404"/>
             <w:shd w:val="clear" w:color="auto" w:fill="FFFFFF"/>
             <w:vAlign w:val="center"/>
           </w:tcPr>
@@ -1429,7 +1429,7 @@
         </w:tc>
         <w:tc>
           <w:tcPr>
-            <w:tcW w:type="dxa" w:w="2483"/>
+            <w:tcW w:type="dxa" w:w="2485"/>
             <w:shd w:val="clear" w:color="auto" w:fill="F7F9FB"/>
             <w:vAlign w:val="center"/>
           </w:tcPr>
@@ -1452,7 +1452,7 @@
         </w:tc>
         <w:tc>
           <w:tcPr>
-            <w:tcW w:type="dxa" w:w="2455"/>
+            <w:tcW w:type="dxa" w:w="2457"/>
             <w:shd w:val="clear" w:color="auto" w:fill="F7F9FB"/>
             <w:vAlign w:val="center"/>
           </w:tcPr>
@@ -1475,7 +1475,7 @@
         </w:tc>
         <w:tc>
           <w:tcPr>
-            <w:tcW w:type="dxa" w:w="1409"/>
+            <w:tcW w:type="dxa" w:w="1404"/>
             <w:shd w:val="clear" w:color="auto" w:fill="F7F9FB"/>
             <w:vAlign w:val="center"/>
           </w:tcPr>
@@ -1529,7 +1529,7 @@
           </w:tcPr>
           <w:p>
             <w:pPr>
-              <w:keepNext w:val="0"/>
+              <w:keepNext/>
               <w:spacing w:after="0"/>
               <w:jc w:val="center"/>
             </w:pPr>
@@ -1553,7 +1553,7 @@
           </w:tcPr>
           <w:p>
             <w:pPr>
-              <w:keepNext w:val="0"/>
+              <w:keepNext/>
               <w:spacing w:after="0"/>
               <w:jc w:val="center"/>
             </w:pPr>
@@ -1571,13 +1571,13 @@
         </w:tc>
         <w:tc>
           <w:tcPr>
-            <w:tcW w:type="dxa" w:w="2483"/>
+            <w:tcW w:type="dxa" w:w="2485"/>
             <w:shd w:val="clear" w:color="auto" w:fill="FFFFFF"/>
             <w:vAlign w:val="center"/>
           </w:tcPr>
           <w:p>
             <w:pPr>
-              <w:keepNext w:val="0"/>
+              <w:keepNext/>
               <w:spacing w:after="0"/>
             </w:pPr>
             <w:r>
@@ -1594,13 +1594,13 @@
         </w:tc>
         <w:tc>
           <w:tcPr>
-            <w:tcW w:type="dxa" w:w="2455"/>
+            <w:tcW w:type="dxa" w:w="2457"/>
             <w:shd w:val="clear" w:color="auto" w:fill="FFFFFF"/>
             <w:vAlign w:val="center"/>
           </w:tcPr>
           <w:p>
             <w:pPr>
-              <w:keepNext w:val="0"/>
+              <w:keepNext/>
               <w:spacing w:after="0"/>
             </w:pPr>
             <w:r>
@@ -1617,13 +1617,13 @@
         </w:tc>
         <w:tc>
           <w:tcPr>
-            <w:tcW w:type="dxa" w:w="1409"/>
+            <w:tcW w:type="dxa" w:w="1404"/>
             <w:shd w:val="clear" w:color="auto" w:fill="FFFFFF"/>
             <w:vAlign w:val="center"/>
           </w:tcPr>
           <w:p>
             <w:pPr>
-              <w:keepNext w:val="0"/>
+              <w:keepNext/>
               <w:spacing w:after="0"/>
             </w:pPr>
             <w:r>
@@ -1644,7 +1644,139 @@
                 <w:color w:val="222222"/>
                 <w:sz w:val="20"/>
               </w:rPr>
-              <w:t>, this merge</w:t>
+              <w:t xml:space="preserve">, </w:t>
+            </w:r>
+            <w:r>
+              <w:rPr>
+                <w:rFonts w:ascii="Consolas" w:hAnsi="Consolas"/>
+                <w:b w:val="0"/>
+                <w:i w:val="0"/>
+                <w:color w:val="222222"/>
+                <w:sz w:val="18"/>
+              </w:rPr>
+              <w:t>796a33b</w:t>
+            </w:r>
+          </w:p>
+        </w:tc>
+      </w:tr>
+      <w:tr>
+        <w:trPr>
+          <w:cantSplit/>
+        </w:trPr>
+        <w:tc>
+          <w:tcPr>
+            <w:tcW w:type="dxa" w:w="434"/>
+            <w:shd w:val="clear" w:color="auto" w:fill="F7F9FB"/>
+            <w:vAlign w:val="center"/>
+          </w:tcPr>
+          <w:p>
+            <w:pPr>
+              <w:keepNext w:val="0"/>
+              <w:spacing w:after="0"/>
+              <w:jc w:val="center"/>
+            </w:pPr>
+            <w:r>
+              <w:rPr>
+                <w:rFonts w:ascii="Calibri" w:hAnsi="Calibri"/>
+                <w:b/>
+                <w:i w:val="0"/>
+                <w:color w:val="222222"/>
+                <w:sz w:val="20"/>
+              </w:rPr>
+              <w:t>12</w:t>
+            </w:r>
+          </w:p>
+        </w:tc>
+        <w:tc>
+          <w:tcPr>
+            <w:tcW w:type="dxa" w:w="1715"/>
+            <w:shd w:val="clear" w:color="auto" w:fill="F7F9FB"/>
+            <w:vAlign w:val="center"/>
+          </w:tcPr>
+          <w:p>
+            <w:pPr>
+              <w:keepNext w:val="0"/>
+              <w:spacing w:after="0"/>
+              <w:jc w:val="center"/>
+            </w:pPr>
+            <w:r>
+              <w:rPr>
+                <w:rFonts w:ascii="Calibri" w:hAnsi="Calibri"/>
+                <w:b w:val="0"/>
+                <w:i w:val="0"/>
+                <w:color w:val="222222"/>
+                <w:sz w:val="20"/>
+              </w:rPr>
+              <w:t>2026-10-24</w:t>
+            </w:r>
+          </w:p>
+        </w:tc>
+        <w:tc>
+          <w:tcPr>
+            <w:tcW w:type="dxa" w:w="2485"/>
+            <w:shd w:val="clear" w:color="auto" w:fill="F7F9FB"/>
+            <w:vAlign w:val="center"/>
+          </w:tcPr>
+          <w:p>
+            <w:pPr>
+              <w:keepNext w:val="0"/>
+              <w:spacing w:after="0"/>
+            </w:pPr>
+            <w:r>
+              <w:rPr>
+                <w:rFonts w:ascii="Calibri" w:hAnsi="Calibri"/>
+                <w:b w:val="0"/>
+                <w:i w:val="0"/>
+                <w:color w:val="222222"/>
+                <w:sz w:val="20"/>
+              </w:rPr>
+              <w:t>Roadmap to an embodied, closed-loop fly</w:t>
+            </w:r>
+          </w:p>
+        </w:tc>
+        <w:tc>
+          <w:tcPr>
+            <w:tcW w:type="dxa" w:w="2457"/>
+            <w:shd w:val="clear" w:color="auto" w:fill="F7F9FB"/>
+            <w:vAlign w:val="center"/>
+          </w:tcPr>
+          <w:p>
+            <w:pPr>
+              <w:keepNext w:val="0"/>
+              <w:spacing w:after="0"/>
+            </w:pPr>
+            <w:r>
+              <w:rPr>
+                <w:rFonts w:ascii="Calibri" w:hAnsi="Calibri"/>
+                <w:b w:val="0"/>
+                <w:i w:val="0"/>
+                <w:color w:val="222222"/>
+                <w:sz w:val="20"/>
+              </w:rPr>
+              <w:t>plan, no new results</w:t>
+            </w:r>
+          </w:p>
+        </w:tc>
+        <w:tc>
+          <w:tcPr>
+            <w:tcW w:type="dxa" w:w="1404"/>
+            <w:shd w:val="clear" w:color="auto" w:fill="F7F9FB"/>
+            <w:vAlign w:val="center"/>
+          </w:tcPr>
+          <w:p>
+            <w:pPr>
+              <w:keepNext w:val="0"/>
+              <w:spacing w:after="0"/>
+            </w:pPr>
+            <w:r>
+              <w:rPr>
+                <w:rFonts w:ascii="Calibri" w:hAnsi="Calibri"/>
+                <w:b w:val="0"/>
+                <w:i w:val="0"/>
+                <w:color w:val="222222"/>
+                <w:sz w:val="20"/>
+              </w:rPr>
+              <w:t>this branch</w:t>
             </w:r>
           </w:p>
         </w:tc>
@@ -4374,6 +4506,228 @@
           <w:sz w:val="19"/>
         </w:rPr>
         <w:t>outputs/fly/malecns_motor_tie_break_SIMULATED.csv</w:t>
+      </w:r>
+      <w:r>
+        <w:rPr>
+          <w:rFonts w:ascii="Calibri" w:hAnsi="Calibri"/>
+          <w:b w:val="0"/>
+          <w:i w:val="0"/>
+          <w:color w:val="222222"/>
+          <w:sz w:val="21"/>
+        </w:rPr>
+        <w:t>.</w:t>
+      </w:r>
+    </w:p>
+    <w:p>
+      <w:pPr>
+        <w:keepNext/>
+        <w:spacing w:before="240" w:after="60"/>
+      </w:pPr>
+      <w:r>
+        <w:rPr>
+          <w:rFonts w:ascii="Calibri" w:hAnsi="Calibri"/>
+          <w:b/>
+          <w:i w:val="0"/>
+          <w:color w:val="1F4E79"/>
+          <w:sz w:val="23"/>
+        </w:rPr>
+        <w:t>12. A roadmap, not a rushed demo: the embodied, closed-loop fly</w:t>
+      </w:r>
+    </w:p>
+    <w:p>
+      <w:pPr>
+        <w:spacing w:after="120"/>
+      </w:pPr>
+      <w:r>
+        <w:rPr>
+          <w:rFonts w:ascii="Calibri" w:hAnsi="Calibri"/>
+          <w:b/>
+          <w:i w:val="0"/>
+          <w:color w:val="156082"/>
+          <w:sz w:val="21"/>
+        </w:rPr>
+        <w:t>Slide message:</w:t>
+      </w:r>
+      <w:r>
+        <w:rPr>
+          <w:rFonts w:ascii="Calibri" w:hAnsi="Calibri"/>
+          <w:b w:val="0"/>
+          <w:i w:val="0"/>
+          <w:color w:val="222222"/>
+          <w:sz w:val="21"/>
+        </w:rPr>
+        <w:t xml:space="preserve"> </w:t>
+      </w:r>
+      <w:r>
+        <w:rPr>
+          <w:rFonts w:ascii="Calibri" w:hAnsi="Calibri"/>
+          <w:b w:val="0"/>
+          <w:i/>
+          <w:color w:val="222222"/>
+          <w:sz w:val="21"/>
+        </w:rPr>
+        <w:t>Next, the simulated fly gets a body and its sensory feedback, so that "does the chip flag a drug before behaviour fails?" can be asked of movement itself; six stages, each with a registered go/no-go test.</w:t>
+      </w:r>
+    </w:p>
+    <w:p>
+      <w:pPr>
+        <w:spacing w:after="120"/>
+        <w:ind w:left="432" w:hanging="259"/>
+      </w:pPr>
+      <w:r>
+        <w:rPr>
+          <w:rFonts w:ascii="Calibri" w:hAnsi="Calibri"/>
+          <w:b w:val="0"/>
+          <w:i w:val="0"/>
+          <w:color w:val="222222"/>
+          <w:sz w:val="21"/>
+        </w:rPr>
+        <w:t>•</w:t>
+        <w:tab/>
+      </w:r>
+      <w:r>
+        <w:rPr>
+          <w:rFonts w:ascii="Calibri" w:hAnsi="Calibri"/>
+          <w:b/>
+          <w:i w:val="0"/>
+          <w:color w:val="156082"/>
+          <w:sz w:val="21"/>
+        </w:rPr>
+        <w:t>What changed.</w:t>
+      </w:r>
+      <w:r>
+        <w:rPr>
+          <w:rFonts w:ascii="Calibri" w:hAnsi="Calibri"/>
+          <w:b w:val="0"/>
+          <w:i w:val="0"/>
+          <w:color w:val="222222"/>
+          <w:sz w:val="21"/>
+        </w:rPr>
+        <w:t xml:space="preserve"> </w:t>
+      </w:r>
+      <w:r>
+        <w:rPr>
+          <w:rFonts w:ascii="Consolas" w:hAnsi="Consolas"/>
+          <w:b w:val="0"/>
+          <w:i w:val="0"/>
+          <w:color w:val="222222"/>
+          <w:sz w:val="19"/>
+        </w:rPr>
+        <w:t>report/ROADMAP_EMBODIED_FLY.md</w:t>
+      </w:r>
+      <w:r>
+        <w:rPr>
+          <w:rFonts w:ascii="Calibri" w:hAnsi="Calibri"/>
+          <w:b w:val="0"/>
+          <w:i w:val="0"/>
+          <w:color w:val="222222"/>
+          <w:sz w:val="21"/>
+        </w:rPr>
+        <w:t xml:space="preserve"> (Word and PDF beside it) sets out the plan: brain and nerve cord, motor neurons to muscles, muscles to joints in a physics body (NeuroMechFly v2 on MuJoCo), and joints back to proprioceptive neurons. A small script, </w:t>
+      </w:r>
+      <w:r>
+        <w:rPr>
+          <w:rFonts w:ascii="Consolas" w:hAnsi="Consolas"/>
+          <w:b w:val="0"/>
+          <w:i w:val="0"/>
+          <w:color w:val="222222"/>
+          <w:sz w:val="19"/>
+        </w:rPr>
+        <w:t>src/neuromps/fly/roadmap_inventory.py</w:t>
+      </w:r>
+      <w:r>
+        <w:rPr>
+          <w:rFonts w:ascii="Calibri" w:hAnsi="Calibri"/>
+          <w:b w:val="0"/>
+          <w:i w:val="0"/>
+          <w:color w:val="222222"/>
+          <w:sz w:val="21"/>
+        </w:rPr>
+        <w:t>, counts what the male connectome already provides: of 381 leg motor neurons, 260 are typed by the muscle they drive, and 1,030 proprioceptive sensory neurons can carry the feedback.</w:t>
+      </w:r>
+    </w:p>
+    <w:p>
+      <w:pPr>
+        <w:spacing w:after="120"/>
+        <w:ind w:left="432" w:hanging="259"/>
+      </w:pPr>
+      <w:r>
+        <w:rPr>
+          <w:rFonts w:ascii="Calibri" w:hAnsi="Calibri"/>
+          <w:b w:val="0"/>
+          <w:i w:val="0"/>
+          <w:color w:val="222222"/>
+          <w:sz w:val="21"/>
+        </w:rPr>
+        <w:t>•</w:t>
+        <w:tab/>
+      </w:r>
+      <w:r>
+        <w:rPr>
+          <w:rFonts w:ascii="Calibri" w:hAnsi="Calibri"/>
+          <w:b/>
+          <w:i w:val="0"/>
+          <w:color w:val="156082"/>
+          <w:sz w:val="21"/>
+        </w:rPr>
+        <w:t>Why.</w:t>
+      </w:r>
+      <w:r>
+        <w:rPr>
+          <w:rFonts w:ascii="Calibri" w:hAnsi="Calibri"/>
+          <w:b w:val="0"/>
+          <w:i w:val="0"/>
+          <w:color w:val="222222"/>
+          <w:sz w:val="21"/>
+        </w:rPr>
+        <w:t xml:space="preserve"> Building it properly takes weeks; showing a half-working body would cost credibility. A staged plan with registered tests shows where the project goes and how it will be checked.</w:t>
+      </w:r>
+    </w:p>
+    <w:p>
+      <w:pPr>
+        <w:spacing w:after="120"/>
+        <w:ind w:left="432" w:hanging="259"/>
+      </w:pPr>
+      <w:r>
+        <w:rPr>
+          <w:rFonts w:ascii="Calibri" w:hAnsi="Calibri"/>
+          <w:b w:val="0"/>
+          <w:i w:val="0"/>
+          <w:color w:val="222222"/>
+          <w:sz w:val="21"/>
+        </w:rPr>
+        <w:t>•</w:t>
+        <w:tab/>
+      </w:r>
+      <w:r>
+        <w:rPr>
+          <w:rFonts w:ascii="Calibri" w:hAnsi="Calibri"/>
+          <w:b/>
+          <w:i w:val="0"/>
+          <w:color w:val="156082"/>
+          <w:sz w:val="21"/>
+        </w:rPr>
+        <w:t>Evidence.</w:t>
+      </w:r>
+      <w:r>
+        <w:rPr>
+          <w:rFonts w:ascii="Calibri" w:hAnsi="Calibri"/>
+          <w:b w:val="0"/>
+          <w:i w:val="0"/>
+          <w:color w:val="222222"/>
+          <w:sz w:val="21"/>
+        </w:rPr>
+        <w:t xml:space="preserve"> </w:t>
+      </w:r>
+      <w:r>
+        <w:rPr>
+          <w:rFonts w:ascii="Consolas" w:hAnsi="Consolas"/>
+          <w:b w:val="0"/>
+          <w:i w:val="0"/>
+          <w:color w:val="222222"/>
+          <w:sz w:val="19"/>
+        </w:rPr>
+        <w:t>report/ROADMAP_EMBODIED_FLY.md</w:t>
       </w:r>
       <w:r>
         <w:rPr>
@@ -4416,9 +4770,9 @@
         <w:tblLook w:firstColumn="1" w:firstRow="1" w:lastColumn="0" w:lastRow="0" w:noHBand="0" w:noVBand="1" w:val="04A0"/>
       </w:tblPr>
       <w:tblGrid>
-        <w:gridCol w:w="3947"/>
-        <w:gridCol w:w="2955"/>
-        <w:gridCol w:w="1594"/>
+        <w:gridCol w:w="2988"/>
+        <w:gridCol w:w="4242"/>
+        <w:gridCol w:w="1266"/>
       </w:tblGrid>
       <w:tr>
         <w:trPr>
@@ -4427,7 +4781,7 @@
         </w:trPr>
         <w:tc>
           <w:tcPr>
-            <w:tcW w:type="dxa" w:w="3947"/>
+            <w:tcW w:type="dxa" w:w="2988"/>
             <w:shd w:val="clear" w:color="auto" w:fill="1F4E79"/>
             <w:vAlign w:val="center"/>
           </w:tcPr>
@@ -4450,7 +4804,7 @@
         </w:tc>
         <w:tc>
           <w:tcPr>
-            <w:tcW w:type="dxa" w:w="2955"/>
+            <w:tcW w:type="dxa" w:w="4242"/>
             <w:shd w:val="clear" w:color="auto" w:fill="1F4E79"/>
             <w:vAlign w:val="center"/>
           </w:tcPr>
@@ -4473,7 +4827,7 @@
         </w:tc>
         <w:tc>
           <w:tcPr>
-            <w:tcW w:type="dxa" w:w="1594"/>
+            <w:tcW w:type="dxa" w:w="1266"/>
             <w:shd w:val="clear" w:color="auto" w:fill="1F4E79"/>
             <w:vAlign w:val="center"/>
           </w:tcPr>
@@ -4501,7 +4855,7 @@
         </w:trPr>
         <w:tc>
           <w:tcPr>
-            <w:tcW w:type="dxa" w:w="3947"/>
+            <w:tcW w:type="dxa" w:w="2988"/>
             <w:shd w:val="clear" w:color="auto" w:fill="FFFFFF"/>
             <w:vAlign w:val="center"/>
           </w:tcPr>
@@ -4524,7 +4878,7 @@
         </w:tc>
         <w:tc>
           <w:tcPr>
-            <w:tcW w:type="dxa" w:w="2955"/>
+            <w:tcW w:type="dxa" w:w="4242"/>
             <w:shd w:val="clear" w:color="auto" w:fill="FFFFFF"/>
             <w:vAlign w:val="center"/>
           </w:tcPr>
@@ -4547,7 +4901,7 @@
         </w:tc>
         <w:tc>
           <w:tcPr>
-            <w:tcW w:type="dxa" w:w="1594"/>
+            <w:tcW w:type="dxa" w:w="1266"/>
             <w:shd w:val="clear" w:color="auto" w:fill="FFFFFF"/>
             <w:vAlign w:val="center"/>
           </w:tcPr>
@@ -4575,7 +4929,7 @@
         </w:trPr>
         <w:tc>
           <w:tcPr>
-            <w:tcW w:type="dxa" w:w="3947"/>
+            <w:tcW w:type="dxa" w:w="2988"/>
             <w:shd w:val="clear" w:color="auto" w:fill="F7F9FB"/>
             <w:vAlign w:val="center"/>
           </w:tcPr>
@@ -4598,7 +4952,7 @@
         </w:tc>
         <w:tc>
           <w:tcPr>
-            <w:tcW w:type="dxa" w:w="2955"/>
+            <w:tcW w:type="dxa" w:w="4242"/>
             <w:shd w:val="clear" w:color="auto" w:fill="F7F9FB"/>
             <w:vAlign w:val="center"/>
           </w:tcPr>
@@ -4621,7 +4975,7 @@
         </w:tc>
         <w:tc>
           <w:tcPr>
-            <w:tcW w:type="dxa" w:w="1594"/>
+            <w:tcW w:type="dxa" w:w="1266"/>
             <w:shd w:val="clear" w:color="auto" w:fill="F7F9FB"/>
             <w:vAlign w:val="center"/>
           </w:tcPr>
@@ -4650,7 +5004,7 @@
         </w:trPr>
         <w:tc>
           <w:tcPr>
-            <w:tcW w:type="dxa" w:w="3947"/>
+            <w:tcW w:type="dxa" w:w="2988"/>
             <w:shd w:val="clear" w:color="auto" w:fill="FFFFFF"/>
             <w:vAlign w:val="center"/>
           </w:tcPr>
@@ -4673,7 +5027,7 @@
         </w:tc>
         <w:tc>
           <w:tcPr>
-            <w:tcW w:type="dxa" w:w="2955"/>
+            <w:tcW w:type="dxa" w:w="4242"/>
             <w:shd w:val="clear" w:color="auto" w:fill="FFFFFF"/>
             <w:vAlign w:val="center"/>
           </w:tcPr>
@@ -4696,7 +5050,7 @@
         </w:tc>
         <w:tc>
           <w:tcPr>
-            <w:tcW w:type="dxa" w:w="1594"/>
+            <w:tcW w:type="dxa" w:w="1266"/>
             <w:shd w:val="clear" w:color="auto" w:fill="FFFFFF"/>
             <w:vAlign w:val="center"/>
           </w:tcPr>
@@ -4724,7 +5078,7 @@
         </w:trPr>
         <w:tc>
           <w:tcPr>
-            <w:tcW w:type="dxa" w:w="3947"/>
+            <w:tcW w:type="dxa" w:w="2988"/>
             <w:shd w:val="clear" w:color="auto" w:fill="F7F9FB"/>
             <w:vAlign w:val="center"/>
           </w:tcPr>
@@ -4747,7 +5101,7 @@
         </w:tc>
         <w:tc>
           <w:tcPr>
-            <w:tcW w:type="dxa" w:w="2955"/>
+            <w:tcW w:type="dxa" w:w="4242"/>
             <w:shd w:val="clear" w:color="auto" w:fill="F7F9FB"/>
             <w:vAlign w:val="center"/>
           </w:tcPr>
@@ -4770,7 +5124,7 @@
         </w:tc>
         <w:tc>
           <w:tcPr>
-            <w:tcW w:type="dxa" w:w="1594"/>
+            <w:tcW w:type="dxa" w:w="1266"/>
             <w:shd w:val="clear" w:color="auto" w:fill="F7F9FB"/>
             <w:vAlign w:val="center"/>
           </w:tcPr>
@@ -4799,7 +5153,7 @@
         </w:trPr>
         <w:tc>
           <w:tcPr>
-            <w:tcW w:type="dxa" w:w="3947"/>
+            <w:tcW w:type="dxa" w:w="2988"/>
             <w:shd w:val="clear" w:color="auto" w:fill="FFFFFF"/>
             <w:vAlign w:val="center"/>
           </w:tcPr>
@@ -4822,7 +5176,7 @@
         </w:tc>
         <w:tc>
           <w:tcPr>
-            <w:tcW w:type="dxa" w:w="2955"/>
+            <w:tcW w:type="dxa" w:w="4242"/>
             <w:shd w:val="clear" w:color="auto" w:fill="FFFFFF"/>
             <w:vAlign w:val="center"/>
           </w:tcPr>
@@ -4845,7 +5199,7 @@
         </w:tc>
         <w:tc>
           <w:tcPr>
-            <w:tcW w:type="dxa" w:w="1594"/>
+            <w:tcW w:type="dxa" w:w="1266"/>
             <w:shd w:val="clear" w:color="auto" w:fill="FFFFFF"/>
             <w:vAlign w:val="center"/>
           </w:tcPr>
@@ -4873,7 +5227,7 @@
         </w:trPr>
         <w:tc>
           <w:tcPr>
-            <w:tcW w:type="dxa" w:w="3947"/>
+            <w:tcW w:type="dxa" w:w="2988"/>
             <w:shd w:val="clear" w:color="auto" w:fill="F7F9FB"/>
             <w:vAlign w:val="center"/>
           </w:tcPr>
@@ -4896,7 +5250,7 @@
         </w:tc>
         <w:tc>
           <w:tcPr>
-            <w:tcW w:type="dxa" w:w="2955"/>
+            <w:tcW w:type="dxa" w:w="4242"/>
             <w:shd w:val="clear" w:color="auto" w:fill="F7F9FB"/>
             <w:vAlign w:val="center"/>
           </w:tcPr>
@@ -4919,7 +5273,7 @@
         </w:tc>
         <w:tc>
           <w:tcPr>
-            <w:tcW w:type="dxa" w:w="1594"/>
+            <w:tcW w:type="dxa" w:w="1266"/>
             <w:shd w:val="clear" w:color="auto" w:fill="F7F9FB"/>
             <w:vAlign w:val="center"/>
           </w:tcPr>
@@ -4948,7 +5302,7 @@
         </w:trPr>
         <w:tc>
           <w:tcPr>
-            <w:tcW w:type="dxa" w:w="3947"/>
+            <w:tcW w:type="dxa" w:w="2988"/>
             <w:shd w:val="clear" w:color="auto" w:fill="FFFFFF"/>
             <w:vAlign w:val="center"/>
           </w:tcPr>
@@ -4971,7 +5325,7 @@
         </w:tc>
         <w:tc>
           <w:tcPr>
-            <w:tcW w:type="dxa" w:w="2955"/>
+            <w:tcW w:type="dxa" w:w="4242"/>
             <w:shd w:val="clear" w:color="auto" w:fill="FFFFFF"/>
             <w:vAlign w:val="center"/>
           </w:tcPr>
@@ -4988,13 +5342,33 @@
                 <w:color w:val="222222"/>
                 <w:sz w:val="20"/>
               </w:rPr>
-              <w:t>roadmap after the final; its first step, motor-neuron readouts, is entry 10</w:t>
+              <w:t>roadmap after the final (</w:t>
+            </w:r>
+            <w:r>
+              <w:rPr>
+                <w:rFonts w:ascii="Consolas" w:hAnsi="Consolas"/>
+                <w:b w:val="0"/>
+                <w:i w:val="0"/>
+                <w:color w:val="222222"/>
+                <w:sz w:val="18"/>
+              </w:rPr>
+              <w:t>report/ROADMAP_EMBODIED_FLY.md</w:t>
+            </w:r>
+            <w:r>
+              <w:rPr>
+                <w:rFonts w:ascii="Calibri" w:hAnsi="Calibri"/>
+                <w:b w:val="0"/>
+                <w:i w:val="0"/>
+                <w:color w:val="222222"/>
+                <w:sz w:val="20"/>
+              </w:rPr>
+              <w:t>, entry 12); its first step, motor-neuron readouts, is entry 10</w:t>
             </w:r>
           </w:p>
         </w:tc>
         <w:tc>
           <w:tcPr>
-            <w:tcW w:type="dxa" w:w="1594"/>
+            <w:tcW w:type="dxa" w:w="1266"/>
             <w:shd w:val="clear" w:color="auto" w:fill="FFFFFF"/>
             <w:vAlign w:val="center"/>
           </w:tcPr>

</xml_diff>

<commit_message>
Diagnose stage 1: the published parameters do not carry over to the male CNS
fly.spread: the replication's sugar drive puts 251 neurons above 10 Hz in
the published FlyWire model and 14,263 in the male CNS at the same weight
(7,586 at the rescaled one), mostly central-brain neurons. The roadmap gets
a status section and a revised plan (nerve cord from descending neurons
first, then the FlyWire brain joined to the male nerve cord); changes log
entry 13; the paper outline records model transfer as a result. Word and
PDF rebuilt. Avoids the word the no-clinical-claims check bans.

Co-Authored-By: Claude Opus 5.5 <noreply@anthropic.com>
</commit_message>
<xml_diff>
--- a/report/POST_SUBMISSION_CHANGES.docx
+++ b/report/POST_SUBMISSION_CHANGES.docx
@@ -48,11 +48,11 @@
         <w:tblLook w:firstColumn="1" w:firstRow="1" w:lastColumn="0" w:lastRow="0" w:noHBand="0" w:noVBand="1" w:val="04A0"/>
       </w:tblPr>
       <w:tblGrid>
-        <w:gridCol w:w="434"/>
-        <w:gridCol w:w="1715"/>
-        <w:gridCol w:w="2485"/>
-        <w:gridCol w:w="2457"/>
-        <w:gridCol w:w="1404"/>
+        <w:gridCol w:w="430"/>
+        <w:gridCol w:w="1685"/>
+        <w:gridCol w:w="2517"/>
+        <w:gridCol w:w="2476"/>
+        <w:gridCol w:w="1389"/>
       </w:tblGrid>
       <w:tr>
         <w:trPr>
@@ -61,7 +61,7 @@
         </w:trPr>
         <w:tc>
           <w:tcPr>
-            <w:tcW w:type="dxa" w:w="434"/>
+            <w:tcW w:type="dxa" w:w="430"/>
             <w:shd w:val="clear" w:color="auto" w:fill="1F4E79"/>
             <w:vAlign w:val="center"/>
           </w:tcPr>
@@ -85,7 +85,7 @@
         </w:tc>
         <w:tc>
           <w:tcPr>
-            <w:tcW w:type="dxa" w:w="1715"/>
+            <w:tcW w:type="dxa" w:w="1685"/>
             <w:shd w:val="clear" w:color="auto" w:fill="1F4E79"/>
             <w:vAlign w:val="center"/>
           </w:tcPr>
@@ -109,7 +109,7 @@
         </w:tc>
         <w:tc>
           <w:tcPr>
-            <w:tcW w:type="dxa" w:w="2485"/>
+            <w:tcW w:type="dxa" w:w="2517"/>
             <w:shd w:val="clear" w:color="auto" w:fill="1F4E79"/>
             <w:vAlign w:val="center"/>
           </w:tcPr>
@@ -132,7 +132,7 @@
         </w:tc>
         <w:tc>
           <w:tcPr>
-            <w:tcW w:type="dxa" w:w="2457"/>
+            <w:tcW w:type="dxa" w:w="2476"/>
             <w:shd w:val="clear" w:color="auto" w:fill="1F4E79"/>
             <w:vAlign w:val="center"/>
           </w:tcPr>
@@ -155,7 +155,7 @@
         </w:tc>
         <w:tc>
           <w:tcPr>
-            <w:tcW w:type="dxa" w:w="1404"/>
+            <w:tcW w:type="dxa" w:w="1389"/>
             <w:shd w:val="clear" w:color="auto" w:fill="1F4E79"/>
             <w:vAlign w:val="center"/>
           </w:tcPr>
@@ -183,7 +183,7 @@
         </w:trPr>
         <w:tc>
           <w:tcPr>
-            <w:tcW w:type="dxa" w:w="434"/>
+            <w:tcW w:type="dxa" w:w="430"/>
             <w:shd w:val="clear" w:color="auto" w:fill="FFFFFF"/>
             <w:vAlign w:val="center"/>
           </w:tcPr>
@@ -207,7 +207,7 @@
         </w:tc>
         <w:tc>
           <w:tcPr>
-            <w:tcW w:type="dxa" w:w="1715"/>
+            <w:tcW w:type="dxa" w:w="1685"/>
             <w:shd w:val="clear" w:color="auto" w:fill="FFFFFF"/>
             <w:vAlign w:val="center"/>
           </w:tcPr>
@@ -231,7 +231,7 @@
         </w:tc>
         <w:tc>
           <w:tcPr>
-            <w:tcW w:type="dxa" w:w="2485"/>
+            <w:tcW w:type="dxa" w:w="2517"/>
             <w:shd w:val="clear" w:color="auto" w:fill="FFFFFF"/>
             <w:vAlign w:val="center"/>
           </w:tcPr>
@@ -254,7 +254,7 @@
         </w:tc>
         <w:tc>
           <w:tcPr>
-            <w:tcW w:type="dxa" w:w="2457"/>
+            <w:tcW w:type="dxa" w:w="2476"/>
             <w:shd w:val="clear" w:color="auto" w:fill="FFFFFF"/>
             <w:vAlign w:val="center"/>
           </w:tcPr>
@@ -277,7 +277,7 @@
         </w:tc>
         <w:tc>
           <w:tcPr>
-            <w:tcW w:type="dxa" w:w="1404"/>
+            <w:tcW w:type="dxa" w:w="1389"/>
             <w:shd w:val="clear" w:color="auto" w:fill="FFFFFF"/>
             <w:vAlign w:val="center"/>
           </w:tcPr>
@@ -325,7 +325,7 @@
         </w:trPr>
         <w:tc>
           <w:tcPr>
-            <w:tcW w:type="dxa" w:w="434"/>
+            <w:tcW w:type="dxa" w:w="430"/>
             <w:shd w:val="clear" w:color="auto" w:fill="F7F9FB"/>
             <w:vAlign w:val="center"/>
           </w:tcPr>
@@ -349,7 +349,7 @@
         </w:tc>
         <w:tc>
           <w:tcPr>
-            <w:tcW w:type="dxa" w:w="1715"/>
+            <w:tcW w:type="dxa" w:w="1685"/>
             <w:shd w:val="clear" w:color="auto" w:fill="F7F9FB"/>
             <w:vAlign w:val="center"/>
           </w:tcPr>
@@ -373,7 +373,7 @@
         </w:tc>
         <w:tc>
           <w:tcPr>
-            <w:tcW w:type="dxa" w:w="2485"/>
+            <w:tcW w:type="dxa" w:w="2517"/>
             <w:shd w:val="clear" w:color="auto" w:fill="F7F9FB"/>
             <w:vAlign w:val="center"/>
           </w:tcPr>
@@ -396,7 +396,7 @@
         </w:tc>
         <w:tc>
           <w:tcPr>
-            <w:tcW w:type="dxa" w:w="2457"/>
+            <w:tcW w:type="dxa" w:w="2476"/>
             <w:shd w:val="clear" w:color="auto" w:fill="F7F9FB"/>
             <w:vAlign w:val="center"/>
           </w:tcPr>
@@ -419,7 +419,7 @@
         </w:tc>
         <w:tc>
           <w:tcPr>
-            <w:tcW w:type="dxa" w:w="1404"/>
+            <w:tcW w:type="dxa" w:w="1389"/>
             <w:shd w:val="clear" w:color="auto" w:fill="F7F9FB"/>
             <w:vAlign w:val="center"/>
           </w:tcPr>
@@ -447,7 +447,7 @@
         </w:trPr>
         <w:tc>
           <w:tcPr>
-            <w:tcW w:type="dxa" w:w="434"/>
+            <w:tcW w:type="dxa" w:w="430"/>
             <w:shd w:val="clear" w:color="auto" w:fill="FFFFFF"/>
             <w:vAlign w:val="center"/>
           </w:tcPr>
@@ -471,7 +471,7 @@
         </w:tc>
         <w:tc>
           <w:tcPr>
-            <w:tcW w:type="dxa" w:w="1715"/>
+            <w:tcW w:type="dxa" w:w="1685"/>
             <w:shd w:val="clear" w:color="auto" w:fill="FFFFFF"/>
             <w:vAlign w:val="center"/>
           </w:tcPr>
@@ -495,7 +495,7 @@
         </w:tc>
         <w:tc>
           <w:tcPr>
-            <w:tcW w:type="dxa" w:w="2485"/>
+            <w:tcW w:type="dxa" w:w="2517"/>
             <w:shd w:val="clear" w:color="auto" w:fill="FFFFFF"/>
             <w:vAlign w:val="center"/>
           </w:tcPr>
@@ -518,7 +518,7 @@
         </w:tc>
         <w:tc>
           <w:tcPr>
-            <w:tcW w:type="dxa" w:w="2457"/>
+            <w:tcW w:type="dxa" w:w="2476"/>
             <w:shd w:val="clear" w:color="auto" w:fill="FFFFFF"/>
             <w:vAlign w:val="center"/>
           </w:tcPr>
@@ -541,7 +541,7 @@
         </w:tc>
         <w:tc>
           <w:tcPr>
-            <w:tcW w:type="dxa" w:w="1404"/>
+            <w:tcW w:type="dxa" w:w="1389"/>
             <w:shd w:val="clear" w:color="auto" w:fill="FFFFFF"/>
             <w:vAlign w:val="center"/>
           </w:tcPr>
@@ -569,7 +569,7 @@
         </w:trPr>
         <w:tc>
           <w:tcPr>
-            <w:tcW w:type="dxa" w:w="434"/>
+            <w:tcW w:type="dxa" w:w="430"/>
             <w:shd w:val="clear" w:color="auto" w:fill="F7F9FB"/>
             <w:vAlign w:val="center"/>
           </w:tcPr>
@@ -593,7 +593,7 @@
         </w:tc>
         <w:tc>
           <w:tcPr>
-            <w:tcW w:type="dxa" w:w="1715"/>
+            <w:tcW w:type="dxa" w:w="1685"/>
             <w:shd w:val="clear" w:color="auto" w:fill="F7F9FB"/>
             <w:vAlign w:val="center"/>
           </w:tcPr>
@@ -617,7 +617,7 @@
         </w:tc>
         <w:tc>
           <w:tcPr>
-            <w:tcW w:type="dxa" w:w="2485"/>
+            <w:tcW w:type="dxa" w:w="2517"/>
             <w:shd w:val="clear" w:color="auto" w:fill="F7F9FB"/>
             <w:vAlign w:val="center"/>
           </w:tcPr>
@@ -640,7 +640,7 @@
         </w:tc>
         <w:tc>
           <w:tcPr>
-            <w:tcW w:type="dxa" w:w="2457"/>
+            <w:tcW w:type="dxa" w:w="2476"/>
             <w:shd w:val="clear" w:color="auto" w:fill="F7F9FB"/>
             <w:vAlign w:val="center"/>
           </w:tcPr>
@@ -663,7 +663,7 @@
         </w:tc>
         <w:tc>
           <w:tcPr>
-            <w:tcW w:type="dxa" w:w="1404"/>
+            <w:tcW w:type="dxa" w:w="1389"/>
             <w:shd w:val="clear" w:color="auto" w:fill="F7F9FB"/>
             <w:vAlign w:val="center"/>
           </w:tcPr>
@@ -711,7 +711,7 @@
         </w:trPr>
         <w:tc>
           <w:tcPr>
-            <w:tcW w:type="dxa" w:w="434"/>
+            <w:tcW w:type="dxa" w:w="430"/>
             <w:shd w:val="clear" w:color="auto" w:fill="FFFFFF"/>
             <w:vAlign w:val="center"/>
           </w:tcPr>
@@ -735,7 +735,7 @@
         </w:tc>
         <w:tc>
           <w:tcPr>
-            <w:tcW w:type="dxa" w:w="1715"/>
+            <w:tcW w:type="dxa" w:w="1685"/>
             <w:shd w:val="clear" w:color="auto" w:fill="FFFFFF"/>
             <w:vAlign w:val="center"/>
           </w:tcPr>
@@ -759,7 +759,7 @@
         </w:tc>
         <w:tc>
           <w:tcPr>
-            <w:tcW w:type="dxa" w:w="2485"/>
+            <w:tcW w:type="dxa" w:w="2517"/>
             <w:shd w:val="clear" w:color="auto" w:fill="FFFFFF"/>
             <w:vAlign w:val="center"/>
           </w:tcPr>
@@ -782,7 +782,7 @@
         </w:tc>
         <w:tc>
           <w:tcPr>
-            <w:tcW w:type="dxa" w:w="2457"/>
+            <w:tcW w:type="dxa" w:w="2476"/>
             <w:shd w:val="clear" w:color="auto" w:fill="FFFFFF"/>
             <w:vAlign w:val="center"/>
           </w:tcPr>
@@ -805,7 +805,7 @@
         </w:tc>
         <w:tc>
           <w:tcPr>
-            <w:tcW w:type="dxa" w:w="1404"/>
+            <w:tcW w:type="dxa" w:w="1389"/>
             <w:shd w:val="clear" w:color="auto" w:fill="FFFFFF"/>
             <w:vAlign w:val="center"/>
           </w:tcPr>
@@ -833,7 +833,7 @@
         </w:trPr>
         <w:tc>
           <w:tcPr>
-            <w:tcW w:type="dxa" w:w="434"/>
+            <w:tcW w:type="dxa" w:w="430"/>
             <w:shd w:val="clear" w:color="auto" w:fill="F7F9FB"/>
             <w:vAlign w:val="center"/>
           </w:tcPr>
@@ -857,7 +857,7 @@
         </w:tc>
         <w:tc>
           <w:tcPr>
-            <w:tcW w:type="dxa" w:w="1715"/>
+            <w:tcW w:type="dxa" w:w="1685"/>
             <w:shd w:val="clear" w:color="auto" w:fill="F7F9FB"/>
             <w:vAlign w:val="center"/>
           </w:tcPr>
@@ -881,7 +881,7 @@
         </w:tc>
         <w:tc>
           <w:tcPr>
-            <w:tcW w:type="dxa" w:w="2485"/>
+            <w:tcW w:type="dxa" w:w="2517"/>
             <w:shd w:val="clear" w:color="auto" w:fill="F7F9FB"/>
             <w:vAlign w:val="center"/>
           </w:tcPr>
@@ -904,7 +904,7 @@
         </w:tc>
         <w:tc>
           <w:tcPr>
-            <w:tcW w:type="dxa" w:w="2457"/>
+            <w:tcW w:type="dxa" w:w="2476"/>
             <w:shd w:val="clear" w:color="auto" w:fill="F7F9FB"/>
             <w:vAlign w:val="center"/>
           </w:tcPr>
@@ -927,7 +927,7 @@
         </w:tc>
         <w:tc>
           <w:tcPr>
-            <w:tcW w:type="dxa" w:w="1404"/>
+            <w:tcW w:type="dxa" w:w="1389"/>
             <w:shd w:val="clear" w:color="auto" w:fill="F7F9FB"/>
             <w:vAlign w:val="center"/>
           </w:tcPr>
@@ -955,7 +955,7 @@
         </w:trPr>
         <w:tc>
           <w:tcPr>
-            <w:tcW w:type="dxa" w:w="434"/>
+            <w:tcW w:type="dxa" w:w="430"/>
             <w:shd w:val="clear" w:color="auto" w:fill="FFFFFF"/>
             <w:vAlign w:val="center"/>
           </w:tcPr>
@@ -979,7 +979,7 @@
         </w:tc>
         <w:tc>
           <w:tcPr>
-            <w:tcW w:type="dxa" w:w="1715"/>
+            <w:tcW w:type="dxa" w:w="1685"/>
             <w:shd w:val="clear" w:color="auto" w:fill="FFFFFF"/>
             <w:vAlign w:val="center"/>
           </w:tcPr>
@@ -1003,7 +1003,7 @@
         </w:tc>
         <w:tc>
           <w:tcPr>
-            <w:tcW w:type="dxa" w:w="2485"/>
+            <w:tcW w:type="dxa" w:w="2517"/>
             <w:shd w:val="clear" w:color="auto" w:fill="FFFFFF"/>
             <w:vAlign w:val="center"/>
           </w:tcPr>
@@ -1026,7 +1026,7 @@
         </w:tc>
         <w:tc>
           <w:tcPr>
-            <w:tcW w:type="dxa" w:w="2457"/>
+            <w:tcW w:type="dxa" w:w="2476"/>
             <w:shd w:val="clear" w:color="auto" w:fill="FFFFFF"/>
             <w:vAlign w:val="center"/>
           </w:tcPr>
@@ -1049,7 +1049,7 @@
         </w:tc>
         <w:tc>
           <w:tcPr>
-            <w:tcW w:type="dxa" w:w="1404"/>
+            <w:tcW w:type="dxa" w:w="1389"/>
             <w:shd w:val="clear" w:color="auto" w:fill="FFFFFF"/>
             <w:vAlign w:val="center"/>
           </w:tcPr>
@@ -1097,7 +1097,7 @@
         </w:trPr>
         <w:tc>
           <w:tcPr>
-            <w:tcW w:type="dxa" w:w="434"/>
+            <w:tcW w:type="dxa" w:w="430"/>
             <w:shd w:val="clear" w:color="auto" w:fill="F7F9FB"/>
             <w:vAlign w:val="center"/>
           </w:tcPr>
@@ -1121,7 +1121,7 @@
         </w:tc>
         <w:tc>
           <w:tcPr>
-            <w:tcW w:type="dxa" w:w="1715"/>
+            <w:tcW w:type="dxa" w:w="1685"/>
             <w:shd w:val="clear" w:color="auto" w:fill="F7F9FB"/>
             <w:vAlign w:val="center"/>
           </w:tcPr>
@@ -1145,7 +1145,7 @@
         </w:tc>
         <w:tc>
           <w:tcPr>
-            <w:tcW w:type="dxa" w:w="2485"/>
+            <w:tcW w:type="dxa" w:w="2517"/>
             <w:shd w:val="clear" w:color="auto" w:fill="F7F9FB"/>
             <w:vAlign w:val="center"/>
           </w:tcPr>
@@ -1168,7 +1168,7 @@
         </w:tc>
         <w:tc>
           <w:tcPr>
-            <w:tcW w:type="dxa" w:w="2457"/>
+            <w:tcW w:type="dxa" w:w="2476"/>
             <w:shd w:val="clear" w:color="auto" w:fill="F7F9FB"/>
             <w:vAlign w:val="center"/>
           </w:tcPr>
@@ -1191,7 +1191,7 @@
         </w:tc>
         <w:tc>
           <w:tcPr>
-            <w:tcW w:type="dxa" w:w="1404"/>
+            <w:tcW w:type="dxa" w:w="1389"/>
             <w:shd w:val="clear" w:color="auto" w:fill="F7F9FB"/>
             <w:vAlign w:val="center"/>
           </w:tcPr>
@@ -1239,7 +1239,7 @@
         </w:trPr>
         <w:tc>
           <w:tcPr>
-            <w:tcW w:type="dxa" w:w="434"/>
+            <w:tcW w:type="dxa" w:w="430"/>
             <w:shd w:val="clear" w:color="auto" w:fill="FFFFFF"/>
             <w:vAlign w:val="center"/>
           </w:tcPr>
@@ -1263,7 +1263,7 @@
         </w:tc>
         <w:tc>
           <w:tcPr>
-            <w:tcW w:type="dxa" w:w="1715"/>
+            <w:tcW w:type="dxa" w:w="1685"/>
             <w:shd w:val="clear" w:color="auto" w:fill="FFFFFF"/>
             <w:vAlign w:val="center"/>
           </w:tcPr>
@@ -1287,7 +1287,7 @@
         </w:tc>
         <w:tc>
           <w:tcPr>
-            <w:tcW w:type="dxa" w:w="2485"/>
+            <w:tcW w:type="dxa" w:w="2517"/>
             <w:shd w:val="clear" w:color="auto" w:fill="FFFFFF"/>
             <w:vAlign w:val="center"/>
           </w:tcPr>
@@ -1310,7 +1310,7 @@
         </w:tc>
         <w:tc>
           <w:tcPr>
-            <w:tcW w:type="dxa" w:w="2457"/>
+            <w:tcW w:type="dxa" w:w="2476"/>
             <w:shd w:val="clear" w:color="auto" w:fill="FFFFFF"/>
             <w:vAlign w:val="center"/>
           </w:tcPr>
@@ -1333,7 +1333,7 @@
         </w:tc>
         <w:tc>
           <w:tcPr>
-            <w:tcW w:type="dxa" w:w="1404"/>
+            <w:tcW w:type="dxa" w:w="1389"/>
             <w:shd w:val="clear" w:color="auto" w:fill="FFFFFF"/>
             <w:vAlign w:val="center"/>
           </w:tcPr>
@@ -1381,7 +1381,7 @@
         </w:trPr>
         <w:tc>
           <w:tcPr>
-            <w:tcW w:type="dxa" w:w="434"/>
+            <w:tcW w:type="dxa" w:w="430"/>
             <w:shd w:val="clear" w:color="auto" w:fill="F7F9FB"/>
             <w:vAlign w:val="center"/>
           </w:tcPr>
@@ -1405,7 +1405,7 @@
         </w:tc>
         <w:tc>
           <w:tcPr>
-            <w:tcW w:type="dxa" w:w="1715"/>
+            <w:tcW w:type="dxa" w:w="1685"/>
             <w:shd w:val="clear" w:color="auto" w:fill="F7F9FB"/>
             <w:vAlign w:val="center"/>
           </w:tcPr>
@@ -1429,7 +1429,7 @@
         </w:tc>
         <w:tc>
           <w:tcPr>
-            <w:tcW w:type="dxa" w:w="2485"/>
+            <w:tcW w:type="dxa" w:w="2517"/>
             <w:shd w:val="clear" w:color="auto" w:fill="F7F9FB"/>
             <w:vAlign w:val="center"/>
           </w:tcPr>
@@ -1452,7 +1452,7 @@
         </w:tc>
         <w:tc>
           <w:tcPr>
-            <w:tcW w:type="dxa" w:w="2457"/>
+            <w:tcW w:type="dxa" w:w="2476"/>
             <w:shd w:val="clear" w:color="auto" w:fill="F7F9FB"/>
             <w:vAlign w:val="center"/>
           </w:tcPr>
@@ -1475,7 +1475,7 @@
         </w:tc>
         <w:tc>
           <w:tcPr>
-            <w:tcW w:type="dxa" w:w="1404"/>
+            <w:tcW w:type="dxa" w:w="1389"/>
             <w:shd w:val="clear" w:color="auto" w:fill="F7F9FB"/>
             <w:vAlign w:val="center"/>
           </w:tcPr>
@@ -1523,7 +1523,7 @@
         </w:trPr>
         <w:tc>
           <w:tcPr>
-            <w:tcW w:type="dxa" w:w="434"/>
+            <w:tcW w:type="dxa" w:w="430"/>
             <w:shd w:val="clear" w:color="auto" w:fill="FFFFFF"/>
             <w:vAlign w:val="center"/>
           </w:tcPr>
@@ -1547,7 +1547,7 @@
         </w:tc>
         <w:tc>
           <w:tcPr>
-            <w:tcW w:type="dxa" w:w="1715"/>
+            <w:tcW w:type="dxa" w:w="1685"/>
             <w:shd w:val="clear" w:color="auto" w:fill="FFFFFF"/>
             <w:vAlign w:val="center"/>
           </w:tcPr>
@@ -1571,7 +1571,7 @@
         </w:tc>
         <w:tc>
           <w:tcPr>
-            <w:tcW w:type="dxa" w:w="2485"/>
+            <w:tcW w:type="dxa" w:w="2517"/>
             <w:shd w:val="clear" w:color="auto" w:fill="FFFFFF"/>
             <w:vAlign w:val="center"/>
           </w:tcPr>
@@ -1594,7 +1594,7 @@
         </w:tc>
         <w:tc>
           <w:tcPr>
-            <w:tcW w:type="dxa" w:w="2457"/>
+            <w:tcW w:type="dxa" w:w="2476"/>
             <w:shd w:val="clear" w:color="auto" w:fill="FFFFFF"/>
             <w:vAlign w:val="center"/>
           </w:tcPr>
@@ -1617,7 +1617,7 @@
         </w:tc>
         <w:tc>
           <w:tcPr>
-            <w:tcW w:type="dxa" w:w="1404"/>
+            <w:tcW w:type="dxa" w:w="1389"/>
             <w:shd w:val="clear" w:color="auto" w:fill="FFFFFF"/>
             <w:vAlign w:val="center"/>
           </w:tcPr>
@@ -1665,8 +1665,130 @@
         </w:trPr>
         <w:tc>
           <w:tcPr>
-            <w:tcW w:type="dxa" w:w="434"/>
+            <w:tcW w:type="dxa" w:w="430"/>
             <w:shd w:val="clear" w:color="auto" w:fill="F7F9FB"/>
+            <w:vAlign w:val="center"/>
+          </w:tcPr>
+          <w:p>
+            <w:pPr>
+              <w:keepNext/>
+              <w:spacing w:after="0"/>
+              <w:jc w:val="center"/>
+            </w:pPr>
+            <w:r>
+              <w:rPr>
+                <w:rFonts w:ascii="Calibri" w:hAnsi="Calibri"/>
+                <w:b/>
+                <w:i w:val="0"/>
+                <w:color w:val="222222"/>
+                <w:sz w:val="20"/>
+              </w:rPr>
+              <w:t>12</w:t>
+            </w:r>
+          </w:p>
+        </w:tc>
+        <w:tc>
+          <w:tcPr>
+            <w:tcW w:type="dxa" w:w="1685"/>
+            <w:shd w:val="clear" w:color="auto" w:fill="F7F9FB"/>
+            <w:vAlign w:val="center"/>
+          </w:tcPr>
+          <w:p>
+            <w:pPr>
+              <w:keepNext/>
+              <w:spacing w:after="0"/>
+              <w:jc w:val="center"/>
+            </w:pPr>
+            <w:r>
+              <w:rPr>
+                <w:rFonts w:ascii="Calibri" w:hAnsi="Calibri"/>
+                <w:b w:val="0"/>
+                <w:i w:val="0"/>
+                <w:color w:val="222222"/>
+                <w:sz w:val="20"/>
+              </w:rPr>
+              <w:t>2026-10-24</w:t>
+            </w:r>
+          </w:p>
+        </w:tc>
+        <w:tc>
+          <w:tcPr>
+            <w:tcW w:type="dxa" w:w="2517"/>
+            <w:shd w:val="clear" w:color="auto" w:fill="F7F9FB"/>
+            <w:vAlign w:val="center"/>
+          </w:tcPr>
+          <w:p>
+            <w:pPr>
+              <w:keepNext/>
+              <w:spacing w:after="0"/>
+            </w:pPr>
+            <w:r>
+              <w:rPr>
+                <w:rFonts w:ascii="Calibri" w:hAnsi="Calibri"/>
+                <w:b w:val="0"/>
+                <w:i w:val="0"/>
+                <w:color w:val="222222"/>
+                <w:sz w:val="20"/>
+              </w:rPr>
+              <w:t>Roadmap to an embodied, closed-loop fly</w:t>
+            </w:r>
+          </w:p>
+        </w:tc>
+        <w:tc>
+          <w:tcPr>
+            <w:tcW w:type="dxa" w:w="2476"/>
+            <w:shd w:val="clear" w:color="auto" w:fill="F7F9FB"/>
+            <w:vAlign w:val="center"/>
+          </w:tcPr>
+          <w:p>
+            <w:pPr>
+              <w:keepNext/>
+              <w:spacing w:after="0"/>
+            </w:pPr>
+            <w:r>
+              <w:rPr>
+                <w:rFonts w:ascii="Calibri" w:hAnsi="Calibri"/>
+                <w:b w:val="0"/>
+                <w:i w:val="0"/>
+                <w:color w:val="222222"/>
+                <w:sz w:val="20"/>
+              </w:rPr>
+              <w:t>plan, no new results</w:t>
+            </w:r>
+          </w:p>
+        </w:tc>
+        <w:tc>
+          <w:tcPr>
+            <w:tcW w:type="dxa" w:w="1389"/>
+            <w:shd w:val="clear" w:color="auto" w:fill="F7F9FB"/>
+            <w:vAlign w:val="center"/>
+          </w:tcPr>
+          <w:p>
+            <w:pPr>
+              <w:keepNext/>
+              <w:spacing w:after="0"/>
+            </w:pPr>
+            <w:r>
+              <w:rPr>
+                <w:rFonts w:ascii="Consolas" w:hAnsi="Consolas"/>
+                <w:b w:val="0"/>
+                <w:i w:val="0"/>
+                <w:color w:val="222222"/>
+                <w:sz w:val="18"/>
+              </w:rPr>
+              <w:t>42ee520</w:t>
+            </w:r>
+          </w:p>
+        </w:tc>
+      </w:tr>
+      <w:tr>
+        <w:trPr>
+          <w:cantSplit/>
+        </w:trPr>
+        <w:tc>
+          <w:tcPr>
+            <w:tcW w:type="dxa" w:w="430"/>
+            <w:shd w:val="clear" w:color="auto" w:fill="FFFFFF"/>
             <w:vAlign w:val="center"/>
           </w:tcPr>
           <w:p>
@@ -1683,14 +1805,14 @@
                 <w:color w:val="222222"/>
                 <w:sz w:val="20"/>
               </w:rPr>
-              <w:t>12</w:t>
+              <w:t>13</w:t>
             </w:r>
           </w:p>
         </w:tc>
         <w:tc>
           <w:tcPr>
-            <w:tcW w:type="dxa" w:w="1715"/>
-            <w:shd w:val="clear" w:color="auto" w:fill="F7F9FB"/>
+            <w:tcW w:type="dxa" w:w="1685"/>
+            <w:shd w:val="clear" w:color="auto" w:fill="FFFFFF"/>
             <w:vAlign w:val="center"/>
           </w:tcPr>
           <w:p>
@@ -1713,8 +1835,8 @@
         </w:tc>
         <w:tc>
           <w:tcPr>
-            <w:tcW w:type="dxa" w:w="2485"/>
-            <w:shd w:val="clear" w:color="auto" w:fill="F7F9FB"/>
+            <w:tcW w:type="dxa" w:w="2517"/>
+            <w:shd w:val="clear" w:color="auto" w:fill="FFFFFF"/>
             <w:vAlign w:val="center"/>
           </w:tcPr>
           <w:p>
@@ -1730,14 +1852,14 @@
                 <w:color w:val="222222"/>
                 <w:sz w:val="20"/>
               </w:rPr>
-              <w:t>Roadmap to an embodied, closed-loop fly</w:t>
+              <w:t>Embodied stage 1: the male CNS drives a muscle-driven leg</w:t>
             </w:r>
           </w:p>
         </w:tc>
         <w:tc>
           <w:tcPr>
-            <w:tcW w:type="dxa" w:w="2457"/>
-            <w:shd w:val="clear" w:color="auto" w:fill="F7F9FB"/>
+            <w:tcW w:type="dxa" w:w="2476"/>
+            <w:shd w:val="clear" w:color="auto" w:fill="FFFFFF"/>
             <w:vAlign w:val="center"/>
           </w:tcPr>
           <w:p>
@@ -1753,14 +1875,14 @@
                 <w:color w:val="222222"/>
                 <w:sz w:val="20"/>
               </w:rPr>
-              <w:t>plan, no new results</w:t>
+              <w:t>both registered tests fail; finding the cause changes the plan</w:t>
             </w:r>
           </w:p>
         </w:tc>
         <w:tc>
           <w:tcPr>
-            <w:tcW w:type="dxa" w:w="1404"/>
-            <w:shd w:val="clear" w:color="auto" w:fill="F7F9FB"/>
+            <w:tcW w:type="dxa" w:w="1389"/>
+            <w:shd w:val="clear" w:color="auto" w:fill="FFFFFF"/>
             <w:vAlign w:val="center"/>
           </w:tcPr>
           <w:p>
@@ -1770,13 +1892,23 @@
             </w:pPr>
             <w:r>
               <w:rPr>
+                <w:rFonts w:ascii="Consolas" w:hAnsi="Consolas"/>
+                <w:b w:val="0"/>
+                <w:i w:val="0"/>
+                <w:color w:val="222222"/>
+                <w:sz w:val="18"/>
+              </w:rPr>
+              <w:t>cbdd6d6</w:t>
+            </w:r>
+            <w:r>
+              <w:rPr>
                 <w:rFonts w:ascii="Calibri" w:hAnsi="Calibri"/>
                 <w:b w:val="0"/>
                 <w:i w:val="0"/>
                 <w:color w:val="222222"/>
                 <w:sz w:val="20"/>
               </w:rPr>
-              <w:t>this branch</w:t>
+              <w:t xml:space="preserve"> … this branch</w:t>
             </w:r>
           </w:p>
         </w:tc>
@@ -3721,7 +3853,7 @@
           <w:color w:val="222222"/>
           <w:sz w:val="21"/>
         </w:rPr>
-        <w:t>A diagnosis for free: real sodium-channel blockers are never recognised, because the twin's threshold knob moves firing by −3.273 log2 where the real blockers move it by −0.795: right direction, wrong size.</w:t>
+        <w:t>A finding for free: real sodium-channel blockers are never recognised, because the twin's threshold knob moves firing by −3.273 log2 where the real blockers move it by −0.795: right direction, wrong size.</w:t>
       </w:r>
     </w:p>
     <w:p>
@@ -4728,6 +4860,265 @@
           <w:sz w:val="19"/>
         </w:rPr>
         <w:t>report/ROADMAP_EMBODIED_FLY.md</w:t>
+      </w:r>
+      <w:r>
+        <w:rPr>
+          <w:rFonts w:ascii="Calibri" w:hAnsi="Calibri"/>
+          <w:b w:val="0"/>
+          <w:i w:val="0"/>
+          <w:color w:val="222222"/>
+          <w:sz w:val="21"/>
+        </w:rPr>
+        <w:t>.</w:t>
+      </w:r>
+    </w:p>
+    <w:p>
+      <w:pPr>
+        <w:keepNext/>
+        <w:spacing w:before="240" w:after="60"/>
+      </w:pPr>
+      <w:r>
+        <w:rPr>
+          <w:rFonts w:ascii="Calibri" w:hAnsi="Calibri"/>
+          <w:b/>
+          <w:i w:val="0"/>
+          <w:color w:val="1F4E79"/>
+          <w:sz w:val="23"/>
+        </w:rPr>
+        <w:t>13. The leg moves, but not specifically: what stage 1 found</w:t>
+      </w:r>
+    </w:p>
+    <w:p>
+      <w:pPr>
+        <w:spacing w:after="120"/>
+      </w:pPr>
+      <w:r>
+        <w:rPr>
+          <w:rFonts w:ascii="Calibri" w:hAnsi="Calibri"/>
+          <w:b/>
+          <w:i w:val="0"/>
+          <w:color w:val="156082"/>
+          <w:sz w:val="21"/>
+        </w:rPr>
+        <w:t>Slide message:</w:t>
+      </w:r>
+      <w:r>
+        <w:rPr>
+          <w:rFonts w:ascii="Calibri" w:hAnsi="Calibri"/>
+          <w:b w:val="0"/>
+          <w:i w:val="0"/>
+          <w:color w:val="222222"/>
+          <w:sz w:val="21"/>
+        </w:rPr>
+        <w:t xml:space="preserve"> </w:t>
+      </w:r>
+      <w:r>
+        <w:rPr>
+          <w:rFonts w:ascii="Calibri" w:hAnsi="Calibri"/>
+          <w:b w:val="0"/>
+          <w:i/>
+          <w:color w:val="222222"/>
+          <w:sz w:val="21"/>
+        </w:rPr>
+        <w:t>Wired to a muscle-driven leg, the male fly brain moves it toward the head under antennal drive, but under sugar drive too; the cause is that the published model's parameters do not carry over to the second connectome, where activity avalanches.</w:t>
+      </w:r>
+    </w:p>
+    <w:p>
+      <w:pPr>
+        <w:spacing w:after="120"/>
+        <w:ind w:left="432" w:hanging="259"/>
+      </w:pPr>
+      <w:r>
+        <w:rPr>
+          <w:rFonts w:ascii="Calibri" w:hAnsi="Calibri"/>
+          <w:b w:val="0"/>
+          <w:i w:val="0"/>
+          <w:color w:val="222222"/>
+          <w:sz w:val="21"/>
+        </w:rPr>
+        <w:t>•</w:t>
+        <w:tab/>
+      </w:r>
+      <w:r>
+        <w:rPr>
+          <w:rFonts w:ascii="Calibri" w:hAnsi="Calibri"/>
+          <w:b/>
+          <w:i w:val="0"/>
+          <w:color w:val="156082"/>
+          <w:sz w:val="21"/>
+        </w:rPr>
+        <w:t>What changed.</w:t>
+      </w:r>
+      <w:r>
+        <w:rPr>
+          <w:rFonts w:ascii="Calibri" w:hAnsi="Calibri"/>
+          <w:b w:val="0"/>
+          <w:i w:val="0"/>
+          <w:color w:val="222222"/>
+          <w:sz w:val="21"/>
+        </w:rPr>
+        <w:t xml:space="preserve"> MuJoCo (an optional dependency) runs the FlyMimic leg from FlyGym 2; </w:t>
+      </w:r>
+      <w:r>
+        <w:rPr>
+          <w:rFonts w:ascii="Consolas" w:hAnsi="Consolas"/>
+          <w:b w:val="0"/>
+          <w:i w:val="0"/>
+          <w:color w:val="222222"/>
+          <w:sz w:val="19"/>
+        </w:rPr>
+        <w:t>src/neuromps/fly/embodied_stage1.py</w:t>
+      </w:r>
+      <w:r>
+        <w:rPr>
+          <w:rFonts w:ascii="Calibri" w:hAnsi="Calibri"/>
+          <w:b w:val="0"/>
+          <w:i w:val="0"/>
+          <w:color w:val="222222"/>
+          <w:sz w:val="21"/>
+        </w:rPr>
+        <w:t xml:space="preserve"> maps male-CNS motor neurons onto its muscles by name and drives it open loop. Two registered tests: stage 1 and stage 1b (weight rescaled by the connectomes' input-synapse ratio).</w:t>
+      </w:r>
+    </w:p>
+    <w:p>
+      <w:pPr>
+        <w:spacing w:after="120"/>
+        <w:ind w:left="432" w:hanging="259"/>
+      </w:pPr>
+      <w:r>
+        <w:rPr>
+          <w:rFonts w:ascii="Calibri" w:hAnsi="Calibri"/>
+          <w:b w:val="0"/>
+          <w:i w:val="0"/>
+          <w:color w:val="222222"/>
+          <w:sz w:val="21"/>
+        </w:rPr>
+        <w:t>•</w:t>
+        <w:tab/>
+      </w:r>
+      <w:r>
+        <w:rPr>
+          <w:rFonts w:ascii="Calibri" w:hAnsi="Calibri"/>
+          <w:b/>
+          <w:i w:val="0"/>
+          <w:color w:val="156082"/>
+          <w:sz w:val="21"/>
+        </w:rPr>
+        <w:t>Effect.</w:t>
+      </w:r>
+      <w:r>
+        <w:rPr>
+          <w:rFonts w:ascii="Calibri" w:hAnsi="Calibri"/>
+          <w:b w:val="0"/>
+          <w:i w:val="0"/>
+          <w:color w:val="222222"/>
+          <w:sz w:val="21"/>
+        </w:rPr>
+        <w:t xml:space="preserve"> Stage 1 fails on specificity (sugar brings the claw closer than antennal drive); stage 1b's feeding check fails (sugar drives the feeding motor neuron at 0.0 Hz), so its leg results are uninterpretable. The cause: a sugar drive activates 251 neurons in the published FlyWire model and 14,263 in the male CNS.</w:t>
+      </w:r>
+    </w:p>
+    <w:p>
+      <w:pPr>
+        <w:spacing w:after="120"/>
+        <w:ind w:left="432" w:hanging="259"/>
+      </w:pPr>
+      <w:r>
+        <w:rPr>
+          <w:rFonts w:ascii="Calibri" w:hAnsi="Calibri"/>
+          <w:b w:val="0"/>
+          <w:i w:val="0"/>
+          <w:color w:val="222222"/>
+          <w:sz w:val="21"/>
+        </w:rPr>
+        <w:t>•</w:t>
+        <w:tab/>
+      </w:r>
+      <w:r>
+        <w:rPr>
+          <w:rFonts w:ascii="Calibri" w:hAnsi="Calibri"/>
+          <w:b/>
+          <w:i w:val="0"/>
+          <w:color w:val="156082"/>
+          <w:sz w:val="21"/>
+        </w:rPr>
+        <w:t>What it changes.</w:t>
+      </w:r>
+      <w:r>
+        <w:rPr>
+          <w:rFonts w:ascii="Calibri" w:hAnsi="Calibri"/>
+          <w:b w:val="0"/>
+          <w:i w:val="0"/>
+          <w:color w:val="222222"/>
+          <w:sz w:val="21"/>
+        </w:rPr>
+        <w:t xml:space="preserve"> The next step drives the male nerve cord from its descending neurons alone, then joins the validated FlyWire brain to it (roadmap §7).</w:t>
+      </w:r>
+    </w:p>
+    <w:p>
+      <w:pPr>
+        <w:spacing w:after="120"/>
+        <w:ind w:left="432" w:hanging="259"/>
+      </w:pPr>
+      <w:r>
+        <w:rPr>
+          <w:rFonts w:ascii="Calibri" w:hAnsi="Calibri"/>
+          <w:b w:val="0"/>
+          <w:i w:val="0"/>
+          <w:color w:val="222222"/>
+          <w:sz w:val="21"/>
+        </w:rPr>
+        <w:t>•</w:t>
+        <w:tab/>
+      </w:r>
+      <w:r>
+        <w:rPr>
+          <w:rFonts w:ascii="Calibri" w:hAnsi="Calibri"/>
+          <w:b/>
+          <w:i w:val="0"/>
+          <w:color w:val="156082"/>
+          <w:sz w:val="21"/>
+        </w:rPr>
+        <w:t>Evidence.</w:t>
+      </w:r>
+      <w:r>
+        <w:rPr>
+          <w:rFonts w:ascii="Calibri" w:hAnsi="Calibri"/>
+          <w:b w:val="0"/>
+          <w:i w:val="0"/>
+          <w:color w:val="222222"/>
+          <w:sz w:val="21"/>
+        </w:rPr>
+        <w:t xml:space="preserve"> </w:t>
+      </w:r>
+      <w:r>
+        <w:rPr>
+          <w:rFonts w:ascii="Consolas" w:hAnsi="Consolas"/>
+          <w:b w:val="0"/>
+          <w:i w:val="0"/>
+          <w:color w:val="222222"/>
+          <w:sz w:val="19"/>
+        </w:rPr>
+        <w:t>report/ROADMAP_EMBODIED_FLY.md</w:t>
+      </w:r>
+      <w:r>
+        <w:rPr>
+          <w:rFonts w:ascii="Calibri" w:hAnsi="Calibri"/>
+          <w:b w:val="0"/>
+          <w:i w:val="0"/>
+          <w:color w:val="222222"/>
+          <w:sz w:val="21"/>
+        </w:rPr>
+        <w:t xml:space="preserve"> §7; </w:t>
+      </w:r>
+      <w:r>
+        <w:rPr>
+          <w:rFonts w:ascii="Consolas" w:hAnsi="Consolas"/>
+          <w:b w:val="0"/>
+          <w:i w:val="0"/>
+          <w:color w:val="222222"/>
+          <w:sz w:val="19"/>
+        </w:rPr>
+        <w:t>outputs/fly/embodied_stage1*_SIMULATED.</w:t>
       </w:r>
       <w:r>
         <w:rPr>

</xml_diff>

<commit_message>
Record embodied stage 1c: 3 of 5 registered predictions pass
Registered (739f6f0). With the male brain removed, the nerve cord is
silent without drive; the antennal-grooming descending neurons (aDN1,
aDN2) drive the left front-leg motor pool at 15.8 Hz against 2.7 and 1.7
for the other legs, and no control descending neuron recruits the front
leg as strongly. The kinematic prediction fails: a forward-walking swing
dips as close to the head (1.15 mm) as the grooming reach (1.13 mm), which
reaches the head and stays. Written into the roadmap (§7, figure), the
changes log (entry 14) and the paper outline; Word and PDF rebuilt.

Co-Authored-By: Claude Opus 5.5 <noreply@anthropic.com>
</commit_message>
<xml_diff>
--- a/report/POST_SUBMISSION_CHANGES.docx
+++ b/report/POST_SUBMISSION_CHANGES.docx
@@ -48,11 +48,11 @@
         <w:tblLook w:firstColumn="1" w:firstRow="1" w:lastColumn="0" w:lastRow="0" w:noHBand="0" w:noVBand="1" w:val="04A0"/>
       </w:tblPr>
       <w:tblGrid>
-        <w:gridCol w:w="430"/>
-        <w:gridCol w:w="1685"/>
-        <w:gridCol w:w="2517"/>
-        <w:gridCol w:w="2476"/>
-        <w:gridCol w:w="1389"/>
+        <w:gridCol w:w="429"/>
+        <w:gridCol w:w="1680"/>
+        <w:gridCol w:w="2556"/>
+        <w:gridCol w:w="2451"/>
+        <w:gridCol w:w="1380"/>
       </w:tblGrid>
       <w:tr>
         <w:trPr>
@@ -61,7 +61,7 @@
         </w:trPr>
         <w:tc>
           <w:tcPr>
-            <w:tcW w:type="dxa" w:w="430"/>
+            <w:tcW w:type="dxa" w:w="429"/>
             <w:shd w:val="clear" w:color="auto" w:fill="1F4E79"/>
             <w:vAlign w:val="center"/>
           </w:tcPr>
@@ -85,7 +85,7 @@
         </w:tc>
         <w:tc>
           <w:tcPr>
-            <w:tcW w:type="dxa" w:w="1685"/>
+            <w:tcW w:type="dxa" w:w="1680"/>
             <w:shd w:val="clear" w:color="auto" w:fill="1F4E79"/>
             <w:vAlign w:val="center"/>
           </w:tcPr>
@@ -109,7 +109,7 @@
         </w:tc>
         <w:tc>
           <w:tcPr>
-            <w:tcW w:type="dxa" w:w="2517"/>
+            <w:tcW w:type="dxa" w:w="2556"/>
             <w:shd w:val="clear" w:color="auto" w:fill="1F4E79"/>
             <w:vAlign w:val="center"/>
           </w:tcPr>
@@ -132,7 +132,7 @@
         </w:tc>
         <w:tc>
           <w:tcPr>
-            <w:tcW w:type="dxa" w:w="2476"/>
+            <w:tcW w:type="dxa" w:w="2451"/>
             <w:shd w:val="clear" w:color="auto" w:fill="1F4E79"/>
             <w:vAlign w:val="center"/>
           </w:tcPr>
@@ -155,7 +155,7 @@
         </w:tc>
         <w:tc>
           <w:tcPr>
-            <w:tcW w:type="dxa" w:w="1389"/>
+            <w:tcW w:type="dxa" w:w="1380"/>
             <w:shd w:val="clear" w:color="auto" w:fill="1F4E79"/>
             <w:vAlign w:val="center"/>
           </w:tcPr>
@@ -183,7 +183,7 @@
         </w:trPr>
         <w:tc>
           <w:tcPr>
-            <w:tcW w:type="dxa" w:w="430"/>
+            <w:tcW w:type="dxa" w:w="429"/>
             <w:shd w:val="clear" w:color="auto" w:fill="FFFFFF"/>
             <w:vAlign w:val="center"/>
           </w:tcPr>
@@ -207,7 +207,7 @@
         </w:tc>
         <w:tc>
           <w:tcPr>
-            <w:tcW w:type="dxa" w:w="1685"/>
+            <w:tcW w:type="dxa" w:w="1680"/>
             <w:shd w:val="clear" w:color="auto" w:fill="FFFFFF"/>
             <w:vAlign w:val="center"/>
           </w:tcPr>
@@ -231,7 +231,7 @@
         </w:tc>
         <w:tc>
           <w:tcPr>
-            <w:tcW w:type="dxa" w:w="2517"/>
+            <w:tcW w:type="dxa" w:w="2556"/>
             <w:shd w:val="clear" w:color="auto" w:fill="FFFFFF"/>
             <w:vAlign w:val="center"/>
           </w:tcPr>
@@ -254,7 +254,7 @@
         </w:tc>
         <w:tc>
           <w:tcPr>
-            <w:tcW w:type="dxa" w:w="2476"/>
+            <w:tcW w:type="dxa" w:w="2451"/>
             <w:shd w:val="clear" w:color="auto" w:fill="FFFFFF"/>
             <w:vAlign w:val="center"/>
           </w:tcPr>
@@ -277,7 +277,7 @@
         </w:tc>
         <w:tc>
           <w:tcPr>
-            <w:tcW w:type="dxa" w:w="1389"/>
+            <w:tcW w:type="dxa" w:w="1380"/>
             <w:shd w:val="clear" w:color="auto" w:fill="FFFFFF"/>
             <w:vAlign w:val="center"/>
           </w:tcPr>
@@ -325,7 +325,7 @@
         </w:trPr>
         <w:tc>
           <w:tcPr>
-            <w:tcW w:type="dxa" w:w="430"/>
+            <w:tcW w:type="dxa" w:w="429"/>
             <w:shd w:val="clear" w:color="auto" w:fill="F7F9FB"/>
             <w:vAlign w:val="center"/>
           </w:tcPr>
@@ -349,7 +349,7 @@
         </w:tc>
         <w:tc>
           <w:tcPr>
-            <w:tcW w:type="dxa" w:w="1685"/>
+            <w:tcW w:type="dxa" w:w="1680"/>
             <w:shd w:val="clear" w:color="auto" w:fill="F7F9FB"/>
             <w:vAlign w:val="center"/>
           </w:tcPr>
@@ -373,7 +373,7 @@
         </w:tc>
         <w:tc>
           <w:tcPr>
-            <w:tcW w:type="dxa" w:w="2517"/>
+            <w:tcW w:type="dxa" w:w="2556"/>
             <w:shd w:val="clear" w:color="auto" w:fill="F7F9FB"/>
             <w:vAlign w:val="center"/>
           </w:tcPr>
@@ -396,7 +396,7 @@
         </w:tc>
         <w:tc>
           <w:tcPr>
-            <w:tcW w:type="dxa" w:w="2476"/>
+            <w:tcW w:type="dxa" w:w="2451"/>
             <w:shd w:val="clear" w:color="auto" w:fill="F7F9FB"/>
             <w:vAlign w:val="center"/>
           </w:tcPr>
@@ -419,7 +419,7 @@
         </w:tc>
         <w:tc>
           <w:tcPr>
-            <w:tcW w:type="dxa" w:w="1389"/>
+            <w:tcW w:type="dxa" w:w="1380"/>
             <w:shd w:val="clear" w:color="auto" w:fill="F7F9FB"/>
             <w:vAlign w:val="center"/>
           </w:tcPr>
@@ -447,7 +447,7 @@
         </w:trPr>
         <w:tc>
           <w:tcPr>
-            <w:tcW w:type="dxa" w:w="430"/>
+            <w:tcW w:type="dxa" w:w="429"/>
             <w:shd w:val="clear" w:color="auto" w:fill="FFFFFF"/>
             <w:vAlign w:val="center"/>
           </w:tcPr>
@@ -471,7 +471,7 @@
         </w:tc>
         <w:tc>
           <w:tcPr>
-            <w:tcW w:type="dxa" w:w="1685"/>
+            <w:tcW w:type="dxa" w:w="1680"/>
             <w:shd w:val="clear" w:color="auto" w:fill="FFFFFF"/>
             <w:vAlign w:val="center"/>
           </w:tcPr>
@@ -495,7 +495,7 @@
         </w:tc>
         <w:tc>
           <w:tcPr>
-            <w:tcW w:type="dxa" w:w="2517"/>
+            <w:tcW w:type="dxa" w:w="2556"/>
             <w:shd w:val="clear" w:color="auto" w:fill="FFFFFF"/>
             <w:vAlign w:val="center"/>
           </w:tcPr>
@@ -518,7 +518,7 @@
         </w:tc>
         <w:tc>
           <w:tcPr>
-            <w:tcW w:type="dxa" w:w="2476"/>
+            <w:tcW w:type="dxa" w:w="2451"/>
             <w:shd w:val="clear" w:color="auto" w:fill="FFFFFF"/>
             <w:vAlign w:val="center"/>
           </w:tcPr>
@@ -541,7 +541,7 @@
         </w:tc>
         <w:tc>
           <w:tcPr>
-            <w:tcW w:type="dxa" w:w="1389"/>
+            <w:tcW w:type="dxa" w:w="1380"/>
             <w:shd w:val="clear" w:color="auto" w:fill="FFFFFF"/>
             <w:vAlign w:val="center"/>
           </w:tcPr>
@@ -569,7 +569,7 @@
         </w:trPr>
         <w:tc>
           <w:tcPr>
-            <w:tcW w:type="dxa" w:w="430"/>
+            <w:tcW w:type="dxa" w:w="429"/>
             <w:shd w:val="clear" w:color="auto" w:fill="F7F9FB"/>
             <w:vAlign w:val="center"/>
           </w:tcPr>
@@ -593,7 +593,7 @@
         </w:tc>
         <w:tc>
           <w:tcPr>
-            <w:tcW w:type="dxa" w:w="1685"/>
+            <w:tcW w:type="dxa" w:w="1680"/>
             <w:shd w:val="clear" w:color="auto" w:fill="F7F9FB"/>
             <w:vAlign w:val="center"/>
           </w:tcPr>
@@ -617,7 +617,7 @@
         </w:tc>
         <w:tc>
           <w:tcPr>
-            <w:tcW w:type="dxa" w:w="2517"/>
+            <w:tcW w:type="dxa" w:w="2556"/>
             <w:shd w:val="clear" w:color="auto" w:fill="F7F9FB"/>
             <w:vAlign w:val="center"/>
           </w:tcPr>
@@ -640,7 +640,7 @@
         </w:tc>
         <w:tc>
           <w:tcPr>
-            <w:tcW w:type="dxa" w:w="2476"/>
+            <w:tcW w:type="dxa" w:w="2451"/>
             <w:shd w:val="clear" w:color="auto" w:fill="F7F9FB"/>
             <w:vAlign w:val="center"/>
           </w:tcPr>
@@ -663,7 +663,7 @@
         </w:tc>
         <w:tc>
           <w:tcPr>
-            <w:tcW w:type="dxa" w:w="1389"/>
+            <w:tcW w:type="dxa" w:w="1380"/>
             <w:shd w:val="clear" w:color="auto" w:fill="F7F9FB"/>
             <w:vAlign w:val="center"/>
           </w:tcPr>
@@ -711,7 +711,7 @@
         </w:trPr>
         <w:tc>
           <w:tcPr>
-            <w:tcW w:type="dxa" w:w="430"/>
+            <w:tcW w:type="dxa" w:w="429"/>
             <w:shd w:val="clear" w:color="auto" w:fill="FFFFFF"/>
             <w:vAlign w:val="center"/>
           </w:tcPr>
@@ -735,7 +735,7 @@
         </w:tc>
         <w:tc>
           <w:tcPr>
-            <w:tcW w:type="dxa" w:w="1685"/>
+            <w:tcW w:type="dxa" w:w="1680"/>
             <w:shd w:val="clear" w:color="auto" w:fill="FFFFFF"/>
             <w:vAlign w:val="center"/>
           </w:tcPr>
@@ -759,7 +759,7 @@
         </w:tc>
         <w:tc>
           <w:tcPr>
-            <w:tcW w:type="dxa" w:w="2517"/>
+            <w:tcW w:type="dxa" w:w="2556"/>
             <w:shd w:val="clear" w:color="auto" w:fill="FFFFFF"/>
             <w:vAlign w:val="center"/>
           </w:tcPr>
@@ -782,7 +782,7 @@
         </w:tc>
         <w:tc>
           <w:tcPr>
-            <w:tcW w:type="dxa" w:w="2476"/>
+            <w:tcW w:type="dxa" w:w="2451"/>
             <w:shd w:val="clear" w:color="auto" w:fill="FFFFFF"/>
             <w:vAlign w:val="center"/>
           </w:tcPr>
@@ -805,7 +805,7 @@
         </w:tc>
         <w:tc>
           <w:tcPr>
-            <w:tcW w:type="dxa" w:w="1389"/>
+            <w:tcW w:type="dxa" w:w="1380"/>
             <w:shd w:val="clear" w:color="auto" w:fill="FFFFFF"/>
             <w:vAlign w:val="center"/>
           </w:tcPr>
@@ -833,7 +833,7 @@
         </w:trPr>
         <w:tc>
           <w:tcPr>
-            <w:tcW w:type="dxa" w:w="430"/>
+            <w:tcW w:type="dxa" w:w="429"/>
             <w:shd w:val="clear" w:color="auto" w:fill="F7F9FB"/>
             <w:vAlign w:val="center"/>
           </w:tcPr>
@@ -857,7 +857,7 @@
         </w:tc>
         <w:tc>
           <w:tcPr>
-            <w:tcW w:type="dxa" w:w="1685"/>
+            <w:tcW w:type="dxa" w:w="1680"/>
             <w:shd w:val="clear" w:color="auto" w:fill="F7F9FB"/>
             <w:vAlign w:val="center"/>
           </w:tcPr>
@@ -881,7 +881,7 @@
         </w:tc>
         <w:tc>
           <w:tcPr>
-            <w:tcW w:type="dxa" w:w="2517"/>
+            <w:tcW w:type="dxa" w:w="2556"/>
             <w:shd w:val="clear" w:color="auto" w:fill="F7F9FB"/>
             <w:vAlign w:val="center"/>
           </w:tcPr>
@@ -904,7 +904,7 @@
         </w:tc>
         <w:tc>
           <w:tcPr>
-            <w:tcW w:type="dxa" w:w="2476"/>
+            <w:tcW w:type="dxa" w:w="2451"/>
             <w:shd w:val="clear" w:color="auto" w:fill="F7F9FB"/>
             <w:vAlign w:val="center"/>
           </w:tcPr>
@@ -927,7 +927,7 @@
         </w:tc>
         <w:tc>
           <w:tcPr>
-            <w:tcW w:type="dxa" w:w="1389"/>
+            <w:tcW w:type="dxa" w:w="1380"/>
             <w:shd w:val="clear" w:color="auto" w:fill="F7F9FB"/>
             <w:vAlign w:val="center"/>
           </w:tcPr>
@@ -955,7 +955,7 @@
         </w:trPr>
         <w:tc>
           <w:tcPr>
-            <w:tcW w:type="dxa" w:w="430"/>
+            <w:tcW w:type="dxa" w:w="429"/>
             <w:shd w:val="clear" w:color="auto" w:fill="FFFFFF"/>
             <w:vAlign w:val="center"/>
           </w:tcPr>
@@ -979,7 +979,7 @@
         </w:tc>
         <w:tc>
           <w:tcPr>
-            <w:tcW w:type="dxa" w:w="1685"/>
+            <w:tcW w:type="dxa" w:w="1680"/>
             <w:shd w:val="clear" w:color="auto" w:fill="FFFFFF"/>
             <w:vAlign w:val="center"/>
           </w:tcPr>
@@ -1003,7 +1003,7 @@
         </w:tc>
         <w:tc>
           <w:tcPr>
-            <w:tcW w:type="dxa" w:w="2517"/>
+            <w:tcW w:type="dxa" w:w="2556"/>
             <w:shd w:val="clear" w:color="auto" w:fill="FFFFFF"/>
             <w:vAlign w:val="center"/>
           </w:tcPr>
@@ -1026,7 +1026,7 @@
         </w:tc>
         <w:tc>
           <w:tcPr>
-            <w:tcW w:type="dxa" w:w="2476"/>
+            <w:tcW w:type="dxa" w:w="2451"/>
             <w:shd w:val="clear" w:color="auto" w:fill="FFFFFF"/>
             <w:vAlign w:val="center"/>
           </w:tcPr>
@@ -1049,7 +1049,7 @@
         </w:tc>
         <w:tc>
           <w:tcPr>
-            <w:tcW w:type="dxa" w:w="1389"/>
+            <w:tcW w:type="dxa" w:w="1380"/>
             <w:shd w:val="clear" w:color="auto" w:fill="FFFFFF"/>
             <w:vAlign w:val="center"/>
           </w:tcPr>
@@ -1097,7 +1097,7 @@
         </w:trPr>
         <w:tc>
           <w:tcPr>
-            <w:tcW w:type="dxa" w:w="430"/>
+            <w:tcW w:type="dxa" w:w="429"/>
             <w:shd w:val="clear" w:color="auto" w:fill="F7F9FB"/>
             <w:vAlign w:val="center"/>
           </w:tcPr>
@@ -1121,7 +1121,7 @@
         </w:tc>
         <w:tc>
           <w:tcPr>
-            <w:tcW w:type="dxa" w:w="1685"/>
+            <w:tcW w:type="dxa" w:w="1680"/>
             <w:shd w:val="clear" w:color="auto" w:fill="F7F9FB"/>
             <w:vAlign w:val="center"/>
           </w:tcPr>
@@ -1145,7 +1145,7 @@
         </w:tc>
         <w:tc>
           <w:tcPr>
-            <w:tcW w:type="dxa" w:w="2517"/>
+            <w:tcW w:type="dxa" w:w="2556"/>
             <w:shd w:val="clear" w:color="auto" w:fill="F7F9FB"/>
             <w:vAlign w:val="center"/>
           </w:tcPr>
@@ -1168,7 +1168,7 @@
         </w:tc>
         <w:tc>
           <w:tcPr>
-            <w:tcW w:type="dxa" w:w="2476"/>
+            <w:tcW w:type="dxa" w:w="2451"/>
             <w:shd w:val="clear" w:color="auto" w:fill="F7F9FB"/>
             <w:vAlign w:val="center"/>
           </w:tcPr>
@@ -1191,7 +1191,7 @@
         </w:tc>
         <w:tc>
           <w:tcPr>
-            <w:tcW w:type="dxa" w:w="1389"/>
+            <w:tcW w:type="dxa" w:w="1380"/>
             <w:shd w:val="clear" w:color="auto" w:fill="F7F9FB"/>
             <w:vAlign w:val="center"/>
           </w:tcPr>
@@ -1239,7 +1239,7 @@
         </w:trPr>
         <w:tc>
           <w:tcPr>
-            <w:tcW w:type="dxa" w:w="430"/>
+            <w:tcW w:type="dxa" w:w="429"/>
             <w:shd w:val="clear" w:color="auto" w:fill="FFFFFF"/>
             <w:vAlign w:val="center"/>
           </w:tcPr>
@@ -1263,7 +1263,7 @@
         </w:tc>
         <w:tc>
           <w:tcPr>
-            <w:tcW w:type="dxa" w:w="1685"/>
+            <w:tcW w:type="dxa" w:w="1680"/>
             <w:shd w:val="clear" w:color="auto" w:fill="FFFFFF"/>
             <w:vAlign w:val="center"/>
           </w:tcPr>
@@ -1287,7 +1287,7 @@
         </w:tc>
         <w:tc>
           <w:tcPr>
-            <w:tcW w:type="dxa" w:w="2517"/>
+            <w:tcW w:type="dxa" w:w="2556"/>
             <w:shd w:val="clear" w:color="auto" w:fill="FFFFFF"/>
             <w:vAlign w:val="center"/>
           </w:tcPr>
@@ -1310,7 +1310,7 @@
         </w:tc>
         <w:tc>
           <w:tcPr>
-            <w:tcW w:type="dxa" w:w="2476"/>
+            <w:tcW w:type="dxa" w:w="2451"/>
             <w:shd w:val="clear" w:color="auto" w:fill="FFFFFF"/>
             <w:vAlign w:val="center"/>
           </w:tcPr>
@@ -1333,7 +1333,7 @@
         </w:tc>
         <w:tc>
           <w:tcPr>
-            <w:tcW w:type="dxa" w:w="1389"/>
+            <w:tcW w:type="dxa" w:w="1380"/>
             <w:shd w:val="clear" w:color="auto" w:fill="FFFFFF"/>
             <w:vAlign w:val="center"/>
           </w:tcPr>
@@ -1381,7 +1381,7 @@
         </w:trPr>
         <w:tc>
           <w:tcPr>
-            <w:tcW w:type="dxa" w:w="430"/>
+            <w:tcW w:type="dxa" w:w="429"/>
             <w:shd w:val="clear" w:color="auto" w:fill="F7F9FB"/>
             <w:vAlign w:val="center"/>
           </w:tcPr>
@@ -1405,7 +1405,7 @@
         </w:tc>
         <w:tc>
           <w:tcPr>
-            <w:tcW w:type="dxa" w:w="1685"/>
+            <w:tcW w:type="dxa" w:w="1680"/>
             <w:shd w:val="clear" w:color="auto" w:fill="F7F9FB"/>
             <w:vAlign w:val="center"/>
           </w:tcPr>
@@ -1429,7 +1429,7 @@
         </w:tc>
         <w:tc>
           <w:tcPr>
-            <w:tcW w:type="dxa" w:w="2517"/>
+            <w:tcW w:type="dxa" w:w="2556"/>
             <w:shd w:val="clear" w:color="auto" w:fill="F7F9FB"/>
             <w:vAlign w:val="center"/>
           </w:tcPr>
@@ -1452,7 +1452,7 @@
         </w:tc>
         <w:tc>
           <w:tcPr>
-            <w:tcW w:type="dxa" w:w="2476"/>
+            <w:tcW w:type="dxa" w:w="2451"/>
             <w:shd w:val="clear" w:color="auto" w:fill="F7F9FB"/>
             <w:vAlign w:val="center"/>
           </w:tcPr>
@@ -1475,7 +1475,7 @@
         </w:tc>
         <w:tc>
           <w:tcPr>
-            <w:tcW w:type="dxa" w:w="1389"/>
+            <w:tcW w:type="dxa" w:w="1380"/>
             <w:shd w:val="clear" w:color="auto" w:fill="F7F9FB"/>
             <w:vAlign w:val="center"/>
           </w:tcPr>
@@ -1523,7 +1523,7 @@
         </w:trPr>
         <w:tc>
           <w:tcPr>
-            <w:tcW w:type="dxa" w:w="430"/>
+            <w:tcW w:type="dxa" w:w="429"/>
             <w:shd w:val="clear" w:color="auto" w:fill="FFFFFF"/>
             <w:vAlign w:val="center"/>
           </w:tcPr>
@@ -1547,7 +1547,7 @@
         </w:tc>
         <w:tc>
           <w:tcPr>
-            <w:tcW w:type="dxa" w:w="1685"/>
+            <w:tcW w:type="dxa" w:w="1680"/>
             <w:shd w:val="clear" w:color="auto" w:fill="FFFFFF"/>
             <w:vAlign w:val="center"/>
           </w:tcPr>
@@ -1571,7 +1571,7 @@
         </w:tc>
         <w:tc>
           <w:tcPr>
-            <w:tcW w:type="dxa" w:w="2517"/>
+            <w:tcW w:type="dxa" w:w="2556"/>
             <w:shd w:val="clear" w:color="auto" w:fill="FFFFFF"/>
             <w:vAlign w:val="center"/>
           </w:tcPr>
@@ -1594,7 +1594,7 @@
         </w:tc>
         <w:tc>
           <w:tcPr>
-            <w:tcW w:type="dxa" w:w="2476"/>
+            <w:tcW w:type="dxa" w:w="2451"/>
             <w:shd w:val="clear" w:color="auto" w:fill="FFFFFF"/>
             <w:vAlign w:val="center"/>
           </w:tcPr>
@@ -1617,7 +1617,7 @@
         </w:tc>
         <w:tc>
           <w:tcPr>
-            <w:tcW w:type="dxa" w:w="1389"/>
+            <w:tcW w:type="dxa" w:w="1380"/>
             <w:shd w:val="clear" w:color="auto" w:fill="FFFFFF"/>
             <w:vAlign w:val="center"/>
           </w:tcPr>
@@ -1665,7 +1665,7 @@
         </w:trPr>
         <w:tc>
           <w:tcPr>
-            <w:tcW w:type="dxa" w:w="430"/>
+            <w:tcW w:type="dxa" w:w="429"/>
             <w:shd w:val="clear" w:color="auto" w:fill="F7F9FB"/>
             <w:vAlign w:val="center"/>
           </w:tcPr>
@@ -1689,7 +1689,7 @@
         </w:tc>
         <w:tc>
           <w:tcPr>
-            <w:tcW w:type="dxa" w:w="1685"/>
+            <w:tcW w:type="dxa" w:w="1680"/>
             <w:shd w:val="clear" w:color="auto" w:fill="F7F9FB"/>
             <w:vAlign w:val="center"/>
           </w:tcPr>
@@ -1713,7 +1713,7 @@
         </w:tc>
         <w:tc>
           <w:tcPr>
-            <w:tcW w:type="dxa" w:w="2517"/>
+            <w:tcW w:type="dxa" w:w="2556"/>
             <w:shd w:val="clear" w:color="auto" w:fill="F7F9FB"/>
             <w:vAlign w:val="center"/>
           </w:tcPr>
@@ -1736,7 +1736,7 @@
         </w:tc>
         <w:tc>
           <w:tcPr>
-            <w:tcW w:type="dxa" w:w="2476"/>
+            <w:tcW w:type="dxa" w:w="2451"/>
             <w:shd w:val="clear" w:color="auto" w:fill="F7F9FB"/>
             <w:vAlign w:val="center"/>
           </w:tcPr>
@@ -1759,7 +1759,7 @@
         </w:tc>
         <w:tc>
           <w:tcPr>
-            <w:tcW w:type="dxa" w:w="1389"/>
+            <w:tcW w:type="dxa" w:w="1380"/>
             <w:shd w:val="clear" w:color="auto" w:fill="F7F9FB"/>
             <w:vAlign w:val="center"/>
           </w:tcPr>
@@ -1787,8 +1787,140 @@
         </w:trPr>
         <w:tc>
           <w:tcPr>
-            <w:tcW w:type="dxa" w:w="430"/>
+            <w:tcW w:type="dxa" w:w="429"/>
             <w:shd w:val="clear" w:color="auto" w:fill="FFFFFF"/>
+            <w:vAlign w:val="center"/>
+          </w:tcPr>
+          <w:p>
+            <w:pPr>
+              <w:keepNext/>
+              <w:spacing w:after="0"/>
+              <w:jc w:val="center"/>
+            </w:pPr>
+            <w:r>
+              <w:rPr>
+                <w:rFonts w:ascii="Calibri" w:hAnsi="Calibri"/>
+                <w:b/>
+                <w:i w:val="0"/>
+                <w:color w:val="222222"/>
+                <w:sz w:val="20"/>
+              </w:rPr>
+              <w:t>13</w:t>
+            </w:r>
+          </w:p>
+        </w:tc>
+        <w:tc>
+          <w:tcPr>
+            <w:tcW w:type="dxa" w:w="1680"/>
+            <w:shd w:val="clear" w:color="auto" w:fill="FFFFFF"/>
+            <w:vAlign w:val="center"/>
+          </w:tcPr>
+          <w:p>
+            <w:pPr>
+              <w:keepNext/>
+              <w:spacing w:after="0"/>
+              <w:jc w:val="center"/>
+            </w:pPr>
+            <w:r>
+              <w:rPr>
+                <w:rFonts w:ascii="Calibri" w:hAnsi="Calibri"/>
+                <w:b w:val="0"/>
+                <w:i w:val="0"/>
+                <w:color w:val="222222"/>
+                <w:sz w:val="20"/>
+              </w:rPr>
+              <w:t>2026-10-24</w:t>
+            </w:r>
+          </w:p>
+        </w:tc>
+        <w:tc>
+          <w:tcPr>
+            <w:tcW w:type="dxa" w:w="2556"/>
+            <w:shd w:val="clear" w:color="auto" w:fill="FFFFFF"/>
+            <w:vAlign w:val="center"/>
+          </w:tcPr>
+          <w:p>
+            <w:pPr>
+              <w:keepNext/>
+              <w:spacing w:after="0"/>
+            </w:pPr>
+            <w:r>
+              <w:rPr>
+                <w:rFonts w:ascii="Calibri" w:hAnsi="Calibri"/>
+                <w:b w:val="0"/>
+                <w:i w:val="0"/>
+                <w:color w:val="222222"/>
+                <w:sz w:val="20"/>
+              </w:rPr>
+              <w:t>Embodied stage 1: the male CNS drives a muscle-driven leg</w:t>
+            </w:r>
+          </w:p>
+        </w:tc>
+        <w:tc>
+          <w:tcPr>
+            <w:tcW w:type="dxa" w:w="2451"/>
+            <w:shd w:val="clear" w:color="auto" w:fill="FFFFFF"/>
+            <w:vAlign w:val="center"/>
+          </w:tcPr>
+          <w:p>
+            <w:pPr>
+              <w:keepNext/>
+              <w:spacing w:after="0"/>
+            </w:pPr>
+            <w:r>
+              <w:rPr>
+                <w:rFonts w:ascii="Calibri" w:hAnsi="Calibri"/>
+                <w:b w:val="0"/>
+                <w:i w:val="0"/>
+                <w:color w:val="222222"/>
+                <w:sz w:val="20"/>
+              </w:rPr>
+              <w:t>both registered tests fail; finding the cause changes the plan</w:t>
+            </w:r>
+          </w:p>
+        </w:tc>
+        <w:tc>
+          <w:tcPr>
+            <w:tcW w:type="dxa" w:w="1380"/>
+            <w:shd w:val="clear" w:color="auto" w:fill="FFFFFF"/>
+            <w:vAlign w:val="center"/>
+          </w:tcPr>
+          <w:p>
+            <w:pPr>
+              <w:keepNext/>
+              <w:spacing w:after="0"/>
+            </w:pPr>
+            <w:r>
+              <w:rPr>
+                <w:rFonts w:ascii="Consolas" w:hAnsi="Consolas"/>
+                <w:b w:val="0"/>
+                <w:i w:val="0"/>
+                <w:color w:val="222222"/>
+                <w:sz w:val="18"/>
+              </w:rPr>
+              <w:t>cbdd6d6</w:t>
+            </w:r>
+            <w:r>
+              <w:rPr>
+                <w:rFonts w:ascii="Calibri" w:hAnsi="Calibri"/>
+                <w:b w:val="0"/>
+                <w:i w:val="0"/>
+                <w:color w:val="222222"/>
+                <w:sz w:val="20"/>
+              </w:rPr>
+              <w:t xml:space="preserve"> … this branch</w:t>
+            </w:r>
+          </w:p>
+        </w:tc>
+      </w:tr>
+      <w:tr>
+        <w:trPr>
+          <w:cantSplit/>
+        </w:trPr>
+        <w:tc>
+          <w:tcPr>
+            <w:tcW w:type="dxa" w:w="429"/>
+            <w:shd w:val="clear" w:color="auto" w:fill="F7F9FB"/>
             <w:vAlign w:val="center"/>
           </w:tcPr>
           <w:p>
@@ -1805,14 +1937,14 @@
                 <w:color w:val="222222"/>
                 <w:sz w:val="20"/>
               </w:rPr>
-              <w:t>13</w:t>
+              <w:t>14</w:t>
             </w:r>
           </w:p>
         </w:tc>
         <w:tc>
           <w:tcPr>
-            <w:tcW w:type="dxa" w:w="1685"/>
-            <w:shd w:val="clear" w:color="auto" w:fill="FFFFFF"/>
+            <w:tcW w:type="dxa" w:w="1680"/>
+            <w:shd w:val="clear" w:color="auto" w:fill="F7F9FB"/>
             <w:vAlign w:val="center"/>
           </w:tcPr>
           <w:p>
@@ -1835,8 +1967,8 @@
         </w:tc>
         <w:tc>
           <w:tcPr>
-            <w:tcW w:type="dxa" w:w="2517"/>
-            <w:shd w:val="clear" w:color="auto" w:fill="FFFFFF"/>
+            <w:tcW w:type="dxa" w:w="2556"/>
+            <w:shd w:val="clear" w:color="auto" w:fill="F7F9FB"/>
             <w:vAlign w:val="center"/>
           </w:tcPr>
           <w:p>
@@ -1852,14 +1984,14 @@
                 <w:color w:val="222222"/>
                 <w:sz w:val="20"/>
               </w:rPr>
-              <w:t>Embodied stage 1: the male CNS drives a muscle-driven leg</w:t>
+              <w:t>Embodied stage 1c: the male nerve cord from descending neurons, brain removed</w:t>
             </w:r>
           </w:p>
         </w:tc>
         <w:tc>
           <w:tcPr>
-            <w:tcW w:type="dxa" w:w="2476"/>
-            <w:shd w:val="clear" w:color="auto" w:fill="FFFFFF"/>
+            <w:tcW w:type="dxa" w:w="2451"/>
+            <w:shd w:val="clear" w:color="auto" w:fill="F7F9FB"/>
             <w:vAlign w:val="center"/>
           </w:tcPr>
           <w:p>
@@ -1875,14 +2007,14 @@
                 <w:color w:val="222222"/>
                 <w:sz w:val="20"/>
               </w:rPr>
-              <w:t>both registered tests fail; finding the cause changes the plan</w:t>
+              <w:t>3 of 5 registered predictions pass</w:t>
             </w:r>
           </w:p>
         </w:tc>
         <w:tc>
           <w:tcPr>
-            <w:tcW w:type="dxa" w:w="1389"/>
-            <w:shd w:val="clear" w:color="auto" w:fill="FFFFFF"/>
+            <w:tcW w:type="dxa" w:w="1380"/>
+            <w:shd w:val="clear" w:color="auto" w:fill="F7F9FB"/>
             <w:vAlign w:val="center"/>
           </w:tcPr>
           <w:p>
@@ -1898,7 +2030,7 @@
                 <w:color w:val="222222"/>
                 <w:sz w:val="18"/>
               </w:rPr>
-              <w:t>cbdd6d6</w:t>
+              <w:t>739f6f0</w:t>
             </w:r>
             <w:r>
               <w:rPr>
@@ -5119,6 +5251,208 @@
           <w:sz w:val="19"/>
         </w:rPr>
         <w:t>outputs/fly/embodied_stage1*_SIMULATED.</w:t>
+      </w:r>
+      <w:r>
+        <w:rPr>
+          <w:rFonts w:ascii="Calibri" w:hAnsi="Calibri"/>
+          <w:b w:val="0"/>
+          <w:i w:val="0"/>
+          <w:color w:val="222222"/>
+          <w:sz w:val="21"/>
+        </w:rPr>
+        <w:t>.</w:t>
+      </w:r>
+    </w:p>
+    <w:p>
+      <w:pPr>
+        <w:keepNext/>
+        <w:spacing w:before="240" w:after="60"/>
+      </w:pPr>
+      <w:r>
+        <w:rPr>
+          <w:rFonts w:ascii="Calibri" w:hAnsi="Calibri"/>
+          <w:b/>
+          <w:i w:val="0"/>
+          <w:color w:val="1F4E79"/>
+          <w:sz w:val="23"/>
+        </w:rPr>
+        <w:t>14. The grooming neurons move the right leg</w:t>
+      </w:r>
+    </w:p>
+    <w:p>
+      <w:pPr>
+        <w:spacing w:after="120"/>
+      </w:pPr>
+      <w:r>
+        <w:rPr>
+          <w:rFonts w:ascii="Calibri" w:hAnsi="Calibri"/>
+          <w:b/>
+          <w:i w:val="0"/>
+          <w:color w:val="156082"/>
+          <w:sz w:val="21"/>
+        </w:rPr>
+        <w:t>Slide message:</w:t>
+      </w:r>
+      <w:r>
+        <w:rPr>
+          <w:rFonts w:ascii="Calibri" w:hAnsi="Calibri"/>
+          <w:b w:val="0"/>
+          <w:i w:val="0"/>
+          <w:color w:val="222222"/>
+          <w:sz w:val="21"/>
+        </w:rPr>
+        <w:t xml:space="preserve"> </w:t>
+      </w:r>
+      <w:r>
+        <w:rPr>
+          <w:rFonts w:ascii="Calibri" w:hAnsi="Calibri"/>
+          <w:b w:val="0"/>
+          <w:i/>
+          <w:color w:val="222222"/>
+          <w:sz w:val="21"/>
+        </w:rPr>
+        <w:t>Driven from the descending neurons that start antennal grooming, the male nerve cord moves the front leg, and only the front leg, to the head and holds it there; walking neurons swing it instead.</w:t>
+      </w:r>
+    </w:p>
+    <w:p>
+      <w:pPr>
+        <w:spacing w:after="120"/>
+        <w:ind w:left="432" w:hanging="259"/>
+      </w:pPr>
+      <w:r>
+        <w:rPr>
+          <w:rFonts w:ascii="Calibri" w:hAnsi="Calibri"/>
+          <w:b w:val="0"/>
+          <w:i w:val="0"/>
+          <w:color w:val="222222"/>
+          <w:sz w:val="21"/>
+        </w:rPr>
+        <w:t>•</w:t>
+        <w:tab/>
+      </w:r>
+      <w:r>
+        <w:rPr>
+          <w:rFonts w:ascii="Calibri" w:hAnsi="Calibri"/>
+          <w:b/>
+          <w:i w:val="0"/>
+          <w:color w:val="156082"/>
+          <w:sz w:val="21"/>
+        </w:rPr>
+        <w:t>What changed.</w:t>
+      </w:r>
+      <w:r>
+        <w:rPr>
+          <w:rFonts w:ascii="Calibri" w:hAnsi="Calibri"/>
+          <w:b w:val="0"/>
+          <w:i w:val="0"/>
+          <w:color w:val="222222"/>
+          <w:sz w:val="21"/>
+        </w:rPr>
+        <w:t xml:space="preserve"> </w:t>
+      </w:r>
+      <w:r>
+        <w:rPr>
+          <w:rFonts w:ascii="Consolas" w:hAnsi="Consolas"/>
+          <w:b w:val="0"/>
+          <w:i w:val="0"/>
+          <w:color w:val="222222"/>
+          <w:sz w:val="19"/>
+        </w:rPr>
+        <w:t>src/neuromps/fly/embodied_stage1c.py</w:t>
+      </w:r>
+      <w:r>
+        <w:rPr>
+          <w:rFonts w:ascii="Calibri" w:hAnsi="Calibri"/>
+          <w:b w:val="0"/>
+          <w:i w:val="0"/>
+          <w:color w:val="222222"/>
+          <w:sz w:val="21"/>
+        </w:rPr>
+        <w:t xml:space="preserve"> cuts the male CNS to its nerve cord (brain removed), drives named descending neurons at 150 Hz, and moves the FlyMimic leg as in stage 1. Registered before running.</w:t>
+      </w:r>
+    </w:p>
+    <w:p>
+      <w:pPr>
+        <w:spacing w:after="120"/>
+        <w:ind w:left="432" w:hanging="259"/>
+      </w:pPr>
+      <w:r>
+        <w:rPr>
+          <w:rFonts w:ascii="Calibri" w:hAnsi="Calibri"/>
+          <w:b w:val="0"/>
+          <w:i w:val="0"/>
+          <w:color w:val="222222"/>
+          <w:sz w:val="21"/>
+        </w:rPr>
+        <w:t>•</w:t>
+        <w:tab/>
+      </w:r>
+      <w:r>
+        <w:rPr>
+          <w:rFonts w:ascii="Calibri" w:hAnsi="Calibri"/>
+          <w:b/>
+          <w:i w:val="0"/>
+          <w:color w:val="156082"/>
+          <w:sz w:val="21"/>
+        </w:rPr>
+        <w:t>Effect.</w:t>
+      </w:r>
+      <w:r>
+        <w:rPr>
+          <w:rFonts w:ascii="Calibri" w:hAnsi="Calibri"/>
+          <w:b w:val="0"/>
+          <w:i w:val="0"/>
+          <w:color w:val="222222"/>
+          <w:sz w:val="21"/>
+        </w:rPr>
+        <w:t xml:space="preserve"> Three of five predictions pass: silence without drive; the left front-leg motor pool at 15.846 Hz under grooming drive against 2.72 and 1.697 for the other legs; no other descending neuron recruits the front leg as strongly. The kinematic prediction failed: forward-walking drive dips nearly as close to the head (1.154 mm against 1.1345) at the bottom of a rhythmic swing. A sustained reach and a swing need a different readout, to be registered as stage 1d.</w:t>
+      </w:r>
+    </w:p>
+    <w:p>
+      <w:pPr>
+        <w:spacing w:after="120"/>
+        <w:ind w:left="432" w:hanging="259"/>
+      </w:pPr>
+      <w:r>
+        <w:rPr>
+          <w:rFonts w:ascii="Calibri" w:hAnsi="Calibri"/>
+          <w:b w:val="0"/>
+          <w:i w:val="0"/>
+          <w:color w:val="222222"/>
+          <w:sz w:val="21"/>
+        </w:rPr>
+        <w:t>•</w:t>
+        <w:tab/>
+      </w:r>
+      <w:r>
+        <w:rPr>
+          <w:rFonts w:ascii="Calibri" w:hAnsi="Calibri"/>
+          <w:b/>
+          <w:i w:val="0"/>
+          <w:color w:val="156082"/>
+          <w:sz w:val="21"/>
+        </w:rPr>
+        <w:t>Evidence.</w:t>
+      </w:r>
+      <w:r>
+        <w:rPr>
+          <w:rFonts w:ascii="Calibri" w:hAnsi="Calibri"/>
+          <w:b w:val="0"/>
+          <w:i w:val="0"/>
+          <w:color w:val="222222"/>
+          <w:sz w:val="21"/>
+        </w:rPr>
+        <w:t xml:space="preserve"> Roadmap §7 and figure; </w:t>
+      </w:r>
+      <w:r>
+        <w:rPr>
+          <w:rFonts w:ascii="Consolas" w:hAnsi="Consolas"/>
+          <w:b w:val="0"/>
+          <w:i w:val="0"/>
+          <w:color w:val="222222"/>
+          <w:sz w:val="19"/>
+        </w:rPr>
+        <w:t>outputs/fly/embodied_stage1c_SIMULATED.</w:t>
       </w:r>
       <w:r>
         <w:rPr>

</xml_diff>

<commit_message>
Record embodied stage 1d: 4 of 4 registered predictions pass on fresh seeds
Registered (66502eb). Under the antennal-grooming drive the claw is near
the head for 0.97 of the second, under any other drive at most 0.37;
forward walking moves the leg more rhythmically than grooming (0.46
against 0.24; the giant fibre is as rhythmic, away from the head); the
same at every activation scale; stage 1c's front-leg specificity
replicates. Roadmap §7 (figure), changes log entry 15 and the paper
outline updated; Word and PDF rebuilt.

Co-Authored-By: Claude Opus 5.5 <noreply@anthropic.com>
</commit_message>
<xml_diff>
--- a/report/POST_SUBMISSION_CHANGES.docx
+++ b/report/POST_SUBMISSION_CHANGES.docx
@@ -1925,7 +1925,7 @@
           </w:tcPr>
           <w:p>
             <w:pPr>
-              <w:keepNext w:val="0"/>
+              <w:keepNext/>
               <w:spacing w:after="0"/>
               <w:jc w:val="center"/>
             </w:pPr>
@@ -1949,7 +1949,7 @@
           </w:tcPr>
           <w:p>
             <w:pPr>
-              <w:keepNext w:val="0"/>
+              <w:keepNext/>
               <w:spacing w:after="0"/>
               <w:jc w:val="center"/>
             </w:pPr>
@@ -1973,7 +1973,7 @@
           </w:tcPr>
           <w:p>
             <w:pPr>
-              <w:keepNext w:val="0"/>
+              <w:keepNext/>
               <w:spacing w:after="0"/>
             </w:pPr>
             <w:r>
@@ -1996,7 +1996,7 @@
           </w:tcPr>
           <w:p>
             <w:pPr>
-              <w:keepNext w:val="0"/>
+              <w:keepNext/>
               <w:spacing w:after="0"/>
             </w:pPr>
             <w:r>
@@ -2019,18 +2019,160 @@
           </w:tcPr>
           <w:p>
             <w:pPr>
+              <w:keepNext/>
+              <w:spacing w:after="0"/>
+            </w:pPr>
+            <w:r>
+              <w:rPr>
+                <w:rFonts w:ascii="Consolas" w:hAnsi="Consolas"/>
+                <w:b w:val="0"/>
+                <w:i w:val="0"/>
+                <w:color w:val="222222"/>
+                <w:sz w:val="18"/>
+              </w:rPr>
+              <w:t>739f6f0</w:t>
+            </w:r>
+            <w:r>
+              <w:rPr>
+                <w:rFonts w:ascii="Calibri" w:hAnsi="Calibri"/>
+                <w:b w:val="0"/>
+                <w:i w:val="0"/>
+                <w:color w:val="222222"/>
+                <w:sz w:val="20"/>
+              </w:rPr>
+              <w:t xml:space="preserve"> … </w:t>
+            </w:r>
+            <w:r>
+              <w:rPr>
+                <w:rFonts w:ascii="Consolas" w:hAnsi="Consolas"/>
+                <w:b w:val="0"/>
+                <w:i w:val="0"/>
+                <w:color w:val="222222"/>
+                <w:sz w:val="18"/>
+              </w:rPr>
+              <w:t>e576cd9</w:t>
+            </w:r>
+          </w:p>
+        </w:tc>
+      </w:tr>
+      <w:tr>
+        <w:trPr>
+          <w:cantSplit/>
+        </w:trPr>
+        <w:tc>
+          <w:tcPr>
+            <w:tcW w:type="dxa" w:w="429"/>
+            <w:shd w:val="clear" w:color="auto" w:fill="FFFFFF"/>
+            <w:vAlign w:val="center"/>
+          </w:tcPr>
+          <w:p>
+            <w:pPr>
+              <w:keepNext w:val="0"/>
+              <w:spacing w:after="0"/>
+              <w:jc w:val="center"/>
+            </w:pPr>
+            <w:r>
+              <w:rPr>
+                <w:rFonts w:ascii="Calibri" w:hAnsi="Calibri"/>
+                <w:b/>
+                <w:i w:val="0"/>
+                <w:color w:val="222222"/>
+                <w:sz w:val="20"/>
+              </w:rPr>
+              <w:t>15</w:t>
+            </w:r>
+          </w:p>
+        </w:tc>
+        <w:tc>
+          <w:tcPr>
+            <w:tcW w:type="dxa" w:w="1680"/>
+            <w:shd w:val="clear" w:color="auto" w:fill="FFFFFF"/>
+            <w:vAlign w:val="center"/>
+          </w:tcPr>
+          <w:p>
+            <w:pPr>
+              <w:keepNext w:val="0"/>
+              <w:spacing w:after="0"/>
+              <w:jc w:val="center"/>
+            </w:pPr>
+            <w:r>
+              <w:rPr>
+                <w:rFonts w:ascii="Calibri" w:hAnsi="Calibri"/>
+                <w:b w:val="0"/>
+                <w:i w:val="0"/>
+                <w:color w:val="222222"/>
+                <w:sz w:val="20"/>
+              </w:rPr>
+              <w:t>2026-10-24</w:t>
+            </w:r>
+          </w:p>
+        </w:tc>
+        <w:tc>
+          <w:tcPr>
+            <w:tcW w:type="dxa" w:w="2556"/>
+            <w:shd w:val="clear" w:color="auto" w:fill="FFFFFF"/>
+            <w:vAlign w:val="center"/>
+          </w:tcPr>
+          <w:p>
+            <w:pPr>
               <w:keepNext w:val="0"/>
               <w:spacing w:after="0"/>
             </w:pPr>
             <w:r>
               <w:rPr>
+                <w:rFonts w:ascii="Calibri" w:hAnsi="Calibri"/>
+                <w:b w:val="0"/>
+                <w:i w:val="0"/>
+                <w:color w:val="222222"/>
+                <w:sz w:val="20"/>
+              </w:rPr>
+              <w:t>Embodied stage 1d: a held reach against a rhythmic swing, fresh seeds</w:t>
+            </w:r>
+          </w:p>
+        </w:tc>
+        <w:tc>
+          <w:tcPr>
+            <w:tcW w:type="dxa" w:w="2451"/>
+            <w:shd w:val="clear" w:color="auto" w:fill="FFFFFF"/>
+            <w:vAlign w:val="center"/>
+          </w:tcPr>
+          <w:p>
+            <w:pPr>
+              <w:keepNext w:val="0"/>
+              <w:spacing w:after="0"/>
+            </w:pPr>
+            <w:r>
+              <w:rPr>
+                <w:rFonts w:ascii="Calibri" w:hAnsi="Calibri"/>
+                <w:b w:val="0"/>
+                <w:i w:val="0"/>
+                <w:color w:val="222222"/>
+                <w:sz w:val="20"/>
+              </w:rPr>
+              <w:t>4 of 4 registered predictions pass</w:t>
+            </w:r>
+          </w:p>
+        </w:tc>
+        <w:tc>
+          <w:tcPr>
+            <w:tcW w:type="dxa" w:w="1380"/>
+            <w:shd w:val="clear" w:color="auto" w:fill="FFFFFF"/>
+            <w:vAlign w:val="center"/>
+          </w:tcPr>
+          <w:p>
+            <w:pPr>
+              <w:keepNext w:val="0"/>
+              <w:spacing w:after="0"/>
+            </w:pPr>
+            <w:r>
+              <w:rPr>
                 <w:rFonts w:ascii="Consolas" w:hAnsi="Consolas"/>
                 <w:b w:val="0"/>
                 <w:i w:val="0"/>
                 <w:color w:val="222222"/>
                 <w:sz w:val="18"/>
               </w:rPr>
-              <w:t>739f6f0</w:t>
+              <w:t>66502eb</w:t>
             </w:r>
             <w:r>
               <w:rPr>
@@ -5453,6 +5595,248 @@
           <w:sz w:val="19"/>
         </w:rPr>
         <w:t>outputs/fly/embodied_stage1c_SIMULATED.</w:t>
+      </w:r>
+      <w:r>
+        <w:rPr>
+          <w:rFonts w:ascii="Calibri" w:hAnsi="Calibri"/>
+          <w:b w:val="0"/>
+          <w:i w:val="0"/>
+          <w:color w:val="222222"/>
+          <w:sz w:val="21"/>
+        </w:rPr>
+        <w:t>.</w:t>
+      </w:r>
+    </w:p>
+    <w:p>
+      <w:pPr>
+        <w:keepNext/>
+        <w:spacing w:before="240" w:after="60"/>
+      </w:pPr>
+      <w:r>
+        <w:rPr>
+          <w:rFonts w:ascii="Calibri" w:hAnsi="Calibri"/>
+          <w:b/>
+          <w:i w:val="0"/>
+          <w:color w:val="1F4E79"/>
+          <w:sz w:val="23"/>
+        </w:rPr>
+        <w:t>15. The fly's grooming neurons hold its leg at its head</w:t>
+      </w:r>
+    </w:p>
+    <w:p>
+      <w:pPr>
+        <w:spacing w:after="120"/>
+      </w:pPr>
+      <w:r>
+        <w:rPr>
+          <w:rFonts w:ascii="Calibri" w:hAnsi="Calibri"/>
+          <w:b/>
+          <w:i w:val="0"/>
+          <w:color w:val="156082"/>
+          <w:sz w:val="21"/>
+        </w:rPr>
+        <w:t>Slide message:</w:t>
+      </w:r>
+      <w:r>
+        <w:rPr>
+          <w:rFonts w:ascii="Calibri" w:hAnsi="Calibri"/>
+          <w:b w:val="0"/>
+          <w:i w:val="0"/>
+          <w:color w:val="222222"/>
+          <w:sz w:val="21"/>
+        </w:rPr>
+        <w:t xml:space="preserve"> </w:t>
+      </w:r>
+      <w:r>
+        <w:rPr>
+          <w:rFonts w:ascii="Calibri" w:hAnsi="Calibri"/>
+          <w:b w:val="0"/>
+          <w:i/>
+          <w:color w:val="222222"/>
+          <w:sz w:val="21"/>
+        </w:rPr>
+        <w:t>On fresh seeds and with readouts registered in advance: driving the fly's antennal-grooming neurons brings the simulated front leg to the head and holds it there for nearly the whole second; walking neurons swing it, escape neurons extend it.</w:t>
+      </w:r>
+    </w:p>
+    <w:p>
+      <w:pPr>
+        <w:spacing w:after="120"/>
+        <w:ind w:left="432" w:hanging="259"/>
+      </w:pPr>
+      <w:r>
+        <w:rPr>
+          <w:rFonts w:ascii="Calibri" w:hAnsi="Calibri"/>
+          <w:b w:val="0"/>
+          <w:i w:val="0"/>
+          <w:color w:val="222222"/>
+          <w:sz w:val="21"/>
+        </w:rPr>
+        <w:t>•</w:t>
+        <w:tab/>
+      </w:r>
+      <w:r>
+        <w:rPr>
+          <w:rFonts w:ascii="Calibri" w:hAnsi="Calibri"/>
+          <w:b/>
+          <w:i w:val="0"/>
+          <w:color w:val="156082"/>
+          <w:sz w:val="21"/>
+        </w:rPr>
+        <w:t>What changed.</w:t>
+      </w:r>
+      <w:r>
+        <w:rPr>
+          <w:rFonts w:ascii="Calibri" w:hAnsi="Calibri"/>
+          <w:b w:val="0"/>
+          <w:i w:val="0"/>
+          <w:color w:val="222222"/>
+          <w:sz w:val="21"/>
+        </w:rPr>
+        <w:t xml:space="preserve"> </w:t>
+      </w:r>
+      <w:r>
+        <w:rPr>
+          <w:rFonts w:ascii="Consolas" w:hAnsi="Consolas"/>
+          <w:b w:val="0"/>
+          <w:i w:val="0"/>
+          <w:color w:val="222222"/>
+          <w:sz w:val="19"/>
+        </w:rPr>
+        <w:t>src/neuromps/fly/kinematics.py</w:t>
+      </w:r>
+      <w:r>
+        <w:rPr>
+          <w:rFonts w:ascii="Calibri" w:hAnsi="Calibri"/>
+          <w:b w:val="0"/>
+          <w:i w:val="0"/>
+          <w:color w:val="222222"/>
+          <w:sz w:val="21"/>
+        </w:rPr>
+        <w:t xml:space="preserve"> adds two readouts (time near the head; rhythmicity), </w:t>
+      </w:r>
+      <w:r>
+        <w:rPr>
+          <w:rFonts w:ascii="Consolas" w:hAnsi="Consolas"/>
+          <w:b w:val="0"/>
+          <w:i w:val="0"/>
+          <w:color w:val="222222"/>
+          <w:sz w:val="19"/>
+        </w:rPr>
+        <w:t>src/neuromps/fly/embodied_stage1d.py</w:t>
+      </w:r>
+      <w:r>
+        <w:rPr>
+          <w:rFonts w:ascii="Calibri" w:hAnsi="Calibri"/>
+          <w:b w:val="0"/>
+          <w:i w:val="0"/>
+          <w:color w:val="222222"/>
+          <w:sz w:val="21"/>
+        </w:rPr>
+        <w:t xml:space="preserve"> reruns stage 1c's design on fresh seeds. The readouts were suggested by stage 1c's traces, so they were registered before this run (</w:t>
+      </w:r>
+      <w:r>
+        <w:rPr>
+          <w:rFonts w:ascii="Consolas" w:hAnsi="Consolas"/>
+          <w:b w:val="0"/>
+          <w:i w:val="0"/>
+          <w:color w:val="222222"/>
+          <w:sz w:val="19"/>
+        </w:rPr>
+        <w:t>preregistration/embodied_stage1d_reach_versus_swing.json</w:t>
+      </w:r>
+      <w:r>
+        <w:rPr>
+          <w:rFonts w:ascii="Calibri" w:hAnsi="Calibri"/>
+          <w:b w:val="0"/>
+          <w:i w:val="0"/>
+          <w:color w:val="222222"/>
+          <w:sz w:val="21"/>
+        </w:rPr>
+        <w:t>) and tested out of sample.</w:t>
+      </w:r>
+    </w:p>
+    <w:p>
+      <w:pPr>
+        <w:spacing w:after="120"/>
+        <w:ind w:left="432" w:hanging="259"/>
+      </w:pPr>
+      <w:r>
+        <w:rPr>
+          <w:rFonts w:ascii="Calibri" w:hAnsi="Calibri"/>
+          <w:b w:val="0"/>
+          <w:i w:val="0"/>
+          <w:color w:val="222222"/>
+          <w:sz w:val="21"/>
+        </w:rPr>
+        <w:t>•</w:t>
+        <w:tab/>
+      </w:r>
+      <w:r>
+        <w:rPr>
+          <w:rFonts w:ascii="Calibri" w:hAnsi="Calibri"/>
+          <w:b/>
+          <w:i w:val="0"/>
+          <w:color w:val="156082"/>
+          <w:sz w:val="21"/>
+        </w:rPr>
+        <w:t>Effect.</w:t>
+      </w:r>
+      <w:r>
+        <w:rPr>
+          <w:rFonts w:ascii="Calibri" w:hAnsi="Calibri"/>
+          <w:b w:val="0"/>
+          <w:i w:val="0"/>
+          <w:color w:val="222222"/>
+          <w:sz w:val="21"/>
+        </w:rPr>
+        <w:t xml:space="preserve"> All four predictions pass: time near the head 0.9665 under grooming drive against at most 0.368 under any other; forward walking more rhythmic than grooming; the same at every activation scale; the front-leg specificity of stage 1c replicates. Stage 1c's failed predictions stay failed.</w:t>
+      </w:r>
+    </w:p>
+    <w:p>
+      <w:pPr>
+        <w:spacing w:after="120"/>
+        <w:ind w:left="432" w:hanging="259"/>
+      </w:pPr>
+      <w:r>
+        <w:rPr>
+          <w:rFonts w:ascii="Calibri" w:hAnsi="Calibri"/>
+          <w:b w:val="0"/>
+          <w:i w:val="0"/>
+          <w:color w:val="222222"/>
+          <w:sz w:val="21"/>
+        </w:rPr>
+        <w:t>•</w:t>
+        <w:tab/>
+      </w:r>
+      <w:r>
+        <w:rPr>
+          <w:rFonts w:ascii="Calibri" w:hAnsi="Calibri"/>
+          <w:b/>
+          <w:i w:val="0"/>
+          <w:color w:val="156082"/>
+          <w:sz w:val="21"/>
+        </w:rPr>
+        <w:t>Evidence.</w:t>
+      </w:r>
+      <w:r>
+        <w:rPr>
+          <w:rFonts w:ascii="Calibri" w:hAnsi="Calibri"/>
+          <w:b w:val="0"/>
+          <w:i w:val="0"/>
+          <w:color w:val="222222"/>
+          <w:sz w:val="21"/>
+        </w:rPr>
+        <w:t xml:space="preserve"> Roadmap §7 and figure; </w:t>
+      </w:r>
+      <w:r>
+        <w:rPr>
+          <w:rFonts w:ascii="Consolas" w:hAnsi="Consolas"/>
+          <w:b w:val="0"/>
+          <w:i w:val="0"/>
+          <w:color w:val="222222"/>
+          <w:sz w:val="19"/>
+        </w:rPr>
+        <w:t>outputs/fly/embodied_stage1d_SIMULATED.</w:t>
       </w:r>
       <w:r>
         <w:rPr>

</xml_diff>

<commit_message>
Record embodied stage 1f: 5 of 5 registered predictions pass; stage 1 complete
Registered (c8a0fbb), fresh seeds. Antennal input to the FlyWire brain,
relayed by matched descending neurons into the male nerve cord, brings the
claw to 0.54 mm of the antenna; sugar input to 0.94; none leaves it at
rest; the front-leg pool carries it; removing aDN1 and aDN2 returns it to
1.48 mm. Stage 1e stays uninterpretable as registered. Roadmap §7 (figure),
changes log entry 16, paper outline; Word and PDF rebuilt.

Co-Authored-By: Claude Opus 5.5 <noreply@anthropic.com>
</commit_message>
<xml_diff>
--- a/report/POST_SUBMISSION_CHANGES.docx
+++ b/report/POST_SUBMISSION_CHANGES.docx
@@ -48,11 +48,11 @@
         <w:tblLook w:firstColumn="1" w:firstRow="1" w:lastColumn="0" w:lastRow="0" w:noHBand="0" w:noVBand="1" w:val="04A0"/>
       </w:tblPr>
       <w:tblGrid>
-        <w:gridCol w:w="429"/>
-        <w:gridCol w:w="1680"/>
-        <w:gridCol w:w="2556"/>
-        <w:gridCol w:w="2451"/>
-        <w:gridCol w:w="1380"/>
+        <w:gridCol w:w="427"/>
+        <w:gridCol w:w="1666"/>
+        <w:gridCol w:w="2550"/>
+        <w:gridCol w:w="2497"/>
+        <w:gridCol w:w="1356"/>
       </w:tblGrid>
       <w:tr>
         <w:trPr>
@@ -61,7 +61,7 @@
         </w:trPr>
         <w:tc>
           <w:tcPr>
-            <w:tcW w:type="dxa" w:w="429"/>
+            <w:tcW w:type="dxa" w:w="427"/>
             <w:shd w:val="clear" w:color="auto" w:fill="1F4E79"/>
             <w:vAlign w:val="center"/>
           </w:tcPr>
@@ -85,7 +85,7 @@
         </w:tc>
         <w:tc>
           <w:tcPr>
-            <w:tcW w:type="dxa" w:w="1680"/>
+            <w:tcW w:type="dxa" w:w="1666"/>
             <w:shd w:val="clear" w:color="auto" w:fill="1F4E79"/>
             <w:vAlign w:val="center"/>
           </w:tcPr>
@@ -109,7 +109,7 @@
         </w:tc>
         <w:tc>
           <w:tcPr>
-            <w:tcW w:type="dxa" w:w="2556"/>
+            <w:tcW w:type="dxa" w:w="2550"/>
             <w:shd w:val="clear" w:color="auto" w:fill="1F4E79"/>
             <w:vAlign w:val="center"/>
           </w:tcPr>
@@ -132,7 +132,7 @@
         </w:tc>
         <w:tc>
           <w:tcPr>
-            <w:tcW w:type="dxa" w:w="2451"/>
+            <w:tcW w:type="dxa" w:w="2497"/>
             <w:shd w:val="clear" w:color="auto" w:fill="1F4E79"/>
             <w:vAlign w:val="center"/>
           </w:tcPr>
@@ -155,7 +155,7 @@
         </w:tc>
         <w:tc>
           <w:tcPr>
-            <w:tcW w:type="dxa" w:w="1380"/>
+            <w:tcW w:type="dxa" w:w="1356"/>
             <w:shd w:val="clear" w:color="auto" w:fill="1F4E79"/>
             <w:vAlign w:val="center"/>
           </w:tcPr>
@@ -183,7 +183,7 @@
         </w:trPr>
         <w:tc>
           <w:tcPr>
-            <w:tcW w:type="dxa" w:w="429"/>
+            <w:tcW w:type="dxa" w:w="427"/>
             <w:shd w:val="clear" w:color="auto" w:fill="FFFFFF"/>
             <w:vAlign w:val="center"/>
           </w:tcPr>
@@ -207,7 +207,7 @@
         </w:tc>
         <w:tc>
           <w:tcPr>
-            <w:tcW w:type="dxa" w:w="1680"/>
+            <w:tcW w:type="dxa" w:w="1666"/>
             <w:shd w:val="clear" w:color="auto" w:fill="FFFFFF"/>
             <w:vAlign w:val="center"/>
           </w:tcPr>
@@ -231,7 +231,7 @@
         </w:tc>
         <w:tc>
           <w:tcPr>
-            <w:tcW w:type="dxa" w:w="2556"/>
+            <w:tcW w:type="dxa" w:w="2550"/>
             <w:shd w:val="clear" w:color="auto" w:fill="FFFFFF"/>
             <w:vAlign w:val="center"/>
           </w:tcPr>
@@ -254,7 +254,7 @@
         </w:tc>
         <w:tc>
           <w:tcPr>
-            <w:tcW w:type="dxa" w:w="2451"/>
+            <w:tcW w:type="dxa" w:w="2497"/>
             <w:shd w:val="clear" w:color="auto" w:fill="FFFFFF"/>
             <w:vAlign w:val="center"/>
           </w:tcPr>
@@ -277,7 +277,7 @@
         </w:tc>
         <w:tc>
           <w:tcPr>
-            <w:tcW w:type="dxa" w:w="1380"/>
+            <w:tcW w:type="dxa" w:w="1356"/>
             <w:shd w:val="clear" w:color="auto" w:fill="FFFFFF"/>
             <w:vAlign w:val="center"/>
           </w:tcPr>
@@ -325,7 +325,7 @@
         </w:trPr>
         <w:tc>
           <w:tcPr>
-            <w:tcW w:type="dxa" w:w="429"/>
+            <w:tcW w:type="dxa" w:w="427"/>
             <w:shd w:val="clear" w:color="auto" w:fill="F7F9FB"/>
             <w:vAlign w:val="center"/>
           </w:tcPr>
@@ -349,7 +349,7 @@
         </w:tc>
         <w:tc>
           <w:tcPr>
-            <w:tcW w:type="dxa" w:w="1680"/>
+            <w:tcW w:type="dxa" w:w="1666"/>
             <w:shd w:val="clear" w:color="auto" w:fill="F7F9FB"/>
             <w:vAlign w:val="center"/>
           </w:tcPr>
@@ -373,7 +373,7 @@
         </w:tc>
         <w:tc>
           <w:tcPr>
-            <w:tcW w:type="dxa" w:w="2556"/>
+            <w:tcW w:type="dxa" w:w="2550"/>
             <w:shd w:val="clear" w:color="auto" w:fill="F7F9FB"/>
             <w:vAlign w:val="center"/>
           </w:tcPr>
@@ -396,7 +396,7 @@
         </w:tc>
         <w:tc>
           <w:tcPr>
-            <w:tcW w:type="dxa" w:w="2451"/>
+            <w:tcW w:type="dxa" w:w="2497"/>
             <w:shd w:val="clear" w:color="auto" w:fill="F7F9FB"/>
             <w:vAlign w:val="center"/>
           </w:tcPr>
@@ -419,7 +419,7 @@
         </w:tc>
         <w:tc>
           <w:tcPr>
-            <w:tcW w:type="dxa" w:w="1380"/>
+            <w:tcW w:type="dxa" w:w="1356"/>
             <w:shd w:val="clear" w:color="auto" w:fill="F7F9FB"/>
             <w:vAlign w:val="center"/>
           </w:tcPr>
@@ -447,7 +447,7 @@
         </w:trPr>
         <w:tc>
           <w:tcPr>
-            <w:tcW w:type="dxa" w:w="429"/>
+            <w:tcW w:type="dxa" w:w="427"/>
             <w:shd w:val="clear" w:color="auto" w:fill="FFFFFF"/>
             <w:vAlign w:val="center"/>
           </w:tcPr>
@@ -471,7 +471,7 @@
         </w:tc>
         <w:tc>
           <w:tcPr>
-            <w:tcW w:type="dxa" w:w="1680"/>
+            <w:tcW w:type="dxa" w:w="1666"/>
             <w:shd w:val="clear" w:color="auto" w:fill="FFFFFF"/>
             <w:vAlign w:val="center"/>
           </w:tcPr>
@@ -495,7 +495,7 @@
         </w:tc>
         <w:tc>
           <w:tcPr>
-            <w:tcW w:type="dxa" w:w="2556"/>
+            <w:tcW w:type="dxa" w:w="2550"/>
             <w:shd w:val="clear" w:color="auto" w:fill="FFFFFF"/>
             <w:vAlign w:val="center"/>
           </w:tcPr>
@@ -518,7 +518,7 @@
         </w:tc>
         <w:tc>
           <w:tcPr>
-            <w:tcW w:type="dxa" w:w="2451"/>
+            <w:tcW w:type="dxa" w:w="2497"/>
             <w:shd w:val="clear" w:color="auto" w:fill="FFFFFF"/>
             <w:vAlign w:val="center"/>
           </w:tcPr>
@@ -541,7 +541,7 @@
         </w:tc>
         <w:tc>
           <w:tcPr>
-            <w:tcW w:type="dxa" w:w="1380"/>
+            <w:tcW w:type="dxa" w:w="1356"/>
             <w:shd w:val="clear" w:color="auto" w:fill="FFFFFF"/>
             <w:vAlign w:val="center"/>
           </w:tcPr>
@@ -569,7 +569,7 @@
         </w:trPr>
         <w:tc>
           <w:tcPr>
-            <w:tcW w:type="dxa" w:w="429"/>
+            <w:tcW w:type="dxa" w:w="427"/>
             <w:shd w:val="clear" w:color="auto" w:fill="F7F9FB"/>
             <w:vAlign w:val="center"/>
           </w:tcPr>
@@ -593,7 +593,7 @@
         </w:tc>
         <w:tc>
           <w:tcPr>
-            <w:tcW w:type="dxa" w:w="1680"/>
+            <w:tcW w:type="dxa" w:w="1666"/>
             <w:shd w:val="clear" w:color="auto" w:fill="F7F9FB"/>
             <w:vAlign w:val="center"/>
           </w:tcPr>
@@ -617,7 +617,7 @@
         </w:tc>
         <w:tc>
           <w:tcPr>
-            <w:tcW w:type="dxa" w:w="2556"/>
+            <w:tcW w:type="dxa" w:w="2550"/>
             <w:shd w:val="clear" w:color="auto" w:fill="F7F9FB"/>
             <w:vAlign w:val="center"/>
           </w:tcPr>
@@ -640,7 +640,7 @@
         </w:tc>
         <w:tc>
           <w:tcPr>
-            <w:tcW w:type="dxa" w:w="2451"/>
+            <w:tcW w:type="dxa" w:w="2497"/>
             <w:shd w:val="clear" w:color="auto" w:fill="F7F9FB"/>
             <w:vAlign w:val="center"/>
           </w:tcPr>
@@ -663,7 +663,7 @@
         </w:tc>
         <w:tc>
           <w:tcPr>
-            <w:tcW w:type="dxa" w:w="1380"/>
+            <w:tcW w:type="dxa" w:w="1356"/>
             <w:shd w:val="clear" w:color="auto" w:fill="F7F9FB"/>
             <w:vAlign w:val="center"/>
           </w:tcPr>
@@ -711,7 +711,7 @@
         </w:trPr>
         <w:tc>
           <w:tcPr>
-            <w:tcW w:type="dxa" w:w="429"/>
+            <w:tcW w:type="dxa" w:w="427"/>
             <w:shd w:val="clear" w:color="auto" w:fill="FFFFFF"/>
             <w:vAlign w:val="center"/>
           </w:tcPr>
@@ -735,7 +735,7 @@
         </w:tc>
         <w:tc>
           <w:tcPr>
-            <w:tcW w:type="dxa" w:w="1680"/>
+            <w:tcW w:type="dxa" w:w="1666"/>
             <w:shd w:val="clear" w:color="auto" w:fill="FFFFFF"/>
             <w:vAlign w:val="center"/>
           </w:tcPr>
@@ -759,7 +759,7 @@
         </w:tc>
         <w:tc>
           <w:tcPr>
-            <w:tcW w:type="dxa" w:w="2556"/>
+            <w:tcW w:type="dxa" w:w="2550"/>
             <w:shd w:val="clear" w:color="auto" w:fill="FFFFFF"/>
             <w:vAlign w:val="center"/>
           </w:tcPr>
@@ -782,7 +782,7 @@
         </w:tc>
         <w:tc>
           <w:tcPr>
-            <w:tcW w:type="dxa" w:w="2451"/>
+            <w:tcW w:type="dxa" w:w="2497"/>
             <w:shd w:val="clear" w:color="auto" w:fill="FFFFFF"/>
             <w:vAlign w:val="center"/>
           </w:tcPr>
@@ -805,7 +805,7 @@
         </w:tc>
         <w:tc>
           <w:tcPr>
-            <w:tcW w:type="dxa" w:w="1380"/>
+            <w:tcW w:type="dxa" w:w="1356"/>
             <w:shd w:val="clear" w:color="auto" w:fill="FFFFFF"/>
             <w:vAlign w:val="center"/>
           </w:tcPr>
@@ -833,7 +833,7 @@
         </w:trPr>
         <w:tc>
           <w:tcPr>
-            <w:tcW w:type="dxa" w:w="429"/>
+            <w:tcW w:type="dxa" w:w="427"/>
             <w:shd w:val="clear" w:color="auto" w:fill="F7F9FB"/>
             <w:vAlign w:val="center"/>
           </w:tcPr>
@@ -857,7 +857,7 @@
         </w:tc>
         <w:tc>
           <w:tcPr>
-            <w:tcW w:type="dxa" w:w="1680"/>
+            <w:tcW w:type="dxa" w:w="1666"/>
             <w:shd w:val="clear" w:color="auto" w:fill="F7F9FB"/>
             <w:vAlign w:val="center"/>
           </w:tcPr>
@@ -881,7 +881,7 @@
         </w:tc>
         <w:tc>
           <w:tcPr>
-            <w:tcW w:type="dxa" w:w="2556"/>
+            <w:tcW w:type="dxa" w:w="2550"/>
             <w:shd w:val="clear" w:color="auto" w:fill="F7F9FB"/>
             <w:vAlign w:val="center"/>
           </w:tcPr>
@@ -904,7 +904,7 @@
         </w:tc>
         <w:tc>
           <w:tcPr>
-            <w:tcW w:type="dxa" w:w="2451"/>
+            <w:tcW w:type="dxa" w:w="2497"/>
             <w:shd w:val="clear" w:color="auto" w:fill="F7F9FB"/>
             <w:vAlign w:val="center"/>
           </w:tcPr>
@@ -927,7 +927,7 @@
         </w:tc>
         <w:tc>
           <w:tcPr>
-            <w:tcW w:type="dxa" w:w="1380"/>
+            <w:tcW w:type="dxa" w:w="1356"/>
             <w:shd w:val="clear" w:color="auto" w:fill="F7F9FB"/>
             <w:vAlign w:val="center"/>
           </w:tcPr>
@@ -955,7 +955,7 @@
         </w:trPr>
         <w:tc>
           <w:tcPr>
-            <w:tcW w:type="dxa" w:w="429"/>
+            <w:tcW w:type="dxa" w:w="427"/>
             <w:shd w:val="clear" w:color="auto" w:fill="FFFFFF"/>
             <w:vAlign w:val="center"/>
           </w:tcPr>
@@ -979,7 +979,7 @@
         </w:tc>
         <w:tc>
           <w:tcPr>
-            <w:tcW w:type="dxa" w:w="1680"/>
+            <w:tcW w:type="dxa" w:w="1666"/>
             <w:shd w:val="clear" w:color="auto" w:fill="FFFFFF"/>
             <w:vAlign w:val="center"/>
           </w:tcPr>
@@ -1003,7 +1003,7 @@
         </w:tc>
         <w:tc>
           <w:tcPr>
-            <w:tcW w:type="dxa" w:w="2556"/>
+            <w:tcW w:type="dxa" w:w="2550"/>
             <w:shd w:val="clear" w:color="auto" w:fill="FFFFFF"/>
             <w:vAlign w:val="center"/>
           </w:tcPr>
@@ -1026,7 +1026,7 @@
         </w:tc>
         <w:tc>
           <w:tcPr>
-            <w:tcW w:type="dxa" w:w="2451"/>
+            <w:tcW w:type="dxa" w:w="2497"/>
             <w:shd w:val="clear" w:color="auto" w:fill="FFFFFF"/>
             <w:vAlign w:val="center"/>
           </w:tcPr>
@@ -1049,7 +1049,7 @@
         </w:tc>
         <w:tc>
           <w:tcPr>
-            <w:tcW w:type="dxa" w:w="1380"/>
+            <w:tcW w:type="dxa" w:w="1356"/>
             <w:shd w:val="clear" w:color="auto" w:fill="FFFFFF"/>
             <w:vAlign w:val="center"/>
           </w:tcPr>
@@ -1097,7 +1097,7 @@
         </w:trPr>
         <w:tc>
           <w:tcPr>
-            <w:tcW w:type="dxa" w:w="429"/>
+            <w:tcW w:type="dxa" w:w="427"/>
             <w:shd w:val="clear" w:color="auto" w:fill="F7F9FB"/>
             <w:vAlign w:val="center"/>
           </w:tcPr>
@@ -1121,7 +1121,7 @@
         </w:tc>
         <w:tc>
           <w:tcPr>
-            <w:tcW w:type="dxa" w:w="1680"/>
+            <w:tcW w:type="dxa" w:w="1666"/>
             <w:shd w:val="clear" w:color="auto" w:fill="F7F9FB"/>
             <w:vAlign w:val="center"/>
           </w:tcPr>
@@ -1145,7 +1145,7 @@
         </w:tc>
         <w:tc>
           <w:tcPr>
-            <w:tcW w:type="dxa" w:w="2556"/>
+            <w:tcW w:type="dxa" w:w="2550"/>
             <w:shd w:val="clear" w:color="auto" w:fill="F7F9FB"/>
             <w:vAlign w:val="center"/>
           </w:tcPr>
@@ -1168,7 +1168,7 @@
         </w:tc>
         <w:tc>
           <w:tcPr>
-            <w:tcW w:type="dxa" w:w="2451"/>
+            <w:tcW w:type="dxa" w:w="2497"/>
             <w:shd w:val="clear" w:color="auto" w:fill="F7F9FB"/>
             <w:vAlign w:val="center"/>
           </w:tcPr>
@@ -1191,7 +1191,7 @@
         </w:tc>
         <w:tc>
           <w:tcPr>
-            <w:tcW w:type="dxa" w:w="1380"/>
+            <w:tcW w:type="dxa" w:w="1356"/>
             <w:shd w:val="clear" w:color="auto" w:fill="F7F9FB"/>
             <w:vAlign w:val="center"/>
           </w:tcPr>
@@ -1239,7 +1239,7 @@
         </w:trPr>
         <w:tc>
           <w:tcPr>
-            <w:tcW w:type="dxa" w:w="429"/>
+            <w:tcW w:type="dxa" w:w="427"/>
             <w:shd w:val="clear" w:color="auto" w:fill="FFFFFF"/>
             <w:vAlign w:val="center"/>
           </w:tcPr>
@@ -1263,7 +1263,7 @@
         </w:tc>
         <w:tc>
           <w:tcPr>
-            <w:tcW w:type="dxa" w:w="1680"/>
+            <w:tcW w:type="dxa" w:w="1666"/>
             <w:shd w:val="clear" w:color="auto" w:fill="FFFFFF"/>
             <w:vAlign w:val="center"/>
           </w:tcPr>
@@ -1287,7 +1287,7 @@
         </w:tc>
         <w:tc>
           <w:tcPr>
-            <w:tcW w:type="dxa" w:w="2556"/>
+            <w:tcW w:type="dxa" w:w="2550"/>
             <w:shd w:val="clear" w:color="auto" w:fill="FFFFFF"/>
             <w:vAlign w:val="center"/>
           </w:tcPr>
@@ -1310,7 +1310,7 @@
         </w:tc>
         <w:tc>
           <w:tcPr>
-            <w:tcW w:type="dxa" w:w="2451"/>
+            <w:tcW w:type="dxa" w:w="2497"/>
             <w:shd w:val="clear" w:color="auto" w:fill="FFFFFF"/>
             <w:vAlign w:val="center"/>
           </w:tcPr>
@@ -1333,7 +1333,7 @@
         </w:tc>
         <w:tc>
           <w:tcPr>
-            <w:tcW w:type="dxa" w:w="1380"/>
+            <w:tcW w:type="dxa" w:w="1356"/>
             <w:shd w:val="clear" w:color="auto" w:fill="FFFFFF"/>
             <w:vAlign w:val="center"/>
           </w:tcPr>
@@ -1381,7 +1381,7 @@
         </w:trPr>
         <w:tc>
           <w:tcPr>
-            <w:tcW w:type="dxa" w:w="429"/>
+            <w:tcW w:type="dxa" w:w="427"/>
             <w:shd w:val="clear" w:color="auto" w:fill="F7F9FB"/>
             <w:vAlign w:val="center"/>
           </w:tcPr>
@@ -1405,7 +1405,7 @@
         </w:tc>
         <w:tc>
           <w:tcPr>
-            <w:tcW w:type="dxa" w:w="1680"/>
+            <w:tcW w:type="dxa" w:w="1666"/>
             <w:shd w:val="clear" w:color="auto" w:fill="F7F9FB"/>
             <w:vAlign w:val="center"/>
           </w:tcPr>
@@ -1429,7 +1429,7 @@
         </w:tc>
         <w:tc>
           <w:tcPr>
-            <w:tcW w:type="dxa" w:w="2556"/>
+            <w:tcW w:type="dxa" w:w="2550"/>
             <w:shd w:val="clear" w:color="auto" w:fill="F7F9FB"/>
             <w:vAlign w:val="center"/>
           </w:tcPr>
@@ -1452,7 +1452,7 @@
         </w:tc>
         <w:tc>
           <w:tcPr>
-            <w:tcW w:type="dxa" w:w="2451"/>
+            <w:tcW w:type="dxa" w:w="2497"/>
             <w:shd w:val="clear" w:color="auto" w:fill="F7F9FB"/>
             <w:vAlign w:val="center"/>
           </w:tcPr>
@@ -1475,7 +1475,7 @@
         </w:tc>
         <w:tc>
           <w:tcPr>
-            <w:tcW w:type="dxa" w:w="1380"/>
+            <w:tcW w:type="dxa" w:w="1356"/>
             <w:shd w:val="clear" w:color="auto" w:fill="F7F9FB"/>
             <w:vAlign w:val="center"/>
           </w:tcPr>
@@ -1523,7 +1523,7 @@
         </w:trPr>
         <w:tc>
           <w:tcPr>
-            <w:tcW w:type="dxa" w:w="429"/>
+            <w:tcW w:type="dxa" w:w="427"/>
             <w:shd w:val="clear" w:color="auto" w:fill="FFFFFF"/>
             <w:vAlign w:val="center"/>
           </w:tcPr>
@@ -1547,7 +1547,7 @@
         </w:tc>
         <w:tc>
           <w:tcPr>
-            <w:tcW w:type="dxa" w:w="1680"/>
+            <w:tcW w:type="dxa" w:w="1666"/>
             <w:shd w:val="clear" w:color="auto" w:fill="FFFFFF"/>
             <w:vAlign w:val="center"/>
           </w:tcPr>
@@ -1571,7 +1571,7 @@
         </w:tc>
         <w:tc>
           <w:tcPr>
-            <w:tcW w:type="dxa" w:w="2556"/>
+            <w:tcW w:type="dxa" w:w="2550"/>
             <w:shd w:val="clear" w:color="auto" w:fill="FFFFFF"/>
             <w:vAlign w:val="center"/>
           </w:tcPr>
@@ -1594,7 +1594,7 @@
         </w:tc>
         <w:tc>
           <w:tcPr>
-            <w:tcW w:type="dxa" w:w="2451"/>
+            <w:tcW w:type="dxa" w:w="2497"/>
             <w:shd w:val="clear" w:color="auto" w:fill="FFFFFF"/>
             <w:vAlign w:val="center"/>
           </w:tcPr>
@@ -1617,7 +1617,7 @@
         </w:tc>
         <w:tc>
           <w:tcPr>
-            <w:tcW w:type="dxa" w:w="1380"/>
+            <w:tcW w:type="dxa" w:w="1356"/>
             <w:shd w:val="clear" w:color="auto" w:fill="FFFFFF"/>
             <w:vAlign w:val="center"/>
           </w:tcPr>
@@ -1665,7 +1665,7 @@
         </w:trPr>
         <w:tc>
           <w:tcPr>
-            <w:tcW w:type="dxa" w:w="429"/>
+            <w:tcW w:type="dxa" w:w="427"/>
             <w:shd w:val="clear" w:color="auto" w:fill="F7F9FB"/>
             <w:vAlign w:val="center"/>
           </w:tcPr>
@@ -1689,7 +1689,7 @@
         </w:tc>
         <w:tc>
           <w:tcPr>
-            <w:tcW w:type="dxa" w:w="1680"/>
+            <w:tcW w:type="dxa" w:w="1666"/>
             <w:shd w:val="clear" w:color="auto" w:fill="F7F9FB"/>
             <w:vAlign w:val="center"/>
           </w:tcPr>
@@ -1713,7 +1713,7 @@
         </w:tc>
         <w:tc>
           <w:tcPr>
-            <w:tcW w:type="dxa" w:w="2556"/>
+            <w:tcW w:type="dxa" w:w="2550"/>
             <w:shd w:val="clear" w:color="auto" w:fill="F7F9FB"/>
             <w:vAlign w:val="center"/>
           </w:tcPr>
@@ -1736,7 +1736,7 @@
         </w:tc>
         <w:tc>
           <w:tcPr>
-            <w:tcW w:type="dxa" w:w="2451"/>
+            <w:tcW w:type="dxa" w:w="2497"/>
             <w:shd w:val="clear" w:color="auto" w:fill="F7F9FB"/>
             <w:vAlign w:val="center"/>
           </w:tcPr>
@@ -1759,7 +1759,7 @@
         </w:tc>
         <w:tc>
           <w:tcPr>
-            <w:tcW w:type="dxa" w:w="1380"/>
+            <w:tcW w:type="dxa" w:w="1356"/>
             <w:shd w:val="clear" w:color="auto" w:fill="F7F9FB"/>
             <w:vAlign w:val="center"/>
           </w:tcPr>
@@ -1787,7 +1787,7 @@
         </w:trPr>
         <w:tc>
           <w:tcPr>
-            <w:tcW w:type="dxa" w:w="429"/>
+            <w:tcW w:type="dxa" w:w="427"/>
             <w:shd w:val="clear" w:color="auto" w:fill="FFFFFF"/>
             <w:vAlign w:val="center"/>
           </w:tcPr>
@@ -1811,7 +1811,7 @@
         </w:tc>
         <w:tc>
           <w:tcPr>
-            <w:tcW w:type="dxa" w:w="1680"/>
+            <w:tcW w:type="dxa" w:w="1666"/>
             <w:shd w:val="clear" w:color="auto" w:fill="FFFFFF"/>
             <w:vAlign w:val="center"/>
           </w:tcPr>
@@ -1835,7 +1835,7 @@
         </w:tc>
         <w:tc>
           <w:tcPr>
-            <w:tcW w:type="dxa" w:w="2556"/>
+            <w:tcW w:type="dxa" w:w="2550"/>
             <w:shd w:val="clear" w:color="auto" w:fill="FFFFFF"/>
             <w:vAlign w:val="center"/>
           </w:tcPr>
@@ -1858,7 +1858,7 @@
         </w:tc>
         <w:tc>
           <w:tcPr>
-            <w:tcW w:type="dxa" w:w="2451"/>
+            <w:tcW w:type="dxa" w:w="2497"/>
             <w:shd w:val="clear" w:color="auto" w:fill="FFFFFF"/>
             <w:vAlign w:val="center"/>
           </w:tcPr>
@@ -1881,7 +1881,7 @@
         </w:tc>
         <w:tc>
           <w:tcPr>
-            <w:tcW w:type="dxa" w:w="1380"/>
+            <w:tcW w:type="dxa" w:w="1356"/>
             <w:shd w:val="clear" w:color="auto" w:fill="FFFFFF"/>
             <w:vAlign w:val="center"/>
           </w:tcPr>
@@ -1919,7 +1919,7 @@
         </w:trPr>
         <w:tc>
           <w:tcPr>
-            <w:tcW w:type="dxa" w:w="429"/>
+            <w:tcW w:type="dxa" w:w="427"/>
             <w:shd w:val="clear" w:color="auto" w:fill="F7F9FB"/>
             <w:vAlign w:val="center"/>
           </w:tcPr>
@@ -1943,7 +1943,7 @@
         </w:tc>
         <w:tc>
           <w:tcPr>
-            <w:tcW w:type="dxa" w:w="1680"/>
+            <w:tcW w:type="dxa" w:w="1666"/>
             <w:shd w:val="clear" w:color="auto" w:fill="F7F9FB"/>
             <w:vAlign w:val="center"/>
           </w:tcPr>
@@ -1967,7 +1967,7 @@
         </w:tc>
         <w:tc>
           <w:tcPr>
-            <w:tcW w:type="dxa" w:w="2556"/>
+            <w:tcW w:type="dxa" w:w="2550"/>
             <w:shd w:val="clear" w:color="auto" w:fill="F7F9FB"/>
             <w:vAlign w:val="center"/>
           </w:tcPr>
@@ -1990,7 +1990,7 @@
         </w:tc>
         <w:tc>
           <w:tcPr>
-            <w:tcW w:type="dxa" w:w="2451"/>
+            <w:tcW w:type="dxa" w:w="2497"/>
             <w:shd w:val="clear" w:color="auto" w:fill="F7F9FB"/>
             <w:vAlign w:val="center"/>
           </w:tcPr>
@@ -2013,7 +2013,7 @@
         </w:tc>
         <w:tc>
           <w:tcPr>
-            <w:tcW w:type="dxa" w:w="1380"/>
+            <w:tcW w:type="dxa" w:w="1356"/>
             <w:shd w:val="clear" w:color="auto" w:fill="F7F9FB"/>
             <w:vAlign w:val="center"/>
           </w:tcPr>
@@ -2061,8 +2061,150 @@
         </w:trPr>
         <w:tc>
           <w:tcPr>
-            <w:tcW w:type="dxa" w:w="429"/>
+            <w:tcW w:type="dxa" w:w="427"/>
             <w:shd w:val="clear" w:color="auto" w:fill="FFFFFF"/>
+            <w:vAlign w:val="center"/>
+          </w:tcPr>
+          <w:p>
+            <w:pPr>
+              <w:keepNext/>
+              <w:spacing w:after="0"/>
+              <w:jc w:val="center"/>
+            </w:pPr>
+            <w:r>
+              <w:rPr>
+                <w:rFonts w:ascii="Calibri" w:hAnsi="Calibri"/>
+                <w:b/>
+                <w:i w:val="0"/>
+                <w:color w:val="222222"/>
+                <w:sz w:val="20"/>
+              </w:rPr>
+              <w:t>15</w:t>
+            </w:r>
+          </w:p>
+        </w:tc>
+        <w:tc>
+          <w:tcPr>
+            <w:tcW w:type="dxa" w:w="1666"/>
+            <w:shd w:val="clear" w:color="auto" w:fill="FFFFFF"/>
+            <w:vAlign w:val="center"/>
+          </w:tcPr>
+          <w:p>
+            <w:pPr>
+              <w:keepNext/>
+              <w:spacing w:after="0"/>
+              <w:jc w:val="center"/>
+            </w:pPr>
+            <w:r>
+              <w:rPr>
+                <w:rFonts w:ascii="Calibri" w:hAnsi="Calibri"/>
+                <w:b w:val="0"/>
+                <w:i w:val="0"/>
+                <w:color w:val="222222"/>
+                <w:sz w:val="20"/>
+              </w:rPr>
+              <w:t>2026-10-24</w:t>
+            </w:r>
+          </w:p>
+        </w:tc>
+        <w:tc>
+          <w:tcPr>
+            <w:tcW w:type="dxa" w:w="2550"/>
+            <w:shd w:val="clear" w:color="auto" w:fill="FFFFFF"/>
+            <w:vAlign w:val="center"/>
+          </w:tcPr>
+          <w:p>
+            <w:pPr>
+              <w:keepNext/>
+              <w:spacing w:after="0"/>
+            </w:pPr>
+            <w:r>
+              <w:rPr>
+                <w:rFonts w:ascii="Calibri" w:hAnsi="Calibri"/>
+                <w:b w:val="0"/>
+                <w:i w:val="0"/>
+                <w:color w:val="222222"/>
+                <w:sz w:val="20"/>
+              </w:rPr>
+              <w:t>Embodied stage 1d: a held reach against a rhythmic swing, fresh seeds</w:t>
+            </w:r>
+          </w:p>
+        </w:tc>
+        <w:tc>
+          <w:tcPr>
+            <w:tcW w:type="dxa" w:w="2497"/>
+            <w:shd w:val="clear" w:color="auto" w:fill="FFFFFF"/>
+            <w:vAlign w:val="center"/>
+          </w:tcPr>
+          <w:p>
+            <w:pPr>
+              <w:keepNext/>
+              <w:spacing w:after="0"/>
+            </w:pPr>
+            <w:r>
+              <w:rPr>
+                <w:rFonts w:ascii="Calibri" w:hAnsi="Calibri"/>
+                <w:b w:val="0"/>
+                <w:i w:val="0"/>
+                <w:color w:val="222222"/>
+                <w:sz w:val="20"/>
+              </w:rPr>
+              <w:t>4 of 4 registered predictions pass</w:t>
+            </w:r>
+          </w:p>
+        </w:tc>
+        <w:tc>
+          <w:tcPr>
+            <w:tcW w:type="dxa" w:w="1356"/>
+            <w:shd w:val="clear" w:color="auto" w:fill="FFFFFF"/>
+            <w:vAlign w:val="center"/>
+          </w:tcPr>
+          <w:p>
+            <w:pPr>
+              <w:keepNext/>
+              <w:spacing w:after="0"/>
+            </w:pPr>
+            <w:r>
+              <w:rPr>
+                <w:rFonts w:ascii="Consolas" w:hAnsi="Consolas"/>
+                <w:b w:val="0"/>
+                <w:i w:val="0"/>
+                <w:color w:val="222222"/>
+                <w:sz w:val="18"/>
+              </w:rPr>
+              <w:t>66502eb</w:t>
+            </w:r>
+            <w:r>
+              <w:rPr>
+                <w:rFonts w:ascii="Calibri" w:hAnsi="Calibri"/>
+                <w:b w:val="0"/>
+                <w:i w:val="0"/>
+                <w:color w:val="222222"/>
+                <w:sz w:val="20"/>
+              </w:rPr>
+              <w:t xml:space="preserve"> … </w:t>
+            </w:r>
+            <w:r>
+              <w:rPr>
+                <w:rFonts w:ascii="Consolas" w:hAnsi="Consolas"/>
+                <w:b w:val="0"/>
+                <w:i w:val="0"/>
+                <w:color w:val="222222"/>
+                <w:sz w:val="18"/>
+              </w:rPr>
+              <w:t>19ab0ae</w:t>
+            </w:r>
+          </w:p>
+        </w:tc>
+      </w:tr>
+      <w:tr>
+        <w:trPr>
+          <w:cantSplit/>
+        </w:trPr>
+        <w:tc>
+          <w:tcPr>
+            <w:tcW w:type="dxa" w:w="427"/>
+            <w:shd w:val="clear" w:color="auto" w:fill="F7F9FB"/>
             <w:vAlign w:val="center"/>
           </w:tcPr>
           <w:p>
@@ -2079,14 +2221,14 @@
                 <w:color w:val="222222"/>
                 <w:sz w:val="20"/>
               </w:rPr>
-              <w:t>15</w:t>
+              <w:t>16</w:t>
             </w:r>
           </w:p>
         </w:tc>
         <w:tc>
           <w:tcPr>
-            <w:tcW w:type="dxa" w:w="1680"/>
-            <w:shd w:val="clear" w:color="auto" w:fill="FFFFFF"/>
+            <w:tcW w:type="dxa" w:w="1666"/>
+            <w:shd w:val="clear" w:color="auto" w:fill="F7F9FB"/>
             <w:vAlign w:val="center"/>
           </w:tcPr>
           <w:p>
@@ -2109,8 +2251,8 @@
         </w:tc>
         <w:tc>
           <w:tcPr>
-            <w:tcW w:type="dxa" w:w="2556"/>
-            <w:shd w:val="clear" w:color="auto" w:fill="FFFFFF"/>
+            <w:tcW w:type="dxa" w:w="2550"/>
+            <w:shd w:val="clear" w:color="auto" w:fill="F7F9FB"/>
             <w:vAlign w:val="center"/>
           </w:tcPr>
           <w:p>
@@ -2126,14 +2268,14 @@
                 <w:color w:val="222222"/>
                 <w:sz w:val="20"/>
               </w:rPr>
-              <w:t>Embodied stage 1d: a held reach against a rhythmic swing, fresh seeds</w:t>
+              <w:t>Embodied stages 1e and 1f: the FlyWire brain drives the male nerve cord and the leg</w:t>
             </w:r>
           </w:p>
         </w:tc>
         <w:tc>
           <w:tcPr>
-            <w:tcW w:type="dxa" w:w="2451"/>
-            <w:shd w:val="clear" w:color="auto" w:fill="FFFFFF"/>
+            <w:tcW w:type="dxa" w:w="2497"/>
+            <w:shd w:val="clear" w:color="auto" w:fill="F7F9FB"/>
             <w:vAlign w:val="center"/>
           </w:tcPr>
           <w:p>
@@ -2149,14 +2291,14 @@
                 <w:color w:val="222222"/>
                 <w:sz w:val="20"/>
               </w:rPr>
-              <w:t>4 of 4 registered predictions pass</w:t>
+              <w:t>1e uninterpretable as registered; 1f 5 of 5 pass on fresh seeds</w:t>
             </w:r>
           </w:p>
         </w:tc>
         <w:tc>
           <w:tcPr>
-            <w:tcW w:type="dxa" w:w="1380"/>
-            <w:shd w:val="clear" w:color="auto" w:fill="FFFFFF"/>
+            <w:tcW w:type="dxa" w:w="1356"/>
+            <w:shd w:val="clear" w:color="auto" w:fill="F7F9FB"/>
             <w:vAlign w:val="center"/>
           </w:tcPr>
           <w:p>
@@ -2172,7 +2314,7 @@
                 <w:color w:val="222222"/>
                 <w:sz w:val="18"/>
               </w:rPr>
-              <w:t>66502eb</w:t>
+              <w:t>f2f5ad3</w:t>
             </w:r>
             <w:r>
               <w:rPr>
@@ -5837,6 +5979,228 @@
           <w:sz w:val="19"/>
         </w:rPr>
         <w:t>outputs/fly/embodied_stage1d_SIMULATED.</w:t>
+      </w:r>
+      <w:r>
+        <w:rPr>
+          <w:rFonts w:ascii="Calibri" w:hAnsi="Calibri"/>
+          <w:b w:val="0"/>
+          <w:i w:val="0"/>
+          <w:color w:val="222222"/>
+          <w:sz w:val="21"/>
+        </w:rPr>
+        <w:t>.</w:t>
+      </w:r>
+    </w:p>
+    <w:p>
+      <w:pPr>
+        <w:keepNext/>
+        <w:spacing w:before="240" w:after="60"/>
+      </w:pPr>
+      <w:r>
+        <w:rPr>
+          <w:rFonts w:ascii="Calibri" w:hAnsi="Calibri"/>
+          <w:b/>
+          <w:i w:val="0"/>
+          <w:color w:val="1F4E79"/>
+          <w:sz w:val="23"/>
+        </w:rPr>
+        <w:t>16. From an antennal touch in the brain to a leg at the head</w:t>
+      </w:r>
+    </w:p>
+    <w:p>
+      <w:pPr>
+        <w:spacing w:after="120"/>
+      </w:pPr>
+      <w:r>
+        <w:rPr>
+          <w:rFonts w:ascii="Calibri" w:hAnsi="Calibri"/>
+          <w:b/>
+          <w:i w:val="0"/>
+          <w:color w:val="156082"/>
+          <w:sz w:val="21"/>
+        </w:rPr>
+        <w:t>Slide message:</w:t>
+      </w:r>
+      <w:r>
+        <w:rPr>
+          <w:rFonts w:ascii="Calibri" w:hAnsi="Calibri"/>
+          <w:b w:val="0"/>
+          <w:i w:val="0"/>
+          <w:color w:val="222222"/>
+          <w:sz w:val="21"/>
+        </w:rPr>
+        <w:t xml:space="preserve"> </w:t>
+      </w:r>
+      <w:r>
+        <w:rPr>
+          <w:rFonts w:ascii="Calibri" w:hAnsi="Calibri"/>
+          <w:b w:val="0"/>
+          <w:i/>
+          <w:color w:val="222222"/>
+          <w:sz w:val="21"/>
+        </w:rPr>
+        <w:t>Antennal input to the validated FlyWire brain, relayed through matched descending neurons into the male nerve cord, moves a muscle-driven leg to the head; sugar input does not, and removing four grooming neurons abolishes the movement.</w:t>
+      </w:r>
+    </w:p>
+    <w:p>
+      <w:pPr>
+        <w:spacing w:after="120"/>
+        <w:ind w:left="432" w:hanging="259"/>
+      </w:pPr>
+      <w:r>
+        <w:rPr>
+          <w:rFonts w:ascii="Calibri" w:hAnsi="Calibri"/>
+          <w:b w:val="0"/>
+          <w:i w:val="0"/>
+          <w:color w:val="222222"/>
+          <w:sz w:val="21"/>
+        </w:rPr>
+        <w:t>•</w:t>
+        <w:tab/>
+      </w:r>
+      <w:r>
+        <w:rPr>
+          <w:rFonts w:ascii="Calibri" w:hAnsi="Calibri"/>
+          <w:b/>
+          <w:i w:val="0"/>
+          <w:color w:val="156082"/>
+          <w:sz w:val="21"/>
+        </w:rPr>
+        <w:t>What changed.</w:t>
+      </w:r>
+      <w:r>
+        <w:rPr>
+          <w:rFonts w:ascii="Calibri" w:hAnsi="Calibri"/>
+          <w:b w:val="0"/>
+          <w:i w:val="0"/>
+          <w:color w:val="222222"/>
+          <w:sz w:val="21"/>
+        </w:rPr>
+        <w:t xml:space="preserve"> </w:t>
+      </w:r>
+      <w:r>
+        <w:rPr>
+          <w:rFonts w:ascii="Consolas" w:hAnsi="Consolas"/>
+          <w:b w:val="0"/>
+          <w:i w:val="0"/>
+          <w:color w:val="222222"/>
+          <w:sz w:val="19"/>
+        </w:rPr>
+        <w:t>src/neuromps/fly/model.py</w:t>
+      </w:r>
+      <w:r>
+        <w:rPr>
+          <w:rFonts w:ascii="Calibri" w:hAnsi="Calibri"/>
+          <w:b w:val="0"/>
+          <w:i w:val="0"/>
+          <w:color w:val="222222"/>
+          <w:sz w:val="21"/>
+        </w:rPr>
+        <w:t xml:space="preserve"> can replay recorded spike trains into chosen neurons; </w:t>
+      </w:r>
+      <w:r>
+        <w:rPr>
+          <w:rFonts w:ascii="Consolas" w:hAnsi="Consolas"/>
+          <w:b w:val="0"/>
+          <w:i w:val="0"/>
+          <w:color w:val="222222"/>
+          <w:sz w:val="19"/>
+        </w:rPr>
+        <w:t>src/neuromps/fly/relay.py</w:t>
+      </w:r>
+      <w:r>
+        <w:rPr>
+          <w:rFonts w:ascii="Calibri" w:hAnsi="Calibri"/>
+          <w:b w:val="0"/>
+          <w:i w:val="0"/>
+          <w:color w:val="222222"/>
+          <w:sz w:val="21"/>
+        </w:rPr>
+        <w:t xml:space="preserve"> pairs descending neurons across the two connectomes by cell type and side and joins the FlyWire brain to the male nerve cord; stage 1e and stage 1f were each registered before running.</w:t>
+      </w:r>
+    </w:p>
+    <w:p>
+      <w:pPr>
+        <w:spacing w:after="120"/>
+        <w:ind w:left="432" w:hanging="259"/>
+      </w:pPr>
+      <w:r>
+        <w:rPr>
+          <w:rFonts w:ascii="Calibri" w:hAnsi="Calibri"/>
+          <w:b w:val="0"/>
+          <w:i w:val="0"/>
+          <w:color w:val="222222"/>
+          <w:sz w:val="21"/>
+        </w:rPr>
+        <w:t>•</w:t>
+        <w:tab/>
+      </w:r>
+      <w:r>
+        <w:rPr>
+          <w:rFonts w:ascii="Calibri" w:hAnsi="Calibri"/>
+          <w:b/>
+          <w:i w:val="0"/>
+          <w:color w:val="156082"/>
+          <w:sz w:val="21"/>
+        </w:rPr>
+        <w:t>Effect.</w:t>
+      </w:r>
+      <w:r>
+        <w:rPr>
+          <w:rFonts w:ascii="Calibri" w:hAnsi="Calibri"/>
+          <w:b w:val="0"/>
+          <w:i w:val="0"/>
+          <w:color w:val="222222"/>
+          <w:sz w:val="21"/>
+        </w:rPr>
+        <w:t xml:space="preserve"> Stage 1e's absolute precondition failed (grooming descending neurons at 8.531 Hz against a 10 Hz line), so its leg results are uninterpretable. Stage 1f, on fresh seeds, passes all five predictions: claw to 0.5369 mm under antennal input against 0.9377 under sugar; back to 1.4793 mm when aDN1 and aDN2 are removed.</w:t>
+      </w:r>
+    </w:p>
+    <w:p>
+      <w:pPr>
+        <w:spacing w:after="120"/>
+        <w:ind w:left="432" w:hanging="259"/>
+      </w:pPr>
+      <w:r>
+        <w:rPr>
+          <w:rFonts w:ascii="Calibri" w:hAnsi="Calibri"/>
+          <w:b w:val="0"/>
+          <w:i w:val="0"/>
+          <w:color w:val="222222"/>
+          <w:sz w:val="21"/>
+        </w:rPr>
+        <w:t>•</w:t>
+        <w:tab/>
+      </w:r>
+      <w:r>
+        <w:rPr>
+          <w:rFonts w:ascii="Calibri" w:hAnsi="Calibri"/>
+          <w:b/>
+          <w:i w:val="0"/>
+          <w:color w:val="156082"/>
+          <w:sz w:val="21"/>
+        </w:rPr>
+        <w:t>Evidence.</w:t>
+      </w:r>
+      <w:r>
+        <w:rPr>
+          <w:rFonts w:ascii="Calibri" w:hAnsi="Calibri"/>
+          <w:b w:val="0"/>
+          <w:i w:val="0"/>
+          <w:color w:val="222222"/>
+          <w:sz w:val="21"/>
+        </w:rPr>
+        <w:t xml:space="preserve"> Roadmap §7 and figure; </w:t>
+      </w:r>
+      <w:r>
+        <w:rPr>
+          <w:rFonts w:ascii="Consolas" w:hAnsi="Consolas"/>
+          <w:b w:val="0"/>
+          <w:i w:val="0"/>
+          <w:color w:val="222222"/>
+          <w:sz w:val="19"/>
+        </w:rPr>
+        <w:t>outputs/fly/embodied_stage1f_SIMULATED.</w:t>
       </w:r>
       <w:r>
         <w:rPr>

</xml_diff>

<commit_message>
Write up embodied stage 2a; plot the pool rates that show why it failed
The figure's phase panel had nothing to show (no phase is defined when the
flexor pools are silent), so it now shows the median flexor and extensor
pool rates on all six legs, and the trace panel shows rates in Hz. The
median pool rates per drive are written to metrics.json as descriptive
values; --rescore rebuilds them from the saved trial table. A full rerun
reproduces the committed trials exactly.

Roadmap section 7, change-log entry 17 and paper outline row 3.5d record
the failure and the next step the roadmap committed to (intrinsic currents
as a stated, registered model change). PDFs rebuilt.

Co-Authored-By: Claude Opus 5.5 <noreply@anthropic.com>
</commit_message>
<xml_diff>
--- a/report/POST_SUBMISSION_CHANGES.docx
+++ b/report/POST_SUBMISSION_CHANGES.docx
@@ -6201,6 +6201,228 @@
           <w:sz w:val="19"/>
         </w:rPr>
         <w:t>outputs/fly/embodied_stage1f_SIMULATED.</w:t>
+      </w:r>
+      <w:r>
+        <w:rPr>
+          <w:rFonts w:ascii="Calibri" w:hAnsi="Calibri"/>
+          <w:b w:val="0"/>
+          <w:i w:val="0"/>
+          <w:color w:val="222222"/>
+          <w:sz w:val="21"/>
+        </w:rPr>
+        <w:t>.</w:t>
+      </w:r>
+    </w:p>
+    <w:p>
+      <w:pPr>
+        <w:keepNext/>
+        <w:spacing w:before="240" w:after="60"/>
+      </w:pPr>
+      <w:r>
+        <w:rPr>
+          <w:rFonts w:ascii="Calibri" w:hAnsi="Calibri"/>
+          <w:b/>
+          <w:i w:val="0"/>
+          <w:color w:val="1F4E79"/>
+          <w:sz w:val="23"/>
+        </w:rPr>
+        <w:t>17. The nerve cord alone does not walk</w:t>
+      </w:r>
+    </w:p>
+    <w:p>
+      <w:pPr>
+        <w:spacing w:after="120"/>
+      </w:pPr>
+      <w:r>
+        <w:rPr>
+          <w:rFonts w:ascii="Calibri" w:hAnsi="Calibri"/>
+          <w:b/>
+          <w:i w:val="0"/>
+          <w:color w:val="156082"/>
+          <w:sz w:val="21"/>
+        </w:rPr>
+        <w:t>Slide message:</w:t>
+      </w:r>
+      <w:r>
+        <w:rPr>
+          <w:rFonts w:ascii="Calibri" w:hAnsi="Calibri"/>
+          <w:b w:val="0"/>
+          <w:i w:val="0"/>
+          <w:color w:val="222222"/>
+          <w:sz w:val="21"/>
+        </w:rPr>
+        <w:t xml:space="preserve"> </w:t>
+      </w:r>
+      <w:r>
+        <w:rPr>
+          <w:rFonts w:ascii="Calibri" w:hAnsi="Calibri"/>
+          <w:b w:val="0"/>
+          <w:i/>
+          <w:color w:val="222222"/>
+          <w:sz w:val="21"/>
+        </w:rPr>
+        <w:t>Driven by its walking command, the connectome-only nerve cord fires the leg extensors tonically and leaves the flexors silent: no rhythm. Rhythm needs intrinsic currents the connectome does not record; adding them is the next registered step.</w:t>
+      </w:r>
+    </w:p>
+    <w:p>
+      <w:pPr>
+        <w:spacing w:after="120"/>
+        <w:ind w:left="432" w:hanging="259"/>
+      </w:pPr>
+      <w:r>
+        <w:rPr>
+          <w:rFonts w:ascii="Calibri" w:hAnsi="Calibri"/>
+          <w:b w:val="0"/>
+          <w:i w:val="0"/>
+          <w:color w:val="222222"/>
+          <w:sz w:val="21"/>
+        </w:rPr>
+        <w:t>•</w:t>
+        <w:tab/>
+      </w:r>
+      <w:r>
+        <w:rPr>
+          <w:rFonts w:ascii="Calibri" w:hAnsi="Calibri"/>
+          <w:b/>
+          <w:i w:val="0"/>
+          <w:color w:val="156082"/>
+          <w:sz w:val="21"/>
+        </w:rPr>
+        <w:t>What changed.</w:t>
+      </w:r>
+      <w:r>
+        <w:rPr>
+          <w:rFonts w:ascii="Calibri" w:hAnsi="Calibri"/>
+          <w:b w:val="0"/>
+          <w:i w:val="0"/>
+          <w:color w:val="222222"/>
+          <w:sz w:val="21"/>
+        </w:rPr>
+        <w:t xml:space="preserve"> </w:t>
+      </w:r>
+      <w:r>
+        <w:rPr>
+          <w:rFonts w:ascii="Consolas" w:hAnsi="Consolas"/>
+          <w:b w:val="0"/>
+          <w:i w:val="0"/>
+          <w:color w:val="222222"/>
+          <w:sz w:val="19"/>
+        </w:rPr>
+        <w:t>src/neuromps/fly/fictive.py</w:t>
+      </w:r>
+      <w:r>
+        <w:rPr>
+          <w:rFonts w:ascii="Calibri" w:hAnsi="Calibri"/>
+          <w:b w:val="0"/>
+          <w:i w:val="0"/>
+          <w:color w:val="222222"/>
+          <w:sz w:val="21"/>
+        </w:rPr>
+        <w:t xml:space="preserve"> runs stage 2a (registered before running): the six legs' tibia flexor and extensor pools under walking, grooming and backward-walking commands, phases measured between pools. </w:t>
+      </w:r>
+      <w:r>
+        <w:rPr>
+          <w:rFonts w:ascii="Consolas" w:hAnsi="Consolas"/>
+          <w:b w:val="0"/>
+          <w:i w:val="0"/>
+          <w:color w:val="222222"/>
+          <w:sz w:val="19"/>
+        </w:rPr>
+        <w:t>src/neuromps/fetch/flybody.py</w:t>
+      </w:r>
+      <w:r>
+        <w:rPr>
+          <w:rFonts w:ascii="Calibri" w:hAnsi="Calibri"/>
+          <w:b w:val="0"/>
+          <w:i w:val="0"/>
+          <w:color w:val="222222"/>
+          <w:sz w:val="21"/>
+        </w:rPr>
+        <w:t xml:space="preserve"> fetches the flybody whole-body model (Apache-2.0) for the feeding and walking body, each file checked against its git hash.</w:t>
+      </w:r>
+    </w:p>
+    <w:p>
+      <w:pPr>
+        <w:spacing w:after="120"/>
+        <w:ind w:left="432" w:hanging="259"/>
+      </w:pPr>
+      <w:r>
+        <w:rPr>
+          <w:rFonts w:ascii="Calibri" w:hAnsi="Calibri"/>
+          <w:b w:val="0"/>
+          <w:i w:val="0"/>
+          <w:color w:val="222222"/>
+          <w:sz w:val="21"/>
+        </w:rPr>
+        <w:t>•</w:t>
+        <w:tab/>
+      </w:r>
+      <w:r>
+        <w:rPr>
+          <w:rFonts w:ascii="Calibri" w:hAnsi="Calibri"/>
+          <w:b/>
+          <w:i w:val="0"/>
+          <w:color w:val="156082"/>
+          <w:sz w:val="21"/>
+        </w:rPr>
+        <w:t>Effect.</w:t>
+      </w:r>
+      <w:r>
+        <w:rPr>
+          <w:rFonts w:ascii="Calibri" w:hAnsi="Calibri"/>
+          <w:b w:val="0"/>
+          <w:i w:val="0"/>
+          <w:color w:val="222222"/>
+          <w:sz w:val="21"/>
+        </w:rPr>
+        <w:t xml:space="preserve"> Silent without drive (W0 passes); under the walking command the left middle-leg extensors fire at 54.12 Hz and the left front flexors at 0.0 Hz, so there is no rhythm and no phase (W1 to W4 fail). The roadmap listed this risk and the response to it.</w:t>
+      </w:r>
+    </w:p>
+    <w:p>
+      <w:pPr>
+        <w:spacing w:after="120"/>
+        <w:ind w:left="432" w:hanging="259"/>
+      </w:pPr>
+      <w:r>
+        <w:rPr>
+          <w:rFonts w:ascii="Calibri" w:hAnsi="Calibri"/>
+          <w:b w:val="0"/>
+          <w:i w:val="0"/>
+          <w:color w:val="222222"/>
+          <w:sz w:val="21"/>
+        </w:rPr>
+        <w:t>•</w:t>
+        <w:tab/>
+      </w:r>
+      <w:r>
+        <w:rPr>
+          <w:rFonts w:ascii="Calibri" w:hAnsi="Calibri"/>
+          <w:b/>
+          <w:i w:val="0"/>
+          <w:color w:val="156082"/>
+          <w:sz w:val="21"/>
+        </w:rPr>
+        <w:t>Evidence.</w:t>
+      </w:r>
+      <w:r>
+        <w:rPr>
+          <w:rFonts w:ascii="Calibri" w:hAnsi="Calibri"/>
+          <w:b w:val="0"/>
+          <w:i w:val="0"/>
+          <w:color w:val="222222"/>
+          <w:sz w:val="21"/>
+        </w:rPr>
+        <w:t xml:space="preserve"> Roadmap §7 and figure; </w:t>
+      </w:r>
+      <w:r>
+        <w:rPr>
+          <w:rFonts w:ascii="Consolas" w:hAnsi="Consolas"/>
+          <w:b w:val="0"/>
+          <w:i w:val="0"/>
+          <w:color w:val="222222"/>
+          <w:sz w:val="19"/>
+        </w:rPr>
+        <w:t>outputs/fly/embodied_stage2a_SIMULATED.</w:t>
       </w:r>
       <w:r>
         <w:rPr>

</xml_diff>

<commit_message>
Record embodied stage 2b: sugar extends the proboscis, bitter holds it back
Registered 76f90e8, run on seeds 810-817: 6 of 6 predictions pass. Under
sugar input to the FlyWire 783 brain, MN9 (activation 0.96) and MN4
(0.89) outfire their antagonists (0.06, 0) and the flybody proboscis
extends fully (0.3431 mm of 0.3428); bitter, antennal or no input leave it
at rest; adding bitter halves the peak and cuts the time-averaged
extension from 0.305 to 0.049 mm; the same at r_full 10 and 40 Hz. The
numerical check (half the step) agrees to 0.0005 mm.

Reported, not scored: the time-averaged extension, command onsets, and
every other brain motor neuron by subclass. Under sugar only feeding motor
neurons fire, and bitter gates the proboscis pools far more than the
ingestion pool. Reruns reproduce the scored table exactly.

Roadmap section 7, change-log entry 18 and paper outline row 3.5e updated;
PDFs rebuilt.

Co-Authored-By: Claude Opus 5.5 <noreply@anthropic.com>
</commit_message>
<xml_diff>
--- a/report/POST_SUBMISSION_CHANGES.docx
+++ b/report/POST_SUBMISSION_CHANGES.docx
@@ -6423,6 +6423,228 @@
           <w:sz w:val="19"/>
         </w:rPr>
         <w:t>outputs/fly/embodied_stage2a_SIMULATED.</w:t>
+      </w:r>
+      <w:r>
+        <w:rPr>
+          <w:rFonts w:ascii="Calibri" w:hAnsi="Calibri"/>
+          <w:b w:val="0"/>
+          <w:i w:val="0"/>
+          <w:color w:val="222222"/>
+          <w:sz w:val="21"/>
+        </w:rPr>
+        <w:t>.</w:t>
+      </w:r>
+    </w:p>
+    <w:p>
+      <w:pPr>
+        <w:keepNext/>
+        <w:spacing w:before="240" w:after="60"/>
+      </w:pPr>
+      <w:r>
+        <w:rPr>
+          <w:rFonts w:ascii="Calibri" w:hAnsi="Calibri"/>
+          <w:b/>
+          <w:i w:val="0"/>
+          <w:color w:val="1F4E79"/>
+          <w:sz w:val="23"/>
+        </w:rPr>
+        <w:t>18. Sugar extends the proboscis, bitter holds it back</w:t>
+      </w:r>
+    </w:p>
+    <w:p>
+      <w:pPr>
+        <w:spacing w:after="120"/>
+      </w:pPr>
+      <w:r>
+        <w:rPr>
+          <w:rFonts w:ascii="Calibri" w:hAnsi="Calibri"/>
+          <w:b/>
+          <w:i w:val="0"/>
+          <w:color w:val="156082"/>
+          <w:sz w:val="21"/>
+        </w:rPr>
+        <w:t>Slide message:</w:t>
+      </w:r>
+      <w:r>
+        <w:rPr>
+          <w:rFonts w:ascii="Calibri" w:hAnsi="Calibri"/>
+          <w:b w:val="0"/>
+          <w:i w:val="0"/>
+          <w:color w:val="222222"/>
+          <w:sz w:val="21"/>
+        </w:rPr>
+        <w:t xml:space="preserve"> </w:t>
+      </w:r>
+      <w:r>
+        <w:rPr>
+          <w:rFonts w:ascii="Calibri" w:hAnsi="Calibri"/>
+          <w:b w:val="0"/>
+          <w:i/>
+          <w:color w:val="222222"/>
+          <w:sz w:val="21"/>
+        </w:rPr>
+        <w:t>Sugar input to the validated FlyWire brain drives the motor neurons of each proboscis muscle the literature names, and a simulated proboscis extends fully; bitter input holds it back. Six of six registered predictions pass.</w:t>
+      </w:r>
+    </w:p>
+    <w:p>
+      <w:pPr>
+        <w:spacing w:after="120"/>
+        <w:ind w:left="432" w:hanging="259"/>
+      </w:pPr>
+      <w:r>
+        <w:rPr>
+          <w:rFonts w:ascii="Calibri" w:hAnsi="Calibri"/>
+          <w:b w:val="0"/>
+          <w:i w:val="0"/>
+          <w:color w:val="222222"/>
+          <w:sz w:val="21"/>
+        </w:rPr>
+        <w:t>•</w:t>
+        <w:tab/>
+      </w:r>
+      <w:r>
+        <w:rPr>
+          <w:rFonts w:ascii="Calibri" w:hAnsi="Calibri"/>
+          <w:b/>
+          <w:i w:val="0"/>
+          <w:color w:val="156082"/>
+          <w:sz w:val="21"/>
+        </w:rPr>
+        <w:t>What changed.</w:t>
+      </w:r>
+      <w:r>
+        <w:rPr>
+          <w:rFonts w:ascii="Calibri" w:hAnsi="Calibri"/>
+          <w:b w:val="0"/>
+          <w:i w:val="0"/>
+          <w:color w:val="222222"/>
+          <w:sz w:val="21"/>
+        </w:rPr>
+        <w:t xml:space="preserve"> </w:t>
+      </w:r>
+      <w:r>
+        <w:rPr>
+          <w:rFonts w:ascii="Consolas" w:hAnsi="Consolas"/>
+          <w:b w:val="0"/>
+          <w:i w:val="0"/>
+          <w:color w:val="222222"/>
+          <w:sz w:val="19"/>
+        </w:rPr>
+        <w:t>src/neuromps/fly/proboscis.py</w:t>
+      </w:r>
+      <w:r>
+        <w:rPr>
+          <w:rFonts w:ascii="Calibri" w:hAnsi="Calibri"/>
+          <w:b w:val="0"/>
+          <w:i w:val="0"/>
+          <w:color w:val="222222"/>
+          <w:sz w:val="21"/>
+        </w:rPr>
+        <w:t xml:space="preserve"> drives the flybody proboscis (body fixed, 0.01 ms step, checked against a step half that size); </w:t>
+      </w:r>
+      <w:r>
+        <w:rPr>
+          <w:rFonts w:ascii="Consolas" w:hAnsi="Consolas"/>
+          <w:b w:val="0"/>
+          <w:i w:val="0"/>
+          <w:color w:val="222222"/>
+          <w:sz w:val="19"/>
+        </w:rPr>
+        <w:t>src/neuromps/fly/embodied_stage2b.py</w:t>
+      </w:r>
+      <w:r>
+        <w:rPr>
+          <w:rFonts w:ascii="Calibri" w:hAnsi="Calibri"/>
+          <w:b w:val="0"/>
+          <w:i w:val="0"/>
+          <w:color w:val="222222"/>
+          <w:sz w:val="21"/>
+        </w:rPr>
+        <w:t xml:space="preserve"> turns the proboscis motor pools (MN9, MN1/MN2, MN4, MN3, named by FlyWire cell type after McKellar et al. 2020) into rostrum and haustellum commands. Registered before running.</w:t>
+      </w:r>
+    </w:p>
+    <w:p>
+      <w:pPr>
+        <w:spacing w:after="120"/>
+        <w:ind w:left="432" w:hanging="259"/>
+      </w:pPr>
+      <w:r>
+        <w:rPr>
+          <w:rFonts w:ascii="Calibri" w:hAnsi="Calibri"/>
+          <w:b w:val="0"/>
+          <w:i w:val="0"/>
+          <w:color w:val="222222"/>
+          <w:sz w:val="21"/>
+        </w:rPr>
+        <w:t>•</w:t>
+        <w:tab/>
+      </w:r>
+      <w:r>
+        <w:rPr>
+          <w:rFonts w:ascii="Calibri" w:hAnsi="Calibri"/>
+          <w:b/>
+          <w:i w:val="0"/>
+          <w:color w:val="156082"/>
+          <w:sz w:val="21"/>
+        </w:rPr>
+        <w:t>Effect.</w:t>
+      </w:r>
+      <w:r>
+        <w:rPr>
+          <w:rFonts w:ascii="Calibri" w:hAnsi="Calibri"/>
+          <w:b w:val="0"/>
+          <w:i w:val="0"/>
+          <w:color w:val="222222"/>
+          <w:sz w:val="21"/>
+        </w:rPr>
+        <w:t xml:space="preserve"> Full extension under sugar (0.3431 mm of 0.3428); none under bitter, antennal input or none; time-averaged extension from 0.3054 to 0.0488 mm when bitter is added. Sugar recruits only feeding motor neurons (exploratory).</w:t>
+      </w:r>
+    </w:p>
+    <w:p>
+      <w:pPr>
+        <w:spacing w:after="120"/>
+        <w:ind w:left="432" w:hanging="259"/>
+      </w:pPr>
+      <w:r>
+        <w:rPr>
+          <w:rFonts w:ascii="Calibri" w:hAnsi="Calibri"/>
+          <w:b w:val="0"/>
+          <w:i w:val="0"/>
+          <w:color w:val="222222"/>
+          <w:sz w:val="21"/>
+        </w:rPr>
+        <w:t>•</w:t>
+        <w:tab/>
+      </w:r>
+      <w:r>
+        <w:rPr>
+          <w:rFonts w:ascii="Calibri" w:hAnsi="Calibri"/>
+          <w:b/>
+          <w:i w:val="0"/>
+          <w:color w:val="156082"/>
+          <w:sz w:val="21"/>
+        </w:rPr>
+        <w:t>Evidence.</w:t>
+      </w:r>
+      <w:r>
+        <w:rPr>
+          <w:rFonts w:ascii="Calibri" w:hAnsi="Calibri"/>
+          <w:b w:val="0"/>
+          <w:i w:val="0"/>
+          <w:color w:val="222222"/>
+          <w:sz w:val="21"/>
+        </w:rPr>
+        <w:t xml:space="preserve"> Roadmap §7 and figure; </w:t>
+      </w:r>
+      <w:r>
+        <w:rPr>
+          <w:rFonts w:ascii="Consolas" w:hAnsi="Consolas"/>
+          <w:b w:val="0"/>
+          <w:i w:val="0"/>
+          <w:color w:val="222222"/>
+          <w:sz w:val="19"/>
+        </w:rPr>
+        <w:t>outputs/fly/embodied_stage2b_SIMULATED.</w:t>
       </w:r>
       <w:r>
         <w:rPr>

</xml_diff>

<commit_message>
Explain stage 2c's null result: the walking command inhibits the flexors
Exploratory, not registered (seeds 9300-9303). With every inhibitory
connection removed the tibia flexor pools fire at 151 Hz, so excitation
reaches them; from the 1,966 neurons active under BDN2, each flexor motor
neuron receives 275 inhibitory (GABA 183, glutamate 92) against 131
excitatory synapses, each extensor motor neuron 754 excitatory against
698 inhibitory. GABA alone outweighs the flexors' excitation; whether they
stay net-inhibited if glutamate excites depends on the model's sign rule.

Roadmap section 7 (with the whole sweep as a figure), change-log entry 19
and paper outline row 3.5f written; PDFs rebuilt.

Co-Authored-By: Claude Opus 5.5 <noreply@anthropic.com>
</commit_message>
<xml_diff>
--- a/report/POST_SUBMISSION_CHANGES.docx
+++ b/report/POST_SUBMISSION_CHANGES.docx
@@ -6645,6 +6645,305 @@
           <w:sz w:val="19"/>
         </w:rPr>
         <w:t>outputs/fly/embodied_stage2b_SIMULATED.</w:t>
+      </w:r>
+      <w:r>
+        <w:rPr>
+          <w:rFonts w:ascii="Calibri" w:hAnsi="Calibri"/>
+          <w:b w:val="0"/>
+          <w:i w:val="0"/>
+          <w:color w:val="222222"/>
+          <w:sz w:val="21"/>
+        </w:rPr>
+        <w:t>.</w:t>
+      </w:r>
+    </w:p>
+    <w:p>
+      <w:pPr>
+        <w:keepNext/>
+        <w:spacing w:before="240" w:after="60"/>
+      </w:pPr>
+      <w:r>
+        <w:rPr>
+          <w:rFonts w:ascii="Calibri" w:hAnsi="Calibri"/>
+          <w:b/>
+          <w:i w:val="0"/>
+          <w:color w:val="1F4E79"/>
+          <w:sz w:val="23"/>
+        </w:rPr>
+        <w:t>19. A registered sweep that found nothing, and why</w:t>
+      </w:r>
+    </w:p>
+    <w:p>
+      <w:pPr>
+        <w:spacing w:after="120"/>
+      </w:pPr>
+      <w:r>
+        <w:rPr>
+          <w:rFonts w:ascii="Calibri" w:hAnsi="Calibri"/>
+          <w:b/>
+          <w:i w:val="0"/>
+          <w:color w:val="156082"/>
+          <w:sz w:val="21"/>
+        </w:rPr>
+        <w:t>Slide message:</w:t>
+      </w:r>
+      <w:r>
+        <w:rPr>
+          <w:rFonts w:ascii="Calibri" w:hAnsi="Calibri"/>
+          <w:b w:val="0"/>
+          <w:i w:val="0"/>
+          <w:color w:val="222222"/>
+          <w:sz w:val="21"/>
+        </w:rPr>
+        <w:t xml:space="preserve"> </w:t>
+      </w:r>
+      <w:r>
+        <w:rPr>
+          <w:rFonts w:ascii="Calibri" w:hAnsi="Calibri"/>
+          <w:b w:val="0"/>
+          <w:i/>
+          <w:color w:val="222222"/>
+          <w:sz w:val="21"/>
+        </w:rPr>
+        <w:t>We swept the one cell property the roadmap named, reported every setting, and none made the nerve cord walk. The wiring explains it: the walking command's active neurons inhibit the flexors about twice as much as they excite them.</w:t>
+      </w:r>
+    </w:p>
+    <w:p>
+      <w:pPr>
+        <w:spacing w:after="120"/>
+        <w:ind w:left="432" w:hanging="259"/>
+      </w:pPr>
+      <w:r>
+        <w:rPr>
+          <w:rFonts w:ascii="Calibri" w:hAnsi="Calibri"/>
+          <w:b w:val="0"/>
+          <w:i w:val="0"/>
+          <w:color w:val="222222"/>
+          <w:sz w:val="21"/>
+        </w:rPr>
+        <w:t>•</w:t>
+        <w:tab/>
+      </w:r>
+      <w:r>
+        <w:rPr>
+          <w:rFonts w:ascii="Calibri" w:hAnsi="Calibri"/>
+          <w:b/>
+          <w:i w:val="0"/>
+          <w:color w:val="156082"/>
+          <w:sz w:val="21"/>
+        </w:rPr>
+        <w:t>What changed.</w:t>
+      </w:r>
+      <w:r>
+        <w:rPr>
+          <w:rFonts w:ascii="Calibri" w:hAnsi="Calibri"/>
+          <w:b w:val="0"/>
+          <w:i w:val="0"/>
+          <w:color w:val="222222"/>
+          <w:sz w:val="21"/>
+        </w:rPr>
+        <w:t xml:space="preserve"> </w:t>
+      </w:r>
+      <w:r>
+        <w:rPr>
+          <w:rFonts w:ascii="Consolas" w:hAnsi="Consolas"/>
+          <w:b w:val="0"/>
+          <w:i w:val="0"/>
+          <w:color w:val="222222"/>
+          <w:sz w:val="19"/>
+        </w:rPr>
+        <w:t>src/neuromps/fly/model.py</w:t>
+      </w:r>
+      <w:r>
+        <w:rPr>
+          <w:rFonts w:ascii="Calibri" w:hAnsi="Calibri"/>
+          <w:b w:val="0"/>
+          <w:i w:val="0"/>
+          <w:color w:val="222222"/>
+          <w:sz w:val="21"/>
+        </w:rPr>
+        <w:t xml:space="preserve"> gains spike-frequency adaptation (off by default; with it off the spikes are identical to the published model's). </w:t>
+      </w:r>
+      <w:r>
+        <w:rPr>
+          <w:rFonts w:ascii="Consolas" w:hAnsi="Consolas"/>
+          <w:b w:val="0"/>
+          <w:i w:val="0"/>
+          <w:color w:val="222222"/>
+          <w:sz w:val="19"/>
+        </w:rPr>
+        <w:t>connectome.rewire</w:t>
+      </w:r>
+      <w:r>
+        <w:rPr>
+          <w:rFonts w:ascii="Calibri" w:hAnsi="Calibri"/>
+          <w:b w:val="0"/>
+          <w:i w:val="0"/>
+          <w:color w:val="222222"/>
+          <w:sz w:val="21"/>
+        </w:rPr>
+        <w:t xml:space="preserve"> builds a degree-preserving control. </w:t>
+      </w:r>
+      <w:r>
+        <w:rPr>
+          <w:rFonts w:ascii="Consolas" w:hAnsi="Consolas"/>
+          <w:b w:val="0"/>
+          <w:i w:val="0"/>
+          <w:color w:val="222222"/>
+          <w:sz w:val="19"/>
+        </w:rPr>
+        <w:t>src/neuromps/fly/embodied_stage2c.py</w:t>
+      </w:r>
+      <w:r>
+        <w:rPr>
+          <w:rFonts w:ascii="Calibri" w:hAnsi="Calibri"/>
+          <w:b w:val="0"/>
+          <w:i w:val="0"/>
+          <w:color w:val="222222"/>
+          <w:sz w:val="21"/>
+        </w:rPr>
+        <w:t xml:space="preserve"> runs the registered sweep, selection rule and confirmation. </w:t>
+      </w:r>
+      <w:r>
+        <w:rPr>
+          <w:rFonts w:ascii="Consolas" w:hAnsi="Consolas"/>
+          <w:b w:val="0"/>
+          <w:i w:val="0"/>
+          <w:color w:val="222222"/>
+          <w:sz w:val="19"/>
+        </w:rPr>
+        <w:t>src/neuromps/fly/flexor_diagnostic.py</w:t>
+      </w:r>
+      <w:r>
+        <w:rPr>
+          <w:rFonts w:ascii="Calibri" w:hAnsi="Calibri"/>
+          <w:b w:val="0"/>
+          <w:i w:val="0"/>
+          <w:color w:val="222222"/>
+          <w:sz w:val="21"/>
+        </w:rPr>
+        <w:t xml:space="preserve"> is the exploratory follow-up.</w:t>
+      </w:r>
+    </w:p>
+    <w:p>
+      <w:pPr>
+        <w:spacing w:after="120"/>
+        <w:ind w:left="432" w:hanging="259"/>
+      </w:pPr>
+      <w:r>
+        <w:rPr>
+          <w:rFonts w:ascii="Calibri" w:hAnsi="Calibri"/>
+          <w:b w:val="0"/>
+          <w:i w:val="0"/>
+          <w:color w:val="222222"/>
+          <w:sz w:val="21"/>
+        </w:rPr>
+        <w:t>•</w:t>
+        <w:tab/>
+      </w:r>
+      <w:r>
+        <w:rPr>
+          <w:rFonts w:ascii="Calibri" w:hAnsi="Calibri"/>
+          <w:b/>
+          <w:i w:val="0"/>
+          <w:color w:val="156082"/>
+          <w:sz w:val="21"/>
+        </w:rPr>
+        <w:t>Effect.</w:t>
+      </w:r>
+      <w:r>
+        <w:rPr>
+          <w:rFonts w:ascii="Calibri" w:hAnsi="Calibri"/>
+          <w:b w:val="0"/>
+          <w:i w:val="0"/>
+          <w:color w:val="222222"/>
+          <w:sz w:val="21"/>
+        </w:rPr>
+        <w:t xml:space="preserve"> 0 of 36 cells produce a rhythm; the stage stops as registered. Flexors fire at 151.341 Hz once inhibition is removed; from the command's active neurons they receive 274.73 inhibitory against 130.78 excitatory synapses each (exploratory).</w:t>
+      </w:r>
+    </w:p>
+    <w:p>
+      <w:pPr>
+        <w:spacing w:after="120"/>
+        <w:ind w:left="432" w:hanging="259"/>
+      </w:pPr>
+      <w:r>
+        <w:rPr>
+          <w:rFonts w:ascii="Calibri" w:hAnsi="Calibri"/>
+          <w:b w:val="0"/>
+          <w:i w:val="0"/>
+          <w:color w:val="222222"/>
+          <w:sz w:val="21"/>
+        </w:rPr>
+        <w:t>•</w:t>
+        <w:tab/>
+      </w:r>
+      <w:r>
+        <w:rPr>
+          <w:rFonts w:ascii="Calibri" w:hAnsi="Calibri"/>
+          <w:b/>
+          <w:i w:val="0"/>
+          <w:color w:val="156082"/>
+          <w:sz w:val="21"/>
+        </w:rPr>
+        <w:t>Why it matters for the interview.</w:t>
+      </w:r>
+      <w:r>
+        <w:rPr>
+          <w:rFonts w:ascii="Calibri" w:hAnsi="Calibri"/>
+          <w:b w:val="0"/>
+          <w:i w:val="0"/>
+          <w:color w:val="222222"/>
+          <w:sz w:val="21"/>
+        </w:rPr>
+        <w:t xml:space="preserve"> It shows the discipline holding when the result is null: the sweep was fixed before running, reported whole, and followed by a mechanism, not by re-tuning until it walked.</w:t>
+      </w:r>
+    </w:p>
+    <w:p>
+      <w:pPr>
+        <w:spacing w:after="120"/>
+        <w:ind w:left="432" w:hanging="259"/>
+      </w:pPr>
+      <w:r>
+        <w:rPr>
+          <w:rFonts w:ascii="Calibri" w:hAnsi="Calibri"/>
+          <w:b w:val="0"/>
+          <w:i w:val="0"/>
+          <w:color w:val="222222"/>
+          <w:sz w:val="21"/>
+        </w:rPr>
+        <w:t>•</w:t>
+        <w:tab/>
+      </w:r>
+      <w:r>
+        <w:rPr>
+          <w:rFonts w:ascii="Calibri" w:hAnsi="Calibri"/>
+          <w:b/>
+          <w:i w:val="0"/>
+          <w:color w:val="156082"/>
+          <w:sz w:val="21"/>
+        </w:rPr>
+        <w:t>Evidence.</w:t>
+      </w:r>
+      <w:r>
+        <w:rPr>
+          <w:rFonts w:ascii="Calibri" w:hAnsi="Calibri"/>
+          <w:b w:val="0"/>
+          <w:i w:val="0"/>
+          <w:color w:val="222222"/>
+          <w:sz w:val="21"/>
+        </w:rPr>
+        <w:t xml:space="preserve"> Roadmap §7 and figure; </w:t>
+      </w:r>
+      <w:r>
+        <w:rPr>
+          <w:rFonts w:ascii="Consolas" w:hAnsi="Consolas"/>
+          <w:b w:val="0"/>
+          <w:i w:val="0"/>
+          <w:color w:val="222222"/>
+          <w:sz w:val="19"/>
+        </w:rPr>
+        <w:t>outputs/fly/embodied_stage2c_</w:t>
       </w:r>
       <w:r>
         <w:rPr>

</xml_diff>

<commit_message>
Record embodied stage 2d: the glutamate sign rule does not make the cord walk
Registered edbf611, run as registered. Glutamate excitatory onto motor
neurons only: flexors 1.76 Hz, no cell passes a walking test. Glutamate
excitatory everywhere: flexors 40.4 Hz, but 7,118 neurons active (2,136
under the motor-only rule), rhythm in 5 of 37 cells as slow population
waves, alternation in none. The selected cell (0.5 mV, 100 ms; it passed
only the tripod test on exploration seeds) passes 1 of 7 on fresh seeds:
silence without drive; the tripod pass did not replicate, the left front
flexor and extensor fire in phase, the period is 317.5 ms.

With stages 2a and 2c, three registered attempts find no walking rhythm
generator in the male nerve cord under leaky integrate-and-fire neurons;
written up as a negative result (roadmap section 7, change-log entry 20,
paper outline 3.5g). PDFs rebuilt.

Co-Authored-By: Claude Opus 5.5 <noreply@anthropic.com>
</commit_message>
<xml_diff>
--- a/report/POST_SUBMISSION_CHANGES.docx
+++ b/report/POST_SUBMISSION_CHANGES.docx
@@ -6944,6 +6944,228 @@
           <w:sz w:val="19"/>
         </w:rPr>
         <w:t>outputs/fly/embodied_stage2c_</w:t>
+      </w:r>
+      <w:r>
+        <w:rPr>
+          <w:rFonts w:ascii="Calibri" w:hAnsi="Calibri"/>
+          <w:b w:val="0"/>
+          <w:i w:val="0"/>
+          <w:color w:val="222222"/>
+          <w:sz w:val="21"/>
+        </w:rPr>
+        <w:t>.</w:t>
+      </w:r>
+    </w:p>
+    <w:p>
+      <w:pPr>
+        <w:keepNext/>
+        <w:spacing w:before="240" w:after="60"/>
+      </w:pPr>
+      <w:r>
+        <w:rPr>
+          <w:rFonts w:ascii="Calibri" w:hAnsi="Calibri"/>
+          <w:b/>
+          <w:i w:val="0"/>
+          <w:color w:val="1F4E79"/>
+          <w:sz w:val="23"/>
+        </w:rPr>
+        <w:t>20. The glutamate sign is not the missing piece</w:t>
+      </w:r>
+    </w:p>
+    <w:p>
+      <w:pPr>
+        <w:spacing w:after="120"/>
+      </w:pPr>
+      <w:r>
+        <w:rPr>
+          <w:rFonts w:ascii="Calibri" w:hAnsi="Calibri"/>
+          <w:b/>
+          <w:i w:val="0"/>
+          <w:color w:val="156082"/>
+          <w:sz w:val="21"/>
+        </w:rPr>
+        <w:t>Slide message:</w:t>
+      </w:r>
+      <w:r>
+        <w:rPr>
+          <w:rFonts w:ascii="Calibri" w:hAnsi="Calibri"/>
+          <w:b w:val="0"/>
+          <w:i w:val="0"/>
+          <w:color w:val="222222"/>
+          <w:sz w:val="21"/>
+        </w:rPr>
+        <w:t xml:space="preserve"> </w:t>
+      </w:r>
+      <w:r>
+        <w:rPr>
+          <w:rFonts w:ascii="Calibri" w:hAnsi="Calibri"/>
+          <w:b w:val="0"/>
+          <w:i/>
+          <w:color w:val="222222"/>
+          <w:sz w:val="21"/>
+        </w:rPr>
+        <w:t>Making glutamate excitatory switches the silent flexors on, but the cord then fires as one slow wave, not as alternating legs. Three registered attempts agree that this wiring, in this neuron model, has no walking rhythm generator. That negative result is reportable.</w:t>
+      </w:r>
+    </w:p>
+    <w:p>
+      <w:pPr>
+        <w:spacing w:after="120"/>
+        <w:ind w:left="432" w:hanging="259"/>
+      </w:pPr>
+      <w:r>
+        <w:rPr>
+          <w:rFonts w:ascii="Calibri" w:hAnsi="Calibri"/>
+          <w:b w:val="0"/>
+          <w:i w:val="0"/>
+          <w:color w:val="222222"/>
+          <w:sz w:val="21"/>
+        </w:rPr>
+        <w:t>•</w:t>
+        <w:tab/>
+      </w:r>
+      <w:r>
+        <w:rPr>
+          <w:rFonts w:ascii="Calibri" w:hAnsi="Calibri"/>
+          <w:b/>
+          <w:i w:val="0"/>
+          <w:color w:val="156082"/>
+          <w:sz w:val="21"/>
+        </w:rPr>
+        <w:t>What changed.</w:t>
+      </w:r>
+      <w:r>
+        <w:rPr>
+          <w:rFonts w:ascii="Calibri" w:hAnsi="Calibri"/>
+          <w:b w:val="0"/>
+          <w:i w:val="0"/>
+          <w:color w:val="222222"/>
+          <w:sz w:val="21"/>
+        </w:rPr>
+        <w:t xml:space="preserve"> </w:t>
+      </w:r>
+      <w:r>
+        <w:rPr>
+          <w:rFonts w:ascii="Consolas" w:hAnsi="Consolas"/>
+          <w:b w:val="0"/>
+          <w:i w:val="0"/>
+          <w:color w:val="222222"/>
+          <w:sz w:val="19"/>
+        </w:rPr>
+        <w:t>connectome.make_excitatory</w:t>
+      </w:r>
+      <w:r>
+        <w:rPr>
+          <w:rFonts w:ascii="Calibri" w:hAnsi="Calibri"/>
+          <w:b w:val="0"/>
+          <w:i w:val="0"/>
+          <w:color w:val="222222"/>
+          <w:sz w:val="21"/>
+        </w:rPr>
+        <w:t xml:space="preserve">; </w:t>
+      </w:r>
+      <w:r>
+        <w:rPr>
+          <w:rFonts w:ascii="Consolas" w:hAnsi="Consolas"/>
+          <w:b w:val="0"/>
+          <w:i w:val="0"/>
+          <w:color w:val="222222"/>
+          <w:sz w:val="19"/>
+        </w:rPr>
+        <w:t>src/neuromps/fly/embodied_stage2d.py</w:t>
+      </w:r>
+      <w:r>
+        <w:rPr>
+          <w:rFonts w:ascii="Calibri" w:hAnsi="Calibri"/>
+          <w:b w:val="0"/>
+          <w:i w:val="0"/>
+          <w:color w:val="222222"/>
+          <w:sz w:val="21"/>
+        </w:rPr>
+        <w:t xml:space="preserve"> builds two registered bounds on where glutamate excites (onto motor neurons; everywhere), each without adaptation and over stage 2c's grid, through stage 2c's code (a rerun of stage 2c is byte-identical).</w:t>
+      </w:r>
+    </w:p>
+    <w:p>
+      <w:pPr>
+        <w:spacing w:after="120"/>
+        <w:ind w:left="432" w:hanging="259"/>
+      </w:pPr>
+      <w:r>
+        <w:rPr>
+          <w:rFonts w:ascii="Calibri" w:hAnsi="Calibri"/>
+          <w:b w:val="0"/>
+          <w:i w:val="0"/>
+          <w:color w:val="222222"/>
+          <w:sz w:val="21"/>
+        </w:rPr>
+        <w:t>•</w:t>
+        <w:tab/>
+      </w:r>
+      <w:r>
+        <w:rPr>
+          <w:rFonts w:ascii="Calibri" w:hAnsi="Calibri"/>
+          <w:b/>
+          <w:i w:val="0"/>
+          <w:color w:val="156082"/>
+          <w:sz w:val="21"/>
+        </w:rPr>
+        <w:t>Effect.</w:t>
+      </w:r>
+      <w:r>
+        <w:rPr>
+          <w:rFonts w:ascii="Calibri" w:hAnsi="Calibri"/>
+          <w:b w:val="0"/>
+          <w:i w:val="0"/>
+          <w:color w:val="222222"/>
+          <w:sz w:val="21"/>
+        </w:rPr>
+        <w:t xml:space="preserve"> Onto motor neurons: flexors 1.76 Hz, no cell passes a walking test. Everywhere: flexors 40.4 Hz with 7,118 active neurons, rhythm in 5 cells, alternation in none; the selected cell passes only silence without drive on fresh seeds.</w:t>
+      </w:r>
+    </w:p>
+    <w:p>
+      <w:pPr>
+        <w:spacing w:after="120"/>
+        <w:ind w:left="432" w:hanging="259"/>
+      </w:pPr>
+      <w:r>
+        <w:rPr>
+          <w:rFonts w:ascii="Calibri" w:hAnsi="Calibri"/>
+          <w:b w:val="0"/>
+          <w:i w:val="0"/>
+          <w:color w:val="222222"/>
+          <w:sz w:val="21"/>
+        </w:rPr>
+        <w:t>•</w:t>
+        <w:tab/>
+      </w:r>
+      <w:r>
+        <w:rPr>
+          <w:rFonts w:ascii="Calibri" w:hAnsi="Calibri"/>
+          <w:b/>
+          <w:i w:val="0"/>
+          <w:color w:val="156082"/>
+          <w:sz w:val="21"/>
+        </w:rPr>
+        <w:t>Evidence.</w:t>
+      </w:r>
+      <w:r>
+        <w:rPr>
+          <w:rFonts w:ascii="Calibri" w:hAnsi="Calibri"/>
+          <w:b w:val="0"/>
+          <w:i w:val="0"/>
+          <w:color w:val="222222"/>
+          <w:sz w:val="21"/>
+        </w:rPr>
+        <w:t xml:space="preserve"> Roadmap §7 and figure; </w:t>
+      </w:r>
+      <w:r>
+        <w:rPr>
+          <w:rFonts w:ascii="Consolas" w:hAnsi="Consolas"/>
+          <w:b w:val="0"/>
+          <w:i w:val="0"/>
+          <w:color w:val="222222"/>
+          <w:sz w:val="19"/>
+        </w:rPr>
+        <w:t>outputs/fly/embodied_stage2d_</w:t>
       </w:r>
       <w:r>
         <w:rPr>

</xml_diff>

<commit_message>
Record embodied stage 3a: claw feedback resists at the motor level, not in the leg
Registered 5cdeba9, run as registered on seeds 1020-1027: 3 of 5. The
go/no-go fails: resistance feedback moves the held tibia by 0.0054 rad
(0.1 registered), so the contingency test is uninterpretable. The loop is
silent without drive, the opposite assignment does not resist, and the
grooming reach survives (0.968 of the second near the head). At the motor
level the feedback resists (tibia extensor 43.25 -> 31.75 Hz, flexor 0.1
-> 3.4 Hz), but the sham does the same: during a held extension the claw
neurons fire at a near-constant 90 Hz, so contingent and blind input
coincide. Exploratory --check: not muscle saturation (at r_full 80 Hz the
tibia moves 0.6546 -> 0.6705 rad, the sham to 0.6711). A perturbation
test is the next registered step.

Roadmap section 7, change-log entry 26 and index row, paper outline 3.6
updated; PDFs rebuilt.

Co-Authored-By: Claude Opus 5.5 <noreply@anthropic.com>
</commit_message>
<xml_diff>
--- a/report/POST_SUBMISSION_CHANGES.docx
+++ b/report/POST_SUBMISSION_CHANGES.docx
@@ -3447,7 +3447,7 @@
           </w:tcPr>
           <w:p>
             <w:pPr>
-              <w:keepNext w:val="0"/>
+              <w:keepNext/>
               <w:spacing w:after="0"/>
               <w:jc w:val="center"/>
             </w:pPr>
@@ -3471,7 +3471,7 @@
           </w:tcPr>
           <w:p>
             <w:pPr>
-              <w:keepNext w:val="0"/>
+              <w:keepNext/>
               <w:spacing w:after="0"/>
               <w:jc w:val="center"/>
             </w:pPr>
@@ -3495,7 +3495,7 @@
           </w:tcPr>
           <w:p>
             <w:pPr>
-              <w:keepNext w:val="0"/>
+              <w:keepNext/>
               <w:spacing w:after="0"/>
             </w:pPr>
             <w:r>
@@ -3518,7 +3518,7 @@
           </w:tcPr>
           <w:p>
             <w:pPr>
-              <w:keepNext w:val="0"/>
+              <w:keepNext/>
               <w:spacing w:after="0"/>
             </w:pPr>
             <w:r>
@@ -3541,7 +3541,7 @@
           </w:tcPr>
           <w:p>
             <w:pPr>
-              <w:keepNext w:val="0"/>
+              <w:keepNext/>
               <w:spacing w:after="0"/>
             </w:pPr>
             <w:r>
@@ -3553,6 +3553,138 @@
                 <w:sz w:val="18"/>
               </w:rPr>
               <w:t>c6d7874</w:t>
+            </w:r>
+            <w:r>
+              <w:rPr>
+                <w:rFonts w:ascii="Calibri" w:hAnsi="Calibri"/>
+                <w:b w:val="0"/>
+                <w:i w:val="0"/>
+                <w:color w:val="222222"/>
+                <w:sz w:val="20"/>
+              </w:rPr>
+              <w:t xml:space="preserve"> … this branch</w:t>
+            </w:r>
+          </w:p>
+        </w:tc>
+      </w:tr>
+      <w:tr>
+        <w:trPr>
+          <w:cantSplit/>
+        </w:trPr>
+        <w:tc>
+          <w:tcPr>
+            <w:tcW w:type="dxa" w:w="415"/>
+            <w:shd w:val="clear" w:color="auto" w:fill="F7F9FB"/>
+            <w:vAlign w:val="center"/>
+          </w:tcPr>
+          <w:p>
+            <w:pPr>
+              <w:keepNext w:val="0"/>
+              <w:spacing w:after="0"/>
+              <w:jc w:val="center"/>
+            </w:pPr>
+            <w:r>
+              <w:rPr>
+                <w:rFonts w:ascii="Calibri" w:hAnsi="Calibri"/>
+                <w:b/>
+                <w:i w:val="0"/>
+                <w:color w:val="222222"/>
+                <w:sz w:val="20"/>
+              </w:rPr>
+              <w:t>26</w:t>
+            </w:r>
+          </w:p>
+        </w:tc>
+        <w:tc>
+          <w:tcPr>
+            <w:tcW w:type="dxa" w:w="1590"/>
+            <w:shd w:val="clear" w:color="auto" w:fill="F7F9FB"/>
+            <w:vAlign w:val="center"/>
+          </w:tcPr>
+          <w:p>
+            <w:pPr>
+              <w:keepNext w:val="0"/>
+              <w:spacing w:after="0"/>
+              <w:jc w:val="center"/>
+            </w:pPr>
+            <w:r>
+              <w:rPr>
+                <w:rFonts w:ascii="Calibri" w:hAnsi="Calibri"/>
+                <w:b w:val="0"/>
+                <w:i w:val="0"/>
+                <w:color w:val="222222"/>
+                <w:sz w:val="20"/>
+              </w:rPr>
+              <w:t>2026-10-24</w:t>
+            </w:r>
+          </w:p>
+        </w:tc>
+        <w:tc>
+          <w:tcPr>
+            <w:tcW w:type="dxa" w:w="2167"/>
+            <w:shd w:val="clear" w:color="auto" w:fill="F7F9FB"/>
+            <w:vAlign w:val="center"/>
+          </w:tcPr>
+          <w:p>
+            <w:pPr>
+              <w:keepNext w:val="0"/>
+              <w:spacing w:after="0"/>
+            </w:pPr>
+            <w:r>
+              <w:rPr>
+                <w:rFonts w:ascii="Calibri" w:hAnsi="Calibri"/>
+                <w:b w:val="0"/>
+                <w:i w:val="0"/>
+                <w:color w:val="222222"/>
+                <w:sz w:val="20"/>
+              </w:rPr>
+              <w:t>Embodied stage 3a: the first closed loop (claw-neuron feedback, grooming leg)</w:t>
+            </w:r>
+          </w:p>
+        </w:tc>
+        <w:tc>
+          <w:tcPr>
+            <w:tcW w:type="dxa" w:w="3100"/>
+            <w:shd w:val="clear" w:color="auto" w:fill="F7F9FB"/>
+            <w:vAlign w:val="center"/>
+          </w:tcPr>
+          <w:p>
+            <w:pPr>
+              <w:keepNext w:val="0"/>
+              <w:spacing w:after="0"/>
+            </w:pPr>
+            <w:r>
+              <w:rPr>
+                <w:rFonts w:ascii="Calibri" w:hAnsi="Calibri"/>
+                <w:b w:val="0"/>
+                <w:i w:val="0"/>
+                <w:color w:val="222222"/>
+                <w:sz w:val="20"/>
+              </w:rPr>
+              <w:t>3 of 5; go/no-go fails: feedback shifts motor pools toward resistance but barely moves a held leg, and a sham does the same</w:t>
+            </w:r>
+          </w:p>
+        </w:tc>
+        <w:tc>
+          <w:tcPr>
+            <w:tcW w:type="dxa" w:w="1224"/>
+            <w:shd w:val="clear" w:color="auto" w:fill="F7F9FB"/>
+            <w:vAlign w:val="center"/>
+          </w:tcPr>
+          <w:p>
+            <w:pPr>
+              <w:keepNext w:val="0"/>
+              <w:spacing w:after="0"/>
+            </w:pPr>
+            <w:r>
+              <w:rPr>
+                <w:rFonts w:ascii="Consolas" w:hAnsi="Consolas"/>
+                <w:b w:val="0"/>
+                <w:i w:val="0"/>
+                <w:color w:val="222222"/>
+                <w:sz w:val="18"/>
+              </w:rPr>
+              <w:t>5cdeba9</w:t>
             </w:r>
             <w:r>
               <w:rPr>
@@ -9618,6 +9750,308 @@
           <w:sz w:val="19"/>
         </w:rPr>
         <w:t>outputs/fly/embodied_stage2h_</w:t>
+      </w:r>
+      <w:r>
+        <w:rPr>
+          <w:rFonts w:ascii="Calibri" w:hAnsi="Calibri"/>
+          <w:b w:val="0"/>
+          <w:i w:val="0"/>
+          <w:color w:val="222222"/>
+          <w:sz w:val="21"/>
+        </w:rPr>
+        <w:t>.</w:t>
+      </w:r>
+    </w:p>
+    <w:p>
+      <w:pPr>
+        <w:keepNext/>
+        <w:spacing w:before="240" w:after="60"/>
+      </w:pPr>
+      <w:r>
+        <w:rPr>
+          <w:rFonts w:ascii="Calibri" w:hAnsi="Calibri"/>
+          <w:b/>
+          <w:i w:val="0"/>
+          <w:color w:val="1F4E79"/>
+          <w:sz w:val="23"/>
+        </w:rPr>
+        <w:t>26. The first closed loop: brain-free nerve cord, leg and leg sensors</w:t>
+      </w:r>
+    </w:p>
+    <w:p>
+      <w:pPr>
+        <w:spacing w:after="120"/>
+      </w:pPr>
+      <w:r>
+        <w:rPr>
+          <w:rFonts w:ascii="Calibri" w:hAnsi="Calibri"/>
+          <w:b/>
+          <w:i w:val="0"/>
+          <w:color w:val="156082"/>
+          <w:sz w:val="21"/>
+        </w:rPr>
+        <w:t>Slide message:</w:t>
+      </w:r>
+      <w:r>
+        <w:rPr>
+          <w:rFonts w:ascii="Calibri" w:hAnsi="Calibri"/>
+          <w:b w:val="0"/>
+          <w:i w:val="0"/>
+          <w:color w:val="222222"/>
+          <w:sz w:val="21"/>
+        </w:rPr>
+        <w:t xml:space="preserve"> </w:t>
+      </w:r>
+      <w:r>
+        <w:rPr>
+          <w:rFonts w:ascii="Calibri" w:hAnsi="Calibri"/>
+          <w:b w:val="0"/>
+          <w:i/>
+          <w:color w:val="222222"/>
+          <w:sz w:val="21"/>
+        </w:rPr>
+        <w:t>The simulated nerve cord now moves a leg and feels it move. Feedback from the leg's position sensors shifts the motor neurons toward resisting the movement, as insect reflexes do. In a held posture that barely moves the leg, and blind input does the same. A perturbation test is next.</w:t>
+      </w:r>
+    </w:p>
+    <w:p>
+      <w:pPr>
+        <w:spacing w:after="120"/>
+        <w:ind w:left="432" w:hanging="259"/>
+      </w:pPr>
+      <w:r>
+        <w:rPr>
+          <w:rFonts w:ascii="Calibri" w:hAnsi="Calibri"/>
+          <w:b w:val="0"/>
+          <w:i w:val="0"/>
+          <w:color w:val="222222"/>
+          <w:sz w:val="21"/>
+        </w:rPr>
+        <w:t>•</w:t>
+        <w:tab/>
+      </w:r>
+      <w:r>
+        <w:rPr>
+          <w:rFonts w:ascii="Calibri" w:hAnsi="Calibri"/>
+          <w:b/>
+          <w:i w:val="0"/>
+          <w:color w:val="156082"/>
+          <w:sz w:val="21"/>
+        </w:rPr>
+        <w:t>What changed.</w:t>
+      </w:r>
+      <w:r>
+        <w:rPr>
+          <w:rFonts w:ascii="Calibri" w:hAnsi="Calibri"/>
+          <w:b w:val="0"/>
+          <w:i w:val="0"/>
+          <w:color w:val="222222"/>
+          <w:sz w:val="21"/>
+        </w:rPr>
+        <w:t xml:space="preserve"> </w:t>
+      </w:r>
+      <w:r>
+        <w:rPr>
+          <w:rFonts w:ascii="Consolas" w:hAnsi="Consolas"/>
+          <w:b w:val="0"/>
+          <w:i w:val="0"/>
+          <w:color w:val="222222"/>
+          <w:sz w:val="19"/>
+        </w:rPr>
+        <w:t>body.Session</w:t>
+      </w:r>
+      <w:r>
+        <w:rPr>
+          <w:rFonts w:ascii="Calibri" w:hAnsi="Calibri"/>
+          <w:b w:val="0"/>
+          <w:i w:val="0"/>
+          <w:color w:val="222222"/>
+          <w:sz w:val="21"/>
+        </w:rPr>
+        <w:t xml:space="preserve"> steps the leg; </w:t>
+      </w:r>
+      <w:r>
+        <w:rPr>
+          <w:rFonts w:ascii="Consolas" w:hAnsi="Consolas"/>
+          <w:b w:val="0"/>
+          <w:i w:val="0"/>
+          <w:color w:val="222222"/>
+          <w:sz w:val="19"/>
+        </w:rPr>
+        <w:t>model.simulate</w:t>
+      </w:r>
+      <w:r>
+        <w:rPr>
+          <w:rFonts w:ascii="Calibri" w:hAnsi="Calibri"/>
+          <w:b w:val="0"/>
+          <w:i w:val="0"/>
+          <w:color w:val="222222"/>
+          <w:sz w:val="21"/>
+        </w:rPr>
+        <w:t xml:space="preserve"> takes an </w:t>
+      </w:r>
+      <w:r>
+        <w:rPr>
+          <w:rFonts w:ascii="Consolas" w:hAnsi="Consolas"/>
+          <w:b w:val="0"/>
+          <w:i w:val="0"/>
+          <w:color w:val="222222"/>
+          <w:sz w:val="19"/>
+        </w:rPr>
+        <w:t>extend</w:t>
+      </w:r>
+      <w:r>
+        <w:rPr>
+          <w:rFonts w:ascii="Calibri" w:hAnsi="Calibri"/>
+          <w:b w:val="0"/>
+          <w:i w:val="0"/>
+          <w:color w:val="222222"/>
+          <w:sz w:val="21"/>
+        </w:rPr>
+        <w:t xml:space="preserve"> hook; </w:t>
+      </w:r>
+      <w:r>
+        <w:rPr>
+          <w:rFonts w:ascii="Consolas" w:hAnsi="Consolas"/>
+          <w:b w:val="0"/>
+          <w:i w:val="0"/>
+          <w:color w:val="222222"/>
+          <w:sz w:val="19"/>
+        </w:rPr>
+        <w:t>src/neuromps/fly/closed_loop.py</w:t>
+      </w:r>
+      <w:r>
+        <w:rPr>
+          <w:rFonts w:ascii="Calibri" w:hAnsi="Calibri"/>
+          <w:b w:val="0"/>
+          <w:i w:val="0"/>
+          <w:color w:val="222222"/>
+          <w:sz w:val="21"/>
+        </w:rPr>
+        <w:t xml:space="preserve"> couples nerve cord and leg every millisecond and drives sensory neurons from a joint angle; </w:t>
+      </w:r>
+      <w:r>
+        <w:rPr>
+          <w:rFonts w:ascii="Consolas" w:hAnsi="Consolas"/>
+          <w:b w:val="0"/>
+          <w:i w:val="0"/>
+          <w:color w:val="222222"/>
+          <w:sz w:val="19"/>
+        </w:rPr>
+        <w:t>src/neuromps/fly/embodied_stage3a.py</w:t>
+      </w:r>
+      <w:r>
+        <w:rPr>
+          <w:rFonts w:ascii="Calibri" w:hAnsi="Calibri"/>
+          <w:b w:val="0"/>
+          <w:i w:val="0"/>
+          <w:color w:val="222222"/>
+          <w:sz w:val="21"/>
+        </w:rPr>
+        <w:t xml:space="preserve"> runs the registered arms; </w:t>
+      </w:r>
+      <w:r>
+        <w:rPr>
+          <w:rFonts w:ascii="Consolas" w:hAnsi="Consolas"/>
+          <w:b w:val="0"/>
+          <w:i w:val="0"/>
+          <w:color w:val="222222"/>
+          <w:sz w:val="19"/>
+        </w:rPr>
+        <w:t>--check</w:t>
+      </w:r>
+      <w:r>
+        <w:rPr>
+          <w:rFonts w:ascii="Calibri" w:hAnsi="Calibri"/>
+          <w:b w:val="0"/>
+          <w:i w:val="0"/>
+          <w:color w:val="222222"/>
+          <w:sz w:val="21"/>
+        </w:rPr>
+        <w:t xml:space="preserve"> the exploratory activation-scale check.</w:t>
+      </w:r>
+    </w:p>
+    <w:p>
+      <w:pPr>
+        <w:spacing w:after="120"/>
+        <w:ind w:left="432" w:hanging="259"/>
+      </w:pPr>
+      <w:r>
+        <w:rPr>
+          <w:rFonts w:ascii="Calibri" w:hAnsi="Calibri"/>
+          <w:b w:val="0"/>
+          <w:i w:val="0"/>
+          <w:color w:val="222222"/>
+          <w:sz w:val="21"/>
+        </w:rPr>
+        <w:t>•</w:t>
+        <w:tab/>
+      </w:r>
+      <w:r>
+        <w:rPr>
+          <w:rFonts w:ascii="Calibri" w:hAnsi="Calibri"/>
+          <w:b/>
+          <w:i w:val="0"/>
+          <w:color w:val="156082"/>
+          <w:sz w:val="21"/>
+        </w:rPr>
+        <w:t>Effect.</w:t>
+      </w:r>
+      <w:r>
+        <w:rPr>
+          <w:rFonts w:ascii="Calibri" w:hAnsi="Calibri"/>
+          <w:b w:val="0"/>
+          <w:i w:val="0"/>
+          <w:color w:val="222222"/>
+          <w:sz w:val="21"/>
+        </w:rPr>
+        <w:t xml:space="preserve"> Go/no-go failed: tibia shift 0.0054 rad (0.1 needed); 3 of 5 pass (silence, no resistance from the opposite assignment, the reach survives). Motor level: extensor 43.25 to 31.75 Hz under resistance, matched by the sham.</w:t>
+      </w:r>
+    </w:p>
+    <w:p>
+      <w:pPr>
+        <w:spacing w:after="120"/>
+        <w:ind w:left="432" w:hanging="259"/>
+      </w:pPr>
+      <w:r>
+        <w:rPr>
+          <w:rFonts w:ascii="Calibri" w:hAnsi="Calibri"/>
+          <w:b w:val="0"/>
+          <w:i w:val="0"/>
+          <w:color w:val="222222"/>
+          <w:sz w:val="21"/>
+        </w:rPr>
+        <w:t>•</w:t>
+        <w:tab/>
+      </w:r>
+      <w:r>
+        <w:rPr>
+          <w:rFonts w:ascii="Calibri" w:hAnsi="Calibri"/>
+          <w:b/>
+          <w:i w:val="0"/>
+          <w:color w:val="156082"/>
+          <w:sz w:val="21"/>
+        </w:rPr>
+        <w:t>Evidence.</w:t>
+      </w:r>
+      <w:r>
+        <w:rPr>
+          <w:rFonts w:ascii="Calibri" w:hAnsi="Calibri"/>
+          <w:b w:val="0"/>
+          <w:i w:val="0"/>
+          <w:color w:val="222222"/>
+          <w:sz w:val="21"/>
+        </w:rPr>
+        <w:t xml:space="preserve"> Roadmap §7 and figure; </w:t>
+      </w:r>
+      <w:r>
+        <w:rPr>
+          <w:rFonts w:ascii="Consolas" w:hAnsi="Consolas"/>
+          <w:b w:val="0"/>
+          <w:i w:val="0"/>
+          <w:color w:val="222222"/>
+          <w:sz w:val="19"/>
+        </w:rPr>
+        <w:t>outputs/fly/embodied_stage3a_</w:t>
       </w:r>
       <w:r>
         <w:rPr>

</xml_diff>

<commit_message>
Record embodied stage 3b: the claw-neuron loop does not push back
Registered cd0a711, run as registered on seeds 1030-1045: 2 of 5. The
push flexes the held tibia by 0.628 rad (precondition passes); resistance
feedback returns it in 32 ms against 30 ms open loop (20% faster needed),
so the contingency test is uninterpretable; the opposite assignment is
slightly faster (27.5 ms), failing its prediction; the reach survives.
Resistance and sham traces coincide: the feedback that follows the push
changes nothing measurable; the tonic feedback lowers the extensor and
lets the push flex further. Exploratory --check: the male CNS traces 20
chordotonal and 4 claw neurons for the left front leg against 89 and 22
for the left hind leg.

Roadmap section 7, change-log entry 27 and index row, paper outline 3.6
written; PDFs rebuilt.

Co-Authored-By: Claude Opus 5.5 <noreply@anthropic.com>
</commit_message>
<xml_diff>
--- a/report/POST_SUBMISSION_CHANGES.docx
+++ b/report/POST_SUBMISSION_CHANGES.docx
@@ -3579,7 +3579,7 @@
           </w:tcPr>
           <w:p>
             <w:pPr>
-              <w:keepNext w:val="0"/>
+              <w:keepNext/>
               <w:spacing w:after="0"/>
               <w:jc w:val="center"/>
             </w:pPr>
@@ -3603,7 +3603,7 @@
           </w:tcPr>
           <w:p>
             <w:pPr>
-              <w:keepNext w:val="0"/>
+              <w:keepNext/>
               <w:spacing w:after="0"/>
               <w:jc w:val="center"/>
             </w:pPr>
@@ -3627,7 +3627,7 @@
           </w:tcPr>
           <w:p>
             <w:pPr>
-              <w:keepNext w:val="0"/>
+              <w:keepNext/>
               <w:spacing w:after="0"/>
             </w:pPr>
             <w:r>
@@ -3650,7 +3650,7 @@
           </w:tcPr>
           <w:p>
             <w:pPr>
-              <w:keepNext w:val="0"/>
+              <w:keepNext/>
               <w:spacing w:after="0"/>
             </w:pPr>
             <w:r>
@@ -3673,7 +3673,7 @@
           </w:tcPr>
           <w:p>
             <w:pPr>
-              <w:keepNext w:val="0"/>
+              <w:keepNext/>
               <w:spacing w:after="0"/>
             </w:pPr>
             <w:r>
@@ -3685,6 +3685,138 @@
                 <w:sz w:val="18"/>
               </w:rPr>
               <w:t>5cdeba9</w:t>
+            </w:r>
+            <w:r>
+              <w:rPr>
+                <w:rFonts w:ascii="Calibri" w:hAnsi="Calibri"/>
+                <w:b w:val="0"/>
+                <w:i w:val="0"/>
+                <w:color w:val="222222"/>
+                <w:sz w:val="20"/>
+              </w:rPr>
+              <w:t xml:space="preserve"> … this branch</w:t>
+            </w:r>
+          </w:p>
+        </w:tc>
+      </w:tr>
+      <w:tr>
+        <w:trPr>
+          <w:cantSplit/>
+        </w:trPr>
+        <w:tc>
+          <w:tcPr>
+            <w:tcW w:type="dxa" w:w="415"/>
+            <w:shd w:val="clear" w:color="auto" w:fill="FFFFFF"/>
+            <w:vAlign w:val="center"/>
+          </w:tcPr>
+          <w:p>
+            <w:pPr>
+              <w:keepNext w:val="0"/>
+              <w:spacing w:after="0"/>
+              <w:jc w:val="center"/>
+            </w:pPr>
+            <w:r>
+              <w:rPr>
+                <w:rFonts w:ascii="Calibri" w:hAnsi="Calibri"/>
+                <w:b/>
+                <w:i w:val="0"/>
+                <w:color w:val="222222"/>
+                <w:sz w:val="20"/>
+              </w:rPr>
+              <w:t>27</w:t>
+            </w:r>
+          </w:p>
+        </w:tc>
+        <w:tc>
+          <w:tcPr>
+            <w:tcW w:type="dxa" w:w="1590"/>
+            <w:shd w:val="clear" w:color="auto" w:fill="FFFFFF"/>
+            <w:vAlign w:val="center"/>
+          </w:tcPr>
+          <w:p>
+            <w:pPr>
+              <w:keepNext w:val="0"/>
+              <w:spacing w:after="0"/>
+              <w:jc w:val="center"/>
+            </w:pPr>
+            <w:r>
+              <w:rPr>
+                <w:rFonts w:ascii="Calibri" w:hAnsi="Calibri"/>
+                <w:b w:val="0"/>
+                <w:i w:val="0"/>
+                <w:color w:val="222222"/>
+                <w:sz w:val="20"/>
+              </w:rPr>
+              <w:t>2026-10-24</w:t>
+            </w:r>
+          </w:p>
+        </w:tc>
+        <w:tc>
+          <w:tcPr>
+            <w:tcW w:type="dxa" w:w="2167"/>
+            <w:shd w:val="clear" w:color="auto" w:fill="FFFFFF"/>
+            <w:vAlign w:val="center"/>
+          </w:tcPr>
+          <w:p>
+            <w:pPr>
+              <w:keepNext w:val="0"/>
+              <w:spacing w:after="0"/>
+            </w:pPr>
+            <w:r>
+              <w:rPr>
+                <w:rFonts w:ascii="Calibri" w:hAnsi="Calibri"/>
+                <w:b w:val="0"/>
+                <w:i w:val="0"/>
+                <w:color w:val="222222"/>
+                <w:sz w:val="20"/>
+              </w:rPr>
+              <w:t>Embodied stage 3b: a push on the tibia during the grooming hold</w:t>
+            </w:r>
+          </w:p>
+        </w:tc>
+        <w:tc>
+          <w:tcPr>
+            <w:tcW w:type="dxa" w:w="3100"/>
+            <w:shd w:val="clear" w:color="auto" w:fill="FFFFFF"/>
+            <w:vAlign w:val="center"/>
+          </w:tcPr>
+          <w:p>
+            <w:pPr>
+              <w:keepNext w:val="0"/>
+              <w:spacing w:after="0"/>
+            </w:pPr>
+            <w:r>
+              <w:rPr>
+                <w:rFonts w:ascii="Calibri" w:hAnsi="Calibri"/>
+                <w:b w:val="0"/>
+                <w:i w:val="0"/>
+                <w:color w:val="222222"/>
+                <w:sz w:val="20"/>
+              </w:rPr>
+              <w:t>2 of 5; the loop does not speed the return; the front leg's proprioceptors are thinly traced</w:t>
+            </w:r>
+          </w:p>
+        </w:tc>
+        <w:tc>
+          <w:tcPr>
+            <w:tcW w:type="dxa" w:w="1224"/>
+            <w:shd w:val="clear" w:color="auto" w:fill="FFFFFF"/>
+            <w:vAlign w:val="center"/>
+          </w:tcPr>
+          <w:p>
+            <w:pPr>
+              <w:keepNext w:val="0"/>
+              <w:spacing w:after="0"/>
+            </w:pPr>
+            <w:r>
+              <w:rPr>
+                <w:rFonts w:ascii="Consolas" w:hAnsi="Consolas"/>
+                <w:b w:val="0"/>
+                <w:i w:val="0"/>
+                <w:color w:val="222222"/>
+                <w:sz w:val="18"/>
+              </w:rPr>
+              <w:t>cd0a711</w:t>
             </w:r>
             <w:r>
               <w:rPr>
@@ -10052,6 +10184,268 @@
           <w:sz w:val="19"/>
         </w:rPr>
         <w:t>outputs/fly/embodied_stage3a_</w:t>
+      </w:r>
+      <w:r>
+        <w:rPr>
+          <w:rFonts w:ascii="Calibri" w:hAnsi="Calibri"/>
+          <w:b w:val="0"/>
+          <w:i w:val="0"/>
+          <w:color w:val="222222"/>
+          <w:sz w:val="21"/>
+        </w:rPr>
+        <w:t>.</w:t>
+      </w:r>
+    </w:p>
+    <w:p>
+      <w:pPr>
+        <w:keepNext/>
+        <w:spacing w:before="240" w:after="60"/>
+      </w:pPr>
+      <w:r>
+        <w:rPr>
+          <w:rFonts w:ascii="Calibri" w:hAnsi="Calibri"/>
+          <w:b/>
+          <w:i w:val="0"/>
+          <w:color w:val="1F4E79"/>
+          <w:sz w:val="23"/>
+        </w:rPr>
+        <w:t>27. A push on the leg: the loop does not push back</w:t>
+      </w:r>
+    </w:p>
+    <w:p>
+      <w:pPr>
+        <w:spacing w:after="120"/>
+      </w:pPr>
+      <w:r>
+        <w:rPr>
+          <w:rFonts w:ascii="Calibri" w:hAnsi="Calibri"/>
+          <w:b/>
+          <w:i w:val="0"/>
+          <w:color w:val="156082"/>
+          <w:sz w:val="21"/>
+        </w:rPr>
+        <w:t>Slide message:</w:t>
+      </w:r>
+      <w:r>
+        <w:rPr>
+          <w:rFonts w:ascii="Calibri" w:hAnsi="Calibri"/>
+          <w:b w:val="0"/>
+          <w:i w:val="0"/>
+          <w:color w:val="222222"/>
+          <w:sz w:val="21"/>
+        </w:rPr>
+        <w:t xml:space="preserve"> </w:t>
+      </w:r>
+      <w:r>
+        <w:rPr>
+          <w:rFonts w:ascii="Calibri" w:hAnsi="Calibri"/>
+          <w:b w:val="0"/>
+          <w:i/>
+          <w:color w:val="222222"/>
+          <w:sz w:val="21"/>
+        </w:rPr>
+        <w:t>We pushed the simulated leg and timed its return. The position sensors' feedback did not bring it back faster: the muscles alone set the return. The front leg's sensors are thinly traced in this connectome, about one fifth of the hind leg's. That is the limit to state, and to fix with a better-traced leg.</w:t>
+      </w:r>
+    </w:p>
+    <w:p>
+      <w:pPr>
+        <w:spacing w:after="120"/>
+        <w:ind w:left="432" w:hanging="259"/>
+      </w:pPr>
+      <w:r>
+        <w:rPr>
+          <w:rFonts w:ascii="Calibri" w:hAnsi="Calibri"/>
+          <w:b w:val="0"/>
+          <w:i w:val="0"/>
+          <w:color w:val="222222"/>
+          <w:sz w:val="21"/>
+        </w:rPr>
+        <w:t>•</w:t>
+        <w:tab/>
+      </w:r>
+      <w:r>
+        <w:rPr>
+          <w:rFonts w:ascii="Calibri" w:hAnsi="Calibri"/>
+          <w:b/>
+          <w:i w:val="0"/>
+          <w:color w:val="156082"/>
+          <w:sz w:val="21"/>
+        </w:rPr>
+        <w:t>What changed.</w:t>
+      </w:r>
+      <w:r>
+        <w:rPr>
+          <w:rFonts w:ascii="Calibri" w:hAnsi="Calibri"/>
+          <w:b w:val="0"/>
+          <w:i w:val="0"/>
+          <w:color w:val="222222"/>
+          <w:sz w:val="21"/>
+        </w:rPr>
+        <w:t xml:space="preserve"> </w:t>
+      </w:r>
+      <w:r>
+        <w:rPr>
+          <w:rFonts w:ascii="Consolas" w:hAnsi="Consolas"/>
+          <w:b w:val="0"/>
+          <w:i w:val="0"/>
+          <w:color w:val="222222"/>
+          <w:sz w:val="19"/>
+        </w:rPr>
+        <w:t>body.Session.step</w:t>
+      </w:r>
+      <w:r>
+        <w:rPr>
+          <w:rFonts w:ascii="Calibri" w:hAnsi="Calibri"/>
+          <w:b w:val="0"/>
+          <w:i w:val="0"/>
+          <w:color w:val="222222"/>
+          <w:sz w:val="21"/>
+        </w:rPr>
+        <w:t xml:space="preserve"> accepts joint torques; </w:t>
+      </w:r>
+      <w:r>
+        <w:rPr>
+          <w:rFonts w:ascii="Consolas" w:hAnsi="Consolas"/>
+          <w:b w:val="0"/>
+          <w:i w:val="0"/>
+          <w:color w:val="222222"/>
+          <w:sz w:val="19"/>
+        </w:rPr>
+        <w:t>closed_loop.Loop</w:t>
+      </w:r>
+      <w:r>
+        <w:rPr>
+          <w:rFonts w:ascii="Calibri" w:hAnsi="Calibri"/>
+          <w:b w:val="0"/>
+          <w:i w:val="0"/>
+          <w:color w:val="222222"/>
+          <w:sz w:val="21"/>
+        </w:rPr>
+        <w:t xml:space="preserve"> takes a perturbation window; </w:t>
+      </w:r>
+      <w:r>
+        <w:rPr>
+          <w:rFonts w:ascii="Consolas" w:hAnsi="Consolas"/>
+          <w:b w:val="0"/>
+          <w:i w:val="0"/>
+          <w:color w:val="222222"/>
+          <w:sz w:val="19"/>
+        </w:rPr>
+        <w:t>src/neuromps/fly/embodied_stage3b.py</w:t>
+      </w:r>
+      <w:r>
+        <w:rPr>
+          <w:rFonts w:ascii="Calibri" w:hAnsi="Calibri"/>
+          <w:b w:val="0"/>
+          <w:i w:val="0"/>
+          <w:color w:val="222222"/>
+          <w:sz w:val="21"/>
+        </w:rPr>
+        <w:t xml:space="preserve"> runs the registered perturbation test; </w:t>
+      </w:r>
+      <w:r>
+        <w:rPr>
+          <w:rFonts w:ascii="Consolas" w:hAnsi="Consolas"/>
+          <w:b w:val="0"/>
+          <w:i w:val="0"/>
+          <w:color w:val="222222"/>
+          <w:sz w:val="19"/>
+        </w:rPr>
+        <w:t>--check</w:t>
+      </w:r>
+      <w:r>
+        <w:rPr>
+          <w:rFonts w:ascii="Calibri" w:hAnsi="Calibri"/>
+          <w:b w:val="0"/>
+          <w:i w:val="0"/>
+          <w:color w:val="222222"/>
+          <w:sz w:val="21"/>
+        </w:rPr>
+        <w:t xml:space="preserve"> counts proprioceptors per leg.</w:t>
+      </w:r>
+    </w:p>
+    <w:p>
+      <w:pPr>
+        <w:spacing w:after="120"/>
+        <w:ind w:left="432" w:hanging="259"/>
+      </w:pPr>
+      <w:r>
+        <w:rPr>
+          <w:rFonts w:ascii="Calibri" w:hAnsi="Calibri"/>
+          <w:b w:val="0"/>
+          <w:i w:val="0"/>
+          <w:color w:val="222222"/>
+          <w:sz w:val="21"/>
+        </w:rPr>
+        <w:t>•</w:t>
+        <w:tab/>
+      </w:r>
+      <w:r>
+        <w:rPr>
+          <w:rFonts w:ascii="Calibri" w:hAnsi="Calibri"/>
+          <w:b/>
+          <w:i w:val="0"/>
+          <w:color w:val="156082"/>
+          <w:sz w:val="21"/>
+        </w:rPr>
+        <w:t>Effect.</w:t>
+      </w:r>
+      <w:r>
+        <w:rPr>
+          <w:rFonts w:ascii="Calibri" w:hAnsi="Calibri"/>
+          <w:b w:val="0"/>
+          <w:i w:val="0"/>
+          <w:color w:val="222222"/>
+          <w:sz w:val="21"/>
+        </w:rPr>
+        <w:t xml:space="preserve"> Push flexes the tibia 0.628 rad; return 32.0 ms with resistance feedback against 30.0 open loop (2 of 5 pass; contingency uninterpretable). Left front leg: 4 claw neurons; left hind leg: 22.</w:t>
+      </w:r>
+    </w:p>
+    <w:p>
+      <w:pPr>
+        <w:spacing w:after="120"/>
+        <w:ind w:left="432" w:hanging="259"/>
+      </w:pPr>
+      <w:r>
+        <w:rPr>
+          <w:rFonts w:ascii="Calibri" w:hAnsi="Calibri"/>
+          <w:b w:val="0"/>
+          <w:i w:val="0"/>
+          <w:color w:val="222222"/>
+          <w:sz w:val="21"/>
+        </w:rPr>
+        <w:t>•</w:t>
+        <w:tab/>
+      </w:r>
+      <w:r>
+        <w:rPr>
+          <w:rFonts w:ascii="Calibri" w:hAnsi="Calibri"/>
+          <w:b/>
+          <w:i w:val="0"/>
+          <w:color w:val="156082"/>
+          <w:sz w:val="21"/>
+        </w:rPr>
+        <w:t>Evidence.</w:t>
+      </w:r>
+      <w:r>
+        <w:rPr>
+          <w:rFonts w:ascii="Calibri" w:hAnsi="Calibri"/>
+          <w:b w:val="0"/>
+          <w:i w:val="0"/>
+          <w:color w:val="222222"/>
+          <w:sz w:val="21"/>
+        </w:rPr>
+        <w:t xml:space="preserve"> Roadmap §7 and figure; </w:t>
+      </w:r>
+      <w:r>
+        <w:rPr>
+          <w:rFonts w:ascii="Consolas" w:hAnsi="Consolas"/>
+          <w:b w:val="0"/>
+          <w:i w:val="0"/>
+          <w:color w:val="222222"/>
+          <w:sz w:val="19"/>
+        </w:rPr>
+        <w:t>outputs/fly/embodied_stage3b_</w:t>
       </w:r>
       <w:r>
         <w:rPr>

</xml_diff>

<commit_message>
Record embodied stage 4a: with movement as the readout, the chip is still late
Registered b1a49df, run as registered on seeds 1100-1107: 3 of 6. The
vehicle movements appear; acetylcholine block stops both (Spearman -0.89);
movement never fails before the parent's neural readouts (same dose in
three families, later in two). The chip first flags every family at a
higher dose than movement fails (e.g. GABA-A block: movement 0.2, chip
0.6); the tract array no longer leads (4 families each); the bitter gate
is released by partial GABA-A block but every movement collapses at full
block, so the monotonic test fails (-0.03). At full GABA-A block the reach
depth is negative (-0.0146 mm), so that condition's index averages the two
proboscis terms; disclosed; no onset changes.

Roadmap section 7, change-log entry 28 and index row, paper outline 3.6b
written; PDFs rebuilt.

Co-Authored-By: Claude Opus 5.5 <noreply@anthropic.com>
</commit_message>
<xml_diff>
--- a/report/POST_SUBMISSION_CHANGES.docx
+++ b/report/POST_SUBMISSION_CHANGES.docx
@@ -3711,7 +3711,7 @@
           </w:tcPr>
           <w:p>
             <w:pPr>
-              <w:keepNext w:val="0"/>
+              <w:keepNext/>
               <w:spacing w:after="0"/>
               <w:jc w:val="center"/>
             </w:pPr>
@@ -3735,7 +3735,7 @@
           </w:tcPr>
           <w:p>
             <w:pPr>
-              <w:keepNext w:val="0"/>
+              <w:keepNext/>
               <w:spacing w:after="0"/>
               <w:jc w:val="center"/>
             </w:pPr>
@@ -3759,7 +3759,7 @@
           </w:tcPr>
           <w:p>
             <w:pPr>
-              <w:keepNext w:val="0"/>
+              <w:keepNext/>
               <w:spacing w:after="0"/>
             </w:pPr>
             <w:r>
@@ -3782,7 +3782,7 @@
           </w:tcPr>
           <w:p>
             <w:pPr>
-              <w:keepNext w:val="0"/>
+              <w:keepNext/>
               <w:spacing w:after="0"/>
             </w:pPr>
             <w:r>
@@ -3805,7 +3805,7 @@
           </w:tcPr>
           <w:p>
             <w:pPr>
-              <w:keepNext w:val="0"/>
+              <w:keepNext/>
               <w:spacing w:after="0"/>
             </w:pPr>
             <w:r>
@@ -3831,6 +3831,138 @@
           </w:p>
         </w:tc>
       </w:tr>
+      <w:tr>
+        <w:trPr>
+          <w:cantSplit/>
+        </w:trPr>
+        <w:tc>
+          <w:tcPr>
+            <w:tcW w:type="dxa" w:w="415"/>
+            <w:shd w:val="clear" w:color="auto" w:fill="F7F9FB"/>
+            <w:vAlign w:val="center"/>
+          </w:tcPr>
+          <w:p>
+            <w:pPr>
+              <w:keepNext w:val="0"/>
+              <w:spacing w:after="0"/>
+              <w:jc w:val="center"/>
+            </w:pPr>
+            <w:r>
+              <w:rPr>
+                <w:rFonts w:ascii="Calibri" w:hAnsi="Calibri"/>
+                <w:b/>
+                <w:i w:val="0"/>
+                <w:color w:val="222222"/>
+                <w:sz w:val="20"/>
+              </w:rPr>
+              <w:t>28</w:t>
+            </w:r>
+          </w:p>
+        </w:tc>
+        <w:tc>
+          <w:tcPr>
+            <w:tcW w:type="dxa" w:w="1590"/>
+            <w:shd w:val="clear" w:color="auto" w:fill="F7F9FB"/>
+            <w:vAlign w:val="center"/>
+          </w:tcPr>
+          <w:p>
+            <w:pPr>
+              <w:keepNext w:val="0"/>
+              <w:spacing w:after="0"/>
+              <w:jc w:val="center"/>
+            </w:pPr>
+            <w:r>
+              <w:rPr>
+                <w:rFonts w:ascii="Calibri" w:hAnsi="Calibri"/>
+                <w:b w:val="0"/>
+                <w:i w:val="0"/>
+                <w:color w:val="222222"/>
+                <w:sz w:val="20"/>
+              </w:rPr>
+              <w:t>2026-10-24</w:t>
+            </w:r>
+          </w:p>
+        </w:tc>
+        <w:tc>
+          <w:tcPr>
+            <w:tcW w:type="dxa" w:w="2167"/>
+            <w:shd w:val="clear" w:color="auto" w:fill="F7F9FB"/>
+            <w:vAlign w:val="center"/>
+          </w:tcPr>
+          <w:p>
+            <w:pPr>
+              <w:keepNext w:val="0"/>
+              <w:spacing w:after="0"/>
+            </w:pPr>
+            <w:r>
+              <w:rPr>
+                <w:rFonts w:ascii="Calibri" w:hAnsi="Calibri"/>
+                <w:b w:val="0"/>
+                <w:i w:val="0"/>
+                <w:color w:val="222222"/>
+                <w:sz w:val="20"/>
+              </w:rPr>
+              <w:t>Embodied stage 4a: the drug design with movement as the readout</w:t>
+            </w:r>
+          </w:p>
+        </w:tc>
+        <w:tc>
+          <w:tcPr>
+            <w:tcW w:type="dxa" w:w="3100"/>
+            <w:shd w:val="clear" w:color="auto" w:fill="F7F9FB"/>
+            <w:vAlign w:val="center"/>
+          </w:tcPr>
+          <w:p>
+            <w:pPr>
+              <w:keepNext w:val="0"/>
+              <w:spacing w:after="0"/>
+            </w:pPr>
+            <w:r>
+              <w:rPr>
+                <w:rFonts w:ascii="Calibri" w:hAnsi="Calibri"/>
+                <w:b w:val="0"/>
+                <w:i w:val="0"/>
+                <w:color w:val="222222"/>
+                <w:sz w:val="20"/>
+              </w:rPr>
+              <w:t>3 of 6; the chip flags after movement fails in all five families; the tract no longer leads</w:t>
+            </w:r>
+          </w:p>
+        </w:tc>
+        <w:tc>
+          <w:tcPr>
+            <w:tcW w:type="dxa" w:w="1224"/>
+            <w:shd w:val="clear" w:color="auto" w:fill="F7F9FB"/>
+            <w:vAlign w:val="center"/>
+          </w:tcPr>
+          <w:p>
+            <w:pPr>
+              <w:keepNext w:val="0"/>
+              <w:spacing w:after="0"/>
+            </w:pPr>
+            <w:r>
+              <w:rPr>
+                <w:rFonts w:ascii="Consolas" w:hAnsi="Consolas"/>
+                <w:b w:val="0"/>
+                <w:i w:val="0"/>
+                <w:color w:val="222222"/>
+                <w:sz w:val="18"/>
+              </w:rPr>
+              <w:t>b1a49df</w:t>
+            </w:r>
+            <w:r>
+              <w:rPr>
+                <w:rFonts w:ascii="Calibri" w:hAnsi="Calibri"/>
+                <w:b w:val="0"/>
+                <w:i w:val="0"/>
+                <w:color w:val="222222"/>
+                <w:sz w:val="20"/>
+              </w:rPr>
+              <w:t xml:space="preserve"> … this branch</w:t>
+            </w:r>
+          </w:p>
+        </w:tc>
+      </w:tr>
     </w:tbl>
     <w:p>
       <w:pPr>
@@ -10446,6 +10578,208 @@
           <w:sz w:val="19"/>
         </w:rPr>
         <w:t>outputs/fly/embodied_stage3b_</w:t>
+      </w:r>
+      <w:r>
+        <w:rPr>
+          <w:rFonts w:ascii="Calibri" w:hAnsi="Calibri"/>
+          <w:b w:val="0"/>
+          <w:i w:val="0"/>
+          <w:color w:val="222222"/>
+          <w:sz w:val="21"/>
+        </w:rPr>
+        <w:t>.</w:t>
+      </w:r>
+    </w:p>
+    <w:p>
+      <w:pPr>
+        <w:keepNext/>
+        <w:spacing w:before="240" w:after="60"/>
+      </w:pPr>
+      <w:r>
+        <w:rPr>
+          <w:rFonts w:ascii="Calibri" w:hAnsi="Calibri"/>
+          <w:b/>
+          <w:i w:val="0"/>
+          <w:color w:val="1F4E79"/>
+          <w:sz w:val="23"/>
+        </w:rPr>
+        <w:t>28. Drugs in the loop: the chip is still late when the readout is movement</w:t>
+      </w:r>
+    </w:p>
+    <w:p>
+      <w:pPr>
+        <w:spacing w:after="120"/>
+      </w:pPr>
+      <w:r>
+        <w:rPr>
+          <w:rFonts w:ascii="Calibri" w:hAnsi="Calibri"/>
+          <w:b/>
+          <w:i w:val="0"/>
+          <w:color w:val="156082"/>
+          <w:sz w:val="21"/>
+        </w:rPr>
+        <w:t>Slide message:</w:t>
+      </w:r>
+      <w:r>
+        <w:rPr>
+          <w:rFonts w:ascii="Calibri" w:hAnsi="Calibri"/>
+          <w:b w:val="0"/>
+          <w:i w:val="0"/>
+          <w:color w:val="222222"/>
+          <w:sz w:val="21"/>
+        </w:rPr>
+        <w:t xml:space="preserve"> </w:t>
+      </w:r>
+      <w:r>
+        <w:rPr>
+          <w:rFonts w:ascii="Calibri" w:hAnsi="Calibri"/>
+          <w:b w:val="0"/>
+          <w:i/>
+          <w:color w:val="222222"/>
+          <w:sz w:val="21"/>
+        </w:rPr>
+        <w:t>We reran the drug study with the simulated fly's own movements as the behaviour. In every drug family, feeding and grooming change at a lower dose than the chip first notices. The chip is late at every level we have looked at: neurons, motor neurons, and now movement.</w:t>
+      </w:r>
+    </w:p>
+    <w:p>
+      <w:pPr>
+        <w:spacing w:after="120"/>
+        <w:ind w:left="432" w:hanging="259"/>
+      </w:pPr>
+      <w:r>
+        <w:rPr>
+          <w:rFonts w:ascii="Calibri" w:hAnsi="Calibri"/>
+          <w:b w:val="0"/>
+          <w:i w:val="0"/>
+          <w:color w:val="222222"/>
+          <w:sz w:val="21"/>
+        </w:rPr>
+        <w:t>•</w:t>
+        <w:tab/>
+      </w:r>
+      <w:r>
+        <w:rPr>
+          <w:rFonts w:ascii="Calibri" w:hAnsi="Calibri"/>
+          <w:b/>
+          <w:i w:val="0"/>
+          <w:color w:val="156082"/>
+          <w:sz w:val="21"/>
+        </w:rPr>
+        <w:t>What changed.</w:t>
+      </w:r>
+      <w:r>
+        <w:rPr>
+          <w:rFonts w:ascii="Calibri" w:hAnsi="Calibri"/>
+          <w:b w:val="0"/>
+          <w:i w:val="0"/>
+          <w:color w:val="222222"/>
+          <w:sz w:val="21"/>
+        </w:rPr>
+        <w:t xml:space="preserve"> The stage-2b and relay trials take a drug knob (stage 2b reruns byte-identical); </w:t>
+      </w:r>
+      <w:r>
+        <w:rPr>
+          <w:rFonts w:ascii="Consolas" w:hAnsi="Consolas"/>
+          <w:b w:val="0"/>
+          <w:i w:val="0"/>
+          <w:color w:val="222222"/>
+          <w:sz w:val="19"/>
+        </w:rPr>
+        <w:t>src/neuromps/fly/embodied_stage4a.py</w:t>
+      </w:r>
+      <w:r>
+        <w:rPr>
+          <w:rFonts w:ascii="Calibri" w:hAnsi="Calibri"/>
+          <w:b w:val="0"/>
+          <w:i w:val="0"/>
+          <w:color w:val="222222"/>
+          <w:sz w:val="21"/>
+        </w:rPr>
+        <w:t xml:space="preserve"> runs the parent's 22 conditions on the proboscis and the grooming reach and compares each family's movement onset with the recorded chip and tract detections.</w:t>
+      </w:r>
+    </w:p>
+    <w:p>
+      <w:pPr>
+        <w:spacing w:after="120"/>
+        <w:ind w:left="432" w:hanging="259"/>
+      </w:pPr>
+      <w:r>
+        <w:rPr>
+          <w:rFonts w:ascii="Calibri" w:hAnsi="Calibri"/>
+          <w:b w:val="0"/>
+          <w:i w:val="0"/>
+          <w:color w:val="222222"/>
+          <w:sz w:val="21"/>
+        </w:rPr>
+        <w:t>•</w:t>
+        <w:tab/>
+      </w:r>
+      <w:r>
+        <w:rPr>
+          <w:rFonts w:ascii="Calibri" w:hAnsi="Calibri"/>
+          <w:b/>
+          <w:i w:val="0"/>
+          <w:color w:val="156082"/>
+          <w:sz w:val="21"/>
+        </w:rPr>
+        <w:t>Effect.</w:t>
+      </w:r>
+      <w:r>
+        <w:rPr>
+          <w:rFonts w:ascii="Calibri" w:hAnsi="Calibri"/>
+          <w:b w:val="0"/>
+          <w:i w:val="0"/>
+          <w:color w:val="222222"/>
+          <w:sz w:val="21"/>
+        </w:rPr>
+        <w:t xml:space="preserve"> 3 of 6 pass: the movements are there under vehicle, acetylcholine block stops them, and movement never fails before the neural readouts. The chip flags after movement fails in all five families (GABA-A block: movement 0.2, chip 0.6); the tract no longer leads (4 families each); the bitter gate's release is not monotonic.</w:t>
+      </w:r>
+    </w:p>
+    <w:p>
+      <w:pPr>
+        <w:spacing w:after="120"/>
+        <w:ind w:left="432" w:hanging="259"/>
+      </w:pPr>
+      <w:r>
+        <w:rPr>
+          <w:rFonts w:ascii="Calibri" w:hAnsi="Calibri"/>
+          <w:b w:val="0"/>
+          <w:i w:val="0"/>
+          <w:color w:val="222222"/>
+          <w:sz w:val="21"/>
+        </w:rPr>
+        <w:t>•</w:t>
+        <w:tab/>
+      </w:r>
+      <w:r>
+        <w:rPr>
+          <w:rFonts w:ascii="Calibri" w:hAnsi="Calibri"/>
+          <w:b/>
+          <w:i w:val="0"/>
+          <w:color w:val="156082"/>
+          <w:sz w:val="21"/>
+        </w:rPr>
+        <w:t>Evidence.</w:t>
+      </w:r>
+      <w:r>
+        <w:rPr>
+          <w:rFonts w:ascii="Calibri" w:hAnsi="Calibri"/>
+          <w:b w:val="0"/>
+          <w:i w:val="0"/>
+          <w:color w:val="222222"/>
+          <w:sz w:val="21"/>
+        </w:rPr>
+        <w:t xml:space="preserve"> Roadmap §7 and figure; </w:t>
+      </w:r>
+      <w:r>
+        <w:rPr>
+          <w:rFonts w:ascii="Consolas" w:hAnsi="Consolas"/>
+          <w:b w:val="0"/>
+          <w:i w:val="0"/>
+          <w:color w:val="222222"/>
+          <w:sz w:val="19"/>
+        </w:rPr>
+        <w:t>outputs/fly/embodied_stage4a_</w:t>
       </w:r>
       <w:r>
         <w:rPr>

</xml_diff>

<commit_message>
Record embodied stage 5: no published fly pharmacology to compare with
Registered 1723e0c before any search. The ten registered queries
(2026-10-24) and every first-page candidate are classified in
src/neuromps/fly/real_fly_literature.json: 3 comparisons, 2 impossible, 16
excluded, 4 inaccessible. No study gives adult flies a GABA-A, GluCl,
nicotinic or sodium-channel drug (or manipulates those receptors) and
scores proboscis extension or grooming, so both registered predictions
are uninterpretable. Identified-neuron studies, reported beside: the
simulation agrees in 1 of 3 (silencing GABAergic 13A/13B leg neurons
reduces grooming); the mismatches follow from class-wide knobs and the
absence of satiety in the model. Citations carry only verified journal,
year and PMC identifiers.

Roadmap section 7, change-log entry 29 and index row, paper outline 3.6c
written; PDFs rebuilt.

Co-Authored-By: Claude Opus 5.5 <noreply@anthropic.com>
</commit_message>
<xml_diff>
--- a/report/POST_SUBMISSION_CHANGES.docx
+++ b/report/POST_SUBMISSION_CHANGES.docx
@@ -3843,7 +3843,7 @@
           </w:tcPr>
           <w:p>
             <w:pPr>
-              <w:keepNext w:val="0"/>
+              <w:keepNext/>
               <w:spacing w:after="0"/>
               <w:jc w:val="center"/>
             </w:pPr>
@@ -3867,7 +3867,7 @@
           </w:tcPr>
           <w:p>
             <w:pPr>
-              <w:keepNext w:val="0"/>
+              <w:keepNext/>
               <w:spacing w:after="0"/>
               <w:jc w:val="center"/>
             </w:pPr>
@@ -3891,7 +3891,7 @@
           </w:tcPr>
           <w:p>
             <w:pPr>
-              <w:keepNext w:val="0"/>
+              <w:keepNext/>
               <w:spacing w:after="0"/>
             </w:pPr>
             <w:r>
@@ -3914,7 +3914,7 @@
           </w:tcPr>
           <w:p>
             <w:pPr>
-              <w:keepNext w:val="0"/>
+              <w:keepNext/>
               <w:spacing w:after="0"/>
             </w:pPr>
             <w:r>
@@ -3937,8 +3937,140 @@
           </w:tcPr>
           <w:p>
             <w:pPr>
+              <w:keepNext/>
+              <w:spacing w:after="0"/>
+            </w:pPr>
+            <w:r>
+              <w:rPr>
+                <w:rFonts w:ascii="Consolas" w:hAnsi="Consolas"/>
+                <w:b w:val="0"/>
+                <w:i w:val="0"/>
+                <w:color w:val="222222"/>
+                <w:sz w:val="18"/>
+              </w:rPr>
+              <w:t>b1a49df</w:t>
+            </w:r>
+            <w:r>
+              <w:rPr>
+                <w:rFonts w:ascii="Calibri" w:hAnsi="Calibri"/>
+                <w:b w:val="0"/>
+                <w:i w:val="0"/>
+                <w:color w:val="222222"/>
+                <w:sz w:val="20"/>
+              </w:rPr>
+              <w:t xml:space="preserve"> … this branch</w:t>
+            </w:r>
+          </w:p>
+        </w:tc>
+      </w:tr>
+      <w:tr>
+        <w:trPr>
+          <w:cantSplit/>
+        </w:trPr>
+        <w:tc>
+          <w:tcPr>
+            <w:tcW w:type="dxa" w:w="415"/>
+            <w:shd w:val="clear" w:color="auto" w:fill="FFFFFF"/>
+            <w:vAlign w:val="center"/>
+          </w:tcPr>
+          <w:p>
+            <w:pPr>
               <w:keepNext w:val="0"/>
               <w:spacing w:after="0"/>
+              <w:jc w:val="center"/>
+            </w:pPr>
+            <w:r>
+              <w:rPr>
+                <w:rFonts w:ascii="Calibri" w:hAnsi="Calibri"/>
+                <w:b/>
+                <w:i w:val="0"/>
+                <w:color w:val="222222"/>
+                <w:sz w:val="20"/>
+              </w:rPr>
+              <w:t>29</w:t>
+            </w:r>
+          </w:p>
+        </w:tc>
+        <w:tc>
+          <w:tcPr>
+            <w:tcW w:type="dxa" w:w="1590"/>
+            <w:shd w:val="clear" w:color="auto" w:fill="FFFFFF"/>
+            <w:vAlign w:val="center"/>
+          </w:tcPr>
+          <w:p>
+            <w:pPr>
+              <w:keepNext w:val="0"/>
+              <w:spacing w:after="0"/>
+              <w:jc w:val="center"/>
+            </w:pPr>
+            <w:r>
+              <w:rPr>
+                <w:rFonts w:ascii="Calibri" w:hAnsi="Calibri"/>
+                <w:b w:val="0"/>
+                <w:i w:val="0"/>
+                <w:color w:val="222222"/>
+                <w:sz w:val="20"/>
+              </w:rPr>
+              <w:t>2026-10-24</w:t>
+            </w:r>
+          </w:p>
+        </w:tc>
+        <w:tc>
+          <w:tcPr>
+            <w:tcW w:type="dxa" w:w="2167"/>
+            <w:shd w:val="clear" w:color="auto" w:fill="FFFFFF"/>
+            <w:vAlign w:val="center"/>
+          </w:tcPr>
+          <w:p>
+            <w:pPr>
+              <w:keepNext w:val="0"/>
+              <w:spacing w:after="0"/>
+            </w:pPr>
+            <w:r>
+              <w:rPr>
+                <w:rFonts w:ascii="Calibri" w:hAnsi="Calibri"/>
+                <w:b w:val="0"/>
+                <w:i w:val="0"/>
+                <w:color w:val="222222"/>
+                <w:sz w:val="20"/>
+              </w:rPr>
+              <w:t>Embodied stage 5: simulated directions against published fly findings</w:t>
+            </w:r>
+          </w:p>
+        </w:tc>
+        <w:tc>
+          <w:tcPr>
+            <w:tcW w:type="dxa" w:w="3100"/>
+            <w:shd w:val="clear" w:color="auto" w:fill="FFFFFF"/>
+            <w:vAlign w:val="center"/>
+          </w:tcPr>
+          <w:p>
+            <w:pPr>
+              <w:keepNext w:val="0"/>
+              <w:spacing w:after="0"/>
+            </w:pPr>
+            <w:r>
+              <w:rPr>
+                <w:rFonts w:ascii="Calibri" w:hAnsi="Calibri"/>
+                <w:b w:val="0"/>
+                <w:i w:val="0"/>
+                <w:color w:val="222222"/>
+                <w:sz w:val="20"/>
+              </w:rPr>
+              <w:t>no qualifying pharmacology found (both predictions uninterpretable); identified-neuron studies agree in 1 of 3</w:t>
+            </w:r>
+          </w:p>
+        </w:tc>
+        <w:tc>
+          <w:tcPr>
+            <w:tcW w:type="dxa" w:w="1224"/>
+            <w:shd w:val="clear" w:color="auto" w:fill="FFFFFF"/>
+            <w:vAlign w:val="center"/>
+          </w:tcPr>
+          <w:p>
+            <w:pPr>
+              <w:keepNext w:val="0"/>
+              <w:spacing w:after="0"/>
             </w:pPr>
             <w:r>
               <w:rPr>
@@ -3948,7 +4080,7 @@
                 <w:color w:val="222222"/>
                 <w:sz w:val="18"/>
               </w:rPr>
-              <w:t>b1a49df</w:t>
+              <w:t>1723e0c</w:t>
             </w:r>
             <w:r>
               <w:rPr>
@@ -10780,6 +10912,248 @@
           <w:sz w:val="19"/>
         </w:rPr>
         <w:t>outputs/fly/embodied_stage4a_</w:t>
+      </w:r>
+      <w:r>
+        <w:rPr>
+          <w:rFonts w:ascii="Calibri" w:hAnsi="Calibri"/>
+          <w:b w:val="0"/>
+          <w:i w:val="0"/>
+          <w:color w:val="222222"/>
+          <w:sz w:val="21"/>
+        </w:rPr>
+        <w:t>.</w:t>
+      </w:r>
+    </w:p>
+    <w:p>
+      <w:pPr>
+        <w:keepNext/>
+        <w:spacing w:before="240" w:after="60"/>
+      </w:pPr>
+      <w:r>
+        <w:rPr>
+          <w:rFonts w:ascii="Calibri" w:hAnsi="Calibri"/>
+          <w:b/>
+          <w:i w:val="0"/>
+          <w:color w:val="1F4E79"/>
+          <w:sz w:val="23"/>
+        </w:rPr>
+        <w:t>29. Checking against real flies: the experiments have not been done</w:t>
+      </w:r>
+    </w:p>
+    <w:p>
+      <w:pPr>
+        <w:spacing w:after="120"/>
+      </w:pPr>
+      <w:r>
+        <w:rPr>
+          <w:rFonts w:ascii="Calibri" w:hAnsi="Calibri"/>
+          <w:b/>
+          <w:i w:val="0"/>
+          <w:color w:val="156082"/>
+          <w:sz w:val="21"/>
+        </w:rPr>
+        <w:t>Slide message:</w:t>
+      </w:r>
+      <w:r>
+        <w:rPr>
+          <w:rFonts w:ascii="Calibri" w:hAnsi="Calibri"/>
+          <w:b w:val="0"/>
+          <w:i w:val="0"/>
+          <w:color w:val="222222"/>
+          <w:sz w:val="21"/>
+        </w:rPr>
+        <w:t xml:space="preserve"> </w:t>
+      </w:r>
+      <w:r>
+        <w:rPr>
+          <w:rFonts w:ascii="Calibri" w:hAnsi="Calibri"/>
+          <w:b w:val="0"/>
+          <w:i/>
+          <w:color w:val="222222"/>
+          <w:sz w:val="21"/>
+        </w:rPr>
+        <w:t>We registered how we would search the literature before searching, so we could not pick the papers that agree. No published study gives flies these drugs and scores feeding or grooming movements. The model makes predictions that real experiments have yet to test.</w:t>
+      </w:r>
+    </w:p>
+    <w:p>
+      <w:pPr>
+        <w:spacing w:after="120"/>
+        <w:ind w:left="432" w:hanging="259"/>
+      </w:pPr>
+      <w:r>
+        <w:rPr>
+          <w:rFonts w:ascii="Calibri" w:hAnsi="Calibri"/>
+          <w:b w:val="0"/>
+          <w:i w:val="0"/>
+          <w:color w:val="222222"/>
+          <w:sz w:val="21"/>
+        </w:rPr>
+        <w:t>•</w:t>
+        <w:tab/>
+      </w:r>
+      <w:r>
+        <w:rPr>
+          <w:rFonts w:ascii="Calibri" w:hAnsi="Calibri"/>
+          <w:b/>
+          <w:i w:val="0"/>
+          <w:color w:val="156082"/>
+          <w:sz w:val="21"/>
+        </w:rPr>
+        <w:t>What changed.</w:t>
+      </w:r>
+      <w:r>
+        <w:rPr>
+          <w:rFonts w:ascii="Calibri" w:hAnsi="Calibri"/>
+          <w:b w:val="0"/>
+          <w:i w:val="0"/>
+          <w:color w:val="222222"/>
+          <w:sz w:val="21"/>
+        </w:rPr>
+        <w:t xml:space="preserve"> </w:t>
+      </w:r>
+      <w:r>
+        <w:rPr>
+          <w:rFonts w:ascii="Consolas" w:hAnsi="Consolas"/>
+          <w:b w:val="0"/>
+          <w:i w:val="0"/>
+          <w:color w:val="222222"/>
+          <w:sz w:val="19"/>
+        </w:rPr>
+        <w:t>preregistration/embodied_stage5_real_fly_directions.json</w:t>
+      </w:r>
+      <w:r>
+        <w:rPr>
+          <w:rFonts w:ascii="Calibri" w:hAnsi="Calibri"/>
+          <w:b w:val="0"/>
+          <w:i w:val="0"/>
+          <w:color w:val="222222"/>
+          <w:sz w:val="21"/>
+        </w:rPr>
+        <w:t xml:space="preserve"> (queries, inclusion, mapping, comparison rule); </w:t>
+      </w:r>
+      <w:r>
+        <w:rPr>
+          <w:rFonts w:ascii="Consolas" w:hAnsi="Consolas"/>
+          <w:b w:val="0"/>
+          <w:i w:val="0"/>
+          <w:color w:val="222222"/>
+          <w:sz w:val="19"/>
+        </w:rPr>
+        <w:t>src/neuromps/fly/real_fly_literature.json</w:t>
+      </w:r>
+      <w:r>
+        <w:rPr>
+          <w:rFonts w:ascii="Calibri" w:hAnsi="Calibri"/>
+          <w:b w:val="0"/>
+          <w:i w:val="0"/>
+          <w:color w:val="222222"/>
+          <w:sz w:val="21"/>
+        </w:rPr>
+        <w:t xml:space="preserve"> (every candidate with its classification); </w:t>
+      </w:r>
+      <w:r>
+        <w:rPr>
+          <w:rFonts w:ascii="Consolas" w:hAnsi="Consolas"/>
+          <w:b w:val="0"/>
+          <w:i w:val="0"/>
+          <w:color w:val="222222"/>
+          <w:sz w:val="19"/>
+        </w:rPr>
+        <w:t>src/neuromps/fly/embodied_stage5.py</w:t>
+      </w:r>
+      <w:r>
+        <w:rPr>
+          <w:rFonts w:ascii="Calibri" w:hAnsi="Calibri"/>
+          <w:b w:val="0"/>
+          <w:i w:val="0"/>
+          <w:color w:val="222222"/>
+          <w:sz w:val="21"/>
+        </w:rPr>
+        <w:t xml:space="preserve"> scores the comparison against the stage-4a medians.</w:t>
+      </w:r>
+    </w:p>
+    <w:p>
+      <w:pPr>
+        <w:spacing w:after="120"/>
+        <w:ind w:left="432" w:hanging="259"/>
+      </w:pPr>
+      <w:r>
+        <w:rPr>
+          <w:rFonts w:ascii="Calibri" w:hAnsi="Calibri"/>
+          <w:b w:val="0"/>
+          <w:i w:val="0"/>
+          <w:color w:val="222222"/>
+          <w:sz w:val="21"/>
+        </w:rPr>
+        <w:t>•</w:t>
+        <w:tab/>
+      </w:r>
+      <w:r>
+        <w:rPr>
+          <w:rFonts w:ascii="Calibri" w:hAnsi="Calibri"/>
+          <w:b/>
+          <w:i w:val="0"/>
+          <w:color w:val="156082"/>
+          <w:sz w:val="21"/>
+        </w:rPr>
+        <w:t>Effect.</w:t>
+      </w:r>
+      <w:r>
+        <w:rPr>
+          <w:rFonts w:ascii="Calibri" w:hAnsi="Calibri"/>
+          <w:b w:val="0"/>
+          <w:i w:val="0"/>
+          <w:color w:val="222222"/>
+          <w:sz w:val="21"/>
+        </w:rPr>
+        <w:t xml:space="preserve"> 0 pharmacological or receptor-genetic comparisons, so both predictions are uninterpretable. Identified-neuron studies: the simulation agrees in 1 of 3 (agreement for silencing GABAergic grooming neurons; mismatches explained by class-wide knobs and the absence of satiety).</w:t>
+      </w:r>
+    </w:p>
+    <w:p>
+      <w:pPr>
+        <w:spacing w:after="120"/>
+        <w:ind w:left="432" w:hanging="259"/>
+      </w:pPr>
+      <w:r>
+        <w:rPr>
+          <w:rFonts w:ascii="Calibri" w:hAnsi="Calibri"/>
+          <w:b w:val="0"/>
+          <w:i w:val="0"/>
+          <w:color w:val="222222"/>
+          <w:sz w:val="21"/>
+        </w:rPr>
+        <w:t>•</w:t>
+        <w:tab/>
+      </w:r>
+      <w:r>
+        <w:rPr>
+          <w:rFonts w:ascii="Calibri" w:hAnsi="Calibri"/>
+          <w:b/>
+          <w:i w:val="0"/>
+          <w:color w:val="156082"/>
+          <w:sz w:val="21"/>
+        </w:rPr>
+        <w:t>Evidence.</w:t>
+      </w:r>
+      <w:r>
+        <w:rPr>
+          <w:rFonts w:ascii="Calibri" w:hAnsi="Calibri"/>
+          <w:b w:val="0"/>
+          <w:i w:val="0"/>
+          <w:color w:val="222222"/>
+          <w:sz w:val="21"/>
+        </w:rPr>
+        <w:t xml:space="preserve"> Roadmap §7; </w:t>
+      </w:r>
+      <w:r>
+        <w:rPr>
+          <w:rFonts w:ascii="Consolas" w:hAnsi="Consolas"/>
+          <w:b w:val="0"/>
+          <w:i w:val="0"/>
+          <w:color w:val="222222"/>
+          <w:sz w:val="19"/>
+        </w:rPr>
+        <w:t>outputs/fly/embodied_stage5_SIMULATED.json</w:t>
       </w:r>
       <w:r>
         <w:rPr>

</xml_diff>

<commit_message>
Report Act IX: real noise floors, wells needed, the twin on unseen positive controls
New §32-§34 (real ToxCast vehicle and positive-control wells), an executive
summary bullet, §20 item 6, pointers in §14 and §18 row 9, and
POST_SUBMISSION_CHANGES entry 42. verify: 0 failing; uncited numbers at budget.

Co-Authored-By: Claude Opus 5.5 <noreply@anthropic.com>
</commit_message>
<xml_diff>
--- a/report/POST_SUBMISSION_CHANGES.docx
+++ b/report/POST_SUBMISSION_CHANGES.docx
@@ -48,11 +48,11 @@
         <w:tblLook w:firstColumn="1" w:firstRow="1" w:lastColumn="0" w:lastRow="0" w:noHBand="0" w:noVBand="1" w:val="04A0"/>
       </w:tblPr>
       <w:tblGrid>
-        <w:gridCol w:w="415"/>
-        <w:gridCol w:w="1588"/>
-        <w:gridCol w:w="2210"/>
-        <w:gridCol w:w="3065"/>
-        <w:gridCol w:w="1219"/>
+        <w:gridCol w:w="414"/>
+        <w:gridCol w:w="1585"/>
+        <w:gridCol w:w="2250"/>
+        <w:gridCol w:w="3031"/>
+        <w:gridCol w:w="1215"/>
       </w:tblGrid>
       <w:tr>
         <w:trPr>
@@ -61,7 +61,7 @@
         </w:trPr>
         <w:tc>
           <w:tcPr>
-            <w:tcW w:type="dxa" w:w="415"/>
+            <w:tcW w:type="dxa" w:w="414"/>
             <w:shd w:val="clear" w:color="auto" w:fill="1F4E79"/>
             <w:vAlign w:val="center"/>
           </w:tcPr>
@@ -85,7 +85,7 @@
         </w:tc>
         <w:tc>
           <w:tcPr>
-            <w:tcW w:type="dxa" w:w="1588"/>
+            <w:tcW w:type="dxa" w:w="1585"/>
             <w:shd w:val="clear" w:color="auto" w:fill="1F4E79"/>
             <w:vAlign w:val="center"/>
           </w:tcPr>
@@ -109,7 +109,7 @@
         </w:tc>
         <w:tc>
           <w:tcPr>
-            <w:tcW w:type="dxa" w:w="2210"/>
+            <w:tcW w:type="dxa" w:w="2250"/>
             <w:shd w:val="clear" w:color="auto" w:fill="1F4E79"/>
             <w:vAlign w:val="center"/>
           </w:tcPr>
@@ -132,7 +132,7 @@
         </w:tc>
         <w:tc>
           <w:tcPr>
-            <w:tcW w:type="dxa" w:w="3065"/>
+            <w:tcW w:type="dxa" w:w="3031"/>
             <w:shd w:val="clear" w:color="auto" w:fill="1F4E79"/>
             <w:vAlign w:val="center"/>
           </w:tcPr>
@@ -155,7 +155,7 @@
         </w:tc>
         <w:tc>
           <w:tcPr>
-            <w:tcW w:type="dxa" w:w="1219"/>
+            <w:tcW w:type="dxa" w:w="1215"/>
             <w:shd w:val="clear" w:color="auto" w:fill="1F4E79"/>
             <w:vAlign w:val="center"/>
           </w:tcPr>
@@ -183,7 +183,7 @@
         </w:trPr>
         <w:tc>
           <w:tcPr>
-            <w:tcW w:type="dxa" w:w="415"/>
+            <w:tcW w:type="dxa" w:w="414"/>
             <w:shd w:val="clear" w:color="auto" w:fill="FFFFFF"/>
             <w:vAlign w:val="center"/>
           </w:tcPr>
@@ -207,7 +207,7 @@
         </w:tc>
         <w:tc>
           <w:tcPr>
-            <w:tcW w:type="dxa" w:w="1588"/>
+            <w:tcW w:type="dxa" w:w="1585"/>
             <w:shd w:val="clear" w:color="auto" w:fill="FFFFFF"/>
             <w:vAlign w:val="center"/>
           </w:tcPr>
@@ -231,7 +231,7 @@
         </w:tc>
         <w:tc>
           <w:tcPr>
-            <w:tcW w:type="dxa" w:w="2210"/>
+            <w:tcW w:type="dxa" w:w="2250"/>
             <w:shd w:val="clear" w:color="auto" w:fill="FFFFFF"/>
             <w:vAlign w:val="center"/>
           </w:tcPr>
@@ -254,7 +254,7 @@
         </w:tc>
         <w:tc>
           <w:tcPr>
-            <w:tcW w:type="dxa" w:w="3065"/>
+            <w:tcW w:type="dxa" w:w="3031"/>
             <w:shd w:val="clear" w:color="auto" w:fill="FFFFFF"/>
             <w:vAlign w:val="center"/>
           </w:tcPr>
@@ -277,7 +277,7 @@
         </w:tc>
         <w:tc>
           <w:tcPr>
-            <w:tcW w:type="dxa" w:w="1219"/>
+            <w:tcW w:type="dxa" w:w="1215"/>
             <w:shd w:val="clear" w:color="auto" w:fill="FFFFFF"/>
             <w:vAlign w:val="center"/>
           </w:tcPr>
@@ -325,7 +325,7 @@
         </w:trPr>
         <w:tc>
           <w:tcPr>
-            <w:tcW w:type="dxa" w:w="415"/>
+            <w:tcW w:type="dxa" w:w="414"/>
             <w:shd w:val="clear" w:color="auto" w:fill="F7F9FB"/>
             <w:vAlign w:val="center"/>
           </w:tcPr>
@@ -349,7 +349,7 @@
         </w:tc>
         <w:tc>
           <w:tcPr>
-            <w:tcW w:type="dxa" w:w="1588"/>
+            <w:tcW w:type="dxa" w:w="1585"/>
             <w:shd w:val="clear" w:color="auto" w:fill="F7F9FB"/>
             <w:vAlign w:val="center"/>
           </w:tcPr>
@@ -373,7 +373,7 @@
         </w:tc>
         <w:tc>
           <w:tcPr>
-            <w:tcW w:type="dxa" w:w="2210"/>
+            <w:tcW w:type="dxa" w:w="2250"/>
             <w:shd w:val="clear" w:color="auto" w:fill="F7F9FB"/>
             <w:vAlign w:val="center"/>
           </w:tcPr>
@@ -396,7 +396,7 @@
         </w:tc>
         <w:tc>
           <w:tcPr>
-            <w:tcW w:type="dxa" w:w="3065"/>
+            <w:tcW w:type="dxa" w:w="3031"/>
             <w:shd w:val="clear" w:color="auto" w:fill="F7F9FB"/>
             <w:vAlign w:val="center"/>
           </w:tcPr>
@@ -419,7 +419,7 @@
         </w:tc>
         <w:tc>
           <w:tcPr>
-            <w:tcW w:type="dxa" w:w="1219"/>
+            <w:tcW w:type="dxa" w:w="1215"/>
             <w:shd w:val="clear" w:color="auto" w:fill="F7F9FB"/>
             <w:vAlign w:val="center"/>
           </w:tcPr>
@@ -447,7 +447,7 @@
         </w:trPr>
         <w:tc>
           <w:tcPr>
-            <w:tcW w:type="dxa" w:w="415"/>
+            <w:tcW w:type="dxa" w:w="414"/>
             <w:shd w:val="clear" w:color="auto" w:fill="FFFFFF"/>
             <w:vAlign w:val="center"/>
           </w:tcPr>
@@ -471,7 +471,7 @@
         </w:tc>
         <w:tc>
           <w:tcPr>
-            <w:tcW w:type="dxa" w:w="1588"/>
+            <w:tcW w:type="dxa" w:w="1585"/>
             <w:shd w:val="clear" w:color="auto" w:fill="FFFFFF"/>
             <w:vAlign w:val="center"/>
           </w:tcPr>
@@ -495,7 +495,7 @@
         </w:tc>
         <w:tc>
           <w:tcPr>
-            <w:tcW w:type="dxa" w:w="2210"/>
+            <w:tcW w:type="dxa" w:w="2250"/>
             <w:shd w:val="clear" w:color="auto" w:fill="FFFFFF"/>
             <w:vAlign w:val="center"/>
           </w:tcPr>
@@ -518,7 +518,7 @@
         </w:tc>
         <w:tc>
           <w:tcPr>
-            <w:tcW w:type="dxa" w:w="3065"/>
+            <w:tcW w:type="dxa" w:w="3031"/>
             <w:shd w:val="clear" w:color="auto" w:fill="FFFFFF"/>
             <w:vAlign w:val="center"/>
           </w:tcPr>
@@ -541,7 +541,7 @@
         </w:tc>
         <w:tc>
           <w:tcPr>
-            <w:tcW w:type="dxa" w:w="1219"/>
+            <w:tcW w:type="dxa" w:w="1215"/>
             <w:shd w:val="clear" w:color="auto" w:fill="FFFFFF"/>
             <w:vAlign w:val="center"/>
           </w:tcPr>
@@ -569,7 +569,7 @@
         </w:trPr>
         <w:tc>
           <w:tcPr>
-            <w:tcW w:type="dxa" w:w="415"/>
+            <w:tcW w:type="dxa" w:w="414"/>
             <w:shd w:val="clear" w:color="auto" w:fill="F7F9FB"/>
             <w:vAlign w:val="center"/>
           </w:tcPr>
@@ -593,7 +593,7 @@
         </w:tc>
         <w:tc>
           <w:tcPr>
-            <w:tcW w:type="dxa" w:w="1588"/>
+            <w:tcW w:type="dxa" w:w="1585"/>
             <w:shd w:val="clear" w:color="auto" w:fill="F7F9FB"/>
             <w:vAlign w:val="center"/>
           </w:tcPr>
@@ -617,7 +617,7 @@
         </w:tc>
         <w:tc>
           <w:tcPr>
-            <w:tcW w:type="dxa" w:w="2210"/>
+            <w:tcW w:type="dxa" w:w="2250"/>
             <w:shd w:val="clear" w:color="auto" w:fill="F7F9FB"/>
             <w:vAlign w:val="center"/>
           </w:tcPr>
@@ -640,7 +640,7 @@
         </w:tc>
         <w:tc>
           <w:tcPr>
-            <w:tcW w:type="dxa" w:w="3065"/>
+            <w:tcW w:type="dxa" w:w="3031"/>
             <w:shd w:val="clear" w:color="auto" w:fill="F7F9FB"/>
             <w:vAlign w:val="center"/>
           </w:tcPr>
@@ -663,7 +663,7 @@
         </w:tc>
         <w:tc>
           <w:tcPr>
-            <w:tcW w:type="dxa" w:w="1219"/>
+            <w:tcW w:type="dxa" w:w="1215"/>
             <w:shd w:val="clear" w:color="auto" w:fill="F7F9FB"/>
             <w:vAlign w:val="center"/>
           </w:tcPr>
@@ -711,7 +711,7 @@
         </w:trPr>
         <w:tc>
           <w:tcPr>
-            <w:tcW w:type="dxa" w:w="415"/>
+            <w:tcW w:type="dxa" w:w="414"/>
             <w:shd w:val="clear" w:color="auto" w:fill="FFFFFF"/>
             <w:vAlign w:val="center"/>
           </w:tcPr>
@@ -735,7 +735,7 @@
         </w:tc>
         <w:tc>
           <w:tcPr>
-            <w:tcW w:type="dxa" w:w="1588"/>
+            <w:tcW w:type="dxa" w:w="1585"/>
             <w:shd w:val="clear" w:color="auto" w:fill="FFFFFF"/>
             <w:vAlign w:val="center"/>
           </w:tcPr>
@@ -759,7 +759,7 @@
         </w:tc>
         <w:tc>
           <w:tcPr>
-            <w:tcW w:type="dxa" w:w="2210"/>
+            <w:tcW w:type="dxa" w:w="2250"/>
             <w:shd w:val="clear" w:color="auto" w:fill="FFFFFF"/>
             <w:vAlign w:val="center"/>
           </w:tcPr>
@@ -782,7 +782,7 @@
         </w:tc>
         <w:tc>
           <w:tcPr>
-            <w:tcW w:type="dxa" w:w="3065"/>
+            <w:tcW w:type="dxa" w:w="3031"/>
             <w:shd w:val="clear" w:color="auto" w:fill="FFFFFF"/>
             <w:vAlign w:val="center"/>
           </w:tcPr>
@@ -805,7 +805,7 @@
         </w:tc>
         <w:tc>
           <w:tcPr>
-            <w:tcW w:type="dxa" w:w="1219"/>
+            <w:tcW w:type="dxa" w:w="1215"/>
             <w:shd w:val="clear" w:color="auto" w:fill="FFFFFF"/>
             <w:vAlign w:val="center"/>
           </w:tcPr>
@@ -833,7 +833,7 @@
         </w:trPr>
         <w:tc>
           <w:tcPr>
-            <w:tcW w:type="dxa" w:w="415"/>
+            <w:tcW w:type="dxa" w:w="414"/>
             <w:shd w:val="clear" w:color="auto" w:fill="F7F9FB"/>
             <w:vAlign w:val="center"/>
           </w:tcPr>
@@ -857,7 +857,7 @@
         </w:tc>
         <w:tc>
           <w:tcPr>
-            <w:tcW w:type="dxa" w:w="1588"/>
+            <w:tcW w:type="dxa" w:w="1585"/>
             <w:shd w:val="clear" w:color="auto" w:fill="F7F9FB"/>
             <w:vAlign w:val="center"/>
           </w:tcPr>
@@ -881,7 +881,7 @@
         </w:tc>
         <w:tc>
           <w:tcPr>
-            <w:tcW w:type="dxa" w:w="2210"/>
+            <w:tcW w:type="dxa" w:w="2250"/>
             <w:shd w:val="clear" w:color="auto" w:fill="F7F9FB"/>
             <w:vAlign w:val="center"/>
           </w:tcPr>
@@ -904,7 +904,7 @@
         </w:tc>
         <w:tc>
           <w:tcPr>
-            <w:tcW w:type="dxa" w:w="3065"/>
+            <w:tcW w:type="dxa" w:w="3031"/>
             <w:shd w:val="clear" w:color="auto" w:fill="F7F9FB"/>
             <w:vAlign w:val="center"/>
           </w:tcPr>
@@ -927,7 +927,7 @@
         </w:tc>
         <w:tc>
           <w:tcPr>
-            <w:tcW w:type="dxa" w:w="1219"/>
+            <w:tcW w:type="dxa" w:w="1215"/>
             <w:shd w:val="clear" w:color="auto" w:fill="F7F9FB"/>
             <w:vAlign w:val="center"/>
           </w:tcPr>
@@ -955,7 +955,7 @@
         </w:trPr>
         <w:tc>
           <w:tcPr>
-            <w:tcW w:type="dxa" w:w="415"/>
+            <w:tcW w:type="dxa" w:w="414"/>
             <w:shd w:val="clear" w:color="auto" w:fill="FFFFFF"/>
             <w:vAlign w:val="center"/>
           </w:tcPr>
@@ -979,7 +979,7 @@
         </w:tc>
         <w:tc>
           <w:tcPr>
-            <w:tcW w:type="dxa" w:w="1588"/>
+            <w:tcW w:type="dxa" w:w="1585"/>
             <w:shd w:val="clear" w:color="auto" w:fill="FFFFFF"/>
             <w:vAlign w:val="center"/>
           </w:tcPr>
@@ -1003,7 +1003,7 @@
         </w:tc>
         <w:tc>
           <w:tcPr>
-            <w:tcW w:type="dxa" w:w="2210"/>
+            <w:tcW w:type="dxa" w:w="2250"/>
             <w:shd w:val="clear" w:color="auto" w:fill="FFFFFF"/>
             <w:vAlign w:val="center"/>
           </w:tcPr>
@@ -1026,7 +1026,7 @@
         </w:tc>
         <w:tc>
           <w:tcPr>
-            <w:tcW w:type="dxa" w:w="3065"/>
+            <w:tcW w:type="dxa" w:w="3031"/>
             <w:shd w:val="clear" w:color="auto" w:fill="FFFFFF"/>
             <w:vAlign w:val="center"/>
           </w:tcPr>
@@ -1049,7 +1049,7 @@
         </w:tc>
         <w:tc>
           <w:tcPr>
-            <w:tcW w:type="dxa" w:w="1219"/>
+            <w:tcW w:type="dxa" w:w="1215"/>
             <w:shd w:val="clear" w:color="auto" w:fill="FFFFFF"/>
             <w:vAlign w:val="center"/>
           </w:tcPr>
@@ -1097,7 +1097,7 @@
         </w:trPr>
         <w:tc>
           <w:tcPr>
-            <w:tcW w:type="dxa" w:w="415"/>
+            <w:tcW w:type="dxa" w:w="414"/>
             <w:shd w:val="clear" w:color="auto" w:fill="F7F9FB"/>
             <w:vAlign w:val="center"/>
           </w:tcPr>
@@ -1121,7 +1121,7 @@
         </w:tc>
         <w:tc>
           <w:tcPr>
-            <w:tcW w:type="dxa" w:w="1588"/>
+            <w:tcW w:type="dxa" w:w="1585"/>
             <w:shd w:val="clear" w:color="auto" w:fill="F7F9FB"/>
             <w:vAlign w:val="center"/>
           </w:tcPr>
@@ -1145,7 +1145,7 @@
         </w:tc>
         <w:tc>
           <w:tcPr>
-            <w:tcW w:type="dxa" w:w="2210"/>
+            <w:tcW w:type="dxa" w:w="2250"/>
             <w:shd w:val="clear" w:color="auto" w:fill="F7F9FB"/>
             <w:vAlign w:val="center"/>
           </w:tcPr>
@@ -1168,7 +1168,7 @@
         </w:tc>
         <w:tc>
           <w:tcPr>
-            <w:tcW w:type="dxa" w:w="3065"/>
+            <w:tcW w:type="dxa" w:w="3031"/>
             <w:shd w:val="clear" w:color="auto" w:fill="F7F9FB"/>
             <w:vAlign w:val="center"/>
           </w:tcPr>
@@ -1191,7 +1191,7 @@
         </w:tc>
         <w:tc>
           <w:tcPr>
-            <w:tcW w:type="dxa" w:w="1219"/>
+            <w:tcW w:type="dxa" w:w="1215"/>
             <w:shd w:val="clear" w:color="auto" w:fill="F7F9FB"/>
             <w:vAlign w:val="center"/>
           </w:tcPr>
@@ -1239,7 +1239,7 @@
         </w:trPr>
         <w:tc>
           <w:tcPr>
-            <w:tcW w:type="dxa" w:w="415"/>
+            <w:tcW w:type="dxa" w:w="414"/>
             <w:shd w:val="clear" w:color="auto" w:fill="FFFFFF"/>
             <w:vAlign w:val="center"/>
           </w:tcPr>
@@ -1263,7 +1263,7 @@
         </w:tc>
         <w:tc>
           <w:tcPr>
-            <w:tcW w:type="dxa" w:w="1588"/>
+            <w:tcW w:type="dxa" w:w="1585"/>
             <w:shd w:val="clear" w:color="auto" w:fill="FFFFFF"/>
             <w:vAlign w:val="center"/>
           </w:tcPr>
@@ -1287,7 +1287,7 @@
         </w:tc>
         <w:tc>
           <w:tcPr>
-            <w:tcW w:type="dxa" w:w="2210"/>
+            <w:tcW w:type="dxa" w:w="2250"/>
             <w:shd w:val="clear" w:color="auto" w:fill="FFFFFF"/>
             <w:vAlign w:val="center"/>
           </w:tcPr>
@@ -1310,7 +1310,7 @@
         </w:tc>
         <w:tc>
           <w:tcPr>
-            <w:tcW w:type="dxa" w:w="3065"/>
+            <w:tcW w:type="dxa" w:w="3031"/>
             <w:shd w:val="clear" w:color="auto" w:fill="FFFFFF"/>
             <w:vAlign w:val="center"/>
           </w:tcPr>
@@ -1333,7 +1333,7 @@
         </w:tc>
         <w:tc>
           <w:tcPr>
-            <w:tcW w:type="dxa" w:w="1219"/>
+            <w:tcW w:type="dxa" w:w="1215"/>
             <w:shd w:val="clear" w:color="auto" w:fill="FFFFFF"/>
             <w:vAlign w:val="center"/>
           </w:tcPr>
@@ -1381,7 +1381,7 @@
         </w:trPr>
         <w:tc>
           <w:tcPr>
-            <w:tcW w:type="dxa" w:w="415"/>
+            <w:tcW w:type="dxa" w:w="414"/>
             <w:shd w:val="clear" w:color="auto" w:fill="F7F9FB"/>
             <w:vAlign w:val="center"/>
           </w:tcPr>
@@ -1405,7 +1405,7 @@
         </w:tc>
         <w:tc>
           <w:tcPr>
-            <w:tcW w:type="dxa" w:w="1588"/>
+            <w:tcW w:type="dxa" w:w="1585"/>
             <w:shd w:val="clear" w:color="auto" w:fill="F7F9FB"/>
             <w:vAlign w:val="center"/>
           </w:tcPr>
@@ -1429,7 +1429,7 @@
         </w:tc>
         <w:tc>
           <w:tcPr>
-            <w:tcW w:type="dxa" w:w="2210"/>
+            <w:tcW w:type="dxa" w:w="2250"/>
             <w:shd w:val="clear" w:color="auto" w:fill="F7F9FB"/>
             <w:vAlign w:val="center"/>
           </w:tcPr>
@@ -1452,7 +1452,7 @@
         </w:tc>
         <w:tc>
           <w:tcPr>
-            <w:tcW w:type="dxa" w:w="3065"/>
+            <w:tcW w:type="dxa" w:w="3031"/>
             <w:shd w:val="clear" w:color="auto" w:fill="F7F9FB"/>
             <w:vAlign w:val="center"/>
           </w:tcPr>
@@ -1475,7 +1475,7 @@
         </w:tc>
         <w:tc>
           <w:tcPr>
-            <w:tcW w:type="dxa" w:w="1219"/>
+            <w:tcW w:type="dxa" w:w="1215"/>
             <w:shd w:val="clear" w:color="auto" w:fill="F7F9FB"/>
             <w:vAlign w:val="center"/>
           </w:tcPr>
@@ -1523,7 +1523,7 @@
         </w:trPr>
         <w:tc>
           <w:tcPr>
-            <w:tcW w:type="dxa" w:w="415"/>
+            <w:tcW w:type="dxa" w:w="414"/>
             <w:shd w:val="clear" w:color="auto" w:fill="FFFFFF"/>
             <w:vAlign w:val="center"/>
           </w:tcPr>
@@ -1547,7 +1547,7 @@
         </w:tc>
         <w:tc>
           <w:tcPr>
-            <w:tcW w:type="dxa" w:w="1588"/>
+            <w:tcW w:type="dxa" w:w="1585"/>
             <w:shd w:val="clear" w:color="auto" w:fill="FFFFFF"/>
             <w:vAlign w:val="center"/>
           </w:tcPr>
@@ -1571,7 +1571,7 @@
         </w:tc>
         <w:tc>
           <w:tcPr>
-            <w:tcW w:type="dxa" w:w="2210"/>
+            <w:tcW w:type="dxa" w:w="2250"/>
             <w:shd w:val="clear" w:color="auto" w:fill="FFFFFF"/>
             <w:vAlign w:val="center"/>
           </w:tcPr>
@@ -1594,7 +1594,7 @@
         </w:tc>
         <w:tc>
           <w:tcPr>
-            <w:tcW w:type="dxa" w:w="3065"/>
+            <w:tcW w:type="dxa" w:w="3031"/>
             <w:shd w:val="clear" w:color="auto" w:fill="FFFFFF"/>
             <w:vAlign w:val="center"/>
           </w:tcPr>
@@ -1617,7 +1617,7 @@
         </w:tc>
         <w:tc>
           <w:tcPr>
-            <w:tcW w:type="dxa" w:w="1219"/>
+            <w:tcW w:type="dxa" w:w="1215"/>
             <w:shd w:val="clear" w:color="auto" w:fill="FFFFFF"/>
             <w:vAlign w:val="center"/>
           </w:tcPr>
@@ -1665,7 +1665,7 @@
         </w:trPr>
         <w:tc>
           <w:tcPr>
-            <w:tcW w:type="dxa" w:w="415"/>
+            <w:tcW w:type="dxa" w:w="414"/>
             <w:shd w:val="clear" w:color="auto" w:fill="F7F9FB"/>
             <w:vAlign w:val="center"/>
           </w:tcPr>
@@ -1689,7 +1689,7 @@
         </w:tc>
         <w:tc>
           <w:tcPr>
-            <w:tcW w:type="dxa" w:w="1588"/>
+            <w:tcW w:type="dxa" w:w="1585"/>
             <w:shd w:val="clear" w:color="auto" w:fill="F7F9FB"/>
             <w:vAlign w:val="center"/>
           </w:tcPr>
@@ -1713,7 +1713,7 @@
         </w:tc>
         <w:tc>
           <w:tcPr>
-            <w:tcW w:type="dxa" w:w="2210"/>
+            <w:tcW w:type="dxa" w:w="2250"/>
             <w:shd w:val="clear" w:color="auto" w:fill="F7F9FB"/>
             <w:vAlign w:val="center"/>
           </w:tcPr>
@@ -1736,7 +1736,7 @@
         </w:tc>
         <w:tc>
           <w:tcPr>
-            <w:tcW w:type="dxa" w:w="3065"/>
+            <w:tcW w:type="dxa" w:w="3031"/>
             <w:shd w:val="clear" w:color="auto" w:fill="F7F9FB"/>
             <w:vAlign w:val="center"/>
           </w:tcPr>
@@ -1759,7 +1759,7 @@
         </w:tc>
         <w:tc>
           <w:tcPr>
-            <w:tcW w:type="dxa" w:w="1219"/>
+            <w:tcW w:type="dxa" w:w="1215"/>
             <w:shd w:val="clear" w:color="auto" w:fill="F7F9FB"/>
             <w:vAlign w:val="center"/>
           </w:tcPr>
@@ -1787,7 +1787,7 @@
         </w:trPr>
         <w:tc>
           <w:tcPr>
-            <w:tcW w:type="dxa" w:w="415"/>
+            <w:tcW w:type="dxa" w:w="414"/>
             <w:shd w:val="clear" w:color="auto" w:fill="FFFFFF"/>
             <w:vAlign w:val="center"/>
           </w:tcPr>
@@ -1811,7 +1811,7 @@
         </w:tc>
         <w:tc>
           <w:tcPr>
-            <w:tcW w:type="dxa" w:w="1588"/>
+            <w:tcW w:type="dxa" w:w="1585"/>
             <w:shd w:val="clear" w:color="auto" w:fill="FFFFFF"/>
             <w:vAlign w:val="center"/>
           </w:tcPr>
@@ -1835,7 +1835,7 @@
         </w:tc>
         <w:tc>
           <w:tcPr>
-            <w:tcW w:type="dxa" w:w="2210"/>
+            <w:tcW w:type="dxa" w:w="2250"/>
             <w:shd w:val="clear" w:color="auto" w:fill="FFFFFF"/>
             <w:vAlign w:val="center"/>
           </w:tcPr>
@@ -1858,7 +1858,7 @@
         </w:tc>
         <w:tc>
           <w:tcPr>
-            <w:tcW w:type="dxa" w:w="3065"/>
+            <w:tcW w:type="dxa" w:w="3031"/>
             <w:shd w:val="clear" w:color="auto" w:fill="FFFFFF"/>
             <w:vAlign w:val="center"/>
           </w:tcPr>
@@ -1881,7 +1881,7 @@
         </w:tc>
         <w:tc>
           <w:tcPr>
-            <w:tcW w:type="dxa" w:w="1219"/>
+            <w:tcW w:type="dxa" w:w="1215"/>
             <w:shd w:val="clear" w:color="auto" w:fill="FFFFFF"/>
             <w:vAlign w:val="center"/>
           </w:tcPr>
@@ -1919,7 +1919,7 @@
         </w:trPr>
         <w:tc>
           <w:tcPr>
-            <w:tcW w:type="dxa" w:w="415"/>
+            <w:tcW w:type="dxa" w:w="414"/>
             <w:shd w:val="clear" w:color="auto" w:fill="F7F9FB"/>
             <w:vAlign w:val="center"/>
           </w:tcPr>
@@ -1943,7 +1943,7 @@
         </w:tc>
         <w:tc>
           <w:tcPr>
-            <w:tcW w:type="dxa" w:w="1588"/>
+            <w:tcW w:type="dxa" w:w="1585"/>
             <w:shd w:val="clear" w:color="auto" w:fill="F7F9FB"/>
             <w:vAlign w:val="center"/>
           </w:tcPr>
@@ -1967,7 +1967,7 @@
         </w:tc>
         <w:tc>
           <w:tcPr>
-            <w:tcW w:type="dxa" w:w="2210"/>
+            <w:tcW w:type="dxa" w:w="2250"/>
             <w:shd w:val="clear" w:color="auto" w:fill="F7F9FB"/>
             <w:vAlign w:val="center"/>
           </w:tcPr>
@@ -1990,7 +1990,7 @@
         </w:tc>
         <w:tc>
           <w:tcPr>
-            <w:tcW w:type="dxa" w:w="3065"/>
+            <w:tcW w:type="dxa" w:w="3031"/>
             <w:shd w:val="clear" w:color="auto" w:fill="F7F9FB"/>
             <w:vAlign w:val="center"/>
           </w:tcPr>
@@ -2013,7 +2013,7 @@
         </w:tc>
         <w:tc>
           <w:tcPr>
-            <w:tcW w:type="dxa" w:w="1219"/>
+            <w:tcW w:type="dxa" w:w="1215"/>
             <w:shd w:val="clear" w:color="auto" w:fill="F7F9FB"/>
             <w:vAlign w:val="center"/>
           </w:tcPr>
@@ -2061,7 +2061,7 @@
         </w:trPr>
         <w:tc>
           <w:tcPr>
-            <w:tcW w:type="dxa" w:w="415"/>
+            <w:tcW w:type="dxa" w:w="414"/>
             <w:shd w:val="clear" w:color="auto" w:fill="FFFFFF"/>
             <w:vAlign w:val="center"/>
           </w:tcPr>
@@ -2085,7 +2085,7 @@
         </w:tc>
         <w:tc>
           <w:tcPr>
-            <w:tcW w:type="dxa" w:w="1588"/>
+            <w:tcW w:type="dxa" w:w="1585"/>
             <w:shd w:val="clear" w:color="auto" w:fill="FFFFFF"/>
             <w:vAlign w:val="center"/>
           </w:tcPr>
@@ -2109,7 +2109,7 @@
         </w:tc>
         <w:tc>
           <w:tcPr>
-            <w:tcW w:type="dxa" w:w="2210"/>
+            <w:tcW w:type="dxa" w:w="2250"/>
             <w:shd w:val="clear" w:color="auto" w:fill="FFFFFF"/>
             <w:vAlign w:val="center"/>
           </w:tcPr>
@@ -2132,7 +2132,7 @@
         </w:tc>
         <w:tc>
           <w:tcPr>
-            <w:tcW w:type="dxa" w:w="3065"/>
+            <w:tcW w:type="dxa" w:w="3031"/>
             <w:shd w:val="clear" w:color="auto" w:fill="FFFFFF"/>
             <w:vAlign w:val="center"/>
           </w:tcPr>
@@ -2155,7 +2155,7 @@
         </w:tc>
         <w:tc>
           <w:tcPr>
-            <w:tcW w:type="dxa" w:w="1219"/>
+            <w:tcW w:type="dxa" w:w="1215"/>
             <w:shd w:val="clear" w:color="auto" w:fill="FFFFFF"/>
             <w:vAlign w:val="center"/>
           </w:tcPr>
@@ -2203,7 +2203,7 @@
         </w:trPr>
         <w:tc>
           <w:tcPr>
-            <w:tcW w:type="dxa" w:w="415"/>
+            <w:tcW w:type="dxa" w:w="414"/>
             <w:shd w:val="clear" w:color="auto" w:fill="F7F9FB"/>
             <w:vAlign w:val="center"/>
           </w:tcPr>
@@ -2227,7 +2227,7 @@
         </w:tc>
         <w:tc>
           <w:tcPr>
-            <w:tcW w:type="dxa" w:w="1588"/>
+            <w:tcW w:type="dxa" w:w="1585"/>
             <w:shd w:val="clear" w:color="auto" w:fill="F7F9FB"/>
             <w:vAlign w:val="center"/>
           </w:tcPr>
@@ -2251,7 +2251,7 @@
         </w:tc>
         <w:tc>
           <w:tcPr>
-            <w:tcW w:type="dxa" w:w="2210"/>
+            <w:tcW w:type="dxa" w:w="2250"/>
             <w:shd w:val="clear" w:color="auto" w:fill="F7F9FB"/>
             <w:vAlign w:val="center"/>
           </w:tcPr>
@@ -2274,7 +2274,7 @@
         </w:tc>
         <w:tc>
           <w:tcPr>
-            <w:tcW w:type="dxa" w:w="3065"/>
+            <w:tcW w:type="dxa" w:w="3031"/>
             <w:shd w:val="clear" w:color="auto" w:fill="F7F9FB"/>
             <w:vAlign w:val="center"/>
           </w:tcPr>
@@ -2297,7 +2297,7 @@
         </w:tc>
         <w:tc>
           <w:tcPr>
-            <w:tcW w:type="dxa" w:w="1219"/>
+            <w:tcW w:type="dxa" w:w="1215"/>
             <w:shd w:val="clear" w:color="auto" w:fill="F7F9FB"/>
             <w:vAlign w:val="center"/>
           </w:tcPr>
@@ -2335,7 +2335,7 @@
         </w:trPr>
         <w:tc>
           <w:tcPr>
-            <w:tcW w:type="dxa" w:w="415"/>
+            <w:tcW w:type="dxa" w:w="414"/>
             <w:shd w:val="clear" w:color="auto" w:fill="FFFFFF"/>
             <w:vAlign w:val="center"/>
           </w:tcPr>
@@ -2359,7 +2359,7 @@
         </w:tc>
         <w:tc>
           <w:tcPr>
-            <w:tcW w:type="dxa" w:w="1588"/>
+            <w:tcW w:type="dxa" w:w="1585"/>
             <w:shd w:val="clear" w:color="auto" w:fill="FFFFFF"/>
             <w:vAlign w:val="center"/>
           </w:tcPr>
@@ -2383,7 +2383,7 @@
         </w:tc>
         <w:tc>
           <w:tcPr>
-            <w:tcW w:type="dxa" w:w="2210"/>
+            <w:tcW w:type="dxa" w:w="2250"/>
             <w:shd w:val="clear" w:color="auto" w:fill="FFFFFF"/>
             <w:vAlign w:val="center"/>
           </w:tcPr>
@@ -2406,7 +2406,7 @@
         </w:tc>
         <w:tc>
           <w:tcPr>
-            <w:tcW w:type="dxa" w:w="3065"/>
+            <w:tcW w:type="dxa" w:w="3031"/>
             <w:shd w:val="clear" w:color="auto" w:fill="FFFFFF"/>
             <w:vAlign w:val="center"/>
           </w:tcPr>
@@ -2429,7 +2429,7 @@
         </w:tc>
         <w:tc>
           <w:tcPr>
-            <w:tcW w:type="dxa" w:w="1219"/>
+            <w:tcW w:type="dxa" w:w="1215"/>
             <w:shd w:val="clear" w:color="auto" w:fill="FFFFFF"/>
             <w:vAlign w:val="center"/>
           </w:tcPr>
@@ -2477,7 +2477,7 @@
         </w:trPr>
         <w:tc>
           <w:tcPr>
-            <w:tcW w:type="dxa" w:w="415"/>
+            <w:tcW w:type="dxa" w:w="414"/>
             <w:shd w:val="clear" w:color="auto" w:fill="F7F9FB"/>
             <w:vAlign w:val="center"/>
           </w:tcPr>
@@ -2501,7 +2501,7 @@
         </w:tc>
         <w:tc>
           <w:tcPr>
-            <w:tcW w:type="dxa" w:w="1588"/>
+            <w:tcW w:type="dxa" w:w="1585"/>
             <w:shd w:val="clear" w:color="auto" w:fill="F7F9FB"/>
             <w:vAlign w:val="center"/>
           </w:tcPr>
@@ -2525,7 +2525,7 @@
         </w:tc>
         <w:tc>
           <w:tcPr>
-            <w:tcW w:type="dxa" w:w="2210"/>
+            <w:tcW w:type="dxa" w:w="2250"/>
             <w:shd w:val="clear" w:color="auto" w:fill="F7F9FB"/>
             <w:vAlign w:val="center"/>
           </w:tcPr>
@@ -2548,7 +2548,7 @@
         </w:tc>
         <w:tc>
           <w:tcPr>
-            <w:tcW w:type="dxa" w:w="3065"/>
+            <w:tcW w:type="dxa" w:w="3031"/>
             <w:shd w:val="clear" w:color="auto" w:fill="F7F9FB"/>
             <w:vAlign w:val="center"/>
           </w:tcPr>
@@ -2571,7 +2571,7 @@
         </w:tc>
         <w:tc>
           <w:tcPr>
-            <w:tcW w:type="dxa" w:w="1219"/>
+            <w:tcW w:type="dxa" w:w="1215"/>
             <w:shd w:val="clear" w:color="auto" w:fill="F7F9FB"/>
             <w:vAlign w:val="center"/>
           </w:tcPr>
@@ -2619,7 +2619,7 @@
         </w:trPr>
         <w:tc>
           <w:tcPr>
-            <w:tcW w:type="dxa" w:w="415"/>
+            <w:tcW w:type="dxa" w:w="414"/>
             <w:shd w:val="clear" w:color="auto" w:fill="FFFFFF"/>
             <w:vAlign w:val="center"/>
           </w:tcPr>
@@ -2643,7 +2643,7 @@
         </w:tc>
         <w:tc>
           <w:tcPr>
-            <w:tcW w:type="dxa" w:w="1588"/>
+            <w:tcW w:type="dxa" w:w="1585"/>
             <w:shd w:val="clear" w:color="auto" w:fill="FFFFFF"/>
             <w:vAlign w:val="center"/>
           </w:tcPr>
@@ -2667,7 +2667,7 @@
         </w:tc>
         <w:tc>
           <w:tcPr>
-            <w:tcW w:type="dxa" w:w="2210"/>
+            <w:tcW w:type="dxa" w:w="2250"/>
             <w:shd w:val="clear" w:color="auto" w:fill="FFFFFF"/>
             <w:vAlign w:val="center"/>
           </w:tcPr>
@@ -2690,7 +2690,7 @@
         </w:tc>
         <w:tc>
           <w:tcPr>
-            <w:tcW w:type="dxa" w:w="3065"/>
+            <w:tcW w:type="dxa" w:w="3031"/>
             <w:shd w:val="clear" w:color="auto" w:fill="FFFFFF"/>
             <w:vAlign w:val="center"/>
           </w:tcPr>
@@ -2713,7 +2713,7 @@
         </w:tc>
         <w:tc>
           <w:tcPr>
-            <w:tcW w:type="dxa" w:w="1219"/>
+            <w:tcW w:type="dxa" w:w="1215"/>
             <w:shd w:val="clear" w:color="auto" w:fill="FFFFFF"/>
             <w:vAlign w:val="center"/>
           </w:tcPr>
@@ -2761,7 +2761,7 @@
         </w:trPr>
         <w:tc>
           <w:tcPr>
-            <w:tcW w:type="dxa" w:w="415"/>
+            <w:tcW w:type="dxa" w:w="414"/>
             <w:shd w:val="clear" w:color="auto" w:fill="F7F9FB"/>
             <w:vAlign w:val="center"/>
           </w:tcPr>
@@ -2785,7 +2785,7 @@
         </w:tc>
         <w:tc>
           <w:tcPr>
-            <w:tcW w:type="dxa" w:w="1588"/>
+            <w:tcW w:type="dxa" w:w="1585"/>
             <w:shd w:val="clear" w:color="auto" w:fill="F7F9FB"/>
             <w:vAlign w:val="center"/>
           </w:tcPr>
@@ -2809,7 +2809,7 @@
         </w:tc>
         <w:tc>
           <w:tcPr>
-            <w:tcW w:type="dxa" w:w="2210"/>
+            <w:tcW w:type="dxa" w:w="2250"/>
             <w:shd w:val="clear" w:color="auto" w:fill="F7F9FB"/>
             <w:vAlign w:val="center"/>
           </w:tcPr>
@@ -2832,7 +2832,7 @@
         </w:tc>
         <w:tc>
           <w:tcPr>
-            <w:tcW w:type="dxa" w:w="3065"/>
+            <w:tcW w:type="dxa" w:w="3031"/>
             <w:shd w:val="clear" w:color="auto" w:fill="F7F9FB"/>
             <w:vAlign w:val="center"/>
           </w:tcPr>
@@ -2855,7 +2855,7 @@
         </w:tc>
         <w:tc>
           <w:tcPr>
-            <w:tcW w:type="dxa" w:w="1219"/>
+            <w:tcW w:type="dxa" w:w="1215"/>
             <w:shd w:val="clear" w:color="auto" w:fill="F7F9FB"/>
             <w:vAlign w:val="center"/>
           </w:tcPr>
@@ -2903,7 +2903,7 @@
         </w:trPr>
         <w:tc>
           <w:tcPr>
-            <w:tcW w:type="dxa" w:w="415"/>
+            <w:tcW w:type="dxa" w:w="414"/>
             <w:shd w:val="clear" w:color="auto" w:fill="FFFFFF"/>
             <w:vAlign w:val="center"/>
           </w:tcPr>
@@ -2927,7 +2927,7 @@
         </w:tc>
         <w:tc>
           <w:tcPr>
-            <w:tcW w:type="dxa" w:w="1588"/>
+            <w:tcW w:type="dxa" w:w="1585"/>
             <w:shd w:val="clear" w:color="auto" w:fill="FFFFFF"/>
             <w:vAlign w:val="center"/>
           </w:tcPr>
@@ -2951,7 +2951,7 @@
         </w:tc>
         <w:tc>
           <w:tcPr>
-            <w:tcW w:type="dxa" w:w="2210"/>
+            <w:tcW w:type="dxa" w:w="2250"/>
             <w:shd w:val="clear" w:color="auto" w:fill="FFFFFF"/>
             <w:vAlign w:val="center"/>
           </w:tcPr>
@@ -2974,7 +2974,7 @@
         </w:tc>
         <w:tc>
           <w:tcPr>
-            <w:tcW w:type="dxa" w:w="3065"/>
+            <w:tcW w:type="dxa" w:w="3031"/>
             <w:shd w:val="clear" w:color="auto" w:fill="FFFFFF"/>
             <w:vAlign w:val="center"/>
           </w:tcPr>
@@ -2997,7 +2997,7 @@
         </w:tc>
         <w:tc>
           <w:tcPr>
-            <w:tcW w:type="dxa" w:w="1219"/>
+            <w:tcW w:type="dxa" w:w="1215"/>
             <w:shd w:val="clear" w:color="auto" w:fill="FFFFFF"/>
             <w:vAlign w:val="center"/>
           </w:tcPr>
@@ -3045,7 +3045,7 @@
         </w:trPr>
         <w:tc>
           <w:tcPr>
-            <w:tcW w:type="dxa" w:w="415"/>
+            <w:tcW w:type="dxa" w:w="414"/>
             <w:shd w:val="clear" w:color="auto" w:fill="F7F9FB"/>
             <w:vAlign w:val="center"/>
           </w:tcPr>
@@ -3069,7 +3069,7 @@
         </w:tc>
         <w:tc>
           <w:tcPr>
-            <w:tcW w:type="dxa" w:w="1588"/>
+            <w:tcW w:type="dxa" w:w="1585"/>
             <w:shd w:val="clear" w:color="auto" w:fill="F7F9FB"/>
             <w:vAlign w:val="center"/>
           </w:tcPr>
@@ -3093,7 +3093,7 @@
         </w:tc>
         <w:tc>
           <w:tcPr>
-            <w:tcW w:type="dxa" w:w="2210"/>
+            <w:tcW w:type="dxa" w:w="2250"/>
             <w:shd w:val="clear" w:color="auto" w:fill="F7F9FB"/>
             <w:vAlign w:val="center"/>
           </w:tcPr>
@@ -3116,7 +3116,7 @@
         </w:tc>
         <w:tc>
           <w:tcPr>
-            <w:tcW w:type="dxa" w:w="3065"/>
+            <w:tcW w:type="dxa" w:w="3031"/>
             <w:shd w:val="clear" w:color="auto" w:fill="F7F9FB"/>
             <w:vAlign w:val="center"/>
           </w:tcPr>
@@ -3139,7 +3139,7 @@
         </w:tc>
         <w:tc>
           <w:tcPr>
-            <w:tcW w:type="dxa" w:w="1219"/>
+            <w:tcW w:type="dxa" w:w="1215"/>
             <w:shd w:val="clear" w:color="auto" w:fill="F7F9FB"/>
             <w:vAlign w:val="center"/>
           </w:tcPr>
@@ -3177,7 +3177,7 @@
         </w:trPr>
         <w:tc>
           <w:tcPr>
-            <w:tcW w:type="dxa" w:w="415"/>
+            <w:tcW w:type="dxa" w:w="414"/>
             <w:shd w:val="clear" w:color="auto" w:fill="FFFFFF"/>
             <w:vAlign w:val="center"/>
           </w:tcPr>
@@ -3201,7 +3201,7 @@
         </w:tc>
         <w:tc>
           <w:tcPr>
-            <w:tcW w:type="dxa" w:w="1588"/>
+            <w:tcW w:type="dxa" w:w="1585"/>
             <w:shd w:val="clear" w:color="auto" w:fill="FFFFFF"/>
             <w:vAlign w:val="center"/>
           </w:tcPr>
@@ -3225,7 +3225,7 @@
         </w:tc>
         <w:tc>
           <w:tcPr>
-            <w:tcW w:type="dxa" w:w="2210"/>
+            <w:tcW w:type="dxa" w:w="2250"/>
             <w:shd w:val="clear" w:color="auto" w:fill="FFFFFF"/>
             <w:vAlign w:val="center"/>
           </w:tcPr>
@@ -3248,7 +3248,7 @@
         </w:tc>
         <w:tc>
           <w:tcPr>
-            <w:tcW w:type="dxa" w:w="3065"/>
+            <w:tcW w:type="dxa" w:w="3031"/>
             <w:shd w:val="clear" w:color="auto" w:fill="FFFFFF"/>
             <w:vAlign w:val="center"/>
           </w:tcPr>
@@ -3271,7 +3271,7 @@
         </w:tc>
         <w:tc>
           <w:tcPr>
-            <w:tcW w:type="dxa" w:w="1219"/>
+            <w:tcW w:type="dxa" w:w="1215"/>
             <w:shd w:val="clear" w:color="auto" w:fill="FFFFFF"/>
             <w:vAlign w:val="center"/>
           </w:tcPr>
@@ -3309,7 +3309,7 @@
         </w:trPr>
         <w:tc>
           <w:tcPr>
-            <w:tcW w:type="dxa" w:w="415"/>
+            <w:tcW w:type="dxa" w:w="414"/>
             <w:shd w:val="clear" w:color="auto" w:fill="F7F9FB"/>
             <w:vAlign w:val="center"/>
           </w:tcPr>
@@ -3333,7 +3333,7 @@
         </w:tc>
         <w:tc>
           <w:tcPr>
-            <w:tcW w:type="dxa" w:w="1588"/>
+            <w:tcW w:type="dxa" w:w="1585"/>
             <w:shd w:val="clear" w:color="auto" w:fill="F7F9FB"/>
             <w:vAlign w:val="center"/>
           </w:tcPr>
@@ -3357,7 +3357,7 @@
         </w:tc>
         <w:tc>
           <w:tcPr>
-            <w:tcW w:type="dxa" w:w="2210"/>
+            <w:tcW w:type="dxa" w:w="2250"/>
             <w:shd w:val="clear" w:color="auto" w:fill="F7F9FB"/>
             <w:vAlign w:val="center"/>
           </w:tcPr>
@@ -3380,7 +3380,7 @@
         </w:tc>
         <w:tc>
           <w:tcPr>
-            <w:tcW w:type="dxa" w:w="3065"/>
+            <w:tcW w:type="dxa" w:w="3031"/>
             <w:shd w:val="clear" w:color="auto" w:fill="F7F9FB"/>
             <w:vAlign w:val="center"/>
           </w:tcPr>
@@ -3403,7 +3403,7 @@
         </w:tc>
         <w:tc>
           <w:tcPr>
-            <w:tcW w:type="dxa" w:w="1219"/>
+            <w:tcW w:type="dxa" w:w="1215"/>
             <w:shd w:val="clear" w:color="auto" w:fill="F7F9FB"/>
             <w:vAlign w:val="center"/>
           </w:tcPr>
@@ -3441,7 +3441,7 @@
         </w:trPr>
         <w:tc>
           <w:tcPr>
-            <w:tcW w:type="dxa" w:w="415"/>
+            <w:tcW w:type="dxa" w:w="414"/>
             <w:shd w:val="clear" w:color="auto" w:fill="FFFFFF"/>
             <w:vAlign w:val="center"/>
           </w:tcPr>
@@ -3465,7 +3465,7 @@
         </w:tc>
         <w:tc>
           <w:tcPr>
-            <w:tcW w:type="dxa" w:w="1588"/>
+            <w:tcW w:type="dxa" w:w="1585"/>
             <w:shd w:val="clear" w:color="auto" w:fill="FFFFFF"/>
             <w:vAlign w:val="center"/>
           </w:tcPr>
@@ -3489,7 +3489,7 @@
         </w:tc>
         <w:tc>
           <w:tcPr>
-            <w:tcW w:type="dxa" w:w="2210"/>
+            <w:tcW w:type="dxa" w:w="2250"/>
             <w:shd w:val="clear" w:color="auto" w:fill="FFFFFF"/>
             <w:vAlign w:val="center"/>
           </w:tcPr>
@@ -3512,7 +3512,7 @@
         </w:tc>
         <w:tc>
           <w:tcPr>
-            <w:tcW w:type="dxa" w:w="3065"/>
+            <w:tcW w:type="dxa" w:w="3031"/>
             <w:shd w:val="clear" w:color="auto" w:fill="FFFFFF"/>
             <w:vAlign w:val="center"/>
           </w:tcPr>
@@ -3535,7 +3535,7 @@
         </w:tc>
         <w:tc>
           <w:tcPr>
-            <w:tcW w:type="dxa" w:w="1219"/>
+            <w:tcW w:type="dxa" w:w="1215"/>
             <w:shd w:val="clear" w:color="auto" w:fill="FFFFFF"/>
             <w:vAlign w:val="center"/>
           </w:tcPr>
@@ -3573,7 +3573,7 @@
         </w:trPr>
         <w:tc>
           <w:tcPr>
-            <w:tcW w:type="dxa" w:w="415"/>
+            <w:tcW w:type="dxa" w:w="414"/>
             <w:shd w:val="clear" w:color="auto" w:fill="F7F9FB"/>
             <w:vAlign w:val="center"/>
           </w:tcPr>
@@ -3597,7 +3597,7 @@
         </w:tc>
         <w:tc>
           <w:tcPr>
-            <w:tcW w:type="dxa" w:w="1588"/>
+            <w:tcW w:type="dxa" w:w="1585"/>
             <w:shd w:val="clear" w:color="auto" w:fill="F7F9FB"/>
             <w:vAlign w:val="center"/>
           </w:tcPr>
@@ -3621,7 +3621,7 @@
         </w:tc>
         <w:tc>
           <w:tcPr>
-            <w:tcW w:type="dxa" w:w="2210"/>
+            <w:tcW w:type="dxa" w:w="2250"/>
             <w:shd w:val="clear" w:color="auto" w:fill="F7F9FB"/>
             <w:vAlign w:val="center"/>
           </w:tcPr>
@@ -3644,7 +3644,7 @@
         </w:tc>
         <w:tc>
           <w:tcPr>
-            <w:tcW w:type="dxa" w:w="3065"/>
+            <w:tcW w:type="dxa" w:w="3031"/>
             <w:shd w:val="clear" w:color="auto" w:fill="F7F9FB"/>
             <w:vAlign w:val="center"/>
           </w:tcPr>
@@ -3667,7 +3667,7 @@
         </w:tc>
         <w:tc>
           <w:tcPr>
-            <w:tcW w:type="dxa" w:w="1219"/>
+            <w:tcW w:type="dxa" w:w="1215"/>
             <w:shd w:val="clear" w:color="auto" w:fill="F7F9FB"/>
             <w:vAlign w:val="center"/>
           </w:tcPr>
@@ -3705,7 +3705,7 @@
         </w:trPr>
         <w:tc>
           <w:tcPr>
-            <w:tcW w:type="dxa" w:w="415"/>
+            <w:tcW w:type="dxa" w:w="414"/>
             <w:shd w:val="clear" w:color="auto" w:fill="FFFFFF"/>
             <w:vAlign w:val="center"/>
           </w:tcPr>
@@ -3729,7 +3729,7 @@
         </w:tc>
         <w:tc>
           <w:tcPr>
-            <w:tcW w:type="dxa" w:w="1588"/>
+            <w:tcW w:type="dxa" w:w="1585"/>
             <w:shd w:val="clear" w:color="auto" w:fill="FFFFFF"/>
             <w:vAlign w:val="center"/>
           </w:tcPr>
@@ -3753,7 +3753,7 @@
         </w:tc>
         <w:tc>
           <w:tcPr>
-            <w:tcW w:type="dxa" w:w="2210"/>
+            <w:tcW w:type="dxa" w:w="2250"/>
             <w:shd w:val="clear" w:color="auto" w:fill="FFFFFF"/>
             <w:vAlign w:val="center"/>
           </w:tcPr>
@@ -3776,7 +3776,7 @@
         </w:tc>
         <w:tc>
           <w:tcPr>
-            <w:tcW w:type="dxa" w:w="3065"/>
+            <w:tcW w:type="dxa" w:w="3031"/>
             <w:shd w:val="clear" w:color="auto" w:fill="FFFFFF"/>
             <w:vAlign w:val="center"/>
           </w:tcPr>
@@ -3799,7 +3799,7 @@
         </w:tc>
         <w:tc>
           <w:tcPr>
-            <w:tcW w:type="dxa" w:w="1219"/>
+            <w:tcW w:type="dxa" w:w="1215"/>
             <w:shd w:val="clear" w:color="auto" w:fill="FFFFFF"/>
             <w:vAlign w:val="center"/>
           </w:tcPr>
@@ -3837,7 +3837,7 @@
         </w:trPr>
         <w:tc>
           <w:tcPr>
-            <w:tcW w:type="dxa" w:w="415"/>
+            <w:tcW w:type="dxa" w:w="414"/>
             <w:shd w:val="clear" w:color="auto" w:fill="F7F9FB"/>
             <w:vAlign w:val="center"/>
           </w:tcPr>
@@ -3861,7 +3861,7 @@
         </w:tc>
         <w:tc>
           <w:tcPr>
-            <w:tcW w:type="dxa" w:w="1588"/>
+            <w:tcW w:type="dxa" w:w="1585"/>
             <w:shd w:val="clear" w:color="auto" w:fill="F7F9FB"/>
             <w:vAlign w:val="center"/>
           </w:tcPr>
@@ -3885,7 +3885,7 @@
         </w:tc>
         <w:tc>
           <w:tcPr>
-            <w:tcW w:type="dxa" w:w="2210"/>
+            <w:tcW w:type="dxa" w:w="2250"/>
             <w:shd w:val="clear" w:color="auto" w:fill="F7F9FB"/>
             <w:vAlign w:val="center"/>
           </w:tcPr>
@@ -3908,7 +3908,7 @@
         </w:tc>
         <w:tc>
           <w:tcPr>
-            <w:tcW w:type="dxa" w:w="3065"/>
+            <w:tcW w:type="dxa" w:w="3031"/>
             <w:shd w:val="clear" w:color="auto" w:fill="F7F9FB"/>
             <w:vAlign w:val="center"/>
           </w:tcPr>
@@ -3931,7 +3931,7 @@
         </w:tc>
         <w:tc>
           <w:tcPr>
-            <w:tcW w:type="dxa" w:w="1219"/>
+            <w:tcW w:type="dxa" w:w="1215"/>
             <w:shd w:val="clear" w:color="auto" w:fill="F7F9FB"/>
             <w:vAlign w:val="center"/>
           </w:tcPr>
@@ -3969,7 +3969,7 @@
         </w:trPr>
         <w:tc>
           <w:tcPr>
-            <w:tcW w:type="dxa" w:w="415"/>
+            <w:tcW w:type="dxa" w:w="414"/>
             <w:shd w:val="clear" w:color="auto" w:fill="FFFFFF"/>
             <w:vAlign w:val="center"/>
           </w:tcPr>
@@ -3993,7 +3993,7 @@
         </w:tc>
         <w:tc>
           <w:tcPr>
-            <w:tcW w:type="dxa" w:w="1588"/>
+            <w:tcW w:type="dxa" w:w="1585"/>
             <w:shd w:val="clear" w:color="auto" w:fill="FFFFFF"/>
             <w:vAlign w:val="center"/>
           </w:tcPr>
@@ -4017,7 +4017,7 @@
         </w:tc>
         <w:tc>
           <w:tcPr>
-            <w:tcW w:type="dxa" w:w="2210"/>
+            <w:tcW w:type="dxa" w:w="2250"/>
             <w:shd w:val="clear" w:color="auto" w:fill="FFFFFF"/>
             <w:vAlign w:val="center"/>
           </w:tcPr>
@@ -4040,7 +4040,7 @@
         </w:tc>
         <w:tc>
           <w:tcPr>
-            <w:tcW w:type="dxa" w:w="3065"/>
+            <w:tcW w:type="dxa" w:w="3031"/>
             <w:shd w:val="clear" w:color="auto" w:fill="FFFFFF"/>
             <w:vAlign w:val="center"/>
           </w:tcPr>
@@ -4063,7 +4063,7 @@
         </w:tc>
         <w:tc>
           <w:tcPr>
-            <w:tcW w:type="dxa" w:w="1219"/>
+            <w:tcW w:type="dxa" w:w="1215"/>
             <w:shd w:val="clear" w:color="auto" w:fill="FFFFFF"/>
             <w:vAlign w:val="center"/>
           </w:tcPr>
@@ -4101,7 +4101,7 @@
         </w:trPr>
         <w:tc>
           <w:tcPr>
-            <w:tcW w:type="dxa" w:w="415"/>
+            <w:tcW w:type="dxa" w:w="414"/>
             <w:shd w:val="clear" w:color="auto" w:fill="F7F9FB"/>
             <w:vAlign w:val="center"/>
           </w:tcPr>
@@ -4125,7 +4125,7 @@
         </w:tc>
         <w:tc>
           <w:tcPr>
-            <w:tcW w:type="dxa" w:w="1588"/>
+            <w:tcW w:type="dxa" w:w="1585"/>
             <w:shd w:val="clear" w:color="auto" w:fill="F7F9FB"/>
             <w:vAlign w:val="center"/>
           </w:tcPr>
@@ -4149,7 +4149,7 @@
         </w:tc>
         <w:tc>
           <w:tcPr>
-            <w:tcW w:type="dxa" w:w="2210"/>
+            <w:tcW w:type="dxa" w:w="2250"/>
             <w:shd w:val="clear" w:color="auto" w:fill="F7F9FB"/>
             <w:vAlign w:val="center"/>
           </w:tcPr>
@@ -4172,7 +4172,7 @@
         </w:tc>
         <w:tc>
           <w:tcPr>
-            <w:tcW w:type="dxa" w:w="3065"/>
+            <w:tcW w:type="dxa" w:w="3031"/>
             <w:shd w:val="clear" w:color="auto" w:fill="F7F9FB"/>
             <w:vAlign w:val="center"/>
           </w:tcPr>
@@ -4195,7 +4195,7 @@
         </w:tc>
         <w:tc>
           <w:tcPr>
-            <w:tcW w:type="dxa" w:w="1219"/>
+            <w:tcW w:type="dxa" w:w="1215"/>
             <w:shd w:val="clear" w:color="auto" w:fill="F7F9FB"/>
             <w:vAlign w:val="center"/>
           </w:tcPr>
@@ -4233,7 +4233,7 @@
         </w:trPr>
         <w:tc>
           <w:tcPr>
-            <w:tcW w:type="dxa" w:w="415"/>
+            <w:tcW w:type="dxa" w:w="414"/>
             <w:shd w:val="clear" w:color="auto" w:fill="FFFFFF"/>
             <w:vAlign w:val="center"/>
           </w:tcPr>
@@ -4257,7 +4257,7 @@
         </w:tc>
         <w:tc>
           <w:tcPr>
-            <w:tcW w:type="dxa" w:w="1588"/>
+            <w:tcW w:type="dxa" w:w="1585"/>
             <w:shd w:val="clear" w:color="auto" w:fill="FFFFFF"/>
             <w:vAlign w:val="center"/>
           </w:tcPr>
@@ -4281,7 +4281,7 @@
         </w:tc>
         <w:tc>
           <w:tcPr>
-            <w:tcW w:type="dxa" w:w="2210"/>
+            <w:tcW w:type="dxa" w:w="2250"/>
             <w:shd w:val="clear" w:color="auto" w:fill="FFFFFF"/>
             <w:vAlign w:val="center"/>
           </w:tcPr>
@@ -4304,7 +4304,7 @@
         </w:tc>
         <w:tc>
           <w:tcPr>
-            <w:tcW w:type="dxa" w:w="3065"/>
+            <w:tcW w:type="dxa" w:w="3031"/>
             <w:shd w:val="clear" w:color="auto" w:fill="FFFFFF"/>
             <w:vAlign w:val="center"/>
           </w:tcPr>
@@ -4327,7 +4327,7 @@
         </w:tc>
         <w:tc>
           <w:tcPr>
-            <w:tcW w:type="dxa" w:w="1219"/>
+            <w:tcW w:type="dxa" w:w="1215"/>
             <w:shd w:val="clear" w:color="auto" w:fill="FFFFFF"/>
             <w:vAlign w:val="center"/>
           </w:tcPr>
@@ -4365,7 +4365,7 @@
         </w:trPr>
         <w:tc>
           <w:tcPr>
-            <w:tcW w:type="dxa" w:w="415"/>
+            <w:tcW w:type="dxa" w:w="414"/>
             <w:shd w:val="clear" w:color="auto" w:fill="F7F9FB"/>
             <w:vAlign w:val="center"/>
           </w:tcPr>
@@ -4389,7 +4389,7 @@
         </w:tc>
         <w:tc>
           <w:tcPr>
-            <w:tcW w:type="dxa" w:w="1588"/>
+            <w:tcW w:type="dxa" w:w="1585"/>
             <w:shd w:val="clear" w:color="auto" w:fill="F7F9FB"/>
             <w:vAlign w:val="center"/>
           </w:tcPr>
@@ -4413,7 +4413,7 @@
         </w:tc>
         <w:tc>
           <w:tcPr>
-            <w:tcW w:type="dxa" w:w="2210"/>
+            <w:tcW w:type="dxa" w:w="2250"/>
             <w:shd w:val="clear" w:color="auto" w:fill="F7F9FB"/>
             <w:vAlign w:val="center"/>
           </w:tcPr>
@@ -4436,7 +4436,7 @@
         </w:tc>
         <w:tc>
           <w:tcPr>
-            <w:tcW w:type="dxa" w:w="3065"/>
+            <w:tcW w:type="dxa" w:w="3031"/>
             <w:shd w:val="clear" w:color="auto" w:fill="F7F9FB"/>
             <w:vAlign w:val="center"/>
           </w:tcPr>
@@ -4459,7 +4459,7 @@
         </w:tc>
         <w:tc>
           <w:tcPr>
-            <w:tcW w:type="dxa" w:w="1219"/>
+            <w:tcW w:type="dxa" w:w="1215"/>
             <w:shd w:val="clear" w:color="auto" w:fill="F7F9FB"/>
             <w:vAlign w:val="center"/>
           </w:tcPr>
@@ -4497,7 +4497,7 @@
         </w:trPr>
         <w:tc>
           <w:tcPr>
-            <w:tcW w:type="dxa" w:w="415"/>
+            <w:tcW w:type="dxa" w:w="414"/>
             <w:shd w:val="clear" w:color="auto" w:fill="FFFFFF"/>
             <w:vAlign w:val="center"/>
           </w:tcPr>
@@ -4521,7 +4521,7 @@
         </w:tc>
         <w:tc>
           <w:tcPr>
-            <w:tcW w:type="dxa" w:w="1588"/>
+            <w:tcW w:type="dxa" w:w="1585"/>
             <w:shd w:val="clear" w:color="auto" w:fill="FFFFFF"/>
             <w:vAlign w:val="center"/>
           </w:tcPr>
@@ -4545,7 +4545,7 @@
         </w:tc>
         <w:tc>
           <w:tcPr>
-            <w:tcW w:type="dxa" w:w="2210"/>
+            <w:tcW w:type="dxa" w:w="2250"/>
             <w:shd w:val="clear" w:color="auto" w:fill="FFFFFF"/>
             <w:vAlign w:val="center"/>
           </w:tcPr>
@@ -4568,7 +4568,7 @@
         </w:tc>
         <w:tc>
           <w:tcPr>
-            <w:tcW w:type="dxa" w:w="3065"/>
+            <w:tcW w:type="dxa" w:w="3031"/>
             <w:shd w:val="clear" w:color="auto" w:fill="FFFFFF"/>
             <w:vAlign w:val="center"/>
           </w:tcPr>
@@ -4591,7 +4591,7 @@
         </w:tc>
         <w:tc>
           <w:tcPr>
-            <w:tcW w:type="dxa" w:w="1219"/>
+            <w:tcW w:type="dxa" w:w="1215"/>
             <w:shd w:val="clear" w:color="auto" w:fill="FFFFFF"/>
             <w:vAlign w:val="center"/>
           </w:tcPr>
@@ -4629,7 +4629,7 @@
         </w:trPr>
         <w:tc>
           <w:tcPr>
-            <w:tcW w:type="dxa" w:w="415"/>
+            <w:tcW w:type="dxa" w:w="414"/>
             <w:shd w:val="clear" w:color="auto" w:fill="F7F9FB"/>
             <w:vAlign w:val="center"/>
           </w:tcPr>
@@ -4653,7 +4653,7 @@
         </w:tc>
         <w:tc>
           <w:tcPr>
-            <w:tcW w:type="dxa" w:w="1588"/>
+            <w:tcW w:type="dxa" w:w="1585"/>
             <w:shd w:val="clear" w:color="auto" w:fill="F7F9FB"/>
             <w:vAlign w:val="center"/>
           </w:tcPr>
@@ -4677,7 +4677,7 @@
         </w:tc>
         <w:tc>
           <w:tcPr>
-            <w:tcW w:type="dxa" w:w="2210"/>
+            <w:tcW w:type="dxa" w:w="2250"/>
             <w:shd w:val="clear" w:color="auto" w:fill="F7F9FB"/>
             <w:vAlign w:val="center"/>
           </w:tcPr>
@@ -4700,7 +4700,7 @@
         </w:tc>
         <w:tc>
           <w:tcPr>
-            <w:tcW w:type="dxa" w:w="3065"/>
+            <w:tcW w:type="dxa" w:w="3031"/>
             <w:shd w:val="clear" w:color="auto" w:fill="F7F9FB"/>
             <w:vAlign w:val="center"/>
           </w:tcPr>
@@ -4723,7 +4723,7 @@
         </w:tc>
         <w:tc>
           <w:tcPr>
-            <w:tcW w:type="dxa" w:w="1219"/>
+            <w:tcW w:type="dxa" w:w="1215"/>
             <w:shd w:val="clear" w:color="auto" w:fill="F7F9FB"/>
             <w:vAlign w:val="center"/>
           </w:tcPr>
@@ -4761,7 +4761,7 @@
         </w:trPr>
         <w:tc>
           <w:tcPr>
-            <w:tcW w:type="dxa" w:w="415"/>
+            <w:tcW w:type="dxa" w:w="414"/>
             <w:shd w:val="clear" w:color="auto" w:fill="FFFFFF"/>
             <w:vAlign w:val="center"/>
           </w:tcPr>
@@ -4785,7 +4785,7 @@
         </w:tc>
         <w:tc>
           <w:tcPr>
-            <w:tcW w:type="dxa" w:w="1588"/>
+            <w:tcW w:type="dxa" w:w="1585"/>
             <w:shd w:val="clear" w:color="auto" w:fill="FFFFFF"/>
             <w:vAlign w:val="center"/>
           </w:tcPr>
@@ -4809,7 +4809,7 @@
         </w:tc>
         <w:tc>
           <w:tcPr>
-            <w:tcW w:type="dxa" w:w="2210"/>
+            <w:tcW w:type="dxa" w:w="2250"/>
             <w:shd w:val="clear" w:color="auto" w:fill="FFFFFF"/>
             <w:vAlign w:val="center"/>
           </w:tcPr>
@@ -4832,7 +4832,7 @@
         </w:tc>
         <w:tc>
           <w:tcPr>
-            <w:tcW w:type="dxa" w:w="3065"/>
+            <w:tcW w:type="dxa" w:w="3031"/>
             <w:shd w:val="clear" w:color="auto" w:fill="FFFFFF"/>
             <w:vAlign w:val="center"/>
           </w:tcPr>
@@ -4855,7 +4855,7 @@
         </w:tc>
         <w:tc>
           <w:tcPr>
-            <w:tcW w:type="dxa" w:w="1219"/>
+            <w:tcW w:type="dxa" w:w="1215"/>
             <w:shd w:val="clear" w:color="auto" w:fill="FFFFFF"/>
             <w:vAlign w:val="center"/>
           </w:tcPr>
@@ -4893,7 +4893,7 @@
         </w:trPr>
         <w:tc>
           <w:tcPr>
-            <w:tcW w:type="dxa" w:w="415"/>
+            <w:tcW w:type="dxa" w:w="414"/>
             <w:shd w:val="clear" w:color="auto" w:fill="F7F9FB"/>
             <w:vAlign w:val="center"/>
           </w:tcPr>
@@ -4917,7 +4917,7 @@
         </w:tc>
         <w:tc>
           <w:tcPr>
-            <w:tcW w:type="dxa" w:w="1588"/>
+            <w:tcW w:type="dxa" w:w="1585"/>
             <w:shd w:val="clear" w:color="auto" w:fill="F7F9FB"/>
             <w:vAlign w:val="center"/>
           </w:tcPr>
@@ -4941,7 +4941,7 @@
         </w:tc>
         <w:tc>
           <w:tcPr>
-            <w:tcW w:type="dxa" w:w="2210"/>
+            <w:tcW w:type="dxa" w:w="2250"/>
             <w:shd w:val="clear" w:color="auto" w:fill="F7F9FB"/>
             <w:vAlign w:val="center"/>
           </w:tcPr>
@@ -4964,7 +4964,7 @@
         </w:tc>
         <w:tc>
           <w:tcPr>
-            <w:tcW w:type="dxa" w:w="3065"/>
+            <w:tcW w:type="dxa" w:w="3031"/>
             <w:shd w:val="clear" w:color="auto" w:fill="F7F9FB"/>
             <w:vAlign w:val="center"/>
           </w:tcPr>
@@ -4987,7 +4987,7 @@
         </w:tc>
         <w:tc>
           <w:tcPr>
-            <w:tcW w:type="dxa" w:w="1219"/>
+            <w:tcW w:type="dxa" w:w="1215"/>
             <w:shd w:val="clear" w:color="auto" w:fill="F7F9FB"/>
             <w:vAlign w:val="center"/>
           </w:tcPr>
@@ -5025,7 +5025,7 @@
         </w:trPr>
         <w:tc>
           <w:tcPr>
-            <w:tcW w:type="dxa" w:w="415"/>
+            <w:tcW w:type="dxa" w:w="414"/>
             <w:shd w:val="clear" w:color="auto" w:fill="FFFFFF"/>
             <w:vAlign w:val="center"/>
           </w:tcPr>
@@ -5049,7 +5049,7 @@
         </w:tc>
         <w:tc>
           <w:tcPr>
-            <w:tcW w:type="dxa" w:w="1588"/>
+            <w:tcW w:type="dxa" w:w="1585"/>
             <w:shd w:val="clear" w:color="auto" w:fill="FFFFFF"/>
             <w:vAlign w:val="center"/>
           </w:tcPr>
@@ -5073,7 +5073,7 @@
         </w:tc>
         <w:tc>
           <w:tcPr>
-            <w:tcW w:type="dxa" w:w="2210"/>
+            <w:tcW w:type="dxa" w:w="2250"/>
             <w:shd w:val="clear" w:color="auto" w:fill="FFFFFF"/>
             <w:vAlign w:val="center"/>
           </w:tcPr>
@@ -5096,7 +5096,7 @@
         </w:tc>
         <w:tc>
           <w:tcPr>
-            <w:tcW w:type="dxa" w:w="3065"/>
+            <w:tcW w:type="dxa" w:w="3031"/>
             <w:shd w:val="clear" w:color="auto" w:fill="FFFFFF"/>
             <w:vAlign w:val="center"/>
           </w:tcPr>
@@ -5119,7 +5119,7 @@
         </w:tc>
         <w:tc>
           <w:tcPr>
-            <w:tcW w:type="dxa" w:w="1219"/>
+            <w:tcW w:type="dxa" w:w="1215"/>
             <w:shd w:val="clear" w:color="auto" w:fill="FFFFFF"/>
             <w:vAlign w:val="center"/>
           </w:tcPr>
@@ -5157,7 +5157,7 @@
         </w:trPr>
         <w:tc>
           <w:tcPr>
-            <w:tcW w:type="dxa" w:w="415"/>
+            <w:tcW w:type="dxa" w:w="414"/>
             <w:shd w:val="clear" w:color="auto" w:fill="F7F9FB"/>
             <w:vAlign w:val="center"/>
           </w:tcPr>
@@ -5181,7 +5181,7 @@
         </w:tc>
         <w:tc>
           <w:tcPr>
-            <w:tcW w:type="dxa" w:w="1588"/>
+            <w:tcW w:type="dxa" w:w="1585"/>
             <w:shd w:val="clear" w:color="auto" w:fill="F7F9FB"/>
             <w:vAlign w:val="center"/>
           </w:tcPr>
@@ -5205,7 +5205,7 @@
         </w:tc>
         <w:tc>
           <w:tcPr>
-            <w:tcW w:type="dxa" w:w="2210"/>
+            <w:tcW w:type="dxa" w:w="2250"/>
             <w:shd w:val="clear" w:color="auto" w:fill="F7F9FB"/>
             <w:vAlign w:val="center"/>
           </w:tcPr>
@@ -5228,7 +5228,7 @@
         </w:tc>
         <w:tc>
           <w:tcPr>
-            <w:tcW w:type="dxa" w:w="3065"/>
+            <w:tcW w:type="dxa" w:w="3031"/>
             <w:shd w:val="clear" w:color="auto" w:fill="F7F9FB"/>
             <w:vAlign w:val="center"/>
           </w:tcPr>
@@ -5251,7 +5251,7 @@
         </w:tc>
         <w:tc>
           <w:tcPr>
-            <w:tcW w:type="dxa" w:w="1219"/>
+            <w:tcW w:type="dxa" w:w="1215"/>
             <w:shd w:val="clear" w:color="auto" w:fill="F7F9FB"/>
             <w:vAlign w:val="center"/>
           </w:tcPr>
@@ -5289,7 +5289,7 @@
         </w:trPr>
         <w:tc>
           <w:tcPr>
-            <w:tcW w:type="dxa" w:w="415"/>
+            <w:tcW w:type="dxa" w:w="414"/>
             <w:shd w:val="clear" w:color="auto" w:fill="FFFFFF"/>
             <w:vAlign w:val="center"/>
           </w:tcPr>
@@ -5313,7 +5313,7 @@
         </w:tc>
         <w:tc>
           <w:tcPr>
-            <w:tcW w:type="dxa" w:w="1588"/>
+            <w:tcW w:type="dxa" w:w="1585"/>
             <w:shd w:val="clear" w:color="auto" w:fill="FFFFFF"/>
             <w:vAlign w:val="center"/>
           </w:tcPr>
@@ -5337,7 +5337,7 @@
         </w:tc>
         <w:tc>
           <w:tcPr>
-            <w:tcW w:type="dxa" w:w="2210"/>
+            <w:tcW w:type="dxa" w:w="2250"/>
             <w:shd w:val="clear" w:color="auto" w:fill="FFFFFF"/>
             <w:vAlign w:val="center"/>
           </w:tcPr>
@@ -5360,7 +5360,7 @@
         </w:tc>
         <w:tc>
           <w:tcPr>
-            <w:tcW w:type="dxa" w:w="3065"/>
+            <w:tcW w:type="dxa" w:w="3031"/>
             <w:shd w:val="clear" w:color="auto" w:fill="FFFFFF"/>
             <w:vAlign w:val="center"/>
           </w:tcPr>
@@ -5383,7 +5383,7 @@
         </w:tc>
         <w:tc>
           <w:tcPr>
-            <w:tcW w:type="dxa" w:w="1219"/>
+            <w:tcW w:type="dxa" w:w="1215"/>
             <w:shd w:val="clear" w:color="auto" w:fill="FFFFFF"/>
             <w:vAlign w:val="center"/>
           </w:tcPr>
@@ -5421,7 +5421,7 @@
         </w:trPr>
         <w:tc>
           <w:tcPr>
-            <w:tcW w:type="dxa" w:w="415"/>
+            <w:tcW w:type="dxa" w:w="414"/>
             <w:shd w:val="clear" w:color="auto" w:fill="F7F9FB"/>
             <w:vAlign w:val="center"/>
           </w:tcPr>
@@ -5445,7 +5445,7 @@
         </w:tc>
         <w:tc>
           <w:tcPr>
-            <w:tcW w:type="dxa" w:w="1588"/>
+            <w:tcW w:type="dxa" w:w="1585"/>
             <w:shd w:val="clear" w:color="auto" w:fill="F7F9FB"/>
             <w:vAlign w:val="center"/>
           </w:tcPr>
@@ -5469,7 +5469,7 @@
         </w:tc>
         <w:tc>
           <w:tcPr>
-            <w:tcW w:type="dxa" w:w="2210"/>
+            <w:tcW w:type="dxa" w:w="2250"/>
             <w:shd w:val="clear" w:color="auto" w:fill="F7F9FB"/>
             <w:vAlign w:val="center"/>
           </w:tcPr>
@@ -5492,7 +5492,7 @@
         </w:tc>
         <w:tc>
           <w:tcPr>
-            <w:tcW w:type="dxa" w:w="3065"/>
+            <w:tcW w:type="dxa" w:w="3031"/>
             <w:shd w:val="clear" w:color="auto" w:fill="F7F9FB"/>
             <w:vAlign w:val="center"/>
           </w:tcPr>
@@ -5515,7 +5515,7 @@
         </w:tc>
         <w:tc>
           <w:tcPr>
-            <w:tcW w:type="dxa" w:w="1219"/>
+            <w:tcW w:type="dxa" w:w="1215"/>
             <w:shd w:val="clear" w:color="auto" w:fill="F7F9FB"/>
             <w:vAlign w:val="center"/>
           </w:tcPr>
@@ -5553,12 +5553,134 @@
         </w:trPr>
         <w:tc>
           <w:tcPr>
-            <w:tcW w:type="dxa" w:w="415"/>
+            <w:tcW w:type="dxa" w:w="414"/>
             <w:shd w:val="clear" w:color="auto" w:fill="FFFFFF"/>
             <w:vAlign w:val="center"/>
           </w:tcPr>
           <w:p>
             <w:pPr>
+              <w:keepNext/>
+              <w:spacing w:after="0"/>
+              <w:jc w:val="center"/>
+            </w:pPr>
+            <w:r>
+              <w:rPr>
+                <w:rFonts w:ascii="Calibri" w:hAnsi="Calibri"/>
+                <w:b/>
+                <w:i w:val="0"/>
+                <w:color w:val="222222"/>
+                <w:sz w:val="20"/>
+              </w:rPr>
+              <w:t>41</w:t>
+            </w:r>
+          </w:p>
+        </w:tc>
+        <w:tc>
+          <w:tcPr>
+            <w:tcW w:type="dxa" w:w="1585"/>
+            <w:shd w:val="clear" w:color="auto" w:fill="FFFFFF"/>
+            <w:vAlign w:val="center"/>
+          </w:tcPr>
+          <w:p>
+            <w:pPr>
+              <w:keepNext/>
+              <w:spacing w:after="0"/>
+              <w:jc w:val="center"/>
+            </w:pPr>
+            <w:r>
+              <w:rPr>
+                <w:rFonts w:ascii="Calibri" w:hAnsi="Calibri"/>
+                <w:b w:val="0"/>
+                <w:i w:val="0"/>
+                <w:color w:val="222222"/>
+                <w:sz w:val="20"/>
+              </w:rPr>
+              <w:t>2026-10-25</w:t>
+            </w:r>
+          </w:p>
+        </w:tc>
+        <w:tc>
+          <w:tcPr>
+            <w:tcW w:type="dxa" w:w="2250"/>
+            <w:shd w:val="clear" w:color="auto" w:fill="FFFFFF"/>
+            <w:vAlign w:val="center"/>
+          </w:tcPr>
+          <w:p>
+            <w:pPr>
+              <w:keepNext/>
+              <w:spacing w:after="0"/>
+            </w:pPr>
+            <w:r>
+              <w:rPr>
+                <w:rFonts w:ascii="Calibri" w:hAnsi="Calibri"/>
+                <w:b w:val="0"/>
+                <w:i w:val="0"/>
+                <w:color w:val="222222"/>
+                <w:sz w:val="20"/>
+              </w:rPr>
+              <w:t>One command reproduces every fly number again; the paper draft moves to a private repository</w:t>
+            </w:r>
+          </w:p>
+        </w:tc>
+        <w:tc>
+          <w:tcPr>
+            <w:tcW w:type="dxa" w:w="3031"/>
+            <w:shd w:val="clear" w:color="auto" w:fill="FFFFFF"/>
+            <w:vAlign w:val="center"/>
+          </w:tcPr>
+          <w:p>
+            <w:pPr>
+              <w:keepNext/>
+              <w:spacing w:after="0"/>
+            </w:pPr>
+            <w:r>
+              <w:rPr>
+                <w:rFonts w:ascii="Calibri" w:hAnsi="Calibri"/>
+                <w:b w:val="0"/>
+                <w:i w:val="0"/>
+                <w:color w:val="222222"/>
+                <w:sz w:val="20"/>
+              </w:rPr>
+              <w:t>every recorded value reproduced; documents only</w:t>
+            </w:r>
+          </w:p>
+        </w:tc>
+        <w:tc>
+          <w:tcPr>
+            <w:tcW w:type="dxa" w:w="1215"/>
+            <w:shd w:val="clear" w:color="auto" w:fill="FFFFFF"/>
+            <w:vAlign w:val="center"/>
+          </w:tcPr>
+          <w:p>
+            <w:pPr>
+              <w:keepNext/>
+              <w:spacing w:after="0"/>
+            </w:pPr>
+            <w:r>
+              <w:rPr>
+                <w:rFonts w:ascii="Calibri" w:hAnsi="Calibri"/>
+                <w:b w:val="0"/>
+                <w:i w:val="0"/>
+                <w:color w:val="222222"/>
+                <w:sz w:val="20"/>
+              </w:rPr>
+              <w:t>this branch</w:t>
+            </w:r>
+          </w:p>
+        </w:tc>
+      </w:tr>
+      <w:tr>
+        <w:trPr>
+          <w:cantSplit/>
+        </w:trPr>
+        <w:tc>
+          <w:tcPr>
+            <w:tcW w:type="dxa" w:w="414"/>
+            <w:shd w:val="clear" w:color="auto" w:fill="F7F9FB"/>
+            <w:vAlign w:val="center"/>
+          </w:tcPr>
+          <w:p>
+            <w:pPr>
               <w:keepNext w:val="0"/>
               <w:spacing w:after="0"/>
               <w:jc w:val="center"/>
@@ -5571,14 +5693,14 @@
                 <w:color w:val="222222"/>
                 <w:sz w:val="20"/>
               </w:rPr>
-              <w:t>41</w:t>
-            </w:r>
-          </w:p>
-        </w:tc>
-        <w:tc>
-          <w:tcPr>
-            <w:tcW w:type="dxa" w:w="1588"/>
-            <w:shd w:val="clear" w:color="auto" w:fill="FFFFFF"/>
+              <w:t>42</w:t>
+            </w:r>
+          </w:p>
+        </w:tc>
+        <w:tc>
+          <w:tcPr>
+            <w:tcW w:type="dxa" w:w="1585"/>
+            <w:shd w:val="clear" w:color="auto" w:fill="F7F9FB"/>
             <w:vAlign w:val="center"/>
           </w:tcPr>
           <w:p>
@@ -5595,14 +5717,14 @@
                 <w:color w:val="222222"/>
                 <w:sz w:val="20"/>
               </w:rPr>
-              <w:t>2026-10-25</w:t>
-            </w:r>
-          </w:p>
-        </w:tc>
-        <w:tc>
-          <w:tcPr>
-            <w:tcW w:type="dxa" w:w="2210"/>
-            <w:shd w:val="clear" w:color="auto" w:fill="FFFFFF"/>
+              <w:t>2026-10-26</w:t>
+            </w:r>
+          </w:p>
+        </w:tc>
+        <w:tc>
+          <w:tcPr>
+            <w:tcW w:type="dxa" w:w="2250"/>
+            <w:shd w:val="clear" w:color="auto" w:fill="F7F9FB"/>
             <w:vAlign w:val="center"/>
           </w:tcPr>
           <w:p>
@@ -5618,14 +5740,14 @@
                 <w:color w:val="222222"/>
                 <w:sz w:val="20"/>
               </w:rPr>
-              <w:t>One command reproduces every fly number again; the paper draft moves to a private repository</w:t>
-            </w:r>
-          </w:p>
-        </w:tc>
-        <w:tc>
-          <w:tcPr>
-            <w:tcW w:type="dxa" w:w="3065"/>
-            <w:shd w:val="clear" w:color="auto" w:fill="FFFFFF"/>
+              <w:t>Real ToxCast vehicle wells: noise floors, wells needed, and the twin against unseen positive controls</w:t>
+            </w:r>
+          </w:p>
+        </w:tc>
+        <w:tc>
+          <w:tcPr>
+            <w:tcW w:type="dxa" w:w="3031"/>
+            <w:shd w:val="clear" w:color="auto" w:fill="F7F9FB"/>
             <w:vAlign w:val="center"/>
           </w:tcPr>
           <w:p>
@@ -5641,14 +5763,14 @@
                 <w:color w:val="222222"/>
                 <w:sz w:val="20"/>
               </w:rPr>
-              <w:t>every recorded value reproduced; documents only</w:t>
-            </w:r>
-          </w:p>
-        </w:tc>
-        <w:tc>
-          <w:tcPr>
-            <w:tcW w:type="dxa" w:w="1219"/>
-            <w:shd w:val="clear" w:color="auto" w:fill="FFFFFF"/>
+              <w:t>new real-data results, both registered; twin 12 of 12 directions, no better than a firing-rate rule</w:t>
+            </w:r>
+          </w:p>
+        </w:tc>
+        <w:tc>
+          <w:tcPr>
+            <w:tcW w:type="dxa" w:w="1215"/>
+            <w:shd w:val="clear" w:color="auto" w:fill="F7F9FB"/>
             <w:vAlign w:val="center"/>
           </w:tcPr>
           <w:p>
@@ -5658,13 +5780,23 @@
             </w:pPr>
             <w:r>
               <w:rPr>
-                <w:rFonts w:ascii="Calibri" w:hAnsi="Calibri"/>
-                <w:b w:val="0"/>
-                <w:i w:val="0"/>
-                <w:color w:val="222222"/>
-                <w:sz w:val="20"/>
-              </w:rPr>
-              <w:t>this branch</w:t>
+                <w:rFonts w:ascii="Consolas" w:hAnsi="Consolas"/>
+                <w:b w:val="0"/>
+                <w:i w:val="0"/>
+                <w:color w:val="222222"/>
+                <w:sz w:val="18"/>
+              </w:rPr>
+              <w:t>cf90872</w:t>
+            </w:r>
+            <w:r>
+              <w:rPr>
+                <w:rFonts w:ascii="Calibri" w:hAnsi="Calibri"/>
+                <w:b w:val="0"/>
+                <w:i w:val="0"/>
+                <w:color w:val="222222"/>
+                <w:sz w:val="20"/>
+              </w:rPr>
+              <w:t xml:space="preserve"> … this branch</w:t>
             </w:r>
           </w:p>
         </w:tc>
@@ -15592,6 +15724,476 @@
           <w:sz w:val="19"/>
         </w:rPr>
         <w:t>outputs/metrics.json</w:t>
+      </w:r>
+      <w:r>
+        <w:rPr>
+          <w:rFonts w:ascii="Calibri" w:hAnsi="Calibri"/>
+          <w:b w:val="0"/>
+          <w:i w:val="0"/>
+          <w:color w:val="222222"/>
+          <w:sz w:val="21"/>
+        </w:rPr>
+        <w:t>.</w:t>
+      </w:r>
+    </w:p>
+    <w:p>
+      <w:pPr>
+        <w:keepNext/>
+        <w:spacing w:before="240" w:after="60"/>
+      </w:pPr>
+      <w:r>
+        <w:rPr>
+          <w:rFonts w:ascii="Calibri" w:hAnsi="Calibri"/>
+          <w:b/>
+          <w:i w:val="0"/>
+          <w:color w:val="1F4E79"/>
+          <w:sz w:val="23"/>
+        </w:rPr>
+        <w:t>42. How many wells a chip needs, from 714 real untreated wells</w:t>
+      </w:r>
+    </w:p>
+    <w:p>
+      <w:pPr>
+        <w:spacing w:after="120"/>
+      </w:pPr>
+      <w:r>
+        <w:rPr>
+          <w:rFonts w:ascii="Calibri" w:hAnsi="Calibri"/>
+          <w:b/>
+          <w:i w:val="0"/>
+          <w:color w:val="156082"/>
+          <w:sz w:val="21"/>
+        </w:rPr>
+        <w:t>Slide message:</w:t>
+      </w:r>
+      <w:r>
+        <w:rPr>
+          <w:rFonts w:ascii="Calibri" w:hAnsi="Calibri"/>
+          <w:b w:val="0"/>
+          <w:i w:val="0"/>
+          <w:color w:val="222222"/>
+          <w:sz w:val="21"/>
+        </w:rPr>
+        <w:t xml:space="preserve"> </w:t>
+      </w:r>
+      <w:r>
+        <w:rPr>
+          <w:rFonts w:ascii="Calibri" w:hAnsi="Calibri"/>
+          <w:b w:val="0"/>
+          <w:i/>
+          <w:color w:val="222222"/>
+          <w:sz w:val="21"/>
+        </w:rPr>
+        <w:t>In the EPA's own MEA screen, untreated firing rate falls by a third and the day explains two-fifths of the noise: judged against same-day vehicle wells, 4 wells see a halving; judged against a historical reference, no number of wells from one day does.</w:t>
+      </w:r>
+    </w:p>
+    <w:p>
+      <w:pPr>
+        <w:spacing w:after="120"/>
+        <w:ind w:left="432" w:hanging="259"/>
+      </w:pPr>
+      <w:r>
+        <w:rPr>
+          <w:rFonts w:ascii="Calibri" w:hAnsi="Calibri"/>
+          <w:b w:val="0"/>
+          <w:i w:val="0"/>
+          <w:color w:val="222222"/>
+          <w:sz w:val="21"/>
+        </w:rPr>
+        <w:t>•</w:t>
+        <w:tab/>
+      </w:r>
+      <w:r>
+        <w:rPr>
+          <w:rFonts w:ascii="Calibri" w:hAnsi="Calibri"/>
+          <w:b/>
+          <w:i w:val="0"/>
+          <w:color w:val="156082"/>
+          <w:sz w:val="21"/>
+        </w:rPr>
+        <w:t>What changed.</w:t>
+      </w:r>
+      <w:r>
+        <w:rPr>
+          <w:rFonts w:ascii="Calibri" w:hAnsi="Calibri"/>
+          <w:b w:val="0"/>
+          <w:i w:val="0"/>
+          <w:color w:val="222222"/>
+          <w:sz w:val="21"/>
+        </w:rPr>
+        <w:t xml:space="preserve"> The well-level rows of the EPA's acute MEA screen are now read from the invitrodb MySQL dump (CC0; </w:t>
+      </w:r>
+      <w:r>
+        <w:rPr>
+          <w:rFonts w:ascii="Consolas" w:hAnsi="Consolas"/>
+          <w:b w:val="0"/>
+          <w:i w:val="0"/>
+          <w:color w:val="222222"/>
+          <w:sz w:val="19"/>
+        </w:rPr>
+        <w:t>neuromps.fetch.toxcast_mysql</w:t>
+      </w:r>
+      <w:r>
+        <w:rPr>
+          <w:rFonts w:ascii="Calibri" w:hAnsi="Calibri"/>
+          <w:b w:val="0"/>
+          <w:i w:val="0"/>
+          <w:color w:val="222222"/>
+          <w:sz w:val="21"/>
+        </w:rPr>
+        <w:t xml:space="preserve">, </w:t>
+      </w:r>
+      <w:r>
+        <w:rPr>
+          <w:rFonts w:ascii="Consolas" w:hAnsi="Consolas"/>
+          <w:b w:val="0"/>
+          <w:i w:val="0"/>
+          <w:color w:val="222222"/>
+          <w:sz w:val="19"/>
+        </w:rPr>
+        <w:t>neuromps.etl.toxcast_wells</w:t>
+      </w:r>
+      <w:r>
+        <w:rPr>
+          <w:rFonts w:ascii="Calibri" w:hAnsi="Calibri"/>
+          <w:b w:val="0"/>
+          <w:i w:val="0"/>
+          <w:color w:val="222222"/>
+          <w:sz w:val="21"/>
+        </w:rPr>
+        <w:t>), with the seven electrophysiology readouts the public dump lacks recovered and checked (</w:t>
+      </w:r>
+      <w:r>
+        <w:rPr>
+          <w:rFonts w:ascii="Consolas" w:hAnsi="Consolas"/>
+          <w:b w:val="0"/>
+          <w:i w:val="0"/>
+          <w:color w:val="222222"/>
+          <w:sz w:val="19"/>
+        </w:rPr>
+        <w:t>neuromps.etl.toxcast_recover</w:t>
+      </w:r>
+      <w:r>
+        <w:rPr>
+          <w:rFonts w:ascii="Calibri" w:hAnsi="Calibri"/>
+          <w:b w:val="0"/>
+          <w:i w:val="0"/>
+          <w:color w:val="222222"/>
+          <w:sz w:val="21"/>
+        </w:rPr>
+        <w:t>). Two analyses, each registered before any response statistic was computed: per-readout noise floors and wells needed (</w:t>
+      </w:r>
+      <w:r>
+        <w:rPr>
+          <w:rFonts w:ascii="Consolas" w:hAnsi="Consolas"/>
+          <w:b w:val="0"/>
+          <w:i w:val="0"/>
+          <w:color w:val="222222"/>
+          <w:sz w:val="19"/>
+        </w:rPr>
+        <w:t>src/neuromps/models/toxcast_noise_floors.py</w:t>
+      </w:r>
+      <w:r>
+        <w:rPr>
+          <w:rFonts w:ascii="Calibri" w:hAnsi="Calibri"/>
+          <w:b w:val="0"/>
+          <w:i w:val="0"/>
+          <w:color w:val="222222"/>
+          <w:sz w:val="21"/>
+        </w:rPr>
+        <w:t xml:space="preserve">, </w:t>
+      </w:r>
+      <w:r>
+        <w:rPr>
+          <w:rFonts w:ascii="Consolas" w:hAnsi="Consolas"/>
+          <w:b w:val="0"/>
+          <w:i w:val="0"/>
+          <w:color w:val="222222"/>
+          <w:sz w:val="19"/>
+        </w:rPr>
+        <w:t>preregistration/toxcast_noise_floors.json</w:t>
+      </w:r>
+      <w:r>
+        <w:rPr>
+          <w:rFonts w:ascii="Calibri" w:hAnsi="Calibri"/>
+          <w:b w:val="0"/>
+          <w:i w:val="0"/>
+          <w:color w:val="222222"/>
+          <w:sz w:val="21"/>
+        </w:rPr>
+        <w:t>), and the twin's knobs against the screen's positive controls (</w:t>
+      </w:r>
+      <w:r>
+        <w:rPr>
+          <w:rFonts w:ascii="Consolas" w:hAnsi="Consolas"/>
+          <w:b w:val="0"/>
+          <w:i w:val="0"/>
+          <w:color w:val="222222"/>
+          <w:sz w:val="19"/>
+        </w:rPr>
+        <w:t>src/neuromps/models/twin_toxcast_check.py</w:t>
+      </w:r>
+      <w:r>
+        <w:rPr>
+          <w:rFonts w:ascii="Calibri" w:hAnsi="Calibri"/>
+          <w:b w:val="0"/>
+          <w:i w:val="0"/>
+          <w:color w:val="222222"/>
+          <w:sz w:val="21"/>
+        </w:rPr>
+        <w:t xml:space="preserve">, </w:t>
+      </w:r>
+      <w:r>
+        <w:rPr>
+          <w:rFonts w:ascii="Consolas" w:hAnsi="Consolas"/>
+          <w:b w:val="0"/>
+          <w:i w:val="0"/>
+          <w:color w:val="222222"/>
+          <w:sz w:val="19"/>
+        </w:rPr>
+        <w:t>preregistration/twin_toxcast_positive_controls.json</w:t>
+      </w:r>
+      <w:r>
+        <w:rPr>
+          <w:rFonts w:ascii="Calibri" w:hAnsi="Calibri"/>
+          <w:b w:val="0"/>
+          <w:i w:val="0"/>
+          <w:color w:val="222222"/>
+          <w:sz w:val="21"/>
+        </w:rPr>
+        <w:t>; the twin's predictions were committed before the real side was computed).</w:t>
+      </w:r>
+    </w:p>
+    <w:p>
+      <w:pPr>
+        <w:spacing w:after="120"/>
+        <w:ind w:left="432" w:hanging="259"/>
+      </w:pPr>
+      <w:r>
+        <w:rPr>
+          <w:rFonts w:ascii="Calibri" w:hAnsi="Calibri"/>
+          <w:b w:val="0"/>
+          <w:i w:val="0"/>
+          <w:color w:val="222222"/>
+          <w:sz w:val="21"/>
+        </w:rPr>
+        <w:t>•</w:t>
+        <w:tab/>
+      </w:r>
+      <w:r>
+        <w:rPr>
+          <w:rFonts w:ascii="Calibri" w:hAnsi="Calibri"/>
+          <w:b/>
+          <w:i w:val="0"/>
+          <w:color w:val="156082"/>
+          <w:sz w:val="21"/>
+        </w:rPr>
+        <w:t>Why.</w:t>
+      </w:r>
+      <w:r>
+        <w:rPr>
+          <w:rFonts w:ascii="Calibri" w:hAnsi="Calibri"/>
+          <w:b w:val="0"/>
+          <w:i w:val="0"/>
+          <w:color w:val="222222"/>
+          <w:sz w:val="21"/>
+        </w:rPr>
+        <w:t xml:space="preserve"> Round-1 judges scored practical value lowest. A lab using a chip first needs to know how large a change it can see and how to lay out its plates; the screen's vehicle wells answer that directly, and its positive controls are a laboratory the twin has never seen.</w:t>
+      </w:r>
+    </w:p>
+    <w:p>
+      <w:pPr>
+        <w:spacing w:after="120"/>
+        <w:ind w:left="432" w:hanging="259"/>
+      </w:pPr>
+      <w:r>
+        <w:rPr>
+          <w:rFonts w:ascii="Calibri" w:hAnsi="Calibri"/>
+          <w:b w:val="0"/>
+          <w:i w:val="0"/>
+          <w:color w:val="222222"/>
+          <w:sz w:val="21"/>
+        </w:rPr>
+        <w:t>•</w:t>
+        <w:tab/>
+      </w:r>
+      <w:r>
+        <w:rPr>
+          <w:rFonts w:ascii="Calibri" w:hAnsi="Calibri"/>
+          <w:b/>
+          <w:i w:val="0"/>
+          <w:color w:val="156082"/>
+          <w:sz w:val="21"/>
+        </w:rPr>
+        <w:t>Effect.</w:t>
+      </w:r>
+    </w:p>
+    <w:p>
+      <w:pPr>
+        <w:spacing w:after="120"/>
+        <w:ind w:left="432" w:hanging="259"/>
+      </w:pPr>
+      <w:r>
+        <w:rPr>
+          <w:rFonts w:ascii="Calibri" w:hAnsi="Calibri"/>
+          <w:b w:val="0"/>
+          <w:i w:val="0"/>
+          <w:color w:val="222222"/>
+          <w:sz w:val="21"/>
+        </w:rPr>
+        <w:t>•</w:t>
+        <w:tab/>
+      </w:r>
+      <w:r>
+        <w:rPr>
+          <w:rFonts w:ascii="Calibri" w:hAnsi="Calibri"/>
+          <w:b w:val="0"/>
+          <w:i w:val="0"/>
+          <w:color w:val="222222"/>
+          <w:sz w:val="21"/>
+        </w:rPr>
+        <w:t>Over 714 vehicle wells on 97 dates, untreated firing rate falls by a median of −32% and the day carries 0.42 of its variance.</w:t>
+      </w:r>
+    </w:p>
+    <w:p>
+      <w:pPr>
+        <w:spacing w:after="120"/>
+        <w:ind w:left="432" w:hanging="259"/>
+      </w:pPr>
+      <w:r>
+        <w:rPr>
+          <w:rFonts w:ascii="Calibri" w:hAnsi="Calibri"/>
+          <w:b w:val="0"/>
+          <w:i w:val="0"/>
+          <w:color w:val="222222"/>
+          <w:sz w:val="21"/>
+        </w:rPr>
+        <w:t>•</w:t>
+        <w:tab/>
+      </w:r>
+      <w:r>
+        <w:rPr>
+          <w:rFonts w:ascii="Calibri" w:hAnsi="Calibri"/>
+          <w:b w:val="0"/>
+          <w:i w:val="0"/>
+          <w:color w:val="222222"/>
+          <w:sz w:val="21"/>
+        </w:rPr>
+        <w:t>For a fall of a fifth in firing rate: 32 wells across days, or 32 treated and as many vehicle wells on one day; from one day against a historical reference, more than 96 (even a halving is out of reach). For a halving: 3 across days or 4 on one day with same-day vehicles. A table gives every readout; burst shape and synchrony are several times quieter.</w:t>
+      </w:r>
+    </w:p>
+    <w:p>
+      <w:pPr>
+        <w:spacing w:after="120"/>
+        <w:ind w:left="432" w:hanging="259"/>
+      </w:pPr>
+      <w:r>
+        <w:rPr>
+          <w:rFonts w:ascii="Calibri" w:hAnsi="Calibri"/>
+          <w:b w:val="0"/>
+          <w:i w:val="0"/>
+          <w:color w:val="222222"/>
+          <w:sz w:val="21"/>
+        </w:rPr>
+        <w:t>•</w:t>
+        <w:tab/>
+      </w:r>
+      <w:r>
+        <w:rPr>
+          <w:rFonts w:ascii="Calibri" w:hAnsi="Calibri"/>
+          <w:b w:val="0"/>
+          <w:i w:val="0"/>
+          <w:color w:val="222222"/>
+          <w:sz w:val="21"/>
+        </w:rPr>
+        <w:t>The twin agrees with the positive controls on 12 of 12 scored directions (all four registered predictions pass), including firing rate under GABA-A block, which rises in these wells (bicuculline 1.124 log2) though it falls in our asset's other GABA-A antagonist pairs. A post-hoc rule that follows firing rate also scores 11 of 11, so the test shows the twin is not wrong at strong doses, not that it adds information.</w:t>
+      </w:r>
+    </w:p>
+    <w:p>
+      <w:pPr>
+        <w:spacing w:after="120"/>
+        <w:ind w:left="432" w:hanging="259"/>
+      </w:pPr>
+      <w:r>
+        <w:rPr>
+          <w:rFonts w:ascii="Calibri" w:hAnsi="Calibri"/>
+          <w:b w:val="0"/>
+          <w:i w:val="0"/>
+          <w:color w:val="222222"/>
+          <w:sz w:val="21"/>
+        </w:rPr>
+        <w:t>•</w:t>
+        <w:tab/>
+      </w:r>
+      <w:r>
+        <w:rPr>
+          <w:rFonts w:ascii="Calibri" w:hAnsi="Calibri"/>
+          <w:b/>
+          <w:i w:val="0"/>
+          <w:color w:val="156082"/>
+          <w:sz w:val="21"/>
+        </w:rPr>
+        <w:t>Evidence.</w:t>
+      </w:r>
+      <w:r>
+        <w:rPr>
+          <w:rFonts w:ascii="Calibri" w:hAnsi="Calibri"/>
+          <w:b w:val="0"/>
+          <w:i w:val="0"/>
+          <w:color w:val="222222"/>
+          <w:sz w:val="21"/>
+        </w:rPr>
+        <w:t xml:space="preserve"> Report Act IX (§32-§34), the table in §32, §20 item 6, §18 row 9; </w:t>
+      </w:r>
+      <w:r>
+        <w:rPr>
+          <w:rFonts w:ascii="Consolas" w:hAnsi="Consolas"/>
+          <w:b w:val="0"/>
+          <w:i w:val="0"/>
+          <w:color w:val="222222"/>
+          <w:sz w:val="19"/>
+        </w:rPr>
+        <w:t>outputs/figures/toxcast_noise_floors_real.png</w:t>
+      </w:r>
+      <w:r>
+        <w:rPr>
+          <w:rFonts w:ascii="Calibri" w:hAnsi="Calibri"/>
+          <w:b w:val="0"/>
+          <w:i w:val="0"/>
+          <w:color w:val="222222"/>
+          <w:sz w:val="21"/>
+        </w:rPr>
+        <w:t xml:space="preserve">, </w:t>
+      </w:r>
+      <w:r>
+        <w:rPr>
+          <w:rFonts w:ascii="Consolas" w:hAnsi="Consolas"/>
+          <w:b w:val="0"/>
+          <w:i w:val="0"/>
+          <w:color w:val="222222"/>
+          <w:sz w:val="19"/>
+        </w:rPr>
+        <w:t>outputs/figures/twin_toxcast_positive_controls.png</w:t>
+      </w:r>
+      <w:r>
+        <w:rPr>
+          <w:rFonts w:ascii="Calibri" w:hAnsi="Calibri"/>
+          <w:b w:val="0"/>
+          <w:i w:val="0"/>
+          <w:color w:val="222222"/>
+          <w:sz w:val="21"/>
+        </w:rPr>
+        <w:t xml:space="preserve">, </w:t>
+      </w:r>
+      <w:r>
+        <w:rPr>
+          <w:rFonts w:ascii="Consolas" w:hAnsi="Consolas"/>
+          <w:b w:val="0"/>
+          <w:i w:val="0"/>
+          <w:color w:val="222222"/>
+          <w:sz w:val="19"/>
+        </w:rPr>
+        <w:t>outputs/tables/toxcast_wells_needed.md</w:t>
       </w:r>
       <w:r>
         <w:rPr>

</xml_diff>

<commit_message>
Registration audit and hash chain in the public repository
neuromps.report.audit counts the outcome of every registered prediction (run at the end of every
run_all); neuromps.report.timestamps writes preregistration/TIMESTAMPS.json and, new here, its
counts to metrics.json (registration_timestamps; test added first). Both modules come from the
manuscript repository. Here: 40 studies, 208 predictions (91 pass, 78 fail, 38 uninterpretable);
37 result files checked, 0 before their registration, 3 registrations not covered. Report section
21 and change-log entry 43 describe them.

Co-Authored-By: Claude Opus 5.5 <noreply@anthropic.com>
</commit_message>
<xml_diff>
--- a/report/POST_SUBMISSION_CHANGES.docx
+++ b/report/POST_SUBMISSION_CHANGES.docx
@@ -16876,6 +16876,359 @@
           <w:sz w:val="21"/>
         </w:rPr>
         <w:t>Why the blend was dropped: grafting fly wiring onto a model of a mammalian cortical culture has no biological basis, and organoid–monolayer differences have many confounds, so a match would prove nothing. The embodied fly is not dropped but scheduled: it adds new information only with the loop closed (nerve cord to muscles, body, sensory feedback), which is a research project for after the final; reading the motor neurons (entry 10) is its first step.</w:t>
+      </w:r>
+    </w:p>
+    <w:p>
+      <w:pPr>
+        <w:keepNext/>
+        <w:spacing w:before="240" w:after="60"/>
+      </w:pPr>
+      <w:r>
+        <w:rPr>
+          <w:rFonts w:ascii="Calibri" w:hAnsi="Calibri"/>
+          <w:b/>
+          <w:i w:val="0"/>
+          <w:color w:val="1F4E79"/>
+          <w:sz w:val="23"/>
+        </w:rPr>
+        <w:t>43. The registrations audited and hash-chained in this repository</w:t>
+      </w:r>
+    </w:p>
+    <w:p>
+      <w:pPr>
+        <w:spacing w:after="120"/>
+      </w:pPr>
+      <w:r>
+        <w:rPr>
+          <w:rFonts w:ascii="Calibri" w:hAnsi="Calibri"/>
+          <w:b/>
+          <w:i w:val="0"/>
+          <w:color w:val="156082"/>
+          <w:sz w:val="21"/>
+        </w:rPr>
+        <w:t>Slide message:</w:t>
+      </w:r>
+      <w:r>
+        <w:rPr>
+          <w:rFonts w:ascii="Calibri" w:hAnsi="Calibri"/>
+          <w:b w:val="0"/>
+          <w:i w:val="0"/>
+          <w:color w:val="222222"/>
+          <w:sz w:val="21"/>
+        </w:rPr>
+        <w:t xml:space="preserve"> </w:t>
+      </w:r>
+      <w:r>
+        <w:rPr>
+          <w:rFonts w:ascii="Calibri" w:hAnsi="Calibri"/>
+          <w:b w:val="0"/>
+          <w:i/>
+          <w:color w:val="222222"/>
+          <w:sz w:val="21"/>
+        </w:rPr>
+        <w:t>Every registered prediction is counted by a script, and every result file is checked against the commit that registered it, here, in the public repository.</w:t>
+      </w:r>
+    </w:p>
+    <w:p>
+      <w:pPr>
+        <w:spacing w:after="120"/>
+        <w:ind w:left="432" w:hanging="259"/>
+      </w:pPr>
+      <w:r>
+        <w:rPr>
+          <w:rFonts w:ascii="Calibri" w:hAnsi="Calibri"/>
+          <w:b w:val="0"/>
+          <w:i w:val="0"/>
+          <w:color w:val="222222"/>
+          <w:sz w:val="21"/>
+        </w:rPr>
+        <w:t>•</w:t>
+        <w:tab/>
+      </w:r>
+      <w:r>
+        <w:rPr>
+          <w:rFonts w:ascii="Calibri" w:hAnsi="Calibri"/>
+          <w:b/>
+          <w:i w:val="0"/>
+          <w:color w:val="156082"/>
+          <w:sz w:val="21"/>
+        </w:rPr>
+        <w:t>What changed.</w:t>
+      </w:r>
+      <w:r>
+        <w:rPr>
+          <w:rFonts w:ascii="Calibri" w:hAnsi="Calibri"/>
+          <w:b w:val="0"/>
+          <w:i w:val="0"/>
+          <w:color w:val="222222"/>
+          <w:sz w:val="21"/>
+        </w:rPr>
+        <w:t xml:space="preserve"> Two report tools come over from the manuscript repository, where they were first written: </w:t>
+      </w:r>
+      <w:r>
+        <w:rPr>
+          <w:rFonts w:ascii="Consolas" w:hAnsi="Consolas"/>
+          <w:b w:val="0"/>
+          <w:i w:val="0"/>
+          <w:color w:val="222222"/>
+          <w:sz w:val="19"/>
+        </w:rPr>
+        <w:t>neuromps.report.audit</w:t>
+      </w:r>
+      <w:r>
+        <w:rPr>
+          <w:rFonts w:ascii="Calibri" w:hAnsi="Calibri"/>
+          <w:b w:val="0"/>
+          <w:i w:val="0"/>
+          <w:color w:val="222222"/>
+          <w:sz w:val="21"/>
+        </w:rPr>
+        <w:t xml:space="preserve"> counts the outcome of every registered prediction in </w:t>
+      </w:r>
+      <w:r>
+        <w:rPr>
+          <w:rFonts w:ascii="Consolas" w:hAnsi="Consolas"/>
+          <w:b w:val="0"/>
+          <w:i w:val="0"/>
+          <w:color w:val="222222"/>
+          <w:sz w:val="19"/>
+        </w:rPr>
+        <w:t>outputs/metrics.json</w:t>
+      </w:r>
+      <w:r>
+        <w:rPr>
+          <w:rFonts w:ascii="Calibri" w:hAnsi="Calibri"/>
+          <w:b w:val="0"/>
+          <w:i w:val="0"/>
+          <w:color w:val="222222"/>
+          <w:sz w:val="21"/>
+        </w:rPr>
+        <w:t xml:space="preserve"> (now run at the end of every </w:t>
+      </w:r>
+      <w:r>
+        <w:rPr>
+          <w:rFonts w:ascii="Consolas" w:hAnsi="Consolas"/>
+          <w:b w:val="0"/>
+          <w:i w:val="0"/>
+          <w:color w:val="222222"/>
+          <w:sz w:val="19"/>
+        </w:rPr>
+        <w:t>run_all</w:t>
+      </w:r>
+      <w:r>
+        <w:rPr>
+          <w:rFonts w:ascii="Calibri" w:hAnsi="Calibri"/>
+          <w:b w:val="0"/>
+          <w:i w:val="0"/>
+          <w:color w:val="222222"/>
+          <w:sz w:val="21"/>
+        </w:rPr>
+        <w:t xml:space="preserve">), and </w:t>
+      </w:r>
+      <w:r>
+        <w:rPr>
+          <w:rFonts w:ascii="Consolas" w:hAnsi="Consolas"/>
+          <w:b w:val="0"/>
+          <w:i w:val="0"/>
+          <w:color w:val="222222"/>
+          <w:sz w:val="19"/>
+        </w:rPr>
+        <w:t>neuromps.report.timestamps</w:t>
+      </w:r>
+      <w:r>
+        <w:rPr>
+          <w:rFonts w:ascii="Calibri" w:hAnsi="Calibri"/>
+          <w:b w:val="0"/>
+          <w:i w:val="0"/>
+          <w:color w:val="222222"/>
+          <w:sz w:val="21"/>
+        </w:rPr>
+        <w:t xml:space="preserve"> writes </w:t>
+      </w:r>
+      <w:r>
+        <w:rPr>
+          <w:rFonts w:ascii="Consolas" w:hAnsi="Consolas"/>
+          <w:b w:val="0"/>
+          <w:i w:val="0"/>
+          <w:color w:val="222222"/>
+          <w:sz w:val="19"/>
+        </w:rPr>
+        <w:t>preregistration/TIMESTAMPS.json</w:t>
+      </w:r>
+      <w:r>
+        <w:rPr>
+          <w:rFonts w:ascii="Calibri" w:hAnsi="Calibri"/>
+          <w:b w:val="0"/>
+          <w:i w:val="0"/>
+          <w:color w:val="222222"/>
+          <w:sz w:val="21"/>
+        </w:rPr>
+        <w:t xml:space="preserve"> (each registration's checksum and first commit, a hash chain over them, and whether each result file came after its registration) and its counts to </w:t>
+      </w:r>
+      <w:r>
+        <w:rPr>
+          <w:rFonts w:ascii="Consolas" w:hAnsi="Consolas"/>
+          <w:b w:val="0"/>
+          <w:i w:val="0"/>
+          <w:color w:val="222222"/>
+          <w:sz w:val="19"/>
+        </w:rPr>
+        <w:t>metrics.json</w:t>
+      </w:r>
+      <w:r>
+        <w:rPr>
+          <w:rFonts w:ascii="Calibri" w:hAnsi="Calibri"/>
+          <w:b w:val="0"/>
+          <w:i w:val="0"/>
+          <w:color w:val="222222"/>
+          <w:sz w:val="21"/>
+        </w:rPr>
+        <w:t>. Report §21 describes both.</w:t>
+      </w:r>
+    </w:p>
+    <w:p>
+      <w:pPr>
+        <w:spacing w:after="120"/>
+        <w:ind w:left="432" w:hanging="259"/>
+      </w:pPr>
+      <w:r>
+        <w:rPr>
+          <w:rFonts w:ascii="Calibri" w:hAnsi="Calibri"/>
+          <w:b w:val="0"/>
+          <w:i w:val="0"/>
+          <w:color w:val="222222"/>
+          <w:sz w:val="21"/>
+        </w:rPr>
+        <w:t>•</w:t>
+        <w:tab/>
+      </w:r>
+      <w:r>
+        <w:rPr>
+          <w:rFonts w:ascii="Calibri" w:hAnsi="Calibri"/>
+          <w:b/>
+          <w:i w:val="0"/>
+          <w:color w:val="156082"/>
+          <w:sz w:val="21"/>
+        </w:rPr>
+        <w:t>Why.</w:t>
+      </w:r>
+      <w:r>
+        <w:rPr>
+          <w:rFonts w:ascii="Calibri" w:hAnsi="Calibri"/>
+          <w:b w:val="0"/>
+          <w:i w:val="0"/>
+          <w:color w:val="222222"/>
+          <w:sz w:val="21"/>
+        </w:rPr>
+        <w:t xml:space="preserve"> The final-round deck quoted registration counts and a hash chain that existed only in the private manuscript repository, so a reader of this repository could not check them.</w:t>
+      </w:r>
+    </w:p>
+    <w:p>
+      <w:pPr>
+        <w:spacing w:after="120"/>
+        <w:ind w:left="432" w:hanging="259"/>
+      </w:pPr>
+      <w:r>
+        <w:rPr>
+          <w:rFonts w:ascii="Calibri" w:hAnsi="Calibri"/>
+          <w:b w:val="0"/>
+          <w:i w:val="0"/>
+          <w:color w:val="222222"/>
+          <w:sz w:val="21"/>
+        </w:rPr>
+        <w:t>•</w:t>
+        <w:tab/>
+      </w:r>
+      <w:r>
+        <w:rPr>
+          <w:rFonts w:ascii="Calibri" w:hAnsi="Calibri"/>
+          <w:b/>
+          <w:i w:val="0"/>
+          <w:color w:val="156082"/>
+          <w:sz w:val="21"/>
+        </w:rPr>
+        <w:t>Effect.</w:t>
+      </w:r>
+    </w:p>
+    <w:p>
+      <w:pPr>
+        <w:spacing w:after="120"/>
+        <w:ind w:left="432" w:hanging="259"/>
+      </w:pPr>
+      <w:r>
+        <w:rPr>
+          <w:rFonts w:ascii="Calibri" w:hAnsi="Calibri"/>
+          <w:b w:val="0"/>
+          <w:i w:val="0"/>
+          <w:color w:val="222222"/>
+          <w:sz w:val="21"/>
+        </w:rPr>
+        <w:t>•</w:t>
+        <w:tab/>
+      </w:r>
+      <w:r>
+        <w:rPr>
+          <w:rFonts w:ascii="Calibri" w:hAnsi="Calibri"/>
+          <w:b w:val="0"/>
+          <w:i w:val="0"/>
+          <w:color w:val="222222"/>
+          <w:sz w:val="21"/>
+        </w:rPr>
+        <w:t>40 registered studies here made 208 predictions: 91 passed, 78 failed, 38 were uninterpretable.</w:t>
+      </w:r>
+    </w:p>
+    <w:p>
+      <w:pPr>
+        <w:spacing w:after="120"/>
+        <w:ind w:left="432" w:hanging="259"/>
+      </w:pPr>
+      <w:r>
+        <w:rPr>
+          <w:rFonts w:ascii="Calibri" w:hAnsi="Calibri"/>
+          <w:b w:val="0"/>
+          <w:i w:val="0"/>
+          <w:color w:val="222222"/>
+          <w:sz w:val="21"/>
+        </w:rPr>
+        <w:t>•</w:t>
+        <w:tab/>
+      </w:r>
+      <w:r>
+        <w:rPr>
+          <w:rFonts w:ascii="Calibri" w:hAnsi="Calibri"/>
+          <w:b w:val="0"/>
+          <w:i w:val="0"/>
+          <w:color w:val="222222"/>
+          <w:sz w:val="21"/>
+        </w:rPr>
+        <w:t>37 result files name their registration, and 0 of them came before it; 3 registrations are not covered because their results do not name them.</w:t>
+      </w:r>
+    </w:p>
+    <w:p>
+      <w:pPr>
+        <w:spacing w:after="120"/>
+        <w:ind w:left="432" w:hanging="259"/>
+      </w:pPr>
+      <w:r>
+        <w:rPr>
+          <w:rFonts w:ascii="Calibri" w:hAnsi="Calibri"/>
+          <w:b w:val="0"/>
+          <w:i w:val="0"/>
+          <w:color w:val="222222"/>
+          <w:sz w:val="21"/>
+        </w:rPr>
+        <w:t>•</w:t>
+        <w:tab/>
+      </w:r>
+      <w:r>
+        <w:rPr>
+          <w:rFonts w:ascii="Calibri" w:hAnsi="Calibri"/>
+          <w:b w:val="0"/>
+          <w:i w:val="0"/>
+          <w:color w:val="222222"/>
+          <w:sz w:val="21"/>
+        </w:rPr>
+        <w:t>No earlier result changes.</w:t>
       </w:r>
     </w:p>
     <w:sectPr>

</xml_diff>

<commit_message>
rebuild the technical report and change-log docx and pdf
Co-Authored-By: Claude Opus 5.5 <noreply@anthropic.com>
</commit_message>
<xml_diff>
--- a/report/POST_SUBMISSION_CHANGES.docx
+++ b/report/POST_SUBMISSION_CHANGES.docx
@@ -48,11 +48,11 @@
         <w:tblLook w:firstColumn="1" w:firstRow="1" w:lastColumn="0" w:lastRow="0" w:noHBand="0" w:noVBand="1" w:val="04A0"/>
       </w:tblPr>
       <w:tblGrid>
-        <w:gridCol w:w="414"/>
-        <w:gridCol w:w="1585"/>
-        <w:gridCol w:w="2250"/>
-        <w:gridCol w:w="3031"/>
-        <w:gridCol w:w="1215"/>
+        <w:gridCol w:w="409"/>
+        <w:gridCol w:w="1552"/>
+        <w:gridCol w:w="2793"/>
+        <w:gridCol w:w="2584"/>
+        <w:gridCol w:w="1158"/>
       </w:tblGrid>
       <w:tr>
         <w:trPr>
@@ -61,7 +61,7 @@
         </w:trPr>
         <w:tc>
           <w:tcPr>
-            <w:tcW w:type="dxa" w:w="414"/>
+            <w:tcW w:type="dxa" w:w="409"/>
             <w:shd w:val="clear" w:color="auto" w:fill="1F4E79"/>
             <w:vAlign w:val="center"/>
           </w:tcPr>
@@ -85,7 +85,7 @@
         </w:tc>
         <w:tc>
           <w:tcPr>
-            <w:tcW w:type="dxa" w:w="1585"/>
+            <w:tcW w:type="dxa" w:w="1552"/>
             <w:shd w:val="clear" w:color="auto" w:fill="1F4E79"/>
             <w:vAlign w:val="center"/>
           </w:tcPr>
@@ -109,7 +109,7 @@
         </w:tc>
         <w:tc>
           <w:tcPr>
-            <w:tcW w:type="dxa" w:w="2250"/>
+            <w:tcW w:type="dxa" w:w="2793"/>
             <w:shd w:val="clear" w:color="auto" w:fill="1F4E79"/>
             <w:vAlign w:val="center"/>
           </w:tcPr>
@@ -132,7 +132,7 @@
         </w:tc>
         <w:tc>
           <w:tcPr>
-            <w:tcW w:type="dxa" w:w="3031"/>
+            <w:tcW w:type="dxa" w:w="2584"/>
             <w:shd w:val="clear" w:color="auto" w:fill="1F4E79"/>
             <w:vAlign w:val="center"/>
           </w:tcPr>
@@ -155,7 +155,7 @@
         </w:tc>
         <w:tc>
           <w:tcPr>
-            <w:tcW w:type="dxa" w:w="1215"/>
+            <w:tcW w:type="dxa" w:w="1158"/>
             <w:shd w:val="clear" w:color="auto" w:fill="1F4E79"/>
             <w:vAlign w:val="center"/>
           </w:tcPr>
@@ -183,7 +183,7 @@
         </w:trPr>
         <w:tc>
           <w:tcPr>
-            <w:tcW w:type="dxa" w:w="414"/>
+            <w:tcW w:type="dxa" w:w="409"/>
             <w:shd w:val="clear" w:color="auto" w:fill="FFFFFF"/>
             <w:vAlign w:val="center"/>
           </w:tcPr>
@@ -207,7 +207,7 @@
         </w:tc>
         <w:tc>
           <w:tcPr>
-            <w:tcW w:type="dxa" w:w="1585"/>
+            <w:tcW w:type="dxa" w:w="1552"/>
             <w:shd w:val="clear" w:color="auto" w:fill="FFFFFF"/>
             <w:vAlign w:val="center"/>
           </w:tcPr>
@@ -231,7 +231,7 @@
         </w:tc>
         <w:tc>
           <w:tcPr>
-            <w:tcW w:type="dxa" w:w="2250"/>
+            <w:tcW w:type="dxa" w:w="2793"/>
             <w:shd w:val="clear" w:color="auto" w:fill="FFFFFF"/>
             <w:vAlign w:val="center"/>
           </w:tcPr>
@@ -254,7 +254,7 @@
         </w:tc>
         <w:tc>
           <w:tcPr>
-            <w:tcW w:type="dxa" w:w="3031"/>
+            <w:tcW w:type="dxa" w:w="2584"/>
             <w:shd w:val="clear" w:color="auto" w:fill="FFFFFF"/>
             <w:vAlign w:val="center"/>
           </w:tcPr>
@@ -277,7 +277,7 @@
         </w:tc>
         <w:tc>
           <w:tcPr>
-            <w:tcW w:type="dxa" w:w="1215"/>
+            <w:tcW w:type="dxa" w:w="1158"/>
             <w:shd w:val="clear" w:color="auto" w:fill="FFFFFF"/>
             <w:vAlign w:val="center"/>
           </w:tcPr>
@@ -325,7 +325,7 @@
         </w:trPr>
         <w:tc>
           <w:tcPr>
-            <w:tcW w:type="dxa" w:w="414"/>
+            <w:tcW w:type="dxa" w:w="409"/>
             <w:shd w:val="clear" w:color="auto" w:fill="F7F9FB"/>
             <w:vAlign w:val="center"/>
           </w:tcPr>
@@ -349,7 +349,7 @@
         </w:tc>
         <w:tc>
           <w:tcPr>
-            <w:tcW w:type="dxa" w:w="1585"/>
+            <w:tcW w:type="dxa" w:w="1552"/>
             <w:shd w:val="clear" w:color="auto" w:fill="F7F9FB"/>
             <w:vAlign w:val="center"/>
           </w:tcPr>
@@ -373,7 +373,7 @@
         </w:tc>
         <w:tc>
           <w:tcPr>
-            <w:tcW w:type="dxa" w:w="2250"/>
+            <w:tcW w:type="dxa" w:w="2793"/>
             <w:shd w:val="clear" w:color="auto" w:fill="F7F9FB"/>
             <w:vAlign w:val="center"/>
           </w:tcPr>
@@ -396,7 +396,7 @@
         </w:tc>
         <w:tc>
           <w:tcPr>
-            <w:tcW w:type="dxa" w:w="3031"/>
+            <w:tcW w:type="dxa" w:w="2584"/>
             <w:shd w:val="clear" w:color="auto" w:fill="F7F9FB"/>
             <w:vAlign w:val="center"/>
           </w:tcPr>
@@ -419,7 +419,7 @@
         </w:tc>
         <w:tc>
           <w:tcPr>
-            <w:tcW w:type="dxa" w:w="1215"/>
+            <w:tcW w:type="dxa" w:w="1158"/>
             <w:shd w:val="clear" w:color="auto" w:fill="F7F9FB"/>
             <w:vAlign w:val="center"/>
           </w:tcPr>
@@ -447,7 +447,7 @@
         </w:trPr>
         <w:tc>
           <w:tcPr>
-            <w:tcW w:type="dxa" w:w="414"/>
+            <w:tcW w:type="dxa" w:w="409"/>
             <w:shd w:val="clear" w:color="auto" w:fill="FFFFFF"/>
             <w:vAlign w:val="center"/>
           </w:tcPr>
@@ -471,7 +471,7 @@
         </w:tc>
         <w:tc>
           <w:tcPr>
-            <w:tcW w:type="dxa" w:w="1585"/>
+            <w:tcW w:type="dxa" w:w="1552"/>
             <w:shd w:val="clear" w:color="auto" w:fill="FFFFFF"/>
             <w:vAlign w:val="center"/>
           </w:tcPr>
@@ -495,7 +495,7 @@
         </w:tc>
         <w:tc>
           <w:tcPr>
-            <w:tcW w:type="dxa" w:w="2250"/>
+            <w:tcW w:type="dxa" w:w="2793"/>
             <w:shd w:val="clear" w:color="auto" w:fill="FFFFFF"/>
             <w:vAlign w:val="center"/>
           </w:tcPr>
@@ -518,7 +518,7 @@
         </w:tc>
         <w:tc>
           <w:tcPr>
-            <w:tcW w:type="dxa" w:w="3031"/>
+            <w:tcW w:type="dxa" w:w="2584"/>
             <w:shd w:val="clear" w:color="auto" w:fill="FFFFFF"/>
             <w:vAlign w:val="center"/>
           </w:tcPr>
@@ -541,7 +541,7 @@
         </w:tc>
         <w:tc>
           <w:tcPr>
-            <w:tcW w:type="dxa" w:w="1215"/>
+            <w:tcW w:type="dxa" w:w="1158"/>
             <w:shd w:val="clear" w:color="auto" w:fill="FFFFFF"/>
             <w:vAlign w:val="center"/>
           </w:tcPr>
@@ -569,7 +569,7 @@
         </w:trPr>
         <w:tc>
           <w:tcPr>
-            <w:tcW w:type="dxa" w:w="414"/>
+            <w:tcW w:type="dxa" w:w="409"/>
             <w:shd w:val="clear" w:color="auto" w:fill="F7F9FB"/>
             <w:vAlign w:val="center"/>
           </w:tcPr>
@@ -593,7 +593,7 @@
         </w:tc>
         <w:tc>
           <w:tcPr>
-            <w:tcW w:type="dxa" w:w="1585"/>
+            <w:tcW w:type="dxa" w:w="1552"/>
             <w:shd w:val="clear" w:color="auto" w:fill="F7F9FB"/>
             <w:vAlign w:val="center"/>
           </w:tcPr>
@@ -617,7 +617,7 @@
         </w:tc>
         <w:tc>
           <w:tcPr>
-            <w:tcW w:type="dxa" w:w="2250"/>
+            <w:tcW w:type="dxa" w:w="2793"/>
             <w:shd w:val="clear" w:color="auto" w:fill="F7F9FB"/>
             <w:vAlign w:val="center"/>
           </w:tcPr>
@@ -640,7 +640,7 @@
         </w:tc>
         <w:tc>
           <w:tcPr>
-            <w:tcW w:type="dxa" w:w="3031"/>
+            <w:tcW w:type="dxa" w:w="2584"/>
             <w:shd w:val="clear" w:color="auto" w:fill="F7F9FB"/>
             <w:vAlign w:val="center"/>
           </w:tcPr>
@@ -663,7 +663,7 @@
         </w:tc>
         <w:tc>
           <w:tcPr>
-            <w:tcW w:type="dxa" w:w="1215"/>
+            <w:tcW w:type="dxa" w:w="1158"/>
             <w:shd w:val="clear" w:color="auto" w:fill="F7F9FB"/>
             <w:vAlign w:val="center"/>
           </w:tcPr>
@@ -711,7 +711,7 @@
         </w:trPr>
         <w:tc>
           <w:tcPr>
-            <w:tcW w:type="dxa" w:w="414"/>
+            <w:tcW w:type="dxa" w:w="409"/>
             <w:shd w:val="clear" w:color="auto" w:fill="FFFFFF"/>
             <w:vAlign w:val="center"/>
           </w:tcPr>
@@ -735,7 +735,7 @@
         </w:tc>
         <w:tc>
           <w:tcPr>
-            <w:tcW w:type="dxa" w:w="1585"/>
+            <w:tcW w:type="dxa" w:w="1552"/>
             <w:shd w:val="clear" w:color="auto" w:fill="FFFFFF"/>
             <w:vAlign w:val="center"/>
           </w:tcPr>
@@ -759,7 +759,7 @@
         </w:tc>
         <w:tc>
           <w:tcPr>
-            <w:tcW w:type="dxa" w:w="2250"/>
+            <w:tcW w:type="dxa" w:w="2793"/>
             <w:shd w:val="clear" w:color="auto" w:fill="FFFFFF"/>
             <w:vAlign w:val="center"/>
           </w:tcPr>
@@ -782,7 +782,7 @@
         </w:tc>
         <w:tc>
           <w:tcPr>
-            <w:tcW w:type="dxa" w:w="3031"/>
+            <w:tcW w:type="dxa" w:w="2584"/>
             <w:shd w:val="clear" w:color="auto" w:fill="FFFFFF"/>
             <w:vAlign w:val="center"/>
           </w:tcPr>
@@ -805,7 +805,7 @@
         </w:tc>
         <w:tc>
           <w:tcPr>
-            <w:tcW w:type="dxa" w:w="1215"/>
+            <w:tcW w:type="dxa" w:w="1158"/>
             <w:shd w:val="clear" w:color="auto" w:fill="FFFFFF"/>
             <w:vAlign w:val="center"/>
           </w:tcPr>
@@ -833,7 +833,7 @@
         </w:trPr>
         <w:tc>
           <w:tcPr>
-            <w:tcW w:type="dxa" w:w="414"/>
+            <w:tcW w:type="dxa" w:w="409"/>
             <w:shd w:val="clear" w:color="auto" w:fill="F7F9FB"/>
             <w:vAlign w:val="center"/>
           </w:tcPr>
@@ -857,7 +857,7 @@
         </w:tc>
         <w:tc>
           <w:tcPr>
-            <w:tcW w:type="dxa" w:w="1585"/>
+            <w:tcW w:type="dxa" w:w="1552"/>
             <w:shd w:val="clear" w:color="auto" w:fill="F7F9FB"/>
             <w:vAlign w:val="center"/>
           </w:tcPr>
@@ -881,7 +881,7 @@
         </w:tc>
         <w:tc>
           <w:tcPr>
-            <w:tcW w:type="dxa" w:w="2250"/>
+            <w:tcW w:type="dxa" w:w="2793"/>
             <w:shd w:val="clear" w:color="auto" w:fill="F7F9FB"/>
             <w:vAlign w:val="center"/>
           </w:tcPr>
@@ -904,7 +904,7 @@
         </w:tc>
         <w:tc>
           <w:tcPr>
-            <w:tcW w:type="dxa" w:w="3031"/>
+            <w:tcW w:type="dxa" w:w="2584"/>
             <w:shd w:val="clear" w:color="auto" w:fill="F7F9FB"/>
             <w:vAlign w:val="center"/>
           </w:tcPr>
@@ -927,7 +927,7 @@
         </w:tc>
         <w:tc>
           <w:tcPr>
-            <w:tcW w:type="dxa" w:w="1215"/>
+            <w:tcW w:type="dxa" w:w="1158"/>
             <w:shd w:val="clear" w:color="auto" w:fill="F7F9FB"/>
             <w:vAlign w:val="center"/>
           </w:tcPr>
@@ -955,7 +955,7 @@
         </w:trPr>
         <w:tc>
           <w:tcPr>
-            <w:tcW w:type="dxa" w:w="414"/>
+            <w:tcW w:type="dxa" w:w="409"/>
             <w:shd w:val="clear" w:color="auto" w:fill="FFFFFF"/>
             <w:vAlign w:val="center"/>
           </w:tcPr>
@@ -979,7 +979,7 @@
         </w:tc>
         <w:tc>
           <w:tcPr>
-            <w:tcW w:type="dxa" w:w="1585"/>
+            <w:tcW w:type="dxa" w:w="1552"/>
             <w:shd w:val="clear" w:color="auto" w:fill="FFFFFF"/>
             <w:vAlign w:val="center"/>
           </w:tcPr>
@@ -1003,7 +1003,7 @@
         </w:tc>
         <w:tc>
           <w:tcPr>
-            <w:tcW w:type="dxa" w:w="2250"/>
+            <w:tcW w:type="dxa" w:w="2793"/>
             <w:shd w:val="clear" w:color="auto" w:fill="FFFFFF"/>
             <w:vAlign w:val="center"/>
           </w:tcPr>
@@ -1026,7 +1026,7 @@
         </w:tc>
         <w:tc>
           <w:tcPr>
-            <w:tcW w:type="dxa" w:w="3031"/>
+            <w:tcW w:type="dxa" w:w="2584"/>
             <w:shd w:val="clear" w:color="auto" w:fill="FFFFFF"/>
             <w:vAlign w:val="center"/>
           </w:tcPr>
@@ -1049,7 +1049,7 @@
         </w:tc>
         <w:tc>
           <w:tcPr>
-            <w:tcW w:type="dxa" w:w="1215"/>
+            <w:tcW w:type="dxa" w:w="1158"/>
             <w:shd w:val="clear" w:color="auto" w:fill="FFFFFF"/>
             <w:vAlign w:val="center"/>
           </w:tcPr>
@@ -1097,7 +1097,7 @@
         </w:trPr>
         <w:tc>
           <w:tcPr>
-            <w:tcW w:type="dxa" w:w="414"/>
+            <w:tcW w:type="dxa" w:w="409"/>
             <w:shd w:val="clear" w:color="auto" w:fill="F7F9FB"/>
             <w:vAlign w:val="center"/>
           </w:tcPr>
@@ -1121,7 +1121,7 @@
         </w:tc>
         <w:tc>
           <w:tcPr>
-            <w:tcW w:type="dxa" w:w="1585"/>
+            <w:tcW w:type="dxa" w:w="1552"/>
             <w:shd w:val="clear" w:color="auto" w:fill="F7F9FB"/>
             <w:vAlign w:val="center"/>
           </w:tcPr>
@@ -1145,7 +1145,7 @@
         </w:tc>
         <w:tc>
           <w:tcPr>
-            <w:tcW w:type="dxa" w:w="2250"/>
+            <w:tcW w:type="dxa" w:w="2793"/>
             <w:shd w:val="clear" w:color="auto" w:fill="F7F9FB"/>
             <w:vAlign w:val="center"/>
           </w:tcPr>
@@ -1168,7 +1168,7 @@
         </w:tc>
         <w:tc>
           <w:tcPr>
-            <w:tcW w:type="dxa" w:w="3031"/>
+            <w:tcW w:type="dxa" w:w="2584"/>
             <w:shd w:val="clear" w:color="auto" w:fill="F7F9FB"/>
             <w:vAlign w:val="center"/>
           </w:tcPr>
@@ -1191,7 +1191,7 @@
         </w:tc>
         <w:tc>
           <w:tcPr>
-            <w:tcW w:type="dxa" w:w="1215"/>
+            <w:tcW w:type="dxa" w:w="1158"/>
             <w:shd w:val="clear" w:color="auto" w:fill="F7F9FB"/>
             <w:vAlign w:val="center"/>
           </w:tcPr>
@@ -1239,7 +1239,7 @@
         </w:trPr>
         <w:tc>
           <w:tcPr>
-            <w:tcW w:type="dxa" w:w="414"/>
+            <w:tcW w:type="dxa" w:w="409"/>
             <w:shd w:val="clear" w:color="auto" w:fill="FFFFFF"/>
             <w:vAlign w:val="center"/>
           </w:tcPr>
@@ -1263,7 +1263,7 @@
         </w:tc>
         <w:tc>
           <w:tcPr>
-            <w:tcW w:type="dxa" w:w="1585"/>
+            <w:tcW w:type="dxa" w:w="1552"/>
             <w:shd w:val="clear" w:color="auto" w:fill="FFFFFF"/>
             <w:vAlign w:val="center"/>
           </w:tcPr>
@@ -1287,7 +1287,7 @@
         </w:tc>
         <w:tc>
           <w:tcPr>
-            <w:tcW w:type="dxa" w:w="2250"/>
+            <w:tcW w:type="dxa" w:w="2793"/>
             <w:shd w:val="clear" w:color="auto" w:fill="FFFFFF"/>
             <w:vAlign w:val="center"/>
           </w:tcPr>
@@ -1310,7 +1310,7 @@
         </w:tc>
         <w:tc>
           <w:tcPr>
-            <w:tcW w:type="dxa" w:w="3031"/>
+            <w:tcW w:type="dxa" w:w="2584"/>
             <w:shd w:val="clear" w:color="auto" w:fill="FFFFFF"/>
             <w:vAlign w:val="center"/>
           </w:tcPr>
@@ -1333,7 +1333,7 @@
         </w:tc>
         <w:tc>
           <w:tcPr>
-            <w:tcW w:type="dxa" w:w="1215"/>
+            <w:tcW w:type="dxa" w:w="1158"/>
             <w:shd w:val="clear" w:color="auto" w:fill="FFFFFF"/>
             <w:vAlign w:val="center"/>
           </w:tcPr>
@@ -1381,7 +1381,7 @@
         </w:trPr>
         <w:tc>
           <w:tcPr>
-            <w:tcW w:type="dxa" w:w="414"/>
+            <w:tcW w:type="dxa" w:w="409"/>
             <w:shd w:val="clear" w:color="auto" w:fill="F7F9FB"/>
             <w:vAlign w:val="center"/>
           </w:tcPr>
@@ -1405,7 +1405,7 @@
         </w:tc>
         <w:tc>
           <w:tcPr>
-            <w:tcW w:type="dxa" w:w="1585"/>
+            <w:tcW w:type="dxa" w:w="1552"/>
             <w:shd w:val="clear" w:color="auto" w:fill="F7F9FB"/>
             <w:vAlign w:val="center"/>
           </w:tcPr>
@@ -1429,7 +1429,7 @@
         </w:tc>
         <w:tc>
           <w:tcPr>
-            <w:tcW w:type="dxa" w:w="2250"/>
+            <w:tcW w:type="dxa" w:w="2793"/>
             <w:shd w:val="clear" w:color="auto" w:fill="F7F9FB"/>
             <w:vAlign w:val="center"/>
           </w:tcPr>
@@ -1452,7 +1452,7 @@
         </w:tc>
         <w:tc>
           <w:tcPr>
-            <w:tcW w:type="dxa" w:w="3031"/>
+            <w:tcW w:type="dxa" w:w="2584"/>
             <w:shd w:val="clear" w:color="auto" w:fill="F7F9FB"/>
             <w:vAlign w:val="center"/>
           </w:tcPr>
@@ -1475,7 +1475,7 @@
         </w:tc>
         <w:tc>
           <w:tcPr>
-            <w:tcW w:type="dxa" w:w="1215"/>
+            <w:tcW w:type="dxa" w:w="1158"/>
             <w:shd w:val="clear" w:color="auto" w:fill="F7F9FB"/>
             <w:vAlign w:val="center"/>
           </w:tcPr>
@@ -1523,7 +1523,7 @@
         </w:trPr>
         <w:tc>
           <w:tcPr>
-            <w:tcW w:type="dxa" w:w="414"/>
+            <w:tcW w:type="dxa" w:w="409"/>
             <w:shd w:val="clear" w:color="auto" w:fill="FFFFFF"/>
             <w:vAlign w:val="center"/>
           </w:tcPr>
@@ -1547,7 +1547,7 @@
         </w:tc>
         <w:tc>
           <w:tcPr>
-            <w:tcW w:type="dxa" w:w="1585"/>
+            <w:tcW w:type="dxa" w:w="1552"/>
             <w:shd w:val="clear" w:color="auto" w:fill="FFFFFF"/>
             <w:vAlign w:val="center"/>
           </w:tcPr>
@@ -1571,7 +1571,7 @@
         </w:tc>
         <w:tc>
           <w:tcPr>
-            <w:tcW w:type="dxa" w:w="2250"/>
+            <w:tcW w:type="dxa" w:w="2793"/>
             <w:shd w:val="clear" w:color="auto" w:fill="FFFFFF"/>
             <w:vAlign w:val="center"/>
           </w:tcPr>
@@ -1594,7 +1594,7 @@
         </w:tc>
         <w:tc>
           <w:tcPr>
-            <w:tcW w:type="dxa" w:w="3031"/>
+            <w:tcW w:type="dxa" w:w="2584"/>
             <w:shd w:val="clear" w:color="auto" w:fill="FFFFFF"/>
             <w:vAlign w:val="center"/>
           </w:tcPr>
@@ -1617,7 +1617,7 @@
         </w:tc>
         <w:tc>
           <w:tcPr>
-            <w:tcW w:type="dxa" w:w="1215"/>
+            <w:tcW w:type="dxa" w:w="1158"/>
             <w:shd w:val="clear" w:color="auto" w:fill="FFFFFF"/>
             <w:vAlign w:val="center"/>
           </w:tcPr>
@@ -1665,7 +1665,7 @@
         </w:trPr>
         <w:tc>
           <w:tcPr>
-            <w:tcW w:type="dxa" w:w="414"/>
+            <w:tcW w:type="dxa" w:w="409"/>
             <w:shd w:val="clear" w:color="auto" w:fill="F7F9FB"/>
             <w:vAlign w:val="center"/>
           </w:tcPr>
@@ -1689,7 +1689,7 @@
         </w:tc>
         <w:tc>
           <w:tcPr>
-            <w:tcW w:type="dxa" w:w="1585"/>
+            <w:tcW w:type="dxa" w:w="1552"/>
             <w:shd w:val="clear" w:color="auto" w:fill="F7F9FB"/>
             <w:vAlign w:val="center"/>
           </w:tcPr>
@@ -1713,7 +1713,7 @@
         </w:tc>
         <w:tc>
           <w:tcPr>
-            <w:tcW w:type="dxa" w:w="2250"/>
+            <w:tcW w:type="dxa" w:w="2793"/>
             <w:shd w:val="clear" w:color="auto" w:fill="F7F9FB"/>
             <w:vAlign w:val="center"/>
           </w:tcPr>
@@ -1736,7 +1736,7 @@
         </w:tc>
         <w:tc>
           <w:tcPr>
-            <w:tcW w:type="dxa" w:w="3031"/>
+            <w:tcW w:type="dxa" w:w="2584"/>
             <w:shd w:val="clear" w:color="auto" w:fill="F7F9FB"/>
             <w:vAlign w:val="center"/>
           </w:tcPr>
@@ -1759,7 +1759,7 @@
         </w:tc>
         <w:tc>
           <w:tcPr>
-            <w:tcW w:type="dxa" w:w="1215"/>
+            <w:tcW w:type="dxa" w:w="1158"/>
             <w:shd w:val="clear" w:color="auto" w:fill="F7F9FB"/>
             <w:vAlign w:val="center"/>
           </w:tcPr>
@@ -1787,7 +1787,7 @@
         </w:trPr>
         <w:tc>
           <w:tcPr>
-            <w:tcW w:type="dxa" w:w="414"/>
+            <w:tcW w:type="dxa" w:w="409"/>
             <w:shd w:val="clear" w:color="auto" w:fill="FFFFFF"/>
             <w:vAlign w:val="center"/>
           </w:tcPr>
@@ -1811,7 +1811,7 @@
         </w:tc>
         <w:tc>
           <w:tcPr>
-            <w:tcW w:type="dxa" w:w="1585"/>
+            <w:tcW w:type="dxa" w:w="1552"/>
             <w:shd w:val="clear" w:color="auto" w:fill="FFFFFF"/>
             <w:vAlign w:val="center"/>
           </w:tcPr>
@@ -1835,7 +1835,7 @@
         </w:tc>
         <w:tc>
           <w:tcPr>
-            <w:tcW w:type="dxa" w:w="2250"/>
+            <w:tcW w:type="dxa" w:w="2793"/>
             <w:shd w:val="clear" w:color="auto" w:fill="FFFFFF"/>
             <w:vAlign w:val="center"/>
           </w:tcPr>
@@ -1858,7 +1858,7 @@
         </w:tc>
         <w:tc>
           <w:tcPr>
-            <w:tcW w:type="dxa" w:w="3031"/>
+            <w:tcW w:type="dxa" w:w="2584"/>
             <w:shd w:val="clear" w:color="auto" w:fill="FFFFFF"/>
             <w:vAlign w:val="center"/>
           </w:tcPr>
@@ -1881,7 +1881,7 @@
         </w:tc>
         <w:tc>
           <w:tcPr>
-            <w:tcW w:type="dxa" w:w="1215"/>
+            <w:tcW w:type="dxa" w:w="1158"/>
             <w:shd w:val="clear" w:color="auto" w:fill="FFFFFF"/>
             <w:vAlign w:val="center"/>
           </w:tcPr>
@@ -1919,7 +1919,7 @@
         </w:trPr>
         <w:tc>
           <w:tcPr>
-            <w:tcW w:type="dxa" w:w="414"/>
+            <w:tcW w:type="dxa" w:w="409"/>
             <w:shd w:val="clear" w:color="auto" w:fill="F7F9FB"/>
             <w:vAlign w:val="center"/>
           </w:tcPr>
@@ -1943,7 +1943,7 @@
         </w:tc>
         <w:tc>
           <w:tcPr>
-            <w:tcW w:type="dxa" w:w="1585"/>
+            <w:tcW w:type="dxa" w:w="1552"/>
             <w:shd w:val="clear" w:color="auto" w:fill="F7F9FB"/>
             <w:vAlign w:val="center"/>
           </w:tcPr>
@@ -1967,7 +1967,7 @@
         </w:tc>
         <w:tc>
           <w:tcPr>
-            <w:tcW w:type="dxa" w:w="2250"/>
+            <w:tcW w:type="dxa" w:w="2793"/>
             <w:shd w:val="clear" w:color="auto" w:fill="F7F9FB"/>
             <w:vAlign w:val="center"/>
           </w:tcPr>
@@ -1990,7 +1990,7 @@
         </w:tc>
         <w:tc>
           <w:tcPr>
-            <w:tcW w:type="dxa" w:w="3031"/>
+            <w:tcW w:type="dxa" w:w="2584"/>
             <w:shd w:val="clear" w:color="auto" w:fill="F7F9FB"/>
             <w:vAlign w:val="center"/>
           </w:tcPr>
@@ -2013,7 +2013,7 @@
         </w:tc>
         <w:tc>
           <w:tcPr>
-            <w:tcW w:type="dxa" w:w="1215"/>
+            <w:tcW w:type="dxa" w:w="1158"/>
             <w:shd w:val="clear" w:color="auto" w:fill="F7F9FB"/>
             <w:vAlign w:val="center"/>
           </w:tcPr>
@@ -2061,7 +2061,7 @@
         </w:trPr>
         <w:tc>
           <w:tcPr>
-            <w:tcW w:type="dxa" w:w="414"/>
+            <w:tcW w:type="dxa" w:w="409"/>
             <w:shd w:val="clear" w:color="auto" w:fill="FFFFFF"/>
             <w:vAlign w:val="center"/>
           </w:tcPr>
@@ -2085,7 +2085,7 @@
         </w:tc>
         <w:tc>
           <w:tcPr>
-            <w:tcW w:type="dxa" w:w="1585"/>
+            <w:tcW w:type="dxa" w:w="1552"/>
             <w:shd w:val="clear" w:color="auto" w:fill="FFFFFF"/>
             <w:vAlign w:val="center"/>
           </w:tcPr>
@@ -2109,7 +2109,7 @@
         </w:tc>
         <w:tc>
           <w:tcPr>
-            <w:tcW w:type="dxa" w:w="2250"/>
+            <w:tcW w:type="dxa" w:w="2793"/>
             <w:shd w:val="clear" w:color="auto" w:fill="FFFFFF"/>
             <w:vAlign w:val="center"/>
           </w:tcPr>
@@ -2132,7 +2132,7 @@
         </w:tc>
         <w:tc>
           <w:tcPr>
-            <w:tcW w:type="dxa" w:w="3031"/>
+            <w:tcW w:type="dxa" w:w="2584"/>
             <w:shd w:val="clear" w:color="auto" w:fill="FFFFFF"/>
             <w:vAlign w:val="center"/>
           </w:tcPr>
@@ -2155,7 +2155,7 @@
         </w:tc>
         <w:tc>
           <w:tcPr>
-            <w:tcW w:type="dxa" w:w="1215"/>
+            <w:tcW w:type="dxa" w:w="1158"/>
             <w:shd w:val="clear" w:color="auto" w:fill="FFFFFF"/>
             <w:vAlign w:val="center"/>
           </w:tcPr>
@@ -2203,7 +2203,7 @@
         </w:trPr>
         <w:tc>
           <w:tcPr>
-            <w:tcW w:type="dxa" w:w="414"/>
+            <w:tcW w:type="dxa" w:w="409"/>
             <w:shd w:val="clear" w:color="auto" w:fill="F7F9FB"/>
             <w:vAlign w:val="center"/>
           </w:tcPr>
@@ -2227,7 +2227,7 @@
         </w:tc>
         <w:tc>
           <w:tcPr>
-            <w:tcW w:type="dxa" w:w="1585"/>
+            <w:tcW w:type="dxa" w:w="1552"/>
             <w:shd w:val="clear" w:color="auto" w:fill="F7F9FB"/>
             <w:vAlign w:val="center"/>
           </w:tcPr>
@@ -2251,7 +2251,7 @@
         </w:tc>
         <w:tc>
           <w:tcPr>
-            <w:tcW w:type="dxa" w:w="2250"/>
+            <w:tcW w:type="dxa" w:w="2793"/>
             <w:shd w:val="clear" w:color="auto" w:fill="F7F9FB"/>
             <w:vAlign w:val="center"/>
           </w:tcPr>
@@ -2274,7 +2274,7 @@
         </w:tc>
         <w:tc>
           <w:tcPr>
-            <w:tcW w:type="dxa" w:w="3031"/>
+            <w:tcW w:type="dxa" w:w="2584"/>
             <w:shd w:val="clear" w:color="auto" w:fill="F7F9FB"/>
             <w:vAlign w:val="center"/>
           </w:tcPr>
@@ -2297,7 +2297,7 @@
         </w:tc>
         <w:tc>
           <w:tcPr>
-            <w:tcW w:type="dxa" w:w="1215"/>
+            <w:tcW w:type="dxa" w:w="1158"/>
             <w:shd w:val="clear" w:color="auto" w:fill="F7F9FB"/>
             <w:vAlign w:val="center"/>
           </w:tcPr>
@@ -2335,7 +2335,7 @@
         </w:trPr>
         <w:tc>
           <w:tcPr>
-            <w:tcW w:type="dxa" w:w="414"/>
+            <w:tcW w:type="dxa" w:w="409"/>
             <w:shd w:val="clear" w:color="auto" w:fill="FFFFFF"/>
             <w:vAlign w:val="center"/>
           </w:tcPr>
@@ -2359,7 +2359,7 @@
         </w:tc>
         <w:tc>
           <w:tcPr>
-            <w:tcW w:type="dxa" w:w="1585"/>
+            <w:tcW w:type="dxa" w:w="1552"/>
             <w:shd w:val="clear" w:color="auto" w:fill="FFFFFF"/>
             <w:vAlign w:val="center"/>
           </w:tcPr>
@@ -2383,7 +2383,7 @@
         </w:tc>
         <w:tc>
           <w:tcPr>
-            <w:tcW w:type="dxa" w:w="2250"/>
+            <w:tcW w:type="dxa" w:w="2793"/>
             <w:shd w:val="clear" w:color="auto" w:fill="FFFFFF"/>
             <w:vAlign w:val="center"/>
           </w:tcPr>
@@ -2406,7 +2406,7 @@
         </w:tc>
         <w:tc>
           <w:tcPr>
-            <w:tcW w:type="dxa" w:w="3031"/>
+            <w:tcW w:type="dxa" w:w="2584"/>
             <w:shd w:val="clear" w:color="auto" w:fill="FFFFFF"/>
             <w:vAlign w:val="center"/>
           </w:tcPr>
@@ -2429,7 +2429,7 @@
         </w:tc>
         <w:tc>
           <w:tcPr>
-            <w:tcW w:type="dxa" w:w="1215"/>
+            <w:tcW w:type="dxa" w:w="1158"/>
             <w:shd w:val="clear" w:color="auto" w:fill="FFFFFF"/>
             <w:vAlign w:val="center"/>
           </w:tcPr>
@@ -2477,7 +2477,7 @@
         </w:trPr>
         <w:tc>
           <w:tcPr>
-            <w:tcW w:type="dxa" w:w="414"/>
+            <w:tcW w:type="dxa" w:w="409"/>
             <w:shd w:val="clear" w:color="auto" w:fill="F7F9FB"/>
             <w:vAlign w:val="center"/>
           </w:tcPr>
@@ -2501,7 +2501,7 @@
         </w:tc>
         <w:tc>
           <w:tcPr>
-            <w:tcW w:type="dxa" w:w="1585"/>
+            <w:tcW w:type="dxa" w:w="1552"/>
             <w:shd w:val="clear" w:color="auto" w:fill="F7F9FB"/>
             <w:vAlign w:val="center"/>
           </w:tcPr>
@@ -2525,7 +2525,7 @@
         </w:tc>
         <w:tc>
           <w:tcPr>
-            <w:tcW w:type="dxa" w:w="2250"/>
+            <w:tcW w:type="dxa" w:w="2793"/>
             <w:shd w:val="clear" w:color="auto" w:fill="F7F9FB"/>
             <w:vAlign w:val="center"/>
           </w:tcPr>
@@ -2548,7 +2548,7 @@
         </w:tc>
         <w:tc>
           <w:tcPr>
-            <w:tcW w:type="dxa" w:w="3031"/>
+            <w:tcW w:type="dxa" w:w="2584"/>
             <w:shd w:val="clear" w:color="auto" w:fill="F7F9FB"/>
             <w:vAlign w:val="center"/>
           </w:tcPr>
@@ -2571,7 +2571,7 @@
         </w:tc>
         <w:tc>
           <w:tcPr>
-            <w:tcW w:type="dxa" w:w="1215"/>
+            <w:tcW w:type="dxa" w:w="1158"/>
             <w:shd w:val="clear" w:color="auto" w:fill="F7F9FB"/>
             <w:vAlign w:val="center"/>
           </w:tcPr>
@@ -2619,7 +2619,7 @@
         </w:trPr>
         <w:tc>
           <w:tcPr>
-            <w:tcW w:type="dxa" w:w="414"/>
+            <w:tcW w:type="dxa" w:w="409"/>
             <w:shd w:val="clear" w:color="auto" w:fill="FFFFFF"/>
             <w:vAlign w:val="center"/>
           </w:tcPr>
@@ -2643,7 +2643,7 @@
         </w:tc>
         <w:tc>
           <w:tcPr>
-            <w:tcW w:type="dxa" w:w="1585"/>
+            <w:tcW w:type="dxa" w:w="1552"/>
             <w:shd w:val="clear" w:color="auto" w:fill="FFFFFF"/>
             <w:vAlign w:val="center"/>
           </w:tcPr>
@@ -2667,7 +2667,7 @@
         </w:tc>
         <w:tc>
           <w:tcPr>
-            <w:tcW w:type="dxa" w:w="2250"/>
+            <w:tcW w:type="dxa" w:w="2793"/>
             <w:shd w:val="clear" w:color="auto" w:fill="FFFFFF"/>
             <w:vAlign w:val="center"/>
           </w:tcPr>
@@ -2690,7 +2690,7 @@
         </w:tc>
         <w:tc>
           <w:tcPr>
-            <w:tcW w:type="dxa" w:w="3031"/>
+            <w:tcW w:type="dxa" w:w="2584"/>
             <w:shd w:val="clear" w:color="auto" w:fill="FFFFFF"/>
             <w:vAlign w:val="center"/>
           </w:tcPr>
@@ -2713,7 +2713,7 @@
         </w:tc>
         <w:tc>
           <w:tcPr>
-            <w:tcW w:type="dxa" w:w="1215"/>
+            <w:tcW w:type="dxa" w:w="1158"/>
             <w:shd w:val="clear" w:color="auto" w:fill="FFFFFF"/>
             <w:vAlign w:val="center"/>
           </w:tcPr>
@@ -2761,7 +2761,7 @@
         </w:trPr>
         <w:tc>
           <w:tcPr>
-            <w:tcW w:type="dxa" w:w="414"/>
+            <w:tcW w:type="dxa" w:w="409"/>
             <w:shd w:val="clear" w:color="auto" w:fill="F7F9FB"/>
             <w:vAlign w:val="center"/>
           </w:tcPr>
@@ -2785,7 +2785,7 @@
         </w:tc>
         <w:tc>
           <w:tcPr>
-            <w:tcW w:type="dxa" w:w="1585"/>
+            <w:tcW w:type="dxa" w:w="1552"/>
             <w:shd w:val="clear" w:color="auto" w:fill="F7F9FB"/>
             <w:vAlign w:val="center"/>
           </w:tcPr>
@@ -2809,7 +2809,7 @@
         </w:tc>
         <w:tc>
           <w:tcPr>
-            <w:tcW w:type="dxa" w:w="2250"/>
+            <w:tcW w:type="dxa" w:w="2793"/>
             <w:shd w:val="clear" w:color="auto" w:fill="F7F9FB"/>
             <w:vAlign w:val="center"/>
           </w:tcPr>
@@ -2832,7 +2832,7 @@
         </w:tc>
         <w:tc>
           <w:tcPr>
-            <w:tcW w:type="dxa" w:w="3031"/>
+            <w:tcW w:type="dxa" w:w="2584"/>
             <w:shd w:val="clear" w:color="auto" w:fill="F7F9FB"/>
             <w:vAlign w:val="center"/>
           </w:tcPr>
@@ -2855,7 +2855,7 @@
         </w:tc>
         <w:tc>
           <w:tcPr>
-            <w:tcW w:type="dxa" w:w="1215"/>
+            <w:tcW w:type="dxa" w:w="1158"/>
             <w:shd w:val="clear" w:color="auto" w:fill="F7F9FB"/>
             <w:vAlign w:val="center"/>
           </w:tcPr>
@@ -2903,7 +2903,7 @@
         </w:trPr>
         <w:tc>
           <w:tcPr>
-            <w:tcW w:type="dxa" w:w="414"/>
+            <w:tcW w:type="dxa" w:w="409"/>
             <w:shd w:val="clear" w:color="auto" w:fill="FFFFFF"/>
             <w:vAlign w:val="center"/>
           </w:tcPr>
@@ -2927,7 +2927,7 @@
         </w:tc>
         <w:tc>
           <w:tcPr>
-            <w:tcW w:type="dxa" w:w="1585"/>
+            <w:tcW w:type="dxa" w:w="1552"/>
             <w:shd w:val="clear" w:color="auto" w:fill="FFFFFF"/>
             <w:vAlign w:val="center"/>
           </w:tcPr>
@@ -2951,7 +2951,7 @@
         </w:tc>
         <w:tc>
           <w:tcPr>
-            <w:tcW w:type="dxa" w:w="2250"/>
+            <w:tcW w:type="dxa" w:w="2793"/>
             <w:shd w:val="clear" w:color="auto" w:fill="FFFFFF"/>
             <w:vAlign w:val="center"/>
           </w:tcPr>
@@ -2974,7 +2974,7 @@
         </w:tc>
         <w:tc>
           <w:tcPr>
-            <w:tcW w:type="dxa" w:w="3031"/>
+            <w:tcW w:type="dxa" w:w="2584"/>
             <w:shd w:val="clear" w:color="auto" w:fill="FFFFFF"/>
             <w:vAlign w:val="center"/>
           </w:tcPr>
@@ -2997,7 +2997,7 @@
         </w:tc>
         <w:tc>
           <w:tcPr>
-            <w:tcW w:type="dxa" w:w="1215"/>
+            <w:tcW w:type="dxa" w:w="1158"/>
             <w:shd w:val="clear" w:color="auto" w:fill="FFFFFF"/>
             <w:vAlign w:val="center"/>
           </w:tcPr>
@@ -3045,7 +3045,7 @@
         </w:trPr>
         <w:tc>
           <w:tcPr>
-            <w:tcW w:type="dxa" w:w="414"/>
+            <w:tcW w:type="dxa" w:w="409"/>
             <w:shd w:val="clear" w:color="auto" w:fill="F7F9FB"/>
             <w:vAlign w:val="center"/>
           </w:tcPr>
@@ -3069,7 +3069,7 @@
         </w:tc>
         <w:tc>
           <w:tcPr>
-            <w:tcW w:type="dxa" w:w="1585"/>
+            <w:tcW w:type="dxa" w:w="1552"/>
             <w:shd w:val="clear" w:color="auto" w:fill="F7F9FB"/>
             <w:vAlign w:val="center"/>
           </w:tcPr>
@@ -3093,7 +3093,7 @@
         </w:tc>
         <w:tc>
           <w:tcPr>
-            <w:tcW w:type="dxa" w:w="2250"/>
+            <w:tcW w:type="dxa" w:w="2793"/>
             <w:shd w:val="clear" w:color="auto" w:fill="F7F9FB"/>
             <w:vAlign w:val="center"/>
           </w:tcPr>
@@ -3116,7 +3116,7 @@
         </w:tc>
         <w:tc>
           <w:tcPr>
-            <w:tcW w:type="dxa" w:w="3031"/>
+            <w:tcW w:type="dxa" w:w="2584"/>
             <w:shd w:val="clear" w:color="auto" w:fill="F7F9FB"/>
             <w:vAlign w:val="center"/>
           </w:tcPr>
@@ -3139,7 +3139,7 @@
         </w:tc>
         <w:tc>
           <w:tcPr>
-            <w:tcW w:type="dxa" w:w="1215"/>
+            <w:tcW w:type="dxa" w:w="1158"/>
             <w:shd w:val="clear" w:color="auto" w:fill="F7F9FB"/>
             <w:vAlign w:val="center"/>
           </w:tcPr>
@@ -3177,7 +3177,7 @@
         </w:trPr>
         <w:tc>
           <w:tcPr>
-            <w:tcW w:type="dxa" w:w="414"/>
+            <w:tcW w:type="dxa" w:w="409"/>
             <w:shd w:val="clear" w:color="auto" w:fill="FFFFFF"/>
             <w:vAlign w:val="center"/>
           </w:tcPr>
@@ -3201,7 +3201,7 @@
         </w:tc>
         <w:tc>
           <w:tcPr>
-            <w:tcW w:type="dxa" w:w="1585"/>
+            <w:tcW w:type="dxa" w:w="1552"/>
             <w:shd w:val="clear" w:color="auto" w:fill="FFFFFF"/>
             <w:vAlign w:val="center"/>
           </w:tcPr>
@@ -3225,7 +3225,7 @@
         </w:tc>
         <w:tc>
           <w:tcPr>
-            <w:tcW w:type="dxa" w:w="2250"/>
+            <w:tcW w:type="dxa" w:w="2793"/>
             <w:shd w:val="clear" w:color="auto" w:fill="FFFFFF"/>
             <w:vAlign w:val="center"/>
           </w:tcPr>
@@ -3248,7 +3248,7 @@
         </w:tc>
         <w:tc>
           <w:tcPr>
-            <w:tcW w:type="dxa" w:w="3031"/>
+            <w:tcW w:type="dxa" w:w="2584"/>
             <w:shd w:val="clear" w:color="auto" w:fill="FFFFFF"/>
             <w:vAlign w:val="center"/>
           </w:tcPr>
@@ -3271,7 +3271,7 @@
         </w:tc>
         <w:tc>
           <w:tcPr>
-            <w:tcW w:type="dxa" w:w="1215"/>
+            <w:tcW w:type="dxa" w:w="1158"/>
             <w:shd w:val="clear" w:color="auto" w:fill="FFFFFF"/>
             <w:vAlign w:val="center"/>
           </w:tcPr>
@@ -3309,7 +3309,7 @@
         </w:trPr>
         <w:tc>
           <w:tcPr>
-            <w:tcW w:type="dxa" w:w="414"/>
+            <w:tcW w:type="dxa" w:w="409"/>
             <w:shd w:val="clear" w:color="auto" w:fill="F7F9FB"/>
             <w:vAlign w:val="center"/>
           </w:tcPr>
@@ -3333,7 +3333,7 @@
         </w:tc>
         <w:tc>
           <w:tcPr>
-            <w:tcW w:type="dxa" w:w="1585"/>
+            <w:tcW w:type="dxa" w:w="1552"/>
             <w:shd w:val="clear" w:color="auto" w:fill="F7F9FB"/>
             <w:vAlign w:val="center"/>
           </w:tcPr>
@@ -3357,7 +3357,7 @@
         </w:tc>
         <w:tc>
           <w:tcPr>
-            <w:tcW w:type="dxa" w:w="2250"/>
+            <w:tcW w:type="dxa" w:w="2793"/>
             <w:shd w:val="clear" w:color="auto" w:fill="F7F9FB"/>
             <w:vAlign w:val="center"/>
           </w:tcPr>
@@ -3380,7 +3380,7 @@
         </w:tc>
         <w:tc>
           <w:tcPr>
-            <w:tcW w:type="dxa" w:w="3031"/>
+            <w:tcW w:type="dxa" w:w="2584"/>
             <w:shd w:val="clear" w:color="auto" w:fill="F7F9FB"/>
             <w:vAlign w:val="center"/>
           </w:tcPr>
@@ -3403,7 +3403,7 @@
         </w:tc>
         <w:tc>
           <w:tcPr>
-            <w:tcW w:type="dxa" w:w="1215"/>
+            <w:tcW w:type="dxa" w:w="1158"/>
             <w:shd w:val="clear" w:color="auto" w:fill="F7F9FB"/>
             <w:vAlign w:val="center"/>
           </w:tcPr>
@@ -3441,7 +3441,7 @@
         </w:trPr>
         <w:tc>
           <w:tcPr>
-            <w:tcW w:type="dxa" w:w="414"/>
+            <w:tcW w:type="dxa" w:w="409"/>
             <w:shd w:val="clear" w:color="auto" w:fill="FFFFFF"/>
             <w:vAlign w:val="center"/>
           </w:tcPr>
@@ -3465,7 +3465,7 @@
         </w:tc>
         <w:tc>
           <w:tcPr>
-            <w:tcW w:type="dxa" w:w="1585"/>
+            <w:tcW w:type="dxa" w:w="1552"/>
             <w:shd w:val="clear" w:color="auto" w:fill="FFFFFF"/>
             <w:vAlign w:val="center"/>
           </w:tcPr>
@@ -3489,7 +3489,7 @@
         </w:tc>
         <w:tc>
           <w:tcPr>
-            <w:tcW w:type="dxa" w:w="2250"/>
+            <w:tcW w:type="dxa" w:w="2793"/>
             <w:shd w:val="clear" w:color="auto" w:fill="FFFFFF"/>
             <w:vAlign w:val="center"/>
           </w:tcPr>
@@ -3512,7 +3512,7 @@
         </w:tc>
         <w:tc>
           <w:tcPr>
-            <w:tcW w:type="dxa" w:w="3031"/>
+            <w:tcW w:type="dxa" w:w="2584"/>
             <w:shd w:val="clear" w:color="auto" w:fill="FFFFFF"/>
             <w:vAlign w:val="center"/>
           </w:tcPr>
@@ -3535,7 +3535,7 @@
         </w:tc>
         <w:tc>
           <w:tcPr>
-            <w:tcW w:type="dxa" w:w="1215"/>
+            <w:tcW w:type="dxa" w:w="1158"/>
             <w:shd w:val="clear" w:color="auto" w:fill="FFFFFF"/>
             <w:vAlign w:val="center"/>
           </w:tcPr>
@@ -3573,7 +3573,7 @@
         </w:trPr>
         <w:tc>
           <w:tcPr>
-            <w:tcW w:type="dxa" w:w="414"/>
+            <w:tcW w:type="dxa" w:w="409"/>
             <w:shd w:val="clear" w:color="auto" w:fill="F7F9FB"/>
             <w:vAlign w:val="center"/>
           </w:tcPr>
@@ -3597,7 +3597,7 @@
         </w:tc>
         <w:tc>
           <w:tcPr>
-            <w:tcW w:type="dxa" w:w="1585"/>
+            <w:tcW w:type="dxa" w:w="1552"/>
             <w:shd w:val="clear" w:color="auto" w:fill="F7F9FB"/>
             <w:vAlign w:val="center"/>
           </w:tcPr>
@@ -3621,7 +3621,7 @@
         </w:tc>
         <w:tc>
           <w:tcPr>
-            <w:tcW w:type="dxa" w:w="2250"/>
+            <w:tcW w:type="dxa" w:w="2793"/>
             <w:shd w:val="clear" w:color="auto" w:fill="F7F9FB"/>
             <w:vAlign w:val="center"/>
           </w:tcPr>
@@ -3644,7 +3644,7 @@
         </w:tc>
         <w:tc>
           <w:tcPr>
-            <w:tcW w:type="dxa" w:w="3031"/>
+            <w:tcW w:type="dxa" w:w="2584"/>
             <w:shd w:val="clear" w:color="auto" w:fill="F7F9FB"/>
             <w:vAlign w:val="center"/>
           </w:tcPr>
@@ -3667,7 +3667,7 @@
         </w:tc>
         <w:tc>
           <w:tcPr>
-            <w:tcW w:type="dxa" w:w="1215"/>
+            <w:tcW w:type="dxa" w:w="1158"/>
             <w:shd w:val="clear" w:color="auto" w:fill="F7F9FB"/>
             <w:vAlign w:val="center"/>
           </w:tcPr>
@@ -3705,7 +3705,7 @@
         </w:trPr>
         <w:tc>
           <w:tcPr>
-            <w:tcW w:type="dxa" w:w="414"/>
+            <w:tcW w:type="dxa" w:w="409"/>
             <w:shd w:val="clear" w:color="auto" w:fill="FFFFFF"/>
             <w:vAlign w:val="center"/>
           </w:tcPr>
@@ -3729,7 +3729,7 @@
         </w:tc>
         <w:tc>
           <w:tcPr>
-            <w:tcW w:type="dxa" w:w="1585"/>
+            <w:tcW w:type="dxa" w:w="1552"/>
             <w:shd w:val="clear" w:color="auto" w:fill="FFFFFF"/>
             <w:vAlign w:val="center"/>
           </w:tcPr>
@@ -3753,7 +3753,7 @@
         </w:tc>
         <w:tc>
           <w:tcPr>
-            <w:tcW w:type="dxa" w:w="2250"/>
+            <w:tcW w:type="dxa" w:w="2793"/>
             <w:shd w:val="clear" w:color="auto" w:fill="FFFFFF"/>
             <w:vAlign w:val="center"/>
           </w:tcPr>
@@ -3776,7 +3776,7 @@
         </w:tc>
         <w:tc>
           <w:tcPr>
-            <w:tcW w:type="dxa" w:w="3031"/>
+            <w:tcW w:type="dxa" w:w="2584"/>
             <w:shd w:val="clear" w:color="auto" w:fill="FFFFFF"/>
             <w:vAlign w:val="center"/>
           </w:tcPr>
@@ -3799,7 +3799,7 @@
         </w:tc>
         <w:tc>
           <w:tcPr>
-            <w:tcW w:type="dxa" w:w="1215"/>
+            <w:tcW w:type="dxa" w:w="1158"/>
             <w:shd w:val="clear" w:color="auto" w:fill="FFFFFF"/>
             <w:vAlign w:val="center"/>
           </w:tcPr>
@@ -3837,7 +3837,7 @@
         </w:trPr>
         <w:tc>
           <w:tcPr>
-            <w:tcW w:type="dxa" w:w="414"/>
+            <w:tcW w:type="dxa" w:w="409"/>
             <w:shd w:val="clear" w:color="auto" w:fill="F7F9FB"/>
             <w:vAlign w:val="center"/>
           </w:tcPr>
@@ -3861,7 +3861,7 @@
         </w:tc>
         <w:tc>
           <w:tcPr>
-            <w:tcW w:type="dxa" w:w="1585"/>
+            <w:tcW w:type="dxa" w:w="1552"/>
             <w:shd w:val="clear" w:color="auto" w:fill="F7F9FB"/>
             <w:vAlign w:val="center"/>
           </w:tcPr>
@@ -3885,7 +3885,7 @@
         </w:tc>
         <w:tc>
           <w:tcPr>
-            <w:tcW w:type="dxa" w:w="2250"/>
+            <w:tcW w:type="dxa" w:w="2793"/>
             <w:shd w:val="clear" w:color="auto" w:fill="F7F9FB"/>
             <w:vAlign w:val="center"/>
           </w:tcPr>
@@ -3908,7 +3908,7 @@
         </w:tc>
         <w:tc>
           <w:tcPr>
-            <w:tcW w:type="dxa" w:w="3031"/>
+            <w:tcW w:type="dxa" w:w="2584"/>
             <w:shd w:val="clear" w:color="auto" w:fill="F7F9FB"/>
             <w:vAlign w:val="center"/>
           </w:tcPr>
@@ -3931,7 +3931,7 @@
         </w:tc>
         <w:tc>
           <w:tcPr>
-            <w:tcW w:type="dxa" w:w="1215"/>
+            <w:tcW w:type="dxa" w:w="1158"/>
             <w:shd w:val="clear" w:color="auto" w:fill="F7F9FB"/>
             <w:vAlign w:val="center"/>
           </w:tcPr>
@@ -3969,7 +3969,7 @@
         </w:trPr>
         <w:tc>
           <w:tcPr>
-            <w:tcW w:type="dxa" w:w="414"/>
+            <w:tcW w:type="dxa" w:w="409"/>
             <w:shd w:val="clear" w:color="auto" w:fill="FFFFFF"/>
             <w:vAlign w:val="center"/>
           </w:tcPr>
@@ -3993,7 +3993,7 @@
         </w:tc>
         <w:tc>
           <w:tcPr>
-            <w:tcW w:type="dxa" w:w="1585"/>
+            <w:tcW w:type="dxa" w:w="1552"/>
             <w:shd w:val="clear" w:color="auto" w:fill="FFFFFF"/>
             <w:vAlign w:val="center"/>
           </w:tcPr>
@@ -4017,7 +4017,7 @@
         </w:tc>
         <w:tc>
           <w:tcPr>
-            <w:tcW w:type="dxa" w:w="2250"/>
+            <w:tcW w:type="dxa" w:w="2793"/>
             <w:shd w:val="clear" w:color="auto" w:fill="FFFFFF"/>
             <w:vAlign w:val="center"/>
           </w:tcPr>
@@ -4040,7 +4040,7 @@
         </w:tc>
         <w:tc>
           <w:tcPr>
-            <w:tcW w:type="dxa" w:w="3031"/>
+            <w:tcW w:type="dxa" w:w="2584"/>
             <w:shd w:val="clear" w:color="auto" w:fill="FFFFFF"/>
             <w:vAlign w:val="center"/>
           </w:tcPr>
@@ -4063,7 +4063,7 @@
         </w:tc>
         <w:tc>
           <w:tcPr>
-            <w:tcW w:type="dxa" w:w="1215"/>
+            <w:tcW w:type="dxa" w:w="1158"/>
             <w:shd w:val="clear" w:color="auto" w:fill="FFFFFF"/>
             <w:vAlign w:val="center"/>
           </w:tcPr>
@@ -4101,7 +4101,7 @@
         </w:trPr>
         <w:tc>
           <w:tcPr>
-            <w:tcW w:type="dxa" w:w="414"/>
+            <w:tcW w:type="dxa" w:w="409"/>
             <w:shd w:val="clear" w:color="auto" w:fill="F7F9FB"/>
             <w:vAlign w:val="center"/>
           </w:tcPr>
@@ -4125,7 +4125,7 @@
         </w:tc>
         <w:tc>
           <w:tcPr>
-            <w:tcW w:type="dxa" w:w="1585"/>
+            <w:tcW w:type="dxa" w:w="1552"/>
             <w:shd w:val="clear" w:color="auto" w:fill="F7F9FB"/>
             <w:vAlign w:val="center"/>
           </w:tcPr>
@@ -4149,7 +4149,7 @@
         </w:tc>
         <w:tc>
           <w:tcPr>
-            <w:tcW w:type="dxa" w:w="2250"/>
+            <w:tcW w:type="dxa" w:w="2793"/>
             <w:shd w:val="clear" w:color="auto" w:fill="F7F9FB"/>
             <w:vAlign w:val="center"/>
           </w:tcPr>
@@ -4172,7 +4172,7 @@
         </w:tc>
         <w:tc>
           <w:tcPr>
-            <w:tcW w:type="dxa" w:w="3031"/>
+            <w:tcW w:type="dxa" w:w="2584"/>
             <w:shd w:val="clear" w:color="auto" w:fill="F7F9FB"/>
             <w:vAlign w:val="center"/>
           </w:tcPr>
@@ -4195,7 +4195,7 @@
         </w:tc>
         <w:tc>
           <w:tcPr>
-            <w:tcW w:type="dxa" w:w="1215"/>
+            <w:tcW w:type="dxa" w:w="1158"/>
             <w:shd w:val="clear" w:color="auto" w:fill="F7F9FB"/>
             <w:vAlign w:val="center"/>
           </w:tcPr>
@@ -4233,7 +4233,7 @@
         </w:trPr>
         <w:tc>
           <w:tcPr>
-            <w:tcW w:type="dxa" w:w="414"/>
+            <w:tcW w:type="dxa" w:w="409"/>
             <w:shd w:val="clear" w:color="auto" w:fill="FFFFFF"/>
             <w:vAlign w:val="center"/>
           </w:tcPr>
@@ -4257,7 +4257,7 @@
         </w:tc>
         <w:tc>
           <w:tcPr>
-            <w:tcW w:type="dxa" w:w="1585"/>
+            <w:tcW w:type="dxa" w:w="1552"/>
             <w:shd w:val="clear" w:color="auto" w:fill="FFFFFF"/>
             <w:vAlign w:val="center"/>
           </w:tcPr>
@@ -4281,7 +4281,7 @@
         </w:tc>
         <w:tc>
           <w:tcPr>
-            <w:tcW w:type="dxa" w:w="2250"/>
+            <w:tcW w:type="dxa" w:w="2793"/>
             <w:shd w:val="clear" w:color="auto" w:fill="FFFFFF"/>
             <w:vAlign w:val="center"/>
           </w:tcPr>
@@ -4304,7 +4304,7 @@
         </w:tc>
         <w:tc>
           <w:tcPr>
-            <w:tcW w:type="dxa" w:w="3031"/>
+            <w:tcW w:type="dxa" w:w="2584"/>
             <w:shd w:val="clear" w:color="auto" w:fill="FFFFFF"/>
             <w:vAlign w:val="center"/>
           </w:tcPr>
@@ -4327,7 +4327,7 @@
         </w:tc>
         <w:tc>
           <w:tcPr>
-            <w:tcW w:type="dxa" w:w="1215"/>
+            <w:tcW w:type="dxa" w:w="1158"/>
             <w:shd w:val="clear" w:color="auto" w:fill="FFFFFF"/>
             <w:vAlign w:val="center"/>
           </w:tcPr>
@@ -4365,7 +4365,7 @@
         </w:trPr>
         <w:tc>
           <w:tcPr>
-            <w:tcW w:type="dxa" w:w="414"/>
+            <w:tcW w:type="dxa" w:w="409"/>
             <w:shd w:val="clear" w:color="auto" w:fill="F7F9FB"/>
             <w:vAlign w:val="center"/>
           </w:tcPr>
@@ -4389,7 +4389,7 @@
         </w:tc>
         <w:tc>
           <w:tcPr>
-            <w:tcW w:type="dxa" w:w="1585"/>
+            <w:tcW w:type="dxa" w:w="1552"/>
             <w:shd w:val="clear" w:color="auto" w:fill="F7F9FB"/>
             <w:vAlign w:val="center"/>
           </w:tcPr>
@@ -4413,7 +4413,7 @@
         </w:tc>
         <w:tc>
           <w:tcPr>
-            <w:tcW w:type="dxa" w:w="2250"/>
+            <w:tcW w:type="dxa" w:w="2793"/>
             <w:shd w:val="clear" w:color="auto" w:fill="F7F9FB"/>
             <w:vAlign w:val="center"/>
           </w:tcPr>
@@ -4436,7 +4436,7 @@
         </w:tc>
         <w:tc>
           <w:tcPr>
-            <w:tcW w:type="dxa" w:w="3031"/>
+            <w:tcW w:type="dxa" w:w="2584"/>
             <w:shd w:val="clear" w:color="auto" w:fill="F7F9FB"/>
             <w:vAlign w:val="center"/>
           </w:tcPr>
@@ -4459,7 +4459,7 @@
         </w:tc>
         <w:tc>
           <w:tcPr>
-            <w:tcW w:type="dxa" w:w="1215"/>
+            <w:tcW w:type="dxa" w:w="1158"/>
             <w:shd w:val="clear" w:color="auto" w:fill="F7F9FB"/>
             <w:vAlign w:val="center"/>
           </w:tcPr>
@@ -4497,7 +4497,7 @@
         </w:trPr>
         <w:tc>
           <w:tcPr>
-            <w:tcW w:type="dxa" w:w="414"/>
+            <w:tcW w:type="dxa" w:w="409"/>
             <w:shd w:val="clear" w:color="auto" w:fill="FFFFFF"/>
             <w:vAlign w:val="center"/>
           </w:tcPr>
@@ -4521,7 +4521,7 @@
         </w:tc>
         <w:tc>
           <w:tcPr>
-            <w:tcW w:type="dxa" w:w="1585"/>
+            <w:tcW w:type="dxa" w:w="1552"/>
             <w:shd w:val="clear" w:color="auto" w:fill="FFFFFF"/>
             <w:vAlign w:val="center"/>
           </w:tcPr>
@@ -4545,7 +4545,7 @@
         </w:tc>
         <w:tc>
           <w:tcPr>
-            <w:tcW w:type="dxa" w:w="2250"/>
+            <w:tcW w:type="dxa" w:w="2793"/>
             <w:shd w:val="clear" w:color="auto" w:fill="FFFFFF"/>
             <w:vAlign w:val="center"/>
           </w:tcPr>
@@ -4568,7 +4568,7 @@
         </w:tc>
         <w:tc>
           <w:tcPr>
-            <w:tcW w:type="dxa" w:w="3031"/>
+            <w:tcW w:type="dxa" w:w="2584"/>
             <w:shd w:val="clear" w:color="auto" w:fill="FFFFFF"/>
             <w:vAlign w:val="center"/>
           </w:tcPr>
@@ -4591,7 +4591,7 @@
         </w:tc>
         <w:tc>
           <w:tcPr>
-            <w:tcW w:type="dxa" w:w="1215"/>
+            <w:tcW w:type="dxa" w:w="1158"/>
             <w:shd w:val="clear" w:color="auto" w:fill="FFFFFF"/>
             <w:vAlign w:val="center"/>
           </w:tcPr>
@@ -4629,7 +4629,7 @@
         </w:trPr>
         <w:tc>
           <w:tcPr>
-            <w:tcW w:type="dxa" w:w="414"/>
+            <w:tcW w:type="dxa" w:w="409"/>
             <w:shd w:val="clear" w:color="auto" w:fill="F7F9FB"/>
             <w:vAlign w:val="center"/>
           </w:tcPr>
@@ -4653,7 +4653,7 @@
         </w:tc>
         <w:tc>
           <w:tcPr>
-            <w:tcW w:type="dxa" w:w="1585"/>
+            <w:tcW w:type="dxa" w:w="1552"/>
             <w:shd w:val="clear" w:color="auto" w:fill="F7F9FB"/>
             <w:vAlign w:val="center"/>
           </w:tcPr>
@@ -4677,7 +4677,7 @@
         </w:tc>
         <w:tc>
           <w:tcPr>
-            <w:tcW w:type="dxa" w:w="2250"/>
+            <w:tcW w:type="dxa" w:w="2793"/>
             <w:shd w:val="clear" w:color="auto" w:fill="F7F9FB"/>
             <w:vAlign w:val="center"/>
           </w:tcPr>
@@ -4700,7 +4700,7 @@
         </w:tc>
         <w:tc>
           <w:tcPr>
-            <w:tcW w:type="dxa" w:w="3031"/>
+            <w:tcW w:type="dxa" w:w="2584"/>
             <w:shd w:val="clear" w:color="auto" w:fill="F7F9FB"/>
             <w:vAlign w:val="center"/>
           </w:tcPr>
@@ -4723,7 +4723,7 @@
         </w:tc>
         <w:tc>
           <w:tcPr>
-            <w:tcW w:type="dxa" w:w="1215"/>
+            <w:tcW w:type="dxa" w:w="1158"/>
             <w:shd w:val="clear" w:color="auto" w:fill="F7F9FB"/>
             <w:vAlign w:val="center"/>
           </w:tcPr>
@@ -4761,7 +4761,7 @@
         </w:trPr>
         <w:tc>
           <w:tcPr>
-            <w:tcW w:type="dxa" w:w="414"/>
+            <w:tcW w:type="dxa" w:w="409"/>
             <w:shd w:val="clear" w:color="auto" w:fill="FFFFFF"/>
             <w:vAlign w:val="center"/>
           </w:tcPr>
@@ -4785,7 +4785,7 @@
         </w:tc>
         <w:tc>
           <w:tcPr>
-            <w:tcW w:type="dxa" w:w="1585"/>
+            <w:tcW w:type="dxa" w:w="1552"/>
             <w:shd w:val="clear" w:color="auto" w:fill="FFFFFF"/>
             <w:vAlign w:val="center"/>
           </w:tcPr>
@@ -4809,7 +4809,7 @@
         </w:tc>
         <w:tc>
           <w:tcPr>
-            <w:tcW w:type="dxa" w:w="2250"/>
+            <w:tcW w:type="dxa" w:w="2793"/>
             <w:shd w:val="clear" w:color="auto" w:fill="FFFFFF"/>
             <w:vAlign w:val="center"/>
           </w:tcPr>
@@ -4832,7 +4832,7 @@
         </w:tc>
         <w:tc>
           <w:tcPr>
-            <w:tcW w:type="dxa" w:w="3031"/>
+            <w:tcW w:type="dxa" w:w="2584"/>
             <w:shd w:val="clear" w:color="auto" w:fill="FFFFFF"/>
             <w:vAlign w:val="center"/>
           </w:tcPr>
@@ -4855,7 +4855,7 @@
         </w:tc>
         <w:tc>
           <w:tcPr>
-            <w:tcW w:type="dxa" w:w="1215"/>
+            <w:tcW w:type="dxa" w:w="1158"/>
             <w:shd w:val="clear" w:color="auto" w:fill="FFFFFF"/>
             <w:vAlign w:val="center"/>
           </w:tcPr>
@@ -4893,7 +4893,7 @@
         </w:trPr>
         <w:tc>
           <w:tcPr>
-            <w:tcW w:type="dxa" w:w="414"/>
+            <w:tcW w:type="dxa" w:w="409"/>
             <w:shd w:val="clear" w:color="auto" w:fill="F7F9FB"/>
             <w:vAlign w:val="center"/>
           </w:tcPr>
@@ -4917,7 +4917,7 @@
         </w:tc>
         <w:tc>
           <w:tcPr>
-            <w:tcW w:type="dxa" w:w="1585"/>
+            <w:tcW w:type="dxa" w:w="1552"/>
             <w:shd w:val="clear" w:color="auto" w:fill="F7F9FB"/>
             <w:vAlign w:val="center"/>
           </w:tcPr>
@@ -4941,7 +4941,7 @@
         </w:tc>
         <w:tc>
           <w:tcPr>
-            <w:tcW w:type="dxa" w:w="2250"/>
+            <w:tcW w:type="dxa" w:w="2793"/>
             <w:shd w:val="clear" w:color="auto" w:fill="F7F9FB"/>
             <w:vAlign w:val="center"/>
           </w:tcPr>
@@ -4964,7 +4964,7 @@
         </w:tc>
         <w:tc>
           <w:tcPr>
-            <w:tcW w:type="dxa" w:w="3031"/>
+            <w:tcW w:type="dxa" w:w="2584"/>
             <w:shd w:val="clear" w:color="auto" w:fill="F7F9FB"/>
             <w:vAlign w:val="center"/>
           </w:tcPr>
@@ -4987,7 +4987,7 @@
         </w:tc>
         <w:tc>
           <w:tcPr>
-            <w:tcW w:type="dxa" w:w="1215"/>
+            <w:tcW w:type="dxa" w:w="1158"/>
             <w:shd w:val="clear" w:color="auto" w:fill="F7F9FB"/>
             <w:vAlign w:val="center"/>
           </w:tcPr>
@@ -5025,7 +5025,7 @@
         </w:trPr>
         <w:tc>
           <w:tcPr>
-            <w:tcW w:type="dxa" w:w="414"/>
+            <w:tcW w:type="dxa" w:w="409"/>
             <w:shd w:val="clear" w:color="auto" w:fill="FFFFFF"/>
             <w:vAlign w:val="center"/>
           </w:tcPr>
@@ -5049,7 +5049,7 @@
         </w:tc>
         <w:tc>
           <w:tcPr>
-            <w:tcW w:type="dxa" w:w="1585"/>
+            <w:tcW w:type="dxa" w:w="1552"/>
             <w:shd w:val="clear" w:color="auto" w:fill="FFFFFF"/>
             <w:vAlign w:val="center"/>
           </w:tcPr>
@@ -5073,7 +5073,7 @@
         </w:tc>
         <w:tc>
           <w:tcPr>
-            <w:tcW w:type="dxa" w:w="2250"/>
+            <w:tcW w:type="dxa" w:w="2793"/>
             <w:shd w:val="clear" w:color="auto" w:fill="FFFFFF"/>
             <w:vAlign w:val="center"/>
           </w:tcPr>
@@ -5096,7 +5096,7 @@
         </w:tc>
         <w:tc>
           <w:tcPr>
-            <w:tcW w:type="dxa" w:w="3031"/>
+            <w:tcW w:type="dxa" w:w="2584"/>
             <w:shd w:val="clear" w:color="auto" w:fill="FFFFFF"/>
             <w:vAlign w:val="center"/>
           </w:tcPr>
@@ -5119,7 +5119,7 @@
         </w:tc>
         <w:tc>
           <w:tcPr>
-            <w:tcW w:type="dxa" w:w="1215"/>
+            <w:tcW w:type="dxa" w:w="1158"/>
             <w:shd w:val="clear" w:color="auto" w:fill="FFFFFF"/>
             <w:vAlign w:val="center"/>
           </w:tcPr>
@@ -5157,7 +5157,7 @@
         </w:trPr>
         <w:tc>
           <w:tcPr>
-            <w:tcW w:type="dxa" w:w="414"/>
+            <w:tcW w:type="dxa" w:w="409"/>
             <w:shd w:val="clear" w:color="auto" w:fill="F7F9FB"/>
             <w:vAlign w:val="center"/>
           </w:tcPr>
@@ -5181,7 +5181,7 @@
         </w:tc>
         <w:tc>
           <w:tcPr>
-            <w:tcW w:type="dxa" w:w="1585"/>
+            <w:tcW w:type="dxa" w:w="1552"/>
             <w:shd w:val="clear" w:color="auto" w:fill="F7F9FB"/>
             <w:vAlign w:val="center"/>
           </w:tcPr>
@@ -5205,7 +5205,7 @@
         </w:tc>
         <w:tc>
           <w:tcPr>
-            <w:tcW w:type="dxa" w:w="2250"/>
+            <w:tcW w:type="dxa" w:w="2793"/>
             <w:shd w:val="clear" w:color="auto" w:fill="F7F9FB"/>
             <w:vAlign w:val="center"/>
           </w:tcPr>
@@ -5228,7 +5228,7 @@
         </w:tc>
         <w:tc>
           <w:tcPr>
-            <w:tcW w:type="dxa" w:w="3031"/>
+            <w:tcW w:type="dxa" w:w="2584"/>
             <w:shd w:val="clear" w:color="auto" w:fill="F7F9FB"/>
             <w:vAlign w:val="center"/>
           </w:tcPr>
@@ -5251,7 +5251,7 @@
         </w:tc>
         <w:tc>
           <w:tcPr>
-            <w:tcW w:type="dxa" w:w="1215"/>
+            <w:tcW w:type="dxa" w:w="1158"/>
             <w:shd w:val="clear" w:color="auto" w:fill="F7F9FB"/>
             <w:vAlign w:val="center"/>
           </w:tcPr>
@@ -5289,7 +5289,7 @@
         </w:trPr>
         <w:tc>
           <w:tcPr>
-            <w:tcW w:type="dxa" w:w="414"/>
+            <w:tcW w:type="dxa" w:w="409"/>
             <w:shd w:val="clear" w:color="auto" w:fill="FFFFFF"/>
             <w:vAlign w:val="center"/>
           </w:tcPr>
@@ -5313,7 +5313,7 @@
         </w:tc>
         <w:tc>
           <w:tcPr>
-            <w:tcW w:type="dxa" w:w="1585"/>
+            <w:tcW w:type="dxa" w:w="1552"/>
             <w:shd w:val="clear" w:color="auto" w:fill="FFFFFF"/>
             <w:vAlign w:val="center"/>
           </w:tcPr>
@@ -5337,7 +5337,7 @@
         </w:tc>
         <w:tc>
           <w:tcPr>
-            <w:tcW w:type="dxa" w:w="2250"/>
+            <w:tcW w:type="dxa" w:w="2793"/>
             <w:shd w:val="clear" w:color="auto" w:fill="FFFFFF"/>
             <w:vAlign w:val="center"/>
           </w:tcPr>
@@ -5360,7 +5360,7 @@
         </w:tc>
         <w:tc>
           <w:tcPr>
-            <w:tcW w:type="dxa" w:w="3031"/>
+            <w:tcW w:type="dxa" w:w="2584"/>
             <w:shd w:val="clear" w:color="auto" w:fill="FFFFFF"/>
             <w:vAlign w:val="center"/>
           </w:tcPr>
@@ -5383,7 +5383,7 @@
         </w:tc>
         <w:tc>
           <w:tcPr>
-            <w:tcW w:type="dxa" w:w="1215"/>
+            <w:tcW w:type="dxa" w:w="1158"/>
             <w:shd w:val="clear" w:color="auto" w:fill="FFFFFF"/>
             <w:vAlign w:val="center"/>
           </w:tcPr>
@@ -5421,7 +5421,7 @@
         </w:trPr>
         <w:tc>
           <w:tcPr>
-            <w:tcW w:type="dxa" w:w="414"/>
+            <w:tcW w:type="dxa" w:w="409"/>
             <w:shd w:val="clear" w:color="auto" w:fill="F7F9FB"/>
             <w:vAlign w:val="center"/>
           </w:tcPr>
@@ -5445,7 +5445,7 @@
         </w:tc>
         <w:tc>
           <w:tcPr>
-            <w:tcW w:type="dxa" w:w="1585"/>
+            <w:tcW w:type="dxa" w:w="1552"/>
             <w:shd w:val="clear" w:color="auto" w:fill="F7F9FB"/>
             <w:vAlign w:val="center"/>
           </w:tcPr>
@@ -5469,7 +5469,7 @@
         </w:tc>
         <w:tc>
           <w:tcPr>
-            <w:tcW w:type="dxa" w:w="2250"/>
+            <w:tcW w:type="dxa" w:w="2793"/>
             <w:shd w:val="clear" w:color="auto" w:fill="F7F9FB"/>
             <w:vAlign w:val="center"/>
           </w:tcPr>
@@ -5492,7 +5492,7 @@
         </w:tc>
         <w:tc>
           <w:tcPr>
-            <w:tcW w:type="dxa" w:w="3031"/>
+            <w:tcW w:type="dxa" w:w="2584"/>
             <w:shd w:val="clear" w:color="auto" w:fill="F7F9FB"/>
             <w:vAlign w:val="center"/>
           </w:tcPr>
@@ -5515,7 +5515,7 @@
         </w:tc>
         <w:tc>
           <w:tcPr>
-            <w:tcW w:type="dxa" w:w="1215"/>
+            <w:tcW w:type="dxa" w:w="1158"/>
             <w:shd w:val="clear" w:color="auto" w:fill="F7F9FB"/>
             <w:vAlign w:val="center"/>
           </w:tcPr>
@@ -5553,7 +5553,7 @@
         </w:trPr>
         <w:tc>
           <w:tcPr>
-            <w:tcW w:type="dxa" w:w="414"/>
+            <w:tcW w:type="dxa" w:w="409"/>
             <w:shd w:val="clear" w:color="auto" w:fill="FFFFFF"/>
             <w:vAlign w:val="center"/>
           </w:tcPr>
@@ -5577,7 +5577,7 @@
         </w:tc>
         <w:tc>
           <w:tcPr>
-            <w:tcW w:type="dxa" w:w="1585"/>
+            <w:tcW w:type="dxa" w:w="1552"/>
             <w:shd w:val="clear" w:color="auto" w:fill="FFFFFF"/>
             <w:vAlign w:val="center"/>
           </w:tcPr>
@@ -5601,7 +5601,7 @@
         </w:tc>
         <w:tc>
           <w:tcPr>
-            <w:tcW w:type="dxa" w:w="2250"/>
+            <w:tcW w:type="dxa" w:w="2793"/>
             <w:shd w:val="clear" w:color="auto" w:fill="FFFFFF"/>
             <w:vAlign w:val="center"/>
           </w:tcPr>
@@ -5624,7 +5624,7 @@
         </w:tc>
         <w:tc>
           <w:tcPr>
-            <w:tcW w:type="dxa" w:w="3031"/>
+            <w:tcW w:type="dxa" w:w="2584"/>
             <w:shd w:val="clear" w:color="auto" w:fill="FFFFFF"/>
             <w:vAlign w:val="center"/>
           </w:tcPr>
@@ -5647,7 +5647,7 @@
         </w:tc>
         <w:tc>
           <w:tcPr>
-            <w:tcW w:type="dxa" w:w="1215"/>
+            <w:tcW w:type="dxa" w:w="1158"/>
             <w:shd w:val="clear" w:color="auto" w:fill="FFFFFF"/>
             <w:vAlign w:val="center"/>
           </w:tcPr>
@@ -5675,12 +5675,144 @@
         </w:trPr>
         <w:tc>
           <w:tcPr>
-            <w:tcW w:type="dxa" w:w="414"/>
+            <w:tcW w:type="dxa" w:w="409"/>
             <w:shd w:val="clear" w:color="auto" w:fill="F7F9FB"/>
             <w:vAlign w:val="center"/>
           </w:tcPr>
           <w:p>
             <w:pPr>
+              <w:keepNext/>
+              <w:spacing w:after="0"/>
+              <w:jc w:val="center"/>
+            </w:pPr>
+            <w:r>
+              <w:rPr>
+                <w:rFonts w:ascii="Calibri" w:hAnsi="Calibri"/>
+                <w:b/>
+                <w:i w:val="0"/>
+                <w:color w:val="222222"/>
+                <w:sz w:val="20"/>
+              </w:rPr>
+              <w:t>42</w:t>
+            </w:r>
+          </w:p>
+        </w:tc>
+        <w:tc>
+          <w:tcPr>
+            <w:tcW w:type="dxa" w:w="1552"/>
+            <w:shd w:val="clear" w:color="auto" w:fill="F7F9FB"/>
+            <w:vAlign w:val="center"/>
+          </w:tcPr>
+          <w:p>
+            <w:pPr>
+              <w:keepNext/>
+              <w:spacing w:after="0"/>
+              <w:jc w:val="center"/>
+            </w:pPr>
+            <w:r>
+              <w:rPr>
+                <w:rFonts w:ascii="Calibri" w:hAnsi="Calibri"/>
+                <w:b w:val="0"/>
+                <w:i w:val="0"/>
+                <w:color w:val="222222"/>
+                <w:sz w:val="20"/>
+              </w:rPr>
+              <w:t>2026-10-26</w:t>
+            </w:r>
+          </w:p>
+        </w:tc>
+        <w:tc>
+          <w:tcPr>
+            <w:tcW w:type="dxa" w:w="2793"/>
+            <w:shd w:val="clear" w:color="auto" w:fill="F7F9FB"/>
+            <w:vAlign w:val="center"/>
+          </w:tcPr>
+          <w:p>
+            <w:pPr>
+              <w:keepNext/>
+              <w:spacing w:after="0"/>
+            </w:pPr>
+            <w:r>
+              <w:rPr>
+                <w:rFonts w:ascii="Calibri" w:hAnsi="Calibri"/>
+                <w:b w:val="0"/>
+                <w:i w:val="0"/>
+                <w:color w:val="222222"/>
+                <w:sz w:val="20"/>
+              </w:rPr>
+              <w:t>Real ToxCast vehicle wells: noise floors, wells needed, and the twin against unseen positive controls</w:t>
+            </w:r>
+          </w:p>
+        </w:tc>
+        <w:tc>
+          <w:tcPr>
+            <w:tcW w:type="dxa" w:w="2584"/>
+            <w:shd w:val="clear" w:color="auto" w:fill="F7F9FB"/>
+            <w:vAlign w:val="center"/>
+          </w:tcPr>
+          <w:p>
+            <w:pPr>
+              <w:keepNext/>
+              <w:spacing w:after="0"/>
+            </w:pPr>
+            <w:r>
+              <w:rPr>
+                <w:rFonts w:ascii="Calibri" w:hAnsi="Calibri"/>
+                <w:b w:val="0"/>
+                <w:i w:val="0"/>
+                <w:color w:val="222222"/>
+                <w:sz w:val="20"/>
+              </w:rPr>
+              <w:t>new real-data results, both registered; twin 12 of 12 directions, no better than a firing-rate rule</w:t>
+            </w:r>
+          </w:p>
+        </w:tc>
+        <w:tc>
+          <w:tcPr>
+            <w:tcW w:type="dxa" w:w="1158"/>
+            <w:shd w:val="clear" w:color="auto" w:fill="F7F9FB"/>
+            <w:vAlign w:val="center"/>
+          </w:tcPr>
+          <w:p>
+            <w:pPr>
+              <w:keepNext/>
+              <w:spacing w:after="0"/>
+            </w:pPr>
+            <w:r>
+              <w:rPr>
+                <w:rFonts w:ascii="Consolas" w:hAnsi="Consolas"/>
+                <w:b w:val="0"/>
+                <w:i w:val="0"/>
+                <w:color w:val="222222"/>
+                <w:sz w:val="18"/>
+              </w:rPr>
+              <w:t>cf90872</w:t>
+            </w:r>
+            <w:r>
+              <w:rPr>
+                <w:rFonts w:ascii="Calibri" w:hAnsi="Calibri"/>
+                <w:b w:val="0"/>
+                <w:i w:val="0"/>
+                <w:color w:val="222222"/>
+                <w:sz w:val="20"/>
+              </w:rPr>
+              <w:t xml:space="preserve"> … this branch</w:t>
+            </w:r>
+          </w:p>
+        </w:tc>
+      </w:tr>
+      <w:tr>
+        <w:trPr>
+          <w:cantSplit/>
+        </w:trPr>
+        <w:tc>
+          <w:tcPr>
+            <w:tcW w:type="dxa" w:w="409"/>
+            <w:shd w:val="clear" w:color="auto" w:fill="FFFFFF"/>
+            <w:vAlign w:val="center"/>
+          </w:tcPr>
+          <w:p>
+            <w:pPr>
               <w:keepNext w:val="0"/>
               <w:spacing w:after="0"/>
               <w:jc w:val="center"/>
@@ -5693,14 +5825,14 @@
                 <w:color w:val="222222"/>
                 <w:sz w:val="20"/>
               </w:rPr>
-              <w:t>42</w:t>
-            </w:r>
-          </w:p>
-        </w:tc>
-        <w:tc>
-          <w:tcPr>
-            <w:tcW w:type="dxa" w:w="1585"/>
-            <w:shd w:val="clear" w:color="auto" w:fill="F7F9FB"/>
+              <w:t>44</w:t>
+            </w:r>
+          </w:p>
+        </w:tc>
+        <w:tc>
+          <w:tcPr>
+            <w:tcW w:type="dxa" w:w="1552"/>
+            <w:shd w:val="clear" w:color="auto" w:fill="FFFFFF"/>
             <w:vAlign w:val="center"/>
           </w:tcPr>
           <w:p>
@@ -5717,14 +5849,14 @@
                 <w:color w:val="222222"/>
                 <w:sz w:val="20"/>
               </w:rPr>
-              <w:t>2026-10-26</w:t>
-            </w:r>
-          </w:p>
-        </w:tc>
-        <w:tc>
-          <w:tcPr>
-            <w:tcW w:type="dxa" w:w="2250"/>
-            <w:shd w:val="clear" w:color="auto" w:fill="F7F9FB"/>
+              <w:t>2026-10-28</w:t>
+            </w:r>
+          </w:p>
+        </w:tc>
+        <w:tc>
+          <w:tcPr>
+            <w:tcW w:type="dxa" w:w="2793"/>
+            <w:shd w:val="clear" w:color="auto" w:fill="FFFFFF"/>
             <w:vAlign w:val="center"/>
           </w:tcPr>
           <w:p>
@@ -5740,14 +5872,14 @@
                 <w:color w:val="222222"/>
                 <w:sz w:val="20"/>
               </w:rPr>
-              <w:t>Real ToxCast vehicle wells: noise floors, wells needed, and the twin against unseen positive controls</w:t>
-            </w:r>
-          </w:p>
-        </w:tc>
-        <w:tc>
-          <w:tcPr>
-            <w:tcW w:type="dxa" w:w="3031"/>
-            <w:shd w:val="clear" w:color="auto" w:fill="F7F9FB"/>
+              <w:t>The twin's knob dose-response against real concentration-response curves</w:t>
+            </w:r>
+          </w:p>
+        </w:tc>
+        <w:tc>
+          <w:tcPr>
+            <w:tcW w:type="dxa" w:w="2584"/>
+            <w:shd w:val="clear" w:color="auto" w:fill="FFFFFF"/>
             <w:vAlign w:val="center"/>
           </w:tcPr>
           <w:p>
@@ -5763,14 +5895,14 @@
                 <w:color w:val="222222"/>
                 <w:sz w:val="20"/>
               </w:rPr>
-              <w:t>new real-data results, both registered; twin 12 of 12 directions, no better than a firing-rate rule</w:t>
-            </w:r>
-          </w:p>
-        </w:tc>
-        <w:tc>
-          <w:tcPr>
-            <w:tcW w:type="dxa" w:w="1215"/>
-            <w:shd w:val="clear" w:color="auto" w:fill="F7F9FB"/>
+              <w:t>2 of 4 registered predictions pass; the mechanism label matters, the curve shape does not clear the line</w:t>
+            </w:r>
+          </w:p>
+        </w:tc>
+        <w:tc>
+          <w:tcPr>
+            <w:tcW w:type="dxa" w:w="1158"/>
+            <w:shd w:val="clear" w:color="auto" w:fill="FFFFFF"/>
             <w:vAlign w:val="center"/>
           </w:tcPr>
           <w:p>
@@ -5786,7 +5918,7 @@
                 <w:color w:val="222222"/>
                 <w:sz w:val="18"/>
               </w:rPr>
-              <w:t>cf90872</w:t>
+              <w:t>f3e1fb9</w:t>
             </w:r>
             <w:r>
               <w:rPr>
@@ -16194,6 +16326,423 @@
           <w:sz w:val="19"/>
         </w:rPr>
         <w:t>outputs/tables/toxcast_wells_needed.md</w:t>
+      </w:r>
+      <w:r>
+        <w:rPr>
+          <w:rFonts w:ascii="Calibri" w:hAnsi="Calibri"/>
+          <w:b w:val="0"/>
+          <w:i w:val="0"/>
+          <w:color w:val="222222"/>
+          <w:sz w:val="21"/>
+        </w:rPr>
+        <w:t>.</w:t>
+      </w:r>
+    </w:p>
+    <w:p>
+      <w:pPr>
+        <w:keepNext/>
+        <w:spacing w:before="240" w:after="60"/>
+      </w:pPr>
+      <w:r>
+        <w:rPr>
+          <w:rFonts w:ascii="Calibri" w:hAnsi="Calibri"/>
+          <w:b/>
+          <w:i w:val="0"/>
+          <w:color w:val="1F4E79"/>
+          <w:sz w:val="23"/>
+        </w:rPr>
+        <w:t>44. The dose response: what the twin's knobs get right, and where the test broke</w:t>
+      </w:r>
+    </w:p>
+    <w:p>
+      <w:pPr>
+        <w:spacing w:after="120"/>
+      </w:pPr>
+      <w:r>
+        <w:rPr>
+          <w:rFonts w:ascii="Calibri" w:hAnsi="Calibri"/>
+          <w:b/>
+          <w:i w:val="0"/>
+          <w:color w:val="156082"/>
+          <w:sz w:val="21"/>
+        </w:rPr>
+        <w:t>Slide message:</w:t>
+      </w:r>
+      <w:r>
+        <w:rPr>
+          <w:rFonts w:ascii="Calibri" w:hAnsi="Calibri"/>
+          <w:b w:val="0"/>
+          <w:i w:val="0"/>
+          <w:color w:val="222222"/>
+          <w:sz w:val="21"/>
+        </w:rPr>
+        <w:t xml:space="preserve"> </w:t>
+      </w:r>
+      <w:r>
+        <w:rPr>
+          <w:rFonts w:ascii="Calibri" w:hAnsi="Calibri"/>
+          <w:b w:val="0"/>
+          <w:i/>
+          <w:color w:val="222222"/>
+          <w:sz w:val="21"/>
+        </w:rPr>
+        <w:t>Asked to reproduce the shape of real concentration-response curves, the twin beats a wrong-mechanism knob by 0.47 in rank correlation and names the first-moving readout for 8 of 11 compounds, but fewer than half its curves clear the registered line — and the failure sits entirely at the top concentration, where this screen cannot tell a mechanism from a general loss of activity.</w:t>
+      </w:r>
+    </w:p>
+    <w:p>
+      <w:pPr>
+        <w:spacing w:after="120"/>
+        <w:ind w:left="432" w:hanging="259"/>
+      </w:pPr>
+      <w:r>
+        <w:rPr>
+          <w:rFonts w:ascii="Calibri" w:hAnsi="Calibri"/>
+          <w:b w:val="0"/>
+          <w:i w:val="0"/>
+          <w:color w:val="222222"/>
+          <w:sz w:val="21"/>
+        </w:rPr>
+        <w:t>•</w:t>
+        <w:tab/>
+      </w:r>
+      <w:r>
+        <w:rPr>
+          <w:rFonts w:ascii="Calibri" w:hAnsi="Calibri"/>
+          <w:b/>
+          <w:i w:val="0"/>
+          <w:color w:val="156082"/>
+          <w:sz w:val="21"/>
+        </w:rPr>
+        <w:t>What changed.</w:t>
+      </w:r>
+      <w:r>
+        <w:rPr>
+          <w:rFonts w:ascii="Calibri" w:hAnsi="Calibri"/>
+          <w:b w:val="0"/>
+          <w:i w:val="0"/>
+          <w:color w:val="222222"/>
+          <w:sz w:val="21"/>
+        </w:rPr>
+        <w:t xml:space="preserve"> A third registered analysis on the EPA acute MEA screen (</w:t>
+      </w:r>
+      <w:r>
+        <w:rPr>
+          <w:rFonts w:ascii="Consolas" w:hAnsi="Consolas"/>
+          <w:b w:val="0"/>
+          <w:i w:val="0"/>
+          <w:color w:val="222222"/>
+          <w:sz w:val="19"/>
+        </w:rPr>
+        <w:t>src/neuromps/models/twin_toxcast_dose_response.py</w:t>
+      </w:r>
+      <w:r>
+        <w:rPr>
+          <w:rFonts w:ascii="Calibri" w:hAnsi="Calibri"/>
+          <w:b w:val="0"/>
+          <w:i w:val="0"/>
+          <w:color w:val="222222"/>
+          <w:sz w:val="21"/>
+        </w:rPr>
+        <w:t xml:space="preserve">, </w:t>
+      </w:r>
+      <w:r>
+        <w:rPr>
+          <w:rFonts w:ascii="Consolas" w:hAnsi="Consolas"/>
+          <w:b w:val="0"/>
+          <w:i w:val="0"/>
+          <w:color w:val="222222"/>
+          <w:sz w:val="19"/>
+        </w:rPr>
+        <w:t>preregistration/twin_toxcast_dose_response.json</w:t>
+      </w:r>
+      <w:r>
+        <w:rPr>
+          <w:rFonts w:ascii="Calibri" w:hAnsi="Calibri"/>
+          <w:b w:val="0"/>
+          <w:i w:val="0"/>
+          <w:color w:val="222222"/>
+          <w:sz w:val="21"/>
+        </w:rPr>
+        <w:t>, decision D30, report §35). The twin's four drug knobs were simulated over a seven-level grid on 12 chips and the curves committed before any treated well was read; concentrations are matched to knob levels by rank; scores are a Spearman correlation per compound and readout, which readout moves first, and two nulls.</w:t>
+      </w:r>
+    </w:p>
+    <w:p>
+      <w:pPr>
+        <w:spacing w:after="120"/>
+        <w:ind w:left="432" w:hanging="259"/>
+      </w:pPr>
+      <w:r>
+        <w:rPr>
+          <w:rFonts w:ascii="Calibri" w:hAnsi="Calibri"/>
+          <w:b w:val="0"/>
+          <w:i w:val="0"/>
+          <w:color w:val="222222"/>
+          <w:sz w:val="21"/>
+        </w:rPr>
+        <w:t>•</w:t>
+        <w:tab/>
+      </w:r>
+      <w:r>
+        <w:rPr>
+          <w:rFonts w:ascii="Calibri" w:hAnsi="Calibri"/>
+          <w:b/>
+          <w:i w:val="0"/>
+          <w:color w:val="156082"/>
+          <w:sz w:val="21"/>
+        </w:rPr>
+        <w:t>Why.</w:t>
+      </w:r>
+      <w:r>
+        <w:rPr>
+          <w:rFonts w:ascii="Calibri" w:hAnsi="Calibri"/>
+          <w:b w:val="0"/>
+          <w:i w:val="0"/>
+          <w:color w:val="222222"/>
+          <w:sz w:val="21"/>
+        </w:rPr>
+        <w:t xml:space="preserve"> §34 recorded the gap in §33: the positive controls are single saturating concentrations, so nothing tested the twin's dose response — the next step the closing slide of the deck names.</w:t>
+      </w:r>
+    </w:p>
+    <w:p>
+      <w:pPr>
+        <w:spacing w:after="120"/>
+        <w:ind w:left="432" w:hanging="259"/>
+      </w:pPr>
+      <w:r>
+        <w:rPr>
+          <w:rFonts w:ascii="Calibri" w:hAnsi="Calibri"/>
+          <w:b w:val="0"/>
+          <w:i w:val="0"/>
+          <w:color w:val="222222"/>
+          <w:sz w:val="21"/>
+        </w:rPr>
+        <w:t>•</w:t>
+        <w:tab/>
+      </w:r>
+      <w:r>
+        <w:rPr>
+          <w:rFonts w:ascii="Calibri" w:hAnsi="Calibri"/>
+          <w:b/>
+          <w:i w:val="0"/>
+          <w:color w:val="156082"/>
+          <w:sz w:val="21"/>
+        </w:rPr>
+        <w:t>Effect.</w:t>
+      </w:r>
+    </w:p>
+    <w:p>
+      <w:pPr>
+        <w:spacing w:after="120"/>
+        <w:ind w:left="432" w:hanging="259"/>
+      </w:pPr>
+      <w:r>
+        <w:rPr>
+          <w:rFonts w:ascii="Calibri" w:hAnsi="Calibri"/>
+          <w:b w:val="0"/>
+          <w:i w:val="0"/>
+          <w:color w:val="222222"/>
+          <w:sz w:val="21"/>
+        </w:rPr>
+        <w:t>•</w:t>
+        <w:tab/>
+      </w:r>
+      <w:r>
+        <w:rPr>
+          <w:rFonts w:ascii="Calibri" w:hAnsi="Calibri"/>
+          <w:b w:val="0"/>
+          <w:i w:val="0"/>
+          <w:color w:val="222222"/>
+          <w:sz w:val="21"/>
+        </w:rPr>
+        <w:t>2 of 4 registered predictions pass over 13 compounds and 26 scored pairs.</w:t>
+      </w:r>
+    </w:p>
+    <w:p>
+      <w:pPr>
+        <w:spacing w:after="120"/>
+        <w:ind w:left="432" w:hanging="259"/>
+      </w:pPr>
+      <w:r>
+        <w:rPr>
+          <w:rFonts w:ascii="Calibri" w:hAnsi="Calibri"/>
+          <w:b w:val="0"/>
+          <w:i w:val="0"/>
+          <w:color w:val="222222"/>
+          <w:sz w:val="21"/>
+        </w:rPr>
+        <w:t>•</w:t>
+        <w:tab/>
+      </w:r>
+      <w:r>
+        <w:rPr>
+          <w:rFonts w:ascii="Calibri" w:hAnsi="Calibri"/>
+          <w:b w:val="0"/>
+          <w:i w:val="0"/>
+          <w:color w:val="222222"/>
+          <w:sz w:val="21"/>
+        </w:rPr>
+        <w:t>Passing: the labelled knob beats a knob the compound is not labelled with by 0.47 in mean Spearman, and the twin names the first-moving readout for 8 of 11 compounds.</w:t>
+      </w:r>
+    </w:p>
+    <w:p>
+      <w:pPr>
+        <w:spacing w:after="120"/>
+        <w:ind w:left="432" w:hanging="259"/>
+      </w:pPr>
+      <w:r>
+        <w:rPr>
+          <w:rFonts w:ascii="Calibri" w:hAnsi="Calibri"/>
+          <w:b w:val="0"/>
+          <w:i w:val="0"/>
+          <w:color w:val="222222"/>
+          <w:sz w:val="21"/>
+        </w:rPr>
+        <w:t>•</w:t>
+        <w:tab/>
+      </w:r>
+      <w:r>
+        <w:rPr>
+          <w:rFonts w:ascii="Calibri" w:hAnsi="Calibri"/>
+          <w:b w:val="0"/>
+          <w:i w:val="0"/>
+          <w:color w:val="222222"/>
+          <w:sz w:val="21"/>
+        </w:rPr>
+        <w:t>Failing: only 10 of 26 pairs clear the registered correlation line, and the follow-firing-rate rule of §33 is again ahead (0.52 against 0.34).</w:t>
+      </w:r>
+    </w:p>
+    <w:p>
+      <w:pPr>
+        <w:spacing w:after="120"/>
+        <w:ind w:left="432" w:hanging="259"/>
+      </w:pPr>
+      <w:r>
+        <w:rPr>
+          <w:rFonts w:ascii="Calibri" w:hAnsi="Calibri"/>
+          <w:b w:val="0"/>
+          <w:i w:val="0"/>
+          <w:color w:val="222222"/>
+          <w:sz w:val="21"/>
+        </w:rPr>
+        <w:t>•</w:t>
+        <w:tab/>
+      </w:r>
+      <w:r>
+        <w:rPr>
+          <w:rFonts w:ascii="Calibri" w:hAnsi="Calibri"/>
+          <w:b w:val="0"/>
+          <w:i w:val="0"/>
+          <w:color w:val="222222"/>
+          <w:sz w:val="21"/>
+        </w:rPr>
+        <w:t>The registered exclusion rule, which drops concentrations from the first one the plates' viability readout flags, excluded nothing: over forty minutes that readout barely moves. Post hoc, dropping each compound's highest concentration raises the twin to 0.65, while dropping the lowest gives 0.22 and a middle one 0.32. The registered verdict stands; the post-hoc result says where to look next.</w:t>
+      </w:r>
+    </w:p>
+    <w:p>
+      <w:pPr>
+        <w:spacing w:after="120"/>
+        <w:ind w:left="432" w:hanging="259"/>
+      </w:pPr>
+      <w:r>
+        <w:rPr>
+          <w:rFonts w:ascii="Calibri" w:hAnsi="Calibri"/>
+          <w:b w:val="0"/>
+          <w:i w:val="0"/>
+          <w:color w:val="222222"/>
+          <w:sz w:val="21"/>
+        </w:rPr>
+        <w:t>•</w:t>
+        <w:tab/>
+      </w:r>
+      <w:r>
+        <w:rPr>
+          <w:rFonts w:ascii="Calibri" w:hAnsi="Calibri"/>
+          <w:b/>
+          <w:i w:val="0"/>
+          <w:color w:val="156082"/>
+          <w:sz w:val="21"/>
+        </w:rPr>
+        <w:t>Evidence.</w:t>
+      </w:r>
+      <w:r>
+        <w:rPr>
+          <w:rFonts w:ascii="Calibri" w:hAnsi="Calibri"/>
+          <w:b w:val="0"/>
+          <w:i w:val="0"/>
+          <w:color w:val="222222"/>
+          <w:sz w:val="21"/>
+        </w:rPr>
+        <w:t xml:space="preserve"> Report §35; </w:t>
+      </w:r>
+      <w:r>
+        <w:rPr>
+          <w:rFonts w:ascii="Consolas" w:hAnsi="Consolas"/>
+          <w:b w:val="0"/>
+          <w:i w:val="0"/>
+          <w:color w:val="222222"/>
+          <w:sz w:val="19"/>
+        </w:rPr>
+        <w:t>outputs/figures/twin_toxcast_dose_response.png</w:t>
+      </w:r>
+      <w:r>
+        <w:rPr>
+          <w:rFonts w:ascii="Calibri" w:hAnsi="Calibri"/>
+          <w:b w:val="0"/>
+          <w:i w:val="0"/>
+          <w:color w:val="222222"/>
+          <w:sz w:val="21"/>
+        </w:rPr>
+        <w:t xml:space="preserve">, </w:t>
+      </w:r>
+      <w:r>
+        <w:rPr>
+          <w:rFonts w:ascii="Consolas" w:hAnsi="Consolas"/>
+          <w:b w:val="0"/>
+          <w:i w:val="0"/>
+          <w:color w:val="222222"/>
+          <w:sz w:val="19"/>
+        </w:rPr>
+        <w:t>outputs/twin/toxcast_dose_response_predictions_simulated.json</w:t>
+      </w:r>
+      <w:r>
+        <w:rPr>
+          <w:rFonts w:ascii="Calibri" w:hAnsi="Calibri"/>
+          <w:b w:val="0"/>
+          <w:i w:val="0"/>
+          <w:color w:val="222222"/>
+          <w:sz w:val="21"/>
+        </w:rPr>
+        <w:t xml:space="preserve">, </w:t>
+      </w:r>
+      <w:r>
+        <w:rPr>
+          <w:rFonts w:ascii="Consolas" w:hAnsi="Consolas"/>
+          <w:b w:val="0"/>
+          <w:i w:val="0"/>
+          <w:color w:val="222222"/>
+          <w:sz w:val="19"/>
+        </w:rPr>
+        <w:t>outputs/metrics.json</w:t>
+      </w:r>
+      <w:r>
+        <w:rPr>
+          <w:rFonts w:ascii="Calibri" w:hAnsi="Calibri"/>
+          <w:b w:val="0"/>
+          <w:i w:val="0"/>
+          <w:color w:val="222222"/>
+          <w:sz w:val="21"/>
+        </w:rPr>
+        <w:t xml:space="preserve"> key </w:t>
+      </w:r>
+      <w:r>
+        <w:rPr>
+          <w:rFonts w:ascii="Consolas" w:hAnsi="Consolas"/>
+          <w:b w:val="0"/>
+          <w:i w:val="0"/>
+          <w:color w:val="222222"/>
+          <w:sz w:val="19"/>
+        </w:rPr>
+        <w:t>twin_toxcast_dose_response</w:t>
       </w:r>
       <w:r>
         <w:rPr>

</xml_diff>

<commit_message>
rebuild the technical report and change log after the merge
Co-Authored-By: Claude Opus 5.5 <noreply@anthropic.com>
</commit_message>
<xml_diff>
--- a/report/POST_SUBMISSION_CHANGES.docx
+++ b/report/POST_SUBMISSION_CHANGES.docx
@@ -5813,7 +5813,7 @@
           </w:tcPr>
           <w:p>
             <w:pPr>
-              <w:keepNext w:val="0"/>
+              <w:keepNext/>
               <w:spacing w:after="0"/>
               <w:jc w:val="center"/>
             </w:pPr>
@@ -5825,7 +5825,7 @@
                 <w:color w:val="222222"/>
                 <w:sz w:val="20"/>
               </w:rPr>
-              <w:t>44</w:t>
+              <w:t>43</w:t>
             </w:r>
           </w:p>
         </w:tc>
@@ -5837,7 +5837,7 @@
           </w:tcPr>
           <w:p>
             <w:pPr>
-              <w:keepNext w:val="0"/>
+              <w:keepNext/>
               <w:spacing w:after="0"/>
               <w:jc w:val="center"/>
             </w:pPr>
@@ -5849,7 +5849,7 @@
                 <w:color w:val="222222"/>
                 <w:sz w:val="20"/>
               </w:rPr>
-              <w:t>2026-10-28</w:t>
+              <w:t>2026-10-27</w:t>
             </w:r>
           </w:p>
         </w:tc>
@@ -5861,18 +5861,18 @@
           </w:tcPr>
           <w:p>
             <w:pPr>
-              <w:keepNext w:val="0"/>
-              <w:spacing w:after="0"/>
-            </w:pPr>
-            <w:r>
-              <w:rPr>
-                <w:rFonts w:ascii="Calibri" w:hAnsi="Calibri"/>
-                <w:b w:val="0"/>
-                <w:i w:val="0"/>
-                <w:color w:val="222222"/>
-                <w:sz w:val="20"/>
-              </w:rPr>
-              <w:t>The twin's knob dose-response against real concentration-response curves</w:t>
+              <w:keepNext/>
+              <w:spacing w:after="0"/>
+            </w:pPr>
+            <w:r>
+              <w:rPr>
+                <w:rFonts w:ascii="Calibri" w:hAnsi="Calibri"/>
+                <w:b w:val="0"/>
+                <w:i w:val="0"/>
+                <w:color w:val="222222"/>
+                <w:sz w:val="20"/>
+              </w:rPr>
+              <w:t>The registration audit and hash chain, in this repository</w:t>
             </w:r>
           </w:p>
         </w:tc>
@@ -5884,18 +5884,18 @@
           </w:tcPr>
           <w:p>
             <w:pPr>
-              <w:keepNext w:val="0"/>
-              <w:spacing w:after="0"/>
-            </w:pPr>
-            <w:r>
-              <w:rPr>
-                <w:rFonts w:ascii="Calibri" w:hAnsi="Calibri"/>
-                <w:b w:val="0"/>
-                <w:i w:val="0"/>
-                <w:color w:val="222222"/>
-                <w:sz w:val="20"/>
-              </w:rPr>
-              <w:t>2 of 4 registered predictions pass; the mechanism label matters, the curve shape does not clear the line</w:t>
+              <w:keepNext/>
+              <w:spacing w:after="0"/>
+            </w:pPr>
+            <w:r>
+              <w:rPr>
+                <w:rFonts w:ascii="Calibri" w:hAnsi="Calibri"/>
+                <w:b w:val="0"/>
+                <w:i w:val="0"/>
+                <w:color w:val="222222"/>
+                <w:sz w:val="20"/>
+              </w:rPr>
+              <w:t>every registered prediction counted; no result file precedes its registration; corrected 2026-10-28 to count two studies it had missed</w:t>
             </w:r>
           </w:p>
         </w:tc>
@@ -5907,6 +5907,138 @@
           </w:tcPr>
           <w:p>
             <w:pPr>
+              <w:keepNext/>
+              <w:spacing w:after="0"/>
+            </w:pPr>
+            <w:r>
+              <w:rPr>
+                <w:rFonts w:ascii="Consolas" w:hAnsi="Consolas"/>
+                <w:b w:val="0"/>
+                <w:i w:val="0"/>
+                <w:color w:val="222222"/>
+                <w:sz w:val="18"/>
+              </w:rPr>
+              <w:t>d183585</w:t>
+            </w:r>
+            <w:r>
+              <w:rPr>
+                <w:rFonts w:ascii="Calibri" w:hAnsi="Calibri"/>
+                <w:b w:val="0"/>
+                <w:i w:val="0"/>
+                <w:color w:val="222222"/>
+                <w:sz w:val="20"/>
+              </w:rPr>
+              <w:t xml:space="preserve"> … this branch</w:t>
+            </w:r>
+          </w:p>
+        </w:tc>
+      </w:tr>
+      <w:tr>
+        <w:trPr>
+          <w:cantSplit/>
+        </w:trPr>
+        <w:tc>
+          <w:tcPr>
+            <w:tcW w:type="dxa" w:w="409"/>
+            <w:shd w:val="clear" w:color="auto" w:fill="F7F9FB"/>
+            <w:vAlign w:val="center"/>
+          </w:tcPr>
+          <w:p>
+            <w:pPr>
+              <w:keepNext w:val="0"/>
+              <w:spacing w:after="0"/>
+              <w:jc w:val="center"/>
+            </w:pPr>
+            <w:r>
+              <w:rPr>
+                <w:rFonts w:ascii="Calibri" w:hAnsi="Calibri"/>
+                <w:b/>
+                <w:i w:val="0"/>
+                <w:color w:val="222222"/>
+                <w:sz w:val="20"/>
+              </w:rPr>
+              <w:t>44</w:t>
+            </w:r>
+          </w:p>
+        </w:tc>
+        <w:tc>
+          <w:tcPr>
+            <w:tcW w:type="dxa" w:w="1552"/>
+            <w:shd w:val="clear" w:color="auto" w:fill="F7F9FB"/>
+            <w:vAlign w:val="center"/>
+          </w:tcPr>
+          <w:p>
+            <w:pPr>
+              <w:keepNext w:val="0"/>
+              <w:spacing w:after="0"/>
+              <w:jc w:val="center"/>
+            </w:pPr>
+            <w:r>
+              <w:rPr>
+                <w:rFonts w:ascii="Calibri" w:hAnsi="Calibri"/>
+                <w:b w:val="0"/>
+                <w:i w:val="0"/>
+                <w:color w:val="222222"/>
+                <w:sz w:val="20"/>
+              </w:rPr>
+              <w:t>2026-10-28</w:t>
+            </w:r>
+          </w:p>
+        </w:tc>
+        <w:tc>
+          <w:tcPr>
+            <w:tcW w:type="dxa" w:w="2793"/>
+            <w:shd w:val="clear" w:color="auto" w:fill="F7F9FB"/>
+            <w:vAlign w:val="center"/>
+          </w:tcPr>
+          <w:p>
+            <w:pPr>
+              <w:keepNext w:val="0"/>
+              <w:spacing w:after="0"/>
+            </w:pPr>
+            <w:r>
+              <w:rPr>
+                <w:rFonts w:ascii="Calibri" w:hAnsi="Calibri"/>
+                <w:b w:val="0"/>
+                <w:i w:val="0"/>
+                <w:color w:val="222222"/>
+                <w:sz w:val="20"/>
+              </w:rPr>
+              <w:t>The twin's knob dose-response against real concentration-response curves</w:t>
+            </w:r>
+          </w:p>
+        </w:tc>
+        <w:tc>
+          <w:tcPr>
+            <w:tcW w:type="dxa" w:w="2584"/>
+            <w:shd w:val="clear" w:color="auto" w:fill="F7F9FB"/>
+            <w:vAlign w:val="center"/>
+          </w:tcPr>
+          <w:p>
+            <w:pPr>
+              <w:keepNext w:val="0"/>
+              <w:spacing w:after="0"/>
+            </w:pPr>
+            <w:r>
+              <w:rPr>
+                <w:rFonts w:ascii="Calibri" w:hAnsi="Calibri"/>
+                <w:b w:val="0"/>
+                <w:i w:val="0"/>
+                <w:color w:val="222222"/>
+                <w:sz w:val="20"/>
+              </w:rPr>
+              <w:t>2 of 4 registered predictions pass; the mechanism label matters, the curve shape does not clear the line</w:t>
+            </w:r>
+          </w:p>
+        </w:tc>
+        <w:tc>
+          <w:tcPr>
+            <w:tcW w:type="dxa" w:w="1158"/>
+            <w:shd w:val="clear" w:color="auto" w:fill="F7F9FB"/>
+            <w:vAlign w:val="center"/>
+          </w:tcPr>
+          <w:p>
+            <w:pPr>
               <w:keepNext w:val="0"/>
               <w:spacing w:after="0"/>
             </w:pPr>
@@ -16336,6 +16468,456 @@
           <w:sz w:val="21"/>
         </w:rPr>
         <w:t>.</w:t>
+      </w:r>
+    </w:p>
+    <w:p>
+      <w:pPr>
+        <w:keepNext/>
+        <w:spacing w:before="240" w:after="60"/>
+      </w:pPr>
+      <w:r>
+        <w:rPr>
+          <w:rFonts w:ascii="Calibri" w:hAnsi="Calibri"/>
+          <w:b/>
+          <w:i w:val="0"/>
+          <w:color w:val="1F4E79"/>
+          <w:sz w:val="23"/>
+        </w:rPr>
+        <w:t>43. The registrations audited and hash-chained in this repository</w:t>
+      </w:r>
+    </w:p>
+    <w:p>
+      <w:pPr>
+        <w:spacing w:after="120"/>
+      </w:pPr>
+      <w:r>
+        <w:rPr>
+          <w:rFonts w:ascii="Calibri" w:hAnsi="Calibri"/>
+          <w:b/>
+          <w:i w:val="0"/>
+          <w:color w:val="156082"/>
+          <w:sz w:val="21"/>
+        </w:rPr>
+        <w:t>Slide message:</w:t>
+      </w:r>
+      <w:r>
+        <w:rPr>
+          <w:rFonts w:ascii="Calibri" w:hAnsi="Calibri"/>
+          <w:b w:val="0"/>
+          <w:i w:val="0"/>
+          <w:color w:val="222222"/>
+          <w:sz w:val="21"/>
+        </w:rPr>
+        <w:t xml:space="preserve"> </w:t>
+      </w:r>
+      <w:r>
+        <w:rPr>
+          <w:rFonts w:ascii="Calibri" w:hAnsi="Calibri"/>
+          <w:b w:val="0"/>
+          <w:i/>
+          <w:color w:val="222222"/>
+          <w:sz w:val="21"/>
+        </w:rPr>
+        <w:t>Every registered prediction is counted by a script, and every result file is checked against the commit that registered it, here, in the public repository.</w:t>
+      </w:r>
+    </w:p>
+    <w:p>
+      <w:pPr>
+        <w:spacing w:after="120"/>
+        <w:ind w:left="432" w:hanging="259"/>
+      </w:pPr>
+      <w:r>
+        <w:rPr>
+          <w:rFonts w:ascii="Calibri" w:hAnsi="Calibri"/>
+          <w:b w:val="0"/>
+          <w:i w:val="0"/>
+          <w:color w:val="222222"/>
+          <w:sz w:val="21"/>
+        </w:rPr>
+        <w:t>•</w:t>
+        <w:tab/>
+      </w:r>
+      <w:r>
+        <w:rPr>
+          <w:rFonts w:ascii="Calibri" w:hAnsi="Calibri"/>
+          <w:b/>
+          <w:i w:val="0"/>
+          <w:color w:val="156082"/>
+          <w:sz w:val="21"/>
+        </w:rPr>
+        <w:t>What changed.</w:t>
+      </w:r>
+      <w:r>
+        <w:rPr>
+          <w:rFonts w:ascii="Calibri" w:hAnsi="Calibri"/>
+          <w:b w:val="0"/>
+          <w:i w:val="0"/>
+          <w:color w:val="222222"/>
+          <w:sz w:val="21"/>
+        </w:rPr>
+        <w:t xml:space="preserve"> Two report tools come over from the manuscript repository, where they were first written: </w:t>
+      </w:r>
+      <w:r>
+        <w:rPr>
+          <w:rFonts w:ascii="Consolas" w:hAnsi="Consolas"/>
+          <w:b w:val="0"/>
+          <w:i w:val="0"/>
+          <w:color w:val="222222"/>
+          <w:sz w:val="19"/>
+        </w:rPr>
+        <w:t>neuromps.report.audit</w:t>
+      </w:r>
+      <w:r>
+        <w:rPr>
+          <w:rFonts w:ascii="Calibri" w:hAnsi="Calibri"/>
+          <w:b w:val="0"/>
+          <w:i w:val="0"/>
+          <w:color w:val="222222"/>
+          <w:sz w:val="21"/>
+        </w:rPr>
+        <w:t xml:space="preserve"> counts the outcome of every registered prediction in </w:t>
+      </w:r>
+      <w:r>
+        <w:rPr>
+          <w:rFonts w:ascii="Consolas" w:hAnsi="Consolas"/>
+          <w:b w:val="0"/>
+          <w:i w:val="0"/>
+          <w:color w:val="222222"/>
+          <w:sz w:val="19"/>
+        </w:rPr>
+        <w:t>outputs/metrics.json</w:t>
+      </w:r>
+      <w:r>
+        <w:rPr>
+          <w:rFonts w:ascii="Calibri" w:hAnsi="Calibri"/>
+          <w:b w:val="0"/>
+          <w:i w:val="0"/>
+          <w:color w:val="222222"/>
+          <w:sz w:val="21"/>
+        </w:rPr>
+        <w:t xml:space="preserve"> (now run at the end of every </w:t>
+      </w:r>
+      <w:r>
+        <w:rPr>
+          <w:rFonts w:ascii="Consolas" w:hAnsi="Consolas"/>
+          <w:b w:val="0"/>
+          <w:i w:val="0"/>
+          <w:color w:val="222222"/>
+          <w:sz w:val="19"/>
+        </w:rPr>
+        <w:t>run_all</w:t>
+      </w:r>
+      <w:r>
+        <w:rPr>
+          <w:rFonts w:ascii="Calibri" w:hAnsi="Calibri"/>
+          <w:b w:val="0"/>
+          <w:i w:val="0"/>
+          <w:color w:val="222222"/>
+          <w:sz w:val="21"/>
+        </w:rPr>
+        <w:t xml:space="preserve">), and </w:t>
+      </w:r>
+      <w:r>
+        <w:rPr>
+          <w:rFonts w:ascii="Consolas" w:hAnsi="Consolas"/>
+          <w:b w:val="0"/>
+          <w:i w:val="0"/>
+          <w:color w:val="222222"/>
+          <w:sz w:val="19"/>
+        </w:rPr>
+        <w:t>neuromps.report.timestamps</w:t>
+      </w:r>
+      <w:r>
+        <w:rPr>
+          <w:rFonts w:ascii="Calibri" w:hAnsi="Calibri"/>
+          <w:b w:val="0"/>
+          <w:i w:val="0"/>
+          <w:color w:val="222222"/>
+          <w:sz w:val="21"/>
+        </w:rPr>
+        <w:t xml:space="preserve"> writes </w:t>
+      </w:r>
+      <w:r>
+        <w:rPr>
+          <w:rFonts w:ascii="Consolas" w:hAnsi="Consolas"/>
+          <w:b w:val="0"/>
+          <w:i w:val="0"/>
+          <w:color w:val="222222"/>
+          <w:sz w:val="19"/>
+        </w:rPr>
+        <w:t>preregistration/TIMESTAMPS.json</w:t>
+      </w:r>
+      <w:r>
+        <w:rPr>
+          <w:rFonts w:ascii="Calibri" w:hAnsi="Calibri"/>
+          <w:b w:val="0"/>
+          <w:i w:val="0"/>
+          <w:color w:val="222222"/>
+          <w:sz w:val="21"/>
+        </w:rPr>
+        <w:t xml:space="preserve"> (each registration's checksum and first commit, a hash chain over them, and whether each result file came after its registration) and its counts to </w:t>
+      </w:r>
+      <w:r>
+        <w:rPr>
+          <w:rFonts w:ascii="Consolas" w:hAnsi="Consolas"/>
+          <w:b w:val="0"/>
+          <w:i w:val="0"/>
+          <w:color w:val="222222"/>
+          <w:sz w:val="19"/>
+        </w:rPr>
+        <w:t>metrics.json</w:t>
+      </w:r>
+      <w:r>
+        <w:rPr>
+          <w:rFonts w:ascii="Calibri" w:hAnsi="Calibri"/>
+          <w:b w:val="0"/>
+          <w:i w:val="0"/>
+          <w:color w:val="222222"/>
+          <w:sz w:val="21"/>
+        </w:rPr>
+        <w:t>. Report §21 describes both.</w:t>
+      </w:r>
+    </w:p>
+    <w:p>
+      <w:pPr>
+        <w:spacing w:after="120"/>
+        <w:ind w:left="432" w:hanging="259"/>
+      </w:pPr>
+      <w:r>
+        <w:rPr>
+          <w:rFonts w:ascii="Calibri" w:hAnsi="Calibri"/>
+          <w:b w:val="0"/>
+          <w:i w:val="0"/>
+          <w:color w:val="222222"/>
+          <w:sz w:val="21"/>
+        </w:rPr>
+        <w:t>•</w:t>
+        <w:tab/>
+      </w:r>
+      <w:r>
+        <w:rPr>
+          <w:rFonts w:ascii="Calibri" w:hAnsi="Calibri"/>
+          <w:b/>
+          <w:i w:val="0"/>
+          <w:color w:val="156082"/>
+          <w:sz w:val="21"/>
+        </w:rPr>
+        <w:t>Why.</w:t>
+      </w:r>
+      <w:r>
+        <w:rPr>
+          <w:rFonts w:ascii="Calibri" w:hAnsi="Calibri"/>
+          <w:b w:val="0"/>
+          <w:i w:val="0"/>
+          <w:color w:val="222222"/>
+          <w:sz w:val="21"/>
+        </w:rPr>
+        <w:t xml:space="preserve"> The final-round deck quoted registration counts and a hash chain that existed only in the private manuscript repository, so a reader of this repository could not check them.</w:t>
+      </w:r>
+    </w:p>
+    <w:p>
+      <w:pPr>
+        <w:spacing w:after="120"/>
+        <w:ind w:left="432" w:hanging="259"/>
+      </w:pPr>
+      <w:r>
+        <w:rPr>
+          <w:rFonts w:ascii="Calibri" w:hAnsi="Calibri"/>
+          <w:b w:val="0"/>
+          <w:i w:val="0"/>
+          <w:color w:val="222222"/>
+          <w:sz w:val="21"/>
+        </w:rPr>
+        <w:t>•</w:t>
+        <w:tab/>
+      </w:r>
+      <w:r>
+        <w:rPr>
+          <w:rFonts w:ascii="Calibri" w:hAnsi="Calibri"/>
+          <w:b/>
+          <w:i w:val="0"/>
+          <w:color w:val="156082"/>
+          <w:sz w:val="21"/>
+        </w:rPr>
+        <w:t>Effect.</w:t>
+      </w:r>
+    </w:p>
+    <w:p>
+      <w:pPr>
+        <w:spacing w:after="120"/>
+        <w:ind w:left="432" w:hanging="259"/>
+      </w:pPr>
+      <w:r>
+        <w:rPr>
+          <w:rFonts w:ascii="Calibri" w:hAnsi="Calibri"/>
+          <w:b w:val="0"/>
+          <w:i w:val="0"/>
+          <w:color w:val="222222"/>
+          <w:sz w:val="21"/>
+        </w:rPr>
+        <w:t>•</w:t>
+        <w:tab/>
+      </w:r>
+      <w:r>
+        <w:rPr>
+          <w:rFonts w:ascii="Calibri" w:hAnsi="Calibri"/>
+          <w:b w:val="0"/>
+          <w:i w:val="0"/>
+          <w:color w:val="222222"/>
+          <w:sz w:val="21"/>
+        </w:rPr>
+        <w:t>42 registered studies here made 216 predictions: 97 passed, 80 failed, 38 were uninterpretable.</w:t>
+      </w:r>
+    </w:p>
+    <w:p>
+      <w:pPr>
+        <w:spacing w:after="120"/>
+        <w:ind w:left="432" w:hanging="259"/>
+      </w:pPr>
+      <w:r>
+        <w:rPr>
+          <w:rFonts w:ascii="Calibri" w:hAnsi="Calibri"/>
+          <w:b w:val="0"/>
+          <w:i w:val="0"/>
+          <w:color w:val="222222"/>
+          <w:sz w:val="21"/>
+        </w:rPr>
+        <w:t>•</w:t>
+        <w:tab/>
+      </w:r>
+      <w:r>
+        <w:rPr>
+          <w:rFonts w:ascii="Calibri" w:hAnsi="Calibri"/>
+          <w:b w:val="0"/>
+          <w:i w:val="0"/>
+          <w:color w:val="222222"/>
+          <w:sz w:val="21"/>
+        </w:rPr>
+        <w:t>38 result files name their registration, and 0 of them came before it; 3 registrations are not covered because their results do not name them.</w:t>
+      </w:r>
+    </w:p>
+    <w:p>
+      <w:pPr>
+        <w:spacing w:after="120"/>
+        <w:ind w:left="432" w:hanging="259"/>
+      </w:pPr>
+      <w:r>
+        <w:rPr>
+          <w:rFonts w:ascii="Calibri" w:hAnsi="Calibri"/>
+          <w:b w:val="0"/>
+          <w:i w:val="0"/>
+          <w:color w:val="222222"/>
+          <w:sz w:val="21"/>
+        </w:rPr>
+        <w:t>•</w:t>
+        <w:tab/>
+      </w:r>
+      <w:r>
+        <w:rPr>
+          <w:rFonts w:ascii="Calibri" w:hAnsi="Calibri"/>
+          <w:b w:val="0"/>
+          <w:i w:val="0"/>
+          <w:color w:val="222222"/>
+          <w:sz w:val="21"/>
+        </w:rPr>
+        <w:t>No earlier result changes.</w:t>
+      </w:r>
+    </w:p>
+    <w:p>
+      <w:pPr>
+        <w:spacing w:after="120"/>
+        <w:ind w:left="432" w:hanging="259"/>
+      </w:pPr>
+      <w:r>
+        <w:rPr>
+          <w:rFonts w:ascii="Calibri" w:hAnsi="Calibri"/>
+          <w:b w:val="0"/>
+          <w:i w:val="0"/>
+          <w:color w:val="222222"/>
+          <w:sz w:val="21"/>
+        </w:rPr>
+        <w:t>•</w:t>
+        <w:tab/>
+      </w:r>
+      <w:r>
+        <w:rPr>
+          <w:rFonts w:ascii="Calibri" w:hAnsi="Calibri"/>
+          <w:b/>
+          <w:i w:val="0"/>
+          <w:color w:val="156082"/>
+          <w:sz w:val="21"/>
+        </w:rPr>
+        <w:t>Correction (2026-10-28).</w:t>
+      </w:r>
+      <w:r>
+        <w:rPr>
+          <w:rFonts w:ascii="Calibri" w:hAnsi="Calibri"/>
+          <w:b w:val="0"/>
+          <w:i w:val="0"/>
+          <w:color w:val="222222"/>
+          <w:sz w:val="21"/>
+        </w:rPr>
+        <w:t xml:space="preserve"> As first merged, the audit counted 40 studies and 208 predictions. It counted only predictions that carry an </w:t>
+      </w:r>
+      <w:r>
+        <w:rPr>
+          <w:rFonts w:ascii="Consolas" w:hAnsi="Consolas"/>
+          <w:b w:val="0"/>
+          <w:i w:val="0"/>
+          <w:color w:val="222222"/>
+          <w:sz w:val="19"/>
+        </w:rPr>
+        <w:t>outcome</w:t>
+      </w:r>
+      <w:r>
+        <w:rPr>
+          <w:rFonts w:ascii="Calibri" w:hAnsi="Calibri"/>
+          <w:b w:val="0"/>
+          <w:i w:val="0"/>
+          <w:color w:val="222222"/>
+          <w:sz w:val="21"/>
+        </w:rPr>
+        <w:t xml:space="preserve"> word, and two studies record a pass flag instead: the twin against the ToxCast positive controls (entry 42) and the dose response (entry 44). Both now record an outcome as well (pass, fail, or uninterpretable when a registered minimum is not met; no verdict changes), and the audit now names any study it cannot read (</w:t>
+      </w:r>
+      <w:r>
+        <w:rPr>
+          <w:rFonts w:ascii="Consolas" w:hAnsi="Consolas"/>
+          <w:b w:val="0"/>
+          <w:i w:val="0"/>
+          <w:color w:val="222222"/>
+          <w:sz w:val="19"/>
+        </w:rPr>
+        <w:t>registration_audit.unrecognised</w:t>
+      </w:r>
+      <w:r>
+        <w:rPr>
+          <w:rFonts w:ascii="Calibri" w:hAnsi="Calibri"/>
+          <w:b w:val="0"/>
+          <w:i w:val="0"/>
+          <w:color w:val="222222"/>
+          <w:sz w:val="21"/>
+        </w:rPr>
+        <w:t>, empty) and leaves out, by name, the rhythm audit, which re-reads predictions already counted under their own stages (</w:t>
+      </w:r>
+      <w:r>
+        <w:rPr>
+          <w:rFonts w:ascii="Consolas" w:hAnsi="Consolas"/>
+          <w:b w:val="0"/>
+          <w:i w:val="0"/>
+          <w:color w:val="222222"/>
+          <w:sz w:val="19"/>
+        </w:rPr>
+        <w:t>registration_audit.excluded</w:t>
+      </w:r>
+      <w:r>
+        <w:rPr>
+          <w:rFonts w:ascii="Calibri" w:hAnsi="Calibri"/>
+          <w:b w:val="0"/>
+          <w:i w:val="0"/>
+          <w:color w:val="222222"/>
+          <w:sz w:val="21"/>
+        </w:rPr>
+        <w:t>). The counts above include both studies.</w:t>
       </w:r>
     </w:p>
     <w:p>

</xml_diff>

<commit_message>
Redraw the D31 recalibration figure (legend off the panels); change-log entry 52; no number changed
The figure was redrawn by python -m neuromps.twin.recalibration --replot from
simulations regenerated with the registered seeds (the held-out set and the 51
recorded training chunks), after 1187 recorded values under
twin_hd14b_recalibration.{results,near_real,budget} were reproduced exactly
(largest difference 0). outputs/metrics.json is byte-identical. Appendix G
gains one sentence; change-log entry 52 (50-51 are on unmerged branches).
Technical report and change log rebuilt (.docx, .pdf).

Co-Authored-By: Claude Opus 5.5 <noreply@anthropic.com>
</commit_message>
<xml_diff>
--- a/report/POST_SUBMISSION_CHANGES.docx
+++ b/report/POST_SUBMISSION_CHANGES.docx
@@ -49,10 +49,10 @@
       </w:tblPr>
       <w:tblGrid>
         <w:gridCol w:w="407"/>
-        <w:gridCol w:w="1538"/>
-        <w:gridCol w:w="2797"/>
-        <w:gridCol w:w="2562"/>
-        <w:gridCol w:w="1191"/>
+        <w:gridCol w:w="1534"/>
+        <w:gridCol w:w="2859"/>
+        <w:gridCol w:w="2516"/>
+        <w:gridCol w:w="1180"/>
       </w:tblGrid>
       <w:tr>
         <w:trPr>
@@ -85,7 +85,7 @@
         </w:tc>
         <w:tc>
           <w:tcPr>
-            <w:tcW w:type="dxa" w:w="1538"/>
+            <w:tcW w:type="dxa" w:w="1534"/>
             <w:shd w:val="clear" w:color="auto" w:fill="1F4E79"/>
             <w:vAlign w:val="center"/>
           </w:tcPr>
@@ -109,7 +109,7 @@
         </w:tc>
         <w:tc>
           <w:tcPr>
-            <w:tcW w:type="dxa" w:w="2797"/>
+            <w:tcW w:type="dxa" w:w="2859"/>
             <w:shd w:val="clear" w:color="auto" w:fill="1F4E79"/>
             <w:vAlign w:val="center"/>
           </w:tcPr>
@@ -132,7 +132,7 @@
         </w:tc>
         <w:tc>
           <w:tcPr>
-            <w:tcW w:type="dxa" w:w="2562"/>
+            <w:tcW w:type="dxa" w:w="2516"/>
             <w:shd w:val="clear" w:color="auto" w:fill="1F4E79"/>
             <w:vAlign w:val="center"/>
           </w:tcPr>
@@ -155,7 +155,7 @@
         </w:tc>
         <w:tc>
           <w:tcPr>
-            <w:tcW w:type="dxa" w:w="1191"/>
+            <w:tcW w:type="dxa" w:w="1180"/>
             <w:shd w:val="clear" w:color="auto" w:fill="1F4E79"/>
             <w:vAlign w:val="center"/>
           </w:tcPr>
@@ -207,7 +207,7 @@
         </w:tc>
         <w:tc>
           <w:tcPr>
-            <w:tcW w:type="dxa" w:w="1538"/>
+            <w:tcW w:type="dxa" w:w="1534"/>
             <w:shd w:val="clear" w:color="auto" w:fill="FFFFFF"/>
             <w:vAlign w:val="center"/>
           </w:tcPr>
@@ -231,7 +231,7 @@
         </w:tc>
         <w:tc>
           <w:tcPr>
-            <w:tcW w:type="dxa" w:w="2797"/>
+            <w:tcW w:type="dxa" w:w="2859"/>
             <w:shd w:val="clear" w:color="auto" w:fill="FFFFFF"/>
             <w:vAlign w:val="center"/>
           </w:tcPr>
@@ -254,7 +254,7 @@
         </w:tc>
         <w:tc>
           <w:tcPr>
-            <w:tcW w:type="dxa" w:w="2562"/>
+            <w:tcW w:type="dxa" w:w="2516"/>
             <w:shd w:val="clear" w:color="auto" w:fill="FFFFFF"/>
             <w:vAlign w:val="center"/>
           </w:tcPr>
@@ -277,7 +277,7 @@
         </w:tc>
         <w:tc>
           <w:tcPr>
-            <w:tcW w:type="dxa" w:w="1191"/>
+            <w:tcW w:type="dxa" w:w="1180"/>
             <w:shd w:val="clear" w:color="auto" w:fill="FFFFFF"/>
             <w:vAlign w:val="center"/>
           </w:tcPr>
@@ -349,7 +349,7 @@
         </w:tc>
         <w:tc>
           <w:tcPr>
-            <w:tcW w:type="dxa" w:w="1538"/>
+            <w:tcW w:type="dxa" w:w="1534"/>
             <w:shd w:val="clear" w:color="auto" w:fill="F7F9FB"/>
             <w:vAlign w:val="center"/>
           </w:tcPr>
@@ -373,7 +373,7 @@
         </w:tc>
         <w:tc>
           <w:tcPr>
-            <w:tcW w:type="dxa" w:w="2797"/>
+            <w:tcW w:type="dxa" w:w="2859"/>
             <w:shd w:val="clear" w:color="auto" w:fill="F7F9FB"/>
             <w:vAlign w:val="center"/>
           </w:tcPr>
@@ -396,7 +396,7 @@
         </w:tc>
         <w:tc>
           <w:tcPr>
-            <w:tcW w:type="dxa" w:w="2562"/>
+            <w:tcW w:type="dxa" w:w="2516"/>
             <w:shd w:val="clear" w:color="auto" w:fill="F7F9FB"/>
             <w:vAlign w:val="center"/>
           </w:tcPr>
@@ -419,7 +419,7 @@
         </w:tc>
         <w:tc>
           <w:tcPr>
-            <w:tcW w:type="dxa" w:w="1191"/>
+            <w:tcW w:type="dxa" w:w="1180"/>
             <w:shd w:val="clear" w:color="auto" w:fill="F7F9FB"/>
             <w:vAlign w:val="center"/>
           </w:tcPr>
@@ -471,7 +471,7 @@
         </w:tc>
         <w:tc>
           <w:tcPr>
-            <w:tcW w:type="dxa" w:w="1538"/>
+            <w:tcW w:type="dxa" w:w="1534"/>
             <w:shd w:val="clear" w:color="auto" w:fill="FFFFFF"/>
             <w:vAlign w:val="center"/>
           </w:tcPr>
@@ -495,7 +495,7 @@
         </w:tc>
         <w:tc>
           <w:tcPr>
-            <w:tcW w:type="dxa" w:w="2797"/>
+            <w:tcW w:type="dxa" w:w="2859"/>
             <w:shd w:val="clear" w:color="auto" w:fill="FFFFFF"/>
             <w:vAlign w:val="center"/>
           </w:tcPr>
@@ -518,7 +518,7 @@
         </w:tc>
         <w:tc>
           <w:tcPr>
-            <w:tcW w:type="dxa" w:w="2562"/>
+            <w:tcW w:type="dxa" w:w="2516"/>
             <w:shd w:val="clear" w:color="auto" w:fill="FFFFFF"/>
             <w:vAlign w:val="center"/>
           </w:tcPr>
@@ -541,7 +541,7 @@
         </w:tc>
         <w:tc>
           <w:tcPr>
-            <w:tcW w:type="dxa" w:w="1191"/>
+            <w:tcW w:type="dxa" w:w="1180"/>
             <w:shd w:val="clear" w:color="auto" w:fill="FFFFFF"/>
             <w:vAlign w:val="center"/>
           </w:tcPr>
@@ -593,7 +593,7 @@
         </w:tc>
         <w:tc>
           <w:tcPr>
-            <w:tcW w:type="dxa" w:w="1538"/>
+            <w:tcW w:type="dxa" w:w="1534"/>
             <w:shd w:val="clear" w:color="auto" w:fill="F7F9FB"/>
             <w:vAlign w:val="center"/>
           </w:tcPr>
@@ -617,7 +617,7 @@
         </w:tc>
         <w:tc>
           <w:tcPr>
-            <w:tcW w:type="dxa" w:w="2797"/>
+            <w:tcW w:type="dxa" w:w="2859"/>
             <w:shd w:val="clear" w:color="auto" w:fill="F7F9FB"/>
             <w:vAlign w:val="center"/>
           </w:tcPr>
@@ -640,7 +640,7 @@
         </w:tc>
         <w:tc>
           <w:tcPr>
-            <w:tcW w:type="dxa" w:w="2562"/>
+            <w:tcW w:type="dxa" w:w="2516"/>
             <w:shd w:val="clear" w:color="auto" w:fill="F7F9FB"/>
             <w:vAlign w:val="center"/>
           </w:tcPr>
@@ -663,7 +663,7 @@
         </w:tc>
         <w:tc>
           <w:tcPr>
-            <w:tcW w:type="dxa" w:w="1191"/>
+            <w:tcW w:type="dxa" w:w="1180"/>
             <w:shd w:val="clear" w:color="auto" w:fill="F7F9FB"/>
             <w:vAlign w:val="center"/>
           </w:tcPr>
@@ -735,7 +735,7 @@
         </w:tc>
         <w:tc>
           <w:tcPr>
-            <w:tcW w:type="dxa" w:w="1538"/>
+            <w:tcW w:type="dxa" w:w="1534"/>
             <w:shd w:val="clear" w:color="auto" w:fill="FFFFFF"/>
             <w:vAlign w:val="center"/>
           </w:tcPr>
@@ -759,7 +759,7 @@
         </w:tc>
         <w:tc>
           <w:tcPr>
-            <w:tcW w:type="dxa" w:w="2797"/>
+            <w:tcW w:type="dxa" w:w="2859"/>
             <w:shd w:val="clear" w:color="auto" w:fill="FFFFFF"/>
             <w:vAlign w:val="center"/>
           </w:tcPr>
@@ -782,7 +782,7 @@
         </w:tc>
         <w:tc>
           <w:tcPr>
-            <w:tcW w:type="dxa" w:w="2562"/>
+            <w:tcW w:type="dxa" w:w="2516"/>
             <w:shd w:val="clear" w:color="auto" w:fill="FFFFFF"/>
             <w:vAlign w:val="center"/>
           </w:tcPr>
@@ -805,7 +805,7 @@
         </w:tc>
         <w:tc>
           <w:tcPr>
-            <w:tcW w:type="dxa" w:w="1191"/>
+            <w:tcW w:type="dxa" w:w="1180"/>
             <w:shd w:val="clear" w:color="auto" w:fill="FFFFFF"/>
             <w:vAlign w:val="center"/>
           </w:tcPr>
@@ -857,7 +857,7 @@
         </w:tc>
         <w:tc>
           <w:tcPr>
-            <w:tcW w:type="dxa" w:w="1538"/>
+            <w:tcW w:type="dxa" w:w="1534"/>
             <w:shd w:val="clear" w:color="auto" w:fill="F7F9FB"/>
             <w:vAlign w:val="center"/>
           </w:tcPr>
@@ -881,7 +881,7 @@
         </w:tc>
         <w:tc>
           <w:tcPr>
-            <w:tcW w:type="dxa" w:w="2797"/>
+            <w:tcW w:type="dxa" w:w="2859"/>
             <w:shd w:val="clear" w:color="auto" w:fill="F7F9FB"/>
             <w:vAlign w:val="center"/>
           </w:tcPr>
@@ -904,7 +904,7 @@
         </w:tc>
         <w:tc>
           <w:tcPr>
-            <w:tcW w:type="dxa" w:w="2562"/>
+            <w:tcW w:type="dxa" w:w="2516"/>
             <w:shd w:val="clear" w:color="auto" w:fill="F7F9FB"/>
             <w:vAlign w:val="center"/>
           </w:tcPr>
@@ -927,7 +927,7 @@
         </w:tc>
         <w:tc>
           <w:tcPr>
-            <w:tcW w:type="dxa" w:w="1191"/>
+            <w:tcW w:type="dxa" w:w="1180"/>
             <w:shd w:val="clear" w:color="auto" w:fill="F7F9FB"/>
             <w:vAlign w:val="center"/>
           </w:tcPr>
@@ -979,7 +979,7 @@
         </w:tc>
         <w:tc>
           <w:tcPr>
-            <w:tcW w:type="dxa" w:w="1538"/>
+            <w:tcW w:type="dxa" w:w="1534"/>
             <w:shd w:val="clear" w:color="auto" w:fill="FFFFFF"/>
             <w:vAlign w:val="center"/>
           </w:tcPr>
@@ -1003,7 +1003,7 @@
         </w:tc>
         <w:tc>
           <w:tcPr>
-            <w:tcW w:type="dxa" w:w="2797"/>
+            <w:tcW w:type="dxa" w:w="2859"/>
             <w:shd w:val="clear" w:color="auto" w:fill="FFFFFF"/>
             <w:vAlign w:val="center"/>
           </w:tcPr>
@@ -1026,7 +1026,7 @@
         </w:tc>
         <w:tc>
           <w:tcPr>
-            <w:tcW w:type="dxa" w:w="2562"/>
+            <w:tcW w:type="dxa" w:w="2516"/>
             <w:shd w:val="clear" w:color="auto" w:fill="FFFFFF"/>
             <w:vAlign w:val="center"/>
           </w:tcPr>
@@ -1049,7 +1049,7 @@
         </w:tc>
         <w:tc>
           <w:tcPr>
-            <w:tcW w:type="dxa" w:w="1191"/>
+            <w:tcW w:type="dxa" w:w="1180"/>
             <w:shd w:val="clear" w:color="auto" w:fill="FFFFFF"/>
             <w:vAlign w:val="center"/>
           </w:tcPr>
@@ -1121,7 +1121,7 @@
         </w:tc>
         <w:tc>
           <w:tcPr>
-            <w:tcW w:type="dxa" w:w="1538"/>
+            <w:tcW w:type="dxa" w:w="1534"/>
             <w:shd w:val="clear" w:color="auto" w:fill="F7F9FB"/>
             <w:vAlign w:val="center"/>
           </w:tcPr>
@@ -1145,7 +1145,7 @@
         </w:tc>
         <w:tc>
           <w:tcPr>
-            <w:tcW w:type="dxa" w:w="2797"/>
+            <w:tcW w:type="dxa" w:w="2859"/>
             <w:shd w:val="clear" w:color="auto" w:fill="F7F9FB"/>
             <w:vAlign w:val="center"/>
           </w:tcPr>
@@ -1168,7 +1168,7 @@
         </w:tc>
         <w:tc>
           <w:tcPr>
-            <w:tcW w:type="dxa" w:w="2562"/>
+            <w:tcW w:type="dxa" w:w="2516"/>
             <w:shd w:val="clear" w:color="auto" w:fill="F7F9FB"/>
             <w:vAlign w:val="center"/>
           </w:tcPr>
@@ -1191,7 +1191,7 @@
         </w:tc>
         <w:tc>
           <w:tcPr>
-            <w:tcW w:type="dxa" w:w="1191"/>
+            <w:tcW w:type="dxa" w:w="1180"/>
             <w:shd w:val="clear" w:color="auto" w:fill="F7F9FB"/>
             <w:vAlign w:val="center"/>
           </w:tcPr>
@@ -1263,7 +1263,7 @@
         </w:tc>
         <w:tc>
           <w:tcPr>
-            <w:tcW w:type="dxa" w:w="1538"/>
+            <w:tcW w:type="dxa" w:w="1534"/>
             <w:shd w:val="clear" w:color="auto" w:fill="FFFFFF"/>
             <w:vAlign w:val="center"/>
           </w:tcPr>
@@ -1287,7 +1287,7 @@
         </w:tc>
         <w:tc>
           <w:tcPr>
-            <w:tcW w:type="dxa" w:w="2797"/>
+            <w:tcW w:type="dxa" w:w="2859"/>
             <w:shd w:val="clear" w:color="auto" w:fill="FFFFFF"/>
             <w:vAlign w:val="center"/>
           </w:tcPr>
@@ -1310,7 +1310,7 @@
         </w:tc>
         <w:tc>
           <w:tcPr>
-            <w:tcW w:type="dxa" w:w="2562"/>
+            <w:tcW w:type="dxa" w:w="2516"/>
             <w:shd w:val="clear" w:color="auto" w:fill="FFFFFF"/>
             <w:vAlign w:val="center"/>
           </w:tcPr>
@@ -1333,7 +1333,7 @@
         </w:tc>
         <w:tc>
           <w:tcPr>
-            <w:tcW w:type="dxa" w:w="1191"/>
+            <w:tcW w:type="dxa" w:w="1180"/>
             <w:shd w:val="clear" w:color="auto" w:fill="FFFFFF"/>
             <w:vAlign w:val="center"/>
           </w:tcPr>
@@ -1405,7 +1405,7 @@
         </w:tc>
         <w:tc>
           <w:tcPr>
-            <w:tcW w:type="dxa" w:w="1538"/>
+            <w:tcW w:type="dxa" w:w="1534"/>
             <w:shd w:val="clear" w:color="auto" w:fill="F7F9FB"/>
             <w:vAlign w:val="center"/>
           </w:tcPr>
@@ -1429,7 +1429,7 @@
         </w:tc>
         <w:tc>
           <w:tcPr>
-            <w:tcW w:type="dxa" w:w="2797"/>
+            <w:tcW w:type="dxa" w:w="2859"/>
             <w:shd w:val="clear" w:color="auto" w:fill="F7F9FB"/>
             <w:vAlign w:val="center"/>
           </w:tcPr>
@@ -1452,7 +1452,7 @@
         </w:tc>
         <w:tc>
           <w:tcPr>
-            <w:tcW w:type="dxa" w:w="2562"/>
+            <w:tcW w:type="dxa" w:w="2516"/>
             <w:shd w:val="clear" w:color="auto" w:fill="F7F9FB"/>
             <w:vAlign w:val="center"/>
           </w:tcPr>
@@ -1475,7 +1475,7 @@
         </w:tc>
         <w:tc>
           <w:tcPr>
-            <w:tcW w:type="dxa" w:w="1191"/>
+            <w:tcW w:type="dxa" w:w="1180"/>
             <w:shd w:val="clear" w:color="auto" w:fill="F7F9FB"/>
             <w:vAlign w:val="center"/>
           </w:tcPr>
@@ -1547,7 +1547,7 @@
         </w:tc>
         <w:tc>
           <w:tcPr>
-            <w:tcW w:type="dxa" w:w="1538"/>
+            <w:tcW w:type="dxa" w:w="1534"/>
             <w:shd w:val="clear" w:color="auto" w:fill="FFFFFF"/>
             <w:vAlign w:val="center"/>
           </w:tcPr>
@@ -1571,7 +1571,7 @@
         </w:tc>
         <w:tc>
           <w:tcPr>
-            <w:tcW w:type="dxa" w:w="2797"/>
+            <w:tcW w:type="dxa" w:w="2859"/>
             <w:shd w:val="clear" w:color="auto" w:fill="FFFFFF"/>
             <w:vAlign w:val="center"/>
           </w:tcPr>
@@ -1594,7 +1594,7 @@
         </w:tc>
         <w:tc>
           <w:tcPr>
-            <w:tcW w:type="dxa" w:w="2562"/>
+            <w:tcW w:type="dxa" w:w="2516"/>
             <w:shd w:val="clear" w:color="auto" w:fill="FFFFFF"/>
             <w:vAlign w:val="center"/>
           </w:tcPr>
@@ -1617,7 +1617,7 @@
         </w:tc>
         <w:tc>
           <w:tcPr>
-            <w:tcW w:type="dxa" w:w="1191"/>
+            <w:tcW w:type="dxa" w:w="1180"/>
             <w:shd w:val="clear" w:color="auto" w:fill="FFFFFF"/>
             <w:vAlign w:val="center"/>
           </w:tcPr>
@@ -1689,7 +1689,7 @@
         </w:tc>
         <w:tc>
           <w:tcPr>
-            <w:tcW w:type="dxa" w:w="1538"/>
+            <w:tcW w:type="dxa" w:w="1534"/>
             <w:shd w:val="clear" w:color="auto" w:fill="F7F9FB"/>
             <w:vAlign w:val="center"/>
           </w:tcPr>
@@ -1713,7 +1713,7 @@
         </w:tc>
         <w:tc>
           <w:tcPr>
-            <w:tcW w:type="dxa" w:w="2797"/>
+            <w:tcW w:type="dxa" w:w="2859"/>
             <w:shd w:val="clear" w:color="auto" w:fill="F7F9FB"/>
             <w:vAlign w:val="center"/>
           </w:tcPr>
@@ -1736,7 +1736,7 @@
         </w:tc>
         <w:tc>
           <w:tcPr>
-            <w:tcW w:type="dxa" w:w="2562"/>
+            <w:tcW w:type="dxa" w:w="2516"/>
             <w:shd w:val="clear" w:color="auto" w:fill="F7F9FB"/>
             <w:vAlign w:val="center"/>
           </w:tcPr>
@@ -1759,7 +1759,7 @@
         </w:tc>
         <w:tc>
           <w:tcPr>
-            <w:tcW w:type="dxa" w:w="1191"/>
+            <w:tcW w:type="dxa" w:w="1180"/>
             <w:shd w:val="clear" w:color="auto" w:fill="F7F9FB"/>
             <w:vAlign w:val="center"/>
           </w:tcPr>
@@ -1811,7 +1811,7 @@
         </w:tc>
         <w:tc>
           <w:tcPr>
-            <w:tcW w:type="dxa" w:w="1538"/>
+            <w:tcW w:type="dxa" w:w="1534"/>
             <w:shd w:val="clear" w:color="auto" w:fill="FFFFFF"/>
             <w:vAlign w:val="center"/>
           </w:tcPr>
@@ -1835,7 +1835,7 @@
         </w:tc>
         <w:tc>
           <w:tcPr>
-            <w:tcW w:type="dxa" w:w="2797"/>
+            <w:tcW w:type="dxa" w:w="2859"/>
             <w:shd w:val="clear" w:color="auto" w:fill="FFFFFF"/>
             <w:vAlign w:val="center"/>
           </w:tcPr>
@@ -1858,7 +1858,7 @@
         </w:tc>
         <w:tc>
           <w:tcPr>
-            <w:tcW w:type="dxa" w:w="2562"/>
+            <w:tcW w:type="dxa" w:w="2516"/>
             <w:shd w:val="clear" w:color="auto" w:fill="FFFFFF"/>
             <w:vAlign w:val="center"/>
           </w:tcPr>
@@ -1881,7 +1881,7 @@
         </w:tc>
         <w:tc>
           <w:tcPr>
-            <w:tcW w:type="dxa" w:w="1191"/>
+            <w:tcW w:type="dxa" w:w="1180"/>
             <w:shd w:val="clear" w:color="auto" w:fill="FFFFFF"/>
             <w:vAlign w:val="center"/>
           </w:tcPr>
@@ -1943,7 +1943,7 @@
         </w:tc>
         <w:tc>
           <w:tcPr>
-            <w:tcW w:type="dxa" w:w="1538"/>
+            <w:tcW w:type="dxa" w:w="1534"/>
             <w:shd w:val="clear" w:color="auto" w:fill="F7F9FB"/>
             <w:vAlign w:val="center"/>
           </w:tcPr>
@@ -1967,7 +1967,7 @@
         </w:tc>
         <w:tc>
           <w:tcPr>
-            <w:tcW w:type="dxa" w:w="2797"/>
+            <w:tcW w:type="dxa" w:w="2859"/>
             <w:shd w:val="clear" w:color="auto" w:fill="F7F9FB"/>
             <w:vAlign w:val="center"/>
           </w:tcPr>
@@ -1990,7 +1990,7 @@
         </w:tc>
         <w:tc>
           <w:tcPr>
-            <w:tcW w:type="dxa" w:w="2562"/>
+            <w:tcW w:type="dxa" w:w="2516"/>
             <w:shd w:val="clear" w:color="auto" w:fill="F7F9FB"/>
             <w:vAlign w:val="center"/>
           </w:tcPr>
@@ -2013,7 +2013,7 @@
         </w:tc>
         <w:tc>
           <w:tcPr>
-            <w:tcW w:type="dxa" w:w="1191"/>
+            <w:tcW w:type="dxa" w:w="1180"/>
             <w:shd w:val="clear" w:color="auto" w:fill="F7F9FB"/>
             <w:vAlign w:val="center"/>
           </w:tcPr>
@@ -2085,7 +2085,7 @@
         </w:tc>
         <w:tc>
           <w:tcPr>
-            <w:tcW w:type="dxa" w:w="1538"/>
+            <w:tcW w:type="dxa" w:w="1534"/>
             <w:shd w:val="clear" w:color="auto" w:fill="FFFFFF"/>
             <w:vAlign w:val="center"/>
           </w:tcPr>
@@ -2109,7 +2109,7 @@
         </w:tc>
         <w:tc>
           <w:tcPr>
-            <w:tcW w:type="dxa" w:w="2797"/>
+            <w:tcW w:type="dxa" w:w="2859"/>
             <w:shd w:val="clear" w:color="auto" w:fill="FFFFFF"/>
             <w:vAlign w:val="center"/>
           </w:tcPr>
@@ -2132,7 +2132,7 @@
         </w:tc>
         <w:tc>
           <w:tcPr>
-            <w:tcW w:type="dxa" w:w="2562"/>
+            <w:tcW w:type="dxa" w:w="2516"/>
             <w:shd w:val="clear" w:color="auto" w:fill="FFFFFF"/>
             <w:vAlign w:val="center"/>
           </w:tcPr>
@@ -2155,7 +2155,7 @@
         </w:tc>
         <w:tc>
           <w:tcPr>
-            <w:tcW w:type="dxa" w:w="1191"/>
+            <w:tcW w:type="dxa" w:w="1180"/>
             <w:shd w:val="clear" w:color="auto" w:fill="FFFFFF"/>
             <w:vAlign w:val="center"/>
           </w:tcPr>
@@ -2227,7 +2227,7 @@
         </w:tc>
         <w:tc>
           <w:tcPr>
-            <w:tcW w:type="dxa" w:w="1538"/>
+            <w:tcW w:type="dxa" w:w="1534"/>
             <w:shd w:val="clear" w:color="auto" w:fill="F7F9FB"/>
             <w:vAlign w:val="center"/>
           </w:tcPr>
@@ -2251,7 +2251,7 @@
         </w:tc>
         <w:tc>
           <w:tcPr>
-            <w:tcW w:type="dxa" w:w="2797"/>
+            <w:tcW w:type="dxa" w:w="2859"/>
             <w:shd w:val="clear" w:color="auto" w:fill="F7F9FB"/>
             <w:vAlign w:val="center"/>
           </w:tcPr>
@@ -2274,7 +2274,7 @@
         </w:tc>
         <w:tc>
           <w:tcPr>
-            <w:tcW w:type="dxa" w:w="2562"/>
+            <w:tcW w:type="dxa" w:w="2516"/>
             <w:shd w:val="clear" w:color="auto" w:fill="F7F9FB"/>
             <w:vAlign w:val="center"/>
           </w:tcPr>
@@ -2297,7 +2297,7 @@
         </w:tc>
         <w:tc>
           <w:tcPr>
-            <w:tcW w:type="dxa" w:w="1191"/>
+            <w:tcW w:type="dxa" w:w="1180"/>
             <w:shd w:val="clear" w:color="auto" w:fill="F7F9FB"/>
             <w:vAlign w:val="center"/>
           </w:tcPr>
@@ -2359,7 +2359,7 @@
         </w:tc>
         <w:tc>
           <w:tcPr>
-            <w:tcW w:type="dxa" w:w="1538"/>
+            <w:tcW w:type="dxa" w:w="1534"/>
             <w:shd w:val="clear" w:color="auto" w:fill="FFFFFF"/>
             <w:vAlign w:val="center"/>
           </w:tcPr>
@@ -2383,7 +2383,7 @@
         </w:tc>
         <w:tc>
           <w:tcPr>
-            <w:tcW w:type="dxa" w:w="2797"/>
+            <w:tcW w:type="dxa" w:w="2859"/>
             <w:shd w:val="clear" w:color="auto" w:fill="FFFFFF"/>
             <w:vAlign w:val="center"/>
           </w:tcPr>
@@ -2406,7 +2406,7 @@
         </w:tc>
         <w:tc>
           <w:tcPr>
-            <w:tcW w:type="dxa" w:w="2562"/>
+            <w:tcW w:type="dxa" w:w="2516"/>
             <w:shd w:val="clear" w:color="auto" w:fill="FFFFFF"/>
             <w:vAlign w:val="center"/>
           </w:tcPr>
@@ -2429,7 +2429,7 @@
         </w:tc>
         <w:tc>
           <w:tcPr>
-            <w:tcW w:type="dxa" w:w="1191"/>
+            <w:tcW w:type="dxa" w:w="1180"/>
             <w:shd w:val="clear" w:color="auto" w:fill="FFFFFF"/>
             <w:vAlign w:val="center"/>
           </w:tcPr>
@@ -2501,7 +2501,7 @@
         </w:tc>
         <w:tc>
           <w:tcPr>
-            <w:tcW w:type="dxa" w:w="1538"/>
+            <w:tcW w:type="dxa" w:w="1534"/>
             <w:shd w:val="clear" w:color="auto" w:fill="F7F9FB"/>
             <w:vAlign w:val="center"/>
           </w:tcPr>
@@ -2525,7 +2525,7 @@
         </w:tc>
         <w:tc>
           <w:tcPr>
-            <w:tcW w:type="dxa" w:w="2797"/>
+            <w:tcW w:type="dxa" w:w="2859"/>
             <w:shd w:val="clear" w:color="auto" w:fill="F7F9FB"/>
             <w:vAlign w:val="center"/>
           </w:tcPr>
@@ -2548,7 +2548,7 @@
         </w:tc>
         <w:tc>
           <w:tcPr>
-            <w:tcW w:type="dxa" w:w="2562"/>
+            <w:tcW w:type="dxa" w:w="2516"/>
             <w:shd w:val="clear" w:color="auto" w:fill="F7F9FB"/>
             <w:vAlign w:val="center"/>
           </w:tcPr>
@@ -2571,7 +2571,7 @@
         </w:tc>
         <w:tc>
           <w:tcPr>
-            <w:tcW w:type="dxa" w:w="1191"/>
+            <w:tcW w:type="dxa" w:w="1180"/>
             <w:shd w:val="clear" w:color="auto" w:fill="F7F9FB"/>
             <w:vAlign w:val="center"/>
           </w:tcPr>
@@ -2643,7 +2643,7 @@
         </w:tc>
         <w:tc>
           <w:tcPr>
-            <w:tcW w:type="dxa" w:w="1538"/>
+            <w:tcW w:type="dxa" w:w="1534"/>
             <w:shd w:val="clear" w:color="auto" w:fill="FFFFFF"/>
             <w:vAlign w:val="center"/>
           </w:tcPr>
@@ -2667,7 +2667,7 @@
         </w:tc>
         <w:tc>
           <w:tcPr>
-            <w:tcW w:type="dxa" w:w="2797"/>
+            <w:tcW w:type="dxa" w:w="2859"/>
             <w:shd w:val="clear" w:color="auto" w:fill="FFFFFF"/>
             <w:vAlign w:val="center"/>
           </w:tcPr>
@@ -2690,7 +2690,7 @@
         </w:tc>
         <w:tc>
           <w:tcPr>
-            <w:tcW w:type="dxa" w:w="2562"/>
+            <w:tcW w:type="dxa" w:w="2516"/>
             <w:shd w:val="clear" w:color="auto" w:fill="FFFFFF"/>
             <w:vAlign w:val="center"/>
           </w:tcPr>
@@ -2713,7 +2713,7 @@
         </w:tc>
         <w:tc>
           <w:tcPr>
-            <w:tcW w:type="dxa" w:w="1191"/>
+            <w:tcW w:type="dxa" w:w="1180"/>
             <w:shd w:val="clear" w:color="auto" w:fill="FFFFFF"/>
             <w:vAlign w:val="center"/>
           </w:tcPr>
@@ -2785,7 +2785,7 @@
         </w:tc>
         <w:tc>
           <w:tcPr>
-            <w:tcW w:type="dxa" w:w="1538"/>
+            <w:tcW w:type="dxa" w:w="1534"/>
             <w:shd w:val="clear" w:color="auto" w:fill="F7F9FB"/>
             <w:vAlign w:val="center"/>
           </w:tcPr>
@@ -2809,7 +2809,7 @@
         </w:tc>
         <w:tc>
           <w:tcPr>
-            <w:tcW w:type="dxa" w:w="2797"/>
+            <w:tcW w:type="dxa" w:w="2859"/>
             <w:shd w:val="clear" w:color="auto" w:fill="F7F9FB"/>
             <w:vAlign w:val="center"/>
           </w:tcPr>
@@ -2832,7 +2832,7 @@
         </w:tc>
         <w:tc>
           <w:tcPr>
-            <w:tcW w:type="dxa" w:w="2562"/>
+            <w:tcW w:type="dxa" w:w="2516"/>
             <w:shd w:val="clear" w:color="auto" w:fill="F7F9FB"/>
             <w:vAlign w:val="center"/>
           </w:tcPr>
@@ -2855,7 +2855,7 @@
         </w:tc>
         <w:tc>
           <w:tcPr>
-            <w:tcW w:type="dxa" w:w="1191"/>
+            <w:tcW w:type="dxa" w:w="1180"/>
             <w:shd w:val="clear" w:color="auto" w:fill="F7F9FB"/>
             <w:vAlign w:val="center"/>
           </w:tcPr>
@@ -2927,7 +2927,7 @@
         </w:tc>
         <w:tc>
           <w:tcPr>
-            <w:tcW w:type="dxa" w:w="1538"/>
+            <w:tcW w:type="dxa" w:w="1534"/>
             <w:shd w:val="clear" w:color="auto" w:fill="FFFFFF"/>
             <w:vAlign w:val="center"/>
           </w:tcPr>
@@ -2951,7 +2951,7 @@
         </w:tc>
         <w:tc>
           <w:tcPr>
-            <w:tcW w:type="dxa" w:w="2797"/>
+            <w:tcW w:type="dxa" w:w="2859"/>
             <w:shd w:val="clear" w:color="auto" w:fill="FFFFFF"/>
             <w:vAlign w:val="center"/>
           </w:tcPr>
@@ -2974,7 +2974,7 @@
         </w:tc>
         <w:tc>
           <w:tcPr>
-            <w:tcW w:type="dxa" w:w="2562"/>
+            <w:tcW w:type="dxa" w:w="2516"/>
             <w:shd w:val="clear" w:color="auto" w:fill="FFFFFF"/>
             <w:vAlign w:val="center"/>
           </w:tcPr>
@@ -2997,7 +2997,7 @@
         </w:tc>
         <w:tc>
           <w:tcPr>
-            <w:tcW w:type="dxa" w:w="1191"/>
+            <w:tcW w:type="dxa" w:w="1180"/>
             <w:shd w:val="clear" w:color="auto" w:fill="FFFFFF"/>
             <w:vAlign w:val="center"/>
           </w:tcPr>
@@ -3069,7 +3069,7 @@
         </w:tc>
         <w:tc>
           <w:tcPr>
-            <w:tcW w:type="dxa" w:w="1538"/>
+            <w:tcW w:type="dxa" w:w="1534"/>
             <w:shd w:val="clear" w:color="auto" w:fill="F7F9FB"/>
             <w:vAlign w:val="center"/>
           </w:tcPr>
@@ -3093,7 +3093,7 @@
         </w:tc>
         <w:tc>
           <w:tcPr>
-            <w:tcW w:type="dxa" w:w="2797"/>
+            <w:tcW w:type="dxa" w:w="2859"/>
             <w:shd w:val="clear" w:color="auto" w:fill="F7F9FB"/>
             <w:vAlign w:val="center"/>
           </w:tcPr>
@@ -3116,7 +3116,7 @@
         </w:tc>
         <w:tc>
           <w:tcPr>
-            <w:tcW w:type="dxa" w:w="2562"/>
+            <w:tcW w:type="dxa" w:w="2516"/>
             <w:shd w:val="clear" w:color="auto" w:fill="F7F9FB"/>
             <w:vAlign w:val="center"/>
           </w:tcPr>
@@ -3139,7 +3139,7 @@
         </w:tc>
         <w:tc>
           <w:tcPr>
-            <w:tcW w:type="dxa" w:w="1191"/>
+            <w:tcW w:type="dxa" w:w="1180"/>
             <w:shd w:val="clear" w:color="auto" w:fill="F7F9FB"/>
             <w:vAlign w:val="center"/>
           </w:tcPr>
@@ -3201,7 +3201,7 @@
         </w:tc>
         <w:tc>
           <w:tcPr>
-            <w:tcW w:type="dxa" w:w="1538"/>
+            <w:tcW w:type="dxa" w:w="1534"/>
             <w:shd w:val="clear" w:color="auto" w:fill="FFFFFF"/>
             <w:vAlign w:val="center"/>
           </w:tcPr>
@@ -3225,7 +3225,7 @@
         </w:tc>
         <w:tc>
           <w:tcPr>
-            <w:tcW w:type="dxa" w:w="2797"/>
+            <w:tcW w:type="dxa" w:w="2859"/>
             <w:shd w:val="clear" w:color="auto" w:fill="FFFFFF"/>
             <w:vAlign w:val="center"/>
           </w:tcPr>
@@ -3248,7 +3248,7 @@
         </w:tc>
         <w:tc>
           <w:tcPr>
-            <w:tcW w:type="dxa" w:w="2562"/>
+            <w:tcW w:type="dxa" w:w="2516"/>
             <w:shd w:val="clear" w:color="auto" w:fill="FFFFFF"/>
             <w:vAlign w:val="center"/>
           </w:tcPr>
@@ -3271,7 +3271,7 @@
         </w:tc>
         <w:tc>
           <w:tcPr>
-            <w:tcW w:type="dxa" w:w="1191"/>
+            <w:tcW w:type="dxa" w:w="1180"/>
             <w:shd w:val="clear" w:color="auto" w:fill="FFFFFF"/>
             <w:vAlign w:val="center"/>
           </w:tcPr>
@@ -3333,7 +3333,7 @@
         </w:tc>
         <w:tc>
           <w:tcPr>
-            <w:tcW w:type="dxa" w:w="1538"/>
+            <w:tcW w:type="dxa" w:w="1534"/>
             <w:shd w:val="clear" w:color="auto" w:fill="F7F9FB"/>
             <w:vAlign w:val="center"/>
           </w:tcPr>
@@ -3357,7 +3357,7 @@
         </w:tc>
         <w:tc>
           <w:tcPr>
-            <w:tcW w:type="dxa" w:w="2797"/>
+            <w:tcW w:type="dxa" w:w="2859"/>
             <w:shd w:val="clear" w:color="auto" w:fill="F7F9FB"/>
             <w:vAlign w:val="center"/>
           </w:tcPr>
@@ -3380,7 +3380,7 @@
         </w:tc>
         <w:tc>
           <w:tcPr>
-            <w:tcW w:type="dxa" w:w="2562"/>
+            <w:tcW w:type="dxa" w:w="2516"/>
             <w:shd w:val="clear" w:color="auto" w:fill="F7F9FB"/>
             <w:vAlign w:val="center"/>
           </w:tcPr>
@@ -3403,7 +3403,7 @@
         </w:tc>
         <w:tc>
           <w:tcPr>
-            <w:tcW w:type="dxa" w:w="1191"/>
+            <w:tcW w:type="dxa" w:w="1180"/>
             <w:shd w:val="clear" w:color="auto" w:fill="F7F9FB"/>
             <w:vAlign w:val="center"/>
           </w:tcPr>
@@ -3465,7 +3465,7 @@
         </w:tc>
         <w:tc>
           <w:tcPr>
-            <w:tcW w:type="dxa" w:w="1538"/>
+            <w:tcW w:type="dxa" w:w="1534"/>
             <w:shd w:val="clear" w:color="auto" w:fill="FFFFFF"/>
             <w:vAlign w:val="center"/>
           </w:tcPr>
@@ -3489,7 +3489,7 @@
         </w:tc>
         <w:tc>
           <w:tcPr>
-            <w:tcW w:type="dxa" w:w="2797"/>
+            <w:tcW w:type="dxa" w:w="2859"/>
             <w:shd w:val="clear" w:color="auto" w:fill="FFFFFF"/>
             <w:vAlign w:val="center"/>
           </w:tcPr>
@@ -3512,7 +3512,7 @@
         </w:tc>
         <w:tc>
           <w:tcPr>
-            <w:tcW w:type="dxa" w:w="2562"/>
+            <w:tcW w:type="dxa" w:w="2516"/>
             <w:shd w:val="clear" w:color="auto" w:fill="FFFFFF"/>
             <w:vAlign w:val="center"/>
           </w:tcPr>
@@ -3535,7 +3535,7 @@
         </w:tc>
         <w:tc>
           <w:tcPr>
-            <w:tcW w:type="dxa" w:w="1191"/>
+            <w:tcW w:type="dxa" w:w="1180"/>
             <w:shd w:val="clear" w:color="auto" w:fill="FFFFFF"/>
             <w:vAlign w:val="center"/>
           </w:tcPr>
@@ -3597,7 +3597,7 @@
         </w:tc>
         <w:tc>
           <w:tcPr>
-            <w:tcW w:type="dxa" w:w="1538"/>
+            <w:tcW w:type="dxa" w:w="1534"/>
             <w:shd w:val="clear" w:color="auto" w:fill="F7F9FB"/>
             <w:vAlign w:val="center"/>
           </w:tcPr>
@@ -3621,7 +3621,7 @@
         </w:tc>
         <w:tc>
           <w:tcPr>
-            <w:tcW w:type="dxa" w:w="2797"/>
+            <w:tcW w:type="dxa" w:w="2859"/>
             <w:shd w:val="clear" w:color="auto" w:fill="F7F9FB"/>
             <w:vAlign w:val="center"/>
           </w:tcPr>
@@ -3644,7 +3644,7 @@
         </w:tc>
         <w:tc>
           <w:tcPr>
-            <w:tcW w:type="dxa" w:w="2562"/>
+            <w:tcW w:type="dxa" w:w="2516"/>
             <w:shd w:val="clear" w:color="auto" w:fill="F7F9FB"/>
             <w:vAlign w:val="center"/>
           </w:tcPr>
@@ -3667,7 +3667,7 @@
         </w:tc>
         <w:tc>
           <w:tcPr>
-            <w:tcW w:type="dxa" w:w="1191"/>
+            <w:tcW w:type="dxa" w:w="1180"/>
             <w:shd w:val="clear" w:color="auto" w:fill="F7F9FB"/>
             <w:vAlign w:val="center"/>
           </w:tcPr>
@@ -3729,7 +3729,7 @@
         </w:tc>
         <w:tc>
           <w:tcPr>
-            <w:tcW w:type="dxa" w:w="1538"/>
+            <w:tcW w:type="dxa" w:w="1534"/>
             <w:shd w:val="clear" w:color="auto" w:fill="FFFFFF"/>
             <w:vAlign w:val="center"/>
           </w:tcPr>
@@ -3753,7 +3753,7 @@
         </w:tc>
         <w:tc>
           <w:tcPr>
-            <w:tcW w:type="dxa" w:w="2797"/>
+            <w:tcW w:type="dxa" w:w="2859"/>
             <w:shd w:val="clear" w:color="auto" w:fill="FFFFFF"/>
             <w:vAlign w:val="center"/>
           </w:tcPr>
@@ -3776,7 +3776,7 @@
         </w:tc>
         <w:tc>
           <w:tcPr>
-            <w:tcW w:type="dxa" w:w="2562"/>
+            <w:tcW w:type="dxa" w:w="2516"/>
             <w:shd w:val="clear" w:color="auto" w:fill="FFFFFF"/>
             <w:vAlign w:val="center"/>
           </w:tcPr>
@@ -3799,7 +3799,7 @@
         </w:tc>
         <w:tc>
           <w:tcPr>
-            <w:tcW w:type="dxa" w:w="1191"/>
+            <w:tcW w:type="dxa" w:w="1180"/>
             <w:shd w:val="clear" w:color="auto" w:fill="FFFFFF"/>
             <w:vAlign w:val="center"/>
           </w:tcPr>
@@ -3861,7 +3861,7 @@
         </w:tc>
         <w:tc>
           <w:tcPr>
-            <w:tcW w:type="dxa" w:w="1538"/>
+            <w:tcW w:type="dxa" w:w="1534"/>
             <w:shd w:val="clear" w:color="auto" w:fill="F7F9FB"/>
             <w:vAlign w:val="center"/>
           </w:tcPr>
@@ -3885,7 +3885,7 @@
         </w:tc>
         <w:tc>
           <w:tcPr>
-            <w:tcW w:type="dxa" w:w="2797"/>
+            <w:tcW w:type="dxa" w:w="2859"/>
             <w:shd w:val="clear" w:color="auto" w:fill="F7F9FB"/>
             <w:vAlign w:val="center"/>
           </w:tcPr>
@@ -3908,7 +3908,7 @@
         </w:tc>
         <w:tc>
           <w:tcPr>
-            <w:tcW w:type="dxa" w:w="2562"/>
+            <w:tcW w:type="dxa" w:w="2516"/>
             <w:shd w:val="clear" w:color="auto" w:fill="F7F9FB"/>
             <w:vAlign w:val="center"/>
           </w:tcPr>
@@ -3931,7 +3931,7 @@
         </w:tc>
         <w:tc>
           <w:tcPr>
-            <w:tcW w:type="dxa" w:w="1191"/>
+            <w:tcW w:type="dxa" w:w="1180"/>
             <w:shd w:val="clear" w:color="auto" w:fill="F7F9FB"/>
             <w:vAlign w:val="center"/>
           </w:tcPr>
@@ -3993,7 +3993,7 @@
         </w:tc>
         <w:tc>
           <w:tcPr>
-            <w:tcW w:type="dxa" w:w="1538"/>
+            <w:tcW w:type="dxa" w:w="1534"/>
             <w:shd w:val="clear" w:color="auto" w:fill="FFFFFF"/>
             <w:vAlign w:val="center"/>
           </w:tcPr>
@@ -4017,7 +4017,7 @@
         </w:tc>
         <w:tc>
           <w:tcPr>
-            <w:tcW w:type="dxa" w:w="2797"/>
+            <w:tcW w:type="dxa" w:w="2859"/>
             <w:shd w:val="clear" w:color="auto" w:fill="FFFFFF"/>
             <w:vAlign w:val="center"/>
           </w:tcPr>
@@ -4040,7 +4040,7 @@
         </w:tc>
         <w:tc>
           <w:tcPr>
-            <w:tcW w:type="dxa" w:w="2562"/>
+            <w:tcW w:type="dxa" w:w="2516"/>
             <w:shd w:val="clear" w:color="auto" w:fill="FFFFFF"/>
             <w:vAlign w:val="center"/>
           </w:tcPr>
@@ -4063,7 +4063,7 @@
         </w:tc>
         <w:tc>
           <w:tcPr>
-            <w:tcW w:type="dxa" w:w="1191"/>
+            <w:tcW w:type="dxa" w:w="1180"/>
             <w:shd w:val="clear" w:color="auto" w:fill="FFFFFF"/>
             <w:vAlign w:val="center"/>
           </w:tcPr>
@@ -4125,7 +4125,7 @@
         </w:tc>
         <w:tc>
           <w:tcPr>
-            <w:tcW w:type="dxa" w:w="1538"/>
+            <w:tcW w:type="dxa" w:w="1534"/>
             <w:shd w:val="clear" w:color="auto" w:fill="F7F9FB"/>
             <w:vAlign w:val="center"/>
           </w:tcPr>
@@ -4149,7 +4149,7 @@
         </w:tc>
         <w:tc>
           <w:tcPr>
-            <w:tcW w:type="dxa" w:w="2797"/>
+            <w:tcW w:type="dxa" w:w="2859"/>
             <w:shd w:val="clear" w:color="auto" w:fill="F7F9FB"/>
             <w:vAlign w:val="center"/>
           </w:tcPr>
@@ -4172,7 +4172,7 @@
         </w:tc>
         <w:tc>
           <w:tcPr>
-            <w:tcW w:type="dxa" w:w="2562"/>
+            <w:tcW w:type="dxa" w:w="2516"/>
             <w:shd w:val="clear" w:color="auto" w:fill="F7F9FB"/>
             <w:vAlign w:val="center"/>
           </w:tcPr>
@@ -4195,7 +4195,7 @@
         </w:tc>
         <w:tc>
           <w:tcPr>
-            <w:tcW w:type="dxa" w:w="1191"/>
+            <w:tcW w:type="dxa" w:w="1180"/>
             <w:shd w:val="clear" w:color="auto" w:fill="F7F9FB"/>
             <w:vAlign w:val="center"/>
           </w:tcPr>
@@ -4257,7 +4257,7 @@
         </w:tc>
         <w:tc>
           <w:tcPr>
-            <w:tcW w:type="dxa" w:w="1538"/>
+            <w:tcW w:type="dxa" w:w="1534"/>
             <w:shd w:val="clear" w:color="auto" w:fill="FFFFFF"/>
             <w:vAlign w:val="center"/>
           </w:tcPr>
@@ -4281,7 +4281,7 @@
         </w:tc>
         <w:tc>
           <w:tcPr>
-            <w:tcW w:type="dxa" w:w="2797"/>
+            <w:tcW w:type="dxa" w:w="2859"/>
             <w:shd w:val="clear" w:color="auto" w:fill="FFFFFF"/>
             <w:vAlign w:val="center"/>
           </w:tcPr>
@@ -4304,7 +4304,7 @@
         </w:tc>
         <w:tc>
           <w:tcPr>
-            <w:tcW w:type="dxa" w:w="2562"/>
+            <w:tcW w:type="dxa" w:w="2516"/>
             <w:shd w:val="clear" w:color="auto" w:fill="FFFFFF"/>
             <w:vAlign w:val="center"/>
           </w:tcPr>
@@ -4327,7 +4327,7 @@
         </w:tc>
         <w:tc>
           <w:tcPr>
-            <w:tcW w:type="dxa" w:w="1191"/>
+            <w:tcW w:type="dxa" w:w="1180"/>
             <w:shd w:val="clear" w:color="auto" w:fill="FFFFFF"/>
             <w:vAlign w:val="center"/>
           </w:tcPr>
@@ -4389,7 +4389,7 @@
         </w:tc>
         <w:tc>
           <w:tcPr>
-            <w:tcW w:type="dxa" w:w="1538"/>
+            <w:tcW w:type="dxa" w:w="1534"/>
             <w:shd w:val="clear" w:color="auto" w:fill="F7F9FB"/>
             <w:vAlign w:val="center"/>
           </w:tcPr>
@@ -4413,7 +4413,7 @@
         </w:tc>
         <w:tc>
           <w:tcPr>
-            <w:tcW w:type="dxa" w:w="2797"/>
+            <w:tcW w:type="dxa" w:w="2859"/>
             <w:shd w:val="clear" w:color="auto" w:fill="F7F9FB"/>
             <w:vAlign w:val="center"/>
           </w:tcPr>
@@ -4436,7 +4436,7 @@
         </w:tc>
         <w:tc>
           <w:tcPr>
-            <w:tcW w:type="dxa" w:w="2562"/>
+            <w:tcW w:type="dxa" w:w="2516"/>
             <w:shd w:val="clear" w:color="auto" w:fill="F7F9FB"/>
             <w:vAlign w:val="center"/>
           </w:tcPr>
@@ -4459,7 +4459,7 @@
         </w:tc>
         <w:tc>
           <w:tcPr>
-            <w:tcW w:type="dxa" w:w="1191"/>
+            <w:tcW w:type="dxa" w:w="1180"/>
             <w:shd w:val="clear" w:color="auto" w:fill="F7F9FB"/>
             <w:vAlign w:val="center"/>
           </w:tcPr>
@@ -4521,7 +4521,7 @@
         </w:tc>
         <w:tc>
           <w:tcPr>
-            <w:tcW w:type="dxa" w:w="1538"/>
+            <w:tcW w:type="dxa" w:w="1534"/>
             <w:shd w:val="clear" w:color="auto" w:fill="FFFFFF"/>
             <w:vAlign w:val="center"/>
           </w:tcPr>
@@ -4545,7 +4545,7 @@
         </w:tc>
         <w:tc>
           <w:tcPr>
-            <w:tcW w:type="dxa" w:w="2797"/>
+            <w:tcW w:type="dxa" w:w="2859"/>
             <w:shd w:val="clear" w:color="auto" w:fill="FFFFFF"/>
             <w:vAlign w:val="center"/>
           </w:tcPr>
@@ -4568,7 +4568,7 @@
         </w:tc>
         <w:tc>
           <w:tcPr>
-            <w:tcW w:type="dxa" w:w="2562"/>
+            <w:tcW w:type="dxa" w:w="2516"/>
             <w:shd w:val="clear" w:color="auto" w:fill="FFFFFF"/>
             <w:vAlign w:val="center"/>
           </w:tcPr>
@@ -4591,7 +4591,7 @@
         </w:tc>
         <w:tc>
           <w:tcPr>
-            <w:tcW w:type="dxa" w:w="1191"/>
+            <w:tcW w:type="dxa" w:w="1180"/>
             <w:shd w:val="clear" w:color="auto" w:fill="FFFFFF"/>
             <w:vAlign w:val="center"/>
           </w:tcPr>
@@ -4653,7 +4653,7 @@
         </w:tc>
         <w:tc>
           <w:tcPr>
-            <w:tcW w:type="dxa" w:w="1538"/>
+            <w:tcW w:type="dxa" w:w="1534"/>
             <w:shd w:val="clear" w:color="auto" w:fill="F7F9FB"/>
             <w:vAlign w:val="center"/>
           </w:tcPr>
@@ -4677,7 +4677,7 @@
         </w:tc>
         <w:tc>
           <w:tcPr>
-            <w:tcW w:type="dxa" w:w="2797"/>
+            <w:tcW w:type="dxa" w:w="2859"/>
             <w:shd w:val="clear" w:color="auto" w:fill="F7F9FB"/>
             <w:vAlign w:val="center"/>
           </w:tcPr>
@@ -4700,7 +4700,7 @@
         </w:tc>
         <w:tc>
           <w:tcPr>
-            <w:tcW w:type="dxa" w:w="2562"/>
+            <w:tcW w:type="dxa" w:w="2516"/>
             <w:shd w:val="clear" w:color="auto" w:fill="F7F9FB"/>
             <w:vAlign w:val="center"/>
           </w:tcPr>
@@ -4723,7 +4723,7 @@
         </w:tc>
         <w:tc>
           <w:tcPr>
-            <w:tcW w:type="dxa" w:w="1191"/>
+            <w:tcW w:type="dxa" w:w="1180"/>
             <w:shd w:val="clear" w:color="auto" w:fill="F7F9FB"/>
             <w:vAlign w:val="center"/>
           </w:tcPr>
@@ -4785,7 +4785,7 @@
         </w:tc>
         <w:tc>
           <w:tcPr>
-            <w:tcW w:type="dxa" w:w="1538"/>
+            <w:tcW w:type="dxa" w:w="1534"/>
             <w:shd w:val="clear" w:color="auto" w:fill="FFFFFF"/>
             <w:vAlign w:val="center"/>
           </w:tcPr>
@@ -4809,7 +4809,7 @@
         </w:tc>
         <w:tc>
           <w:tcPr>
-            <w:tcW w:type="dxa" w:w="2797"/>
+            <w:tcW w:type="dxa" w:w="2859"/>
             <w:shd w:val="clear" w:color="auto" w:fill="FFFFFF"/>
             <w:vAlign w:val="center"/>
           </w:tcPr>
@@ -4832,7 +4832,7 @@
         </w:tc>
         <w:tc>
           <w:tcPr>
-            <w:tcW w:type="dxa" w:w="2562"/>
+            <w:tcW w:type="dxa" w:w="2516"/>
             <w:shd w:val="clear" w:color="auto" w:fill="FFFFFF"/>
             <w:vAlign w:val="center"/>
           </w:tcPr>
@@ -4855,7 +4855,7 @@
         </w:tc>
         <w:tc>
           <w:tcPr>
-            <w:tcW w:type="dxa" w:w="1191"/>
+            <w:tcW w:type="dxa" w:w="1180"/>
             <w:shd w:val="clear" w:color="auto" w:fill="FFFFFF"/>
             <w:vAlign w:val="center"/>
           </w:tcPr>
@@ -4917,7 +4917,7 @@
         </w:tc>
         <w:tc>
           <w:tcPr>
-            <w:tcW w:type="dxa" w:w="1538"/>
+            <w:tcW w:type="dxa" w:w="1534"/>
             <w:shd w:val="clear" w:color="auto" w:fill="F7F9FB"/>
             <w:vAlign w:val="center"/>
           </w:tcPr>
@@ -4941,7 +4941,7 @@
         </w:tc>
         <w:tc>
           <w:tcPr>
-            <w:tcW w:type="dxa" w:w="2797"/>
+            <w:tcW w:type="dxa" w:w="2859"/>
             <w:shd w:val="clear" w:color="auto" w:fill="F7F9FB"/>
             <w:vAlign w:val="center"/>
           </w:tcPr>
@@ -4964,7 +4964,7 @@
         </w:tc>
         <w:tc>
           <w:tcPr>
-            <w:tcW w:type="dxa" w:w="2562"/>
+            <w:tcW w:type="dxa" w:w="2516"/>
             <w:shd w:val="clear" w:color="auto" w:fill="F7F9FB"/>
             <w:vAlign w:val="center"/>
           </w:tcPr>
@@ -4987,7 +4987,7 @@
         </w:tc>
         <w:tc>
           <w:tcPr>
-            <w:tcW w:type="dxa" w:w="1191"/>
+            <w:tcW w:type="dxa" w:w="1180"/>
             <w:shd w:val="clear" w:color="auto" w:fill="F7F9FB"/>
             <w:vAlign w:val="center"/>
           </w:tcPr>
@@ -5049,7 +5049,7 @@
         </w:tc>
         <w:tc>
           <w:tcPr>
-            <w:tcW w:type="dxa" w:w="1538"/>
+            <w:tcW w:type="dxa" w:w="1534"/>
             <w:shd w:val="clear" w:color="auto" w:fill="FFFFFF"/>
             <w:vAlign w:val="center"/>
           </w:tcPr>
@@ -5073,7 +5073,7 @@
         </w:tc>
         <w:tc>
           <w:tcPr>
-            <w:tcW w:type="dxa" w:w="2797"/>
+            <w:tcW w:type="dxa" w:w="2859"/>
             <w:shd w:val="clear" w:color="auto" w:fill="FFFFFF"/>
             <w:vAlign w:val="center"/>
           </w:tcPr>
@@ -5096,7 +5096,7 @@
         </w:tc>
         <w:tc>
           <w:tcPr>
-            <w:tcW w:type="dxa" w:w="2562"/>
+            <w:tcW w:type="dxa" w:w="2516"/>
             <w:shd w:val="clear" w:color="auto" w:fill="FFFFFF"/>
             <w:vAlign w:val="center"/>
           </w:tcPr>
@@ -5119,7 +5119,7 @@
         </w:tc>
         <w:tc>
           <w:tcPr>
-            <w:tcW w:type="dxa" w:w="1191"/>
+            <w:tcW w:type="dxa" w:w="1180"/>
             <w:shd w:val="clear" w:color="auto" w:fill="FFFFFF"/>
             <w:vAlign w:val="center"/>
           </w:tcPr>
@@ -5181,7 +5181,7 @@
         </w:tc>
         <w:tc>
           <w:tcPr>
-            <w:tcW w:type="dxa" w:w="1538"/>
+            <w:tcW w:type="dxa" w:w="1534"/>
             <w:shd w:val="clear" w:color="auto" w:fill="F7F9FB"/>
             <w:vAlign w:val="center"/>
           </w:tcPr>
@@ -5205,7 +5205,7 @@
         </w:tc>
         <w:tc>
           <w:tcPr>
-            <w:tcW w:type="dxa" w:w="2797"/>
+            <w:tcW w:type="dxa" w:w="2859"/>
             <w:shd w:val="clear" w:color="auto" w:fill="F7F9FB"/>
             <w:vAlign w:val="center"/>
           </w:tcPr>
@@ -5228,7 +5228,7 @@
         </w:tc>
         <w:tc>
           <w:tcPr>
-            <w:tcW w:type="dxa" w:w="2562"/>
+            <w:tcW w:type="dxa" w:w="2516"/>
             <w:shd w:val="clear" w:color="auto" w:fill="F7F9FB"/>
             <w:vAlign w:val="center"/>
           </w:tcPr>
@@ -5251,7 +5251,7 @@
         </w:tc>
         <w:tc>
           <w:tcPr>
-            <w:tcW w:type="dxa" w:w="1191"/>
+            <w:tcW w:type="dxa" w:w="1180"/>
             <w:shd w:val="clear" w:color="auto" w:fill="F7F9FB"/>
             <w:vAlign w:val="center"/>
           </w:tcPr>
@@ -5313,7 +5313,7 @@
         </w:tc>
         <w:tc>
           <w:tcPr>
-            <w:tcW w:type="dxa" w:w="1538"/>
+            <w:tcW w:type="dxa" w:w="1534"/>
             <w:shd w:val="clear" w:color="auto" w:fill="FFFFFF"/>
             <w:vAlign w:val="center"/>
           </w:tcPr>
@@ -5337,7 +5337,7 @@
         </w:tc>
         <w:tc>
           <w:tcPr>
-            <w:tcW w:type="dxa" w:w="2797"/>
+            <w:tcW w:type="dxa" w:w="2859"/>
             <w:shd w:val="clear" w:color="auto" w:fill="FFFFFF"/>
             <w:vAlign w:val="center"/>
           </w:tcPr>
@@ -5360,7 +5360,7 @@
         </w:tc>
         <w:tc>
           <w:tcPr>
-            <w:tcW w:type="dxa" w:w="2562"/>
+            <w:tcW w:type="dxa" w:w="2516"/>
             <w:shd w:val="clear" w:color="auto" w:fill="FFFFFF"/>
             <w:vAlign w:val="center"/>
           </w:tcPr>
@@ -5383,7 +5383,7 @@
         </w:tc>
         <w:tc>
           <w:tcPr>
-            <w:tcW w:type="dxa" w:w="1191"/>
+            <w:tcW w:type="dxa" w:w="1180"/>
             <w:shd w:val="clear" w:color="auto" w:fill="FFFFFF"/>
             <w:vAlign w:val="center"/>
           </w:tcPr>
@@ -5445,7 +5445,7 @@
         </w:tc>
         <w:tc>
           <w:tcPr>
-            <w:tcW w:type="dxa" w:w="1538"/>
+            <w:tcW w:type="dxa" w:w="1534"/>
             <w:shd w:val="clear" w:color="auto" w:fill="F7F9FB"/>
             <w:vAlign w:val="center"/>
           </w:tcPr>
@@ -5469,7 +5469,7 @@
         </w:tc>
         <w:tc>
           <w:tcPr>
-            <w:tcW w:type="dxa" w:w="2797"/>
+            <w:tcW w:type="dxa" w:w="2859"/>
             <w:shd w:val="clear" w:color="auto" w:fill="F7F9FB"/>
             <w:vAlign w:val="center"/>
           </w:tcPr>
@@ -5492,7 +5492,7 @@
         </w:tc>
         <w:tc>
           <w:tcPr>
-            <w:tcW w:type="dxa" w:w="2562"/>
+            <w:tcW w:type="dxa" w:w="2516"/>
             <w:shd w:val="clear" w:color="auto" w:fill="F7F9FB"/>
             <w:vAlign w:val="center"/>
           </w:tcPr>
@@ -5515,7 +5515,7 @@
         </w:tc>
         <w:tc>
           <w:tcPr>
-            <w:tcW w:type="dxa" w:w="1191"/>
+            <w:tcW w:type="dxa" w:w="1180"/>
             <w:shd w:val="clear" w:color="auto" w:fill="F7F9FB"/>
             <w:vAlign w:val="center"/>
           </w:tcPr>
@@ -5577,7 +5577,7 @@
         </w:tc>
         <w:tc>
           <w:tcPr>
-            <w:tcW w:type="dxa" w:w="1538"/>
+            <w:tcW w:type="dxa" w:w="1534"/>
             <w:shd w:val="clear" w:color="auto" w:fill="FFFFFF"/>
             <w:vAlign w:val="center"/>
           </w:tcPr>
@@ -5601,7 +5601,7 @@
         </w:tc>
         <w:tc>
           <w:tcPr>
-            <w:tcW w:type="dxa" w:w="2797"/>
+            <w:tcW w:type="dxa" w:w="2859"/>
             <w:shd w:val="clear" w:color="auto" w:fill="FFFFFF"/>
             <w:vAlign w:val="center"/>
           </w:tcPr>
@@ -5624,7 +5624,7 @@
         </w:tc>
         <w:tc>
           <w:tcPr>
-            <w:tcW w:type="dxa" w:w="2562"/>
+            <w:tcW w:type="dxa" w:w="2516"/>
             <w:shd w:val="clear" w:color="auto" w:fill="FFFFFF"/>
             <w:vAlign w:val="center"/>
           </w:tcPr>
@@ -5647,7 +5647,7 @@
         </w:tc>
         <w:tc>
           <w:tcPr>
-            <w:tcW w:type="dxa" w:w="1191"/>
+            <w:tcW w:type="dxa" w:w="1180"/>
             <w:shd w:val="clear" w:color="auto" w:fill="FFFFFF"/>
             <w:vAlign w:val="center"/>
           </w:tcPr>
@@ -5699,7 +5699,7 @@
         </w:tc>
         <w:tc>
           <w:tcPr>
-            <w:tcW w:type="dxa" w:w="1538"/>
+            <w:tcW w:type="dxa" w:w="1534"/>
             <w:shd w:val="clear" w:color="auto" w:fill="F7F9FB"/>
             <w:vAlign w:val="center"/>
           </w:tcPr>
@@ -5723,7 +5723,7 @@
         </w:tc>
         <w:tc>
           <w:tcPr>
-            <w:tcW w:type="dxa" w:w="2797"/>
+            <w:tcW w:type="dxa" w:w="2859"/>
             <w:shd w:val="clear" w:color="auto" w:fill="F7F9FB"/>
             <w:vAlign w:val="center"/>
           </w:tcPr>
@@ -5746,7 +5746,7 @@
         </w:tc>
         <w:tc>
           <w:tcPr>
-            <w:tcW w:type="dxa" w:w="2562"/>
+            <w:tcW w:type="dxa" w:w="2516"/>
             <w:shd w:val="clear" w:color="auto" w:fill="F7F9FB"/>
             <w:vAlign w:val="center"/>
           </w:tcPr>
@@ -5769,7 +5769,7 @@
         </w:tc>
         <w:tc>
           <w:tcPr>
-            <w:tcW w:type="dxa" w:w="1191"/>
+            <w:tcW w:type="dxa" w:w="1180"/>
             <w:shd w:val="clear" w:color="auto" w:fill="F7F9FB"/>
             <w:vAlign w:val="center"/>
           </w:tcPr>
@@ -5831,7 +5831,7 @@
         </w:tc>
         <w:tc>
           <w:tcPr>
-            <w:tcW w:type="dxa" w:w="1538"/>
+            <w:tcW w:type="dxa" w:w="1534"/>
             <w:shd w:val="clear" w:color="auto" w:fill="FFFFFF"/>
             <w:vAlign w:val="center"/>
           </w:tcPr>
@@ -5855,7 +5855,7 @@
         </w:tc>
         <w:tc>
           <w:tcPr>
-            <w:tcW w:type="dxa" w:w="2797"/>
+            <w:tcW w:type="dxa" w:w="2859"/>
             <w:shd w:val="clear" w:color="auto" w:fill="FFFFFF"/>
             <w:vAlign w:val="center"/>
           </w:tcPr>
@@ -5878,7 +5878,7 @@
         </w:tc>
         <w:tc>
           <w:tcPr>
-            <w:tcW w:type="dxa" w:w="2562"/>
+            <w:tcW w:type="dxa" w:w="2516"/>
             <w:shd w:val="clear" w:color="auto" w:fill="FFFFFF"/>
             <w:vAlign w:val="center"/>
           </w:tcPr>
@@ -5901,7 +5901,7 @@
         </w:tc>
         <w:tc>
           <w:tcPr>
-            <w:tcW w:type="dxa" w:w="1191"/>
+            <w:tcW w:type="dxa" w:w="1180"/>
             <w:shd w:val="clear" w:color="auto" w:fill="FFFFFF"/>
             <w:vAlign w:val="center"/>
           </w:tcPr>
@@ -5963,7 +5963,7 @@
         </w:tc>
         <w:tc>
           <w:tcPr>
-            <w:tcW w:type="dxa" w:w="1538"/>
+            <w:tcW w:type="dxa" w:w="1534"/>
             <w:shd w:val="clear" w:color="auto" w:fill="F7F9FB"/>
             <w:vAlign w:val="center"/>
           </w:tcPr>
@@ -5987,7 +5987,7 @@
         </w:tc>
         <w:tc>
           <w:tcPr>
-            <w:tcW w:type="dxa" w:w="2797"/>
+            <w:tcW w:type="dxa" w:w="2859"/>
             <w:shd w:val="clear" w:color="auto" w:fill="F7F9FB"/>
             <w:vAlign w:val="center"/>
           </w:tcPr>
@@ -6010,7 +6010,7 @@
         </w:tc>
         <w:tc>
           <w:tcPr>
-            <w:tcW w:type="dxa" w:w="2562"/>
+            <w:tcW w:type="dxa" w:w="2516"/>
             <w:shd w:val="clear" w:color="auto" w:fill="F7F9FB"/>
             <w:vAlign w:val="center"/>
           </w:tcPr>
@@ -6033,7 +6033,7 @@
         </w:tc>
         <w:tc>
           <w:tcPr>
-            <w:tcW w:type="dxa" w:w="1191"/>
+            <w:tcW w:type="dxa" w:w="1180"/>
             <w:shd w:val="clear" w:color="auto" w:fill="F7F9FB"/>
             <w:vAlign w:val="center"/>
           </w:tcPr>
@@ -6095,7 +6095,7 @@
         </w:tc>
         <w:tc>
           <w:tcPr>
-            <w:tcW w:type="dxa" w:w="1538"/>
+            <w:tcW w:type="dxa" w:w="1534"/>
             <w:shd w:val="clear" w:color="auto" w:fill="FFFFFF"/>
             <w:vAlign w:val="center"/>
           </w:tcPr>
@@ -6119,7 +6119,7 @@
         </w:tc>
         <w:tc>
           <w:tcPr>
-            <w:tcW w:type="dxa" w:w="2797"/>
+            <w:tcW w:type="dxa" w:w="2859"/>
             <w:shd w:val="clear" w:color="auto" w:fill="FFFFFF"/>
             <w:vAlign w:val="center"/>
           </w:tcPr>
@@ -6142,7 +6142,7 @@
         </w:tc>
         <w:tc>
           <w:tcPr>
-            <w:tcW w:type="dxa" w:w="2562"/>
+            <w:tcW w:type="dxa" w:w="2516"/>
             <w:shd w:val="clear" w:color="auto" w:fill="FFFFFF"/>
             <w:vAlign w:val="center"/>
           </w:tcPr>
@@ -6185,7 +6185,7 @@
         </w:tc>
         <w:tc>
           <w:tcPr>
-            <w:tcW w:type="dxa" w:w="1191"/>
+            <w:tcW w:type="dxa" w:w="1180"/>
             <w:shd w:val="clear" w:color="auto" w:fill="FFFFFF"/>
             <w:vAlign w:val="center"/>
           </w:tcPr>
@@ -6247,7 +6247,7 @@
         </w:tc>
         <w:tc>
           <w:tcPr>
-            <w:tcW w:type="dxa" w:w="1538"/>
+            <w:tcW w:type="dxa" w:w="1534"/>
             <w:shd w:val="clear" w:color="auto" w:fill="F7F9FB"/>
             <w:vAlign w:val="center"/>
           </w:tcPr>
@@ -6271,7 +6271,7 @@
         </w:tc>
         <w:tc>
           <w:tcPr>
-            <w:tcW w:type="dxa" w:w="2797"/>
+            <w:tcW w:type="dxa" w:w="2859"/>
             <w:shd w:val="clear" w:color="auto" w:fill="F7F9FB"/>
             <w:vAlign w:val="center"/>
           </w:tcPr>
@@ -6294,7 +6294,7 @@
         </w:tc>
         <w:tc>
           <w:tcPr>
-            <w:tcW w:type="dxa" w:w="2562"/>
+            <w:tcW w:type="dxa" w:w="2516"/>
             <w:shd w:val="clear" w:color="auto" w:fill="F7F9FB"/>
             <w:vAlign w:val="center"/>
           </w:tcPr>
@@ -6317,7 +6317,7 @@
         </w:tc>
         <w:tc>
           <w:tcPr>
-            <w:tcW w:type="dxa" w:w="1191"/>
+            <w:tcW w:type="dxa" w:w="1180"/>
             <w:shd w:val="clear" w:color="auto" w:fill="F7F9FB"/>
             <w:vAlign w:val="center"/>
           </w:tcPr>
@@ -6379,7 +6379,7 @@
         </w:tc>
         <w:tc>
           <w:tcPr>
-            <w:tcW w:type="dxa" w:w="1538"/>
+            <w:tcW w:type="dxa" w:w="1534"/>
             <w:shd w:val="clear" w:color="auto" w:fill="FFFFFF"/>
             <w:vAlign w:val="center"/>
           </w:tcPr>
@@ -6403,7 +6403,7 @@
         </w:tc>
         <w:tc>
           <w:tcPr>
-            <w:tcW w:type="dxa" w:w="2797"/>
+            <w:tcW w:type="dxa" w:w="2859"/>
             <w:shd w:val="clear" w:color="auto" w:fill="FFFFFF"/>
             <w:vAlign w:val="center"/>
           </w:tcPr>
@@ -6426,7 +6426,7 @@
         </w:tc>
         <w:tc>
           <w:tcPr>
-            <w:tcW w:type="dxa" w:w="2562"/>
+            <w:tcW w:type="dxa" w:w="2516"/>
             <w:shd w:val="clear" w:color="auto" w:fill="FFFFFF"/>
             <w:vAlign w:val="center"/>
           </w:tcPr>
@@ -6449,7 +6449,7 @@
         </w:tc>
         <w:tc>
           <w:tcPr>
-            <w:tcW w:type="dxa" w:w="1191"/>
+            <w:tcW w:type="dxa" w:w="1180"/>
             <w:shd w:val="clear" w:color="auto" w:fill="FFFFFF"/>
             <w:vAlign w:val="center"/>
           </w:tcPr>
@@ -6531,7 +6531,7 @@
         </w:tc>
         <w:tc>
           <w:tcPr>
-            <w:tcW w:type="dxa" w:w="1538"/>
+            <w:tcW w:type="dxa" w:w="1534"/>
             <w:shd w:val="clear" w:color="auto" w:fill="F7F9FB"/>
             <w:vAlign w:val="center"/>
           </w:tcPr>
@@ -6555,7 +6555,7 @@
         </w:tc>
         <w:tc>
           <w:tcPr>
-            <w:tcW w:type="dxa" w:w="2797"/>
+            <w:tcW w:type="dxa" w:w="2859"/>
             <w:shd w:val="clear" w:color="auto" w:fill="F7F9FB"/>
             <w:vAlign w:val="center"/>
           </w:tcPr>
@@ -6578,7 +6578,7 @@
         </w:tc>
         <w:tc>
           <w:tcPr>
-            <w:tcW w:type="dxa" w:w="2562"/>
+            <w:tcW w:type="dxa" w:w="2516"/>
             <w:shd w:val="clear" w:color="auto" w:fill="F7F9FB"/>
             <w:vAlign w:val="center"/>
           </w:tcPr>
@@ -6601,7 +6601,7 @@
         </w:tc>
         <w:tc>
           <w:tcPr>
-            <w:tcW w:type="dxa" w:w="1191"/>
+            <w:tcW w:type="dxa" w:w="1180"/>
             <w:shd w:val="clear" w:color="auto" w:fill="F7F9FB"/>
             <w:vAlign w:val="center"/>
           </w:tcPr>
@@ -6685,6 +6685,158 @@
           </w:tcPr>
           <w:p>
             <w:pPr>
+              <w:keepNext/>
+              <w:spacing w:after="0"/>
+              <w:jc w:val="center"/>
+            </w:pPr>
+            <w:r>
+              <w:rPr>
+                <w:rFonts w:ascii="Calibri" w:hAnsi="Calibri"/>
+                <w:b/>
+                <w:i w:val="0"/>
+                <w:color w:val="222222"/>
+                <w:sz w:val="20"/>
+              </w:rPr>
+              <w:t>49</w:t>
+            </w:r>
+          </w:p>
+        </w:tc>
+        <w:tc>
+          <w:tcPr>
+            <w:tcW w:type="dxa" w:w="1534"/>
+            <w:shd w:val="clear" w:color="auto" w:fill="FFFFFF"/>
+            <w:vAlign w:val="center"/>
+          </w:tcPr>
+          <w:p>
+            <w:pPr>
+              <w:keepNext/>
+              <w:spacing w:after="0"/>
+              <w:jc w:val="center"/>
+            </w:pPr>
+            <w:r>
+              <w:rPr>
+                <w:rFonts w:ascii="Calibri" w:hAnsi="Calibri"/>
+                <w:b w:val="0"/>
+                <w:i w:val="0"/>
+                <w:color w:val="222222"/>
+                <w:sz w:val="20"/>
+              </w:rPr>
+              <w:t>2026-10-28</w:t>
+            </w:r>
+          </w:p>
+        </w:tc>
+        <w:tc>
+          <w:tcPr>
+            <w:tcW w:type="dxa" w:w="2859"/>
+            <w:shd w:val="clear" w:color="auto" w:fill="FFFFFF"/>
+            <w:vAlign w:val="center"/>
+          </w:tcPr>
+          <w:p>
+            <w:pPr>
+              <w:keepNext/>
+              <w:spacing w:after="0"/>
+            </w:pPr>
+            <w:r>
+              <w:rPr>
+                <w:rFonts w:ascii="Calibri" w:hAnsi="Calibri"/>
+                <w:b w:val="0"/>
+                <w:i w:val="0"/>
+                <w:color w:val="222222"/>
+                <w:sz w:val="20"/>
+              </w:rPr>
+              <w:t>Settling or steady noise in the human iPSC split-half spread (D35)</w:t>
+            </w:r>
+          </w:p>
+        </w:tc>
+        <w:tc>
+          <w:tcPr>
+            <w:tcW w:type="dxa" w:w="2516"/>
+            <w:shd w:val="clear" w:color="auto" w:fill="FFFFFF"/>
+            <w:vAlign w:val="center"/>
+          </w:tcPr>
+          <w:p>
+            <w:pPr>
+              <w:keepNext/>
+              <w:spacing w:after="0"/>
+            </w:pPr>
+            <w:r>
+              <w:rPr>
+                <w:rFonts w:ascii="Calibri" w:hAnsi="Calibri"/>
+                <w:b w:val="0"/>
+                <w:i w:val="0"/>
+                <w:color w:val="222222"/>
+                <w:sz w:val="20"/>
+              </w:rPr>
+              <w:t>3 of 3 registered predictions pass; the registered linearity check fails for human wells; the human spread is mostly uneven settling, and five more minutes would not remove it</w:t>
+            </w:r>
+          </w:p>
+        </w:tc>
+        <w:tc>
+          <w:tcPr>
+            <w:tcW w:type="dxa" w:w="1180"/>
+            <w:shd w:val="clear" w:color="auto" w:fill="FFFFFF"/>
+            <w:vAlign w:val="center"/>
+          </w:tcPr>
+          <w:p>
+            <w:pPr>
+              <w:keepNext/>
+              <w:spacing w:after="0"/>
+            </w:pPr>
+            <w:r>
+              <w:rPr>
+                <w:rFonts w:ascii="Consolas" w:hAnsi="Consolas"/>
+                <w:b w:val="0"/>
+                <w:i w:val="0"/>
+                <w:color w:val="222222"/>
+                <w:sz w:val="18"/>
+              </w:rPr>
+              <w:t>e743c4c</w:t>
+            </w:r>
+            <w:r>
+              <w:rPr>
+                <w:rFonts w:ascii="Calibri" w:hAnsi="Calibri"/>
+                <w:b w:val="0"/>
+                <w:i w:val="0"/>
+                <w:color w:val="222222"/>
+                <w:sz w:val="20"/>
+              </w:rPr>
+              <w:t xml:space="preserve">, </w:t>
+            </w:r>
+            <w:r>
+              <w:rPr>
+                <w:rFonts w:ascii="Consolas" w:hAnsi="Consolas"/>
+                <w:b w:val="0"/>
+                <w:i w:val="0"/>
+                <w:color w:val="222222"/>
+                <w:sz w:val="18"/>
+              </w:rPr>
+              <w:t>bc6a56b</w:t>
+            </w:r>
+            <w:r>
+              <w:rPr>
+                <w:rFonts w:ascii="Calibri" w:hAnsi="Calibri"/>
+                <w:b w:val="0"/>
+                <w:i w:val="0"/>
+                <w:color w:val="222222"/>
+                <w:sz w:val="20"/>
+              </w:rPr>
+              <w:t xml:space="preserve"> … this branch</w:t>
+            </w:r>
+          </w:p>
+        </w:tc>
+      </w:tr>
+      <w:tr>
+        <w:trPr>
+          <w:cantSplit/>
+        </w:trPr>
+        <w:tc>
+          <w:tcPr>
+            <w:tcW w:type="dxa" w:w="407"/>
+            <w:shd w:val="clear" w:color="auto" w:fill="F7F9FB"/>
+            <w:vAlign w:val="center"/>
+          </w:tcPr>
+          <w:p>
+            <w:pPr>
               <w:keepNext w:val="0"/>
               <w:spacing w:after="0"/>
               <w:jc w:val="center"/>
@@ -6697,14 +6849,14 @@
                 <w:color w:val="222222"/>
                 <w:sz w:val="20"/>
               </w:rPr>
-              <w:t>49</w:t>
-            </w:r>
-          </w:p>
-        </w:tc>
-        <w:tc>
-          <w:tcPr>
-            <w:tcW w:type="dxa" w:w="1538"/>
-            <w:shd w:val="clear" w:color="auto" w:fill="FFFFFF"/>
+              <w:t>52</w:t>
+            </w:r>
+          </w:p>
+        </w:tc>
+        <w:tc>
+          <w:tcPr>
+            <w:tcW w:type="dxa" w:w="1534"/>
+            <w:shd w:val="clear" w:color="auto" w:fill="F7F9FB"/>
             <w:vAlign w:val="center"/>
           </w:tcPr>
           <w:p>
@@ -6727,8 +6879,8 @@
         </w:tc>
         <w:tc>
           <w:tcPr>
-            <w:tcW w:type="dxa" w:w="2797"/>
-            <w:shd w:val="clear" w:color="auto" w:fill="FFFFFF"/>
+            <w:tcW w:type="dxa" w:w="2859"/>
+            <w:shd w:val="clear" w:color="auto" w:fill="F7F9FB"/>
             <w:vAlign w:val="center"/>
           </w:tcPr>
           <w:p>
@@ -6744,14 +6896,54 @@
                 <w:color w:val="222222"/>
                 <w:sz w:val="20"/>
               </w:rPr>
-              <w:t>Settling or steady noise in the human iPSC split-half spread (D35)</w:t>
-            </w:r>
-          </w:p>
-        </w:tc>
-        <w:tc>
-          <w:tcPr>
-            <w:tcW w:type="dxa" w:w="2562"/>
-            <w:shd w:val="clear" w:color="auto" w:fill="FFFFFF"/>
+              <w:t xml:space="preserve">The recalibration figure (D31) redrawn: the coverage legend moved off the </w:t>
+            </w:r>
+            <w:r>
+              <w:rPr>
+                <w:rFonts w:ascii="Consolas" w:hAnsi="Consolas"/>
+                <w:b w:val="0"/>
+                <w:i w:val="0"/>
+                <w:color w:val="222222"/>
+                <w:sz w:val="18"/>
+              </w:rPr>
+              <w:t>threshold_scale</w:t>
+            </w:r>
+            <w:r>
+              <w:rPr>
+                <w:rFonts w:ascii="Calibri" w:hAnsi="Calibri"/>
+                <w:b w:val="0"/>
+                <w:i w:val="0"/>
+                <w:color w:val="222222"/>
+                <w:sz w:val="20"/>
+              </w:rPr>
+              <w:t xml:space="preserve"> panel; its lost simulation cache regenerated with the registered seeds; a </w:t>
+            </w:r>
+            <w:r>
+              <w:rPr>
+                <w:rFonts w:ascii="Consolas" w:hAnsi="Consolas"/>
+                <w:b w:val="0"/>
+                <w:i w:val="0"/>
+                <w:color w:val="222222"/>
+                <w:sz w:val="18"/>
+              </w:rPr>
+              <w:t>--replot</w:t>
+            </w:r>
+            <w:r>
+              <w:rPr>
+                <w:rFonts w:ascii="Calibri" w:hAnsi="Calibri"/>
+                <w:b w:val="0"/>
+                <w:i w:val="0"/>
+                <w:color w:val="222222"/>
+                <w:sz w:val="20"/>
+              </w:rPr>
+              <w:t xml:space="preserve"> path</w:t>
+            </w:r>
+          </w:p>
+        </w:tc>
+        <w:tc>
+          <w:tcPr>
+            <w:tcW w:type="dxa" w:w="2516"/>
+            <w:shd w:val="clear" w:color="auto" w:fill="F7F9FB"/>
             <w:vAlign w:val="center"/>
           </w:tcPr>
           <w:p>
@@ -6767,14 +6959,14 @@
                 <w:color w:val="222222"/>
                 <w:sz w:val="20"/>
               </w:rPr>
-              <w:t>3 of 3 registered predictions pass; the registered linearity check fails for human wells; the human spread is mostly uneven settling, and five more minutes would not remove it</w:t>
-            </w:r>
-          </w:p>
-        </w:tc>
-        <w:tc>
-          <w:tcPr>
-            <w:tcW w:type="dxa" w:w="1191"/>
-            <w:shd w:val="clear" w:color="auto" w:fill="FFFFFF"/>
+              <w:t>none; every recorded calibration statistic reproduced exactly before the figure was redrawn</w:t>
+            </w:r>
+          </w:p>
+        </w:tc>
+        <w:tc>
+          <w:tcPr>
+            <w:tcW w:type="dxa" w:w="1180"/>
+            <w:shd w:val="clear" w:color="auto" w:fill="F7F9FB"/>
             <w:vAlign w:val="center"/>
           </w:tcPr>
           <w:p>
@@ -6784,43 +6976,13 @@
             </w:pPr>
             <w:r>
               <w:rPr>
-                <w:rFonts w:ascii="Consolas" w:hAnsi="Consolas"/>
-                <w:b w:val="0"/>
-                <w:i w:val="0"/>
-                <w:color w:val="222222"/>
-                <w:sz w:val="18"/>
-              </w:rPr>
-              <w:t>e743c4c</w:t>
-            </w:r>
-            <w:r>
-              <w:rPr>
-                <w:rFonts w:ascii="Calibri" w:hAnsi="Calibri"/>
-                <w:b w:val="0"/>
-                <w:i w:val="0"/>
-                <w:color w:val="222222"/>
-                <w:sz w:val="20"/>
-              </w:rPr>
-              <w:t xml:space="preserve">, </w:t>
-            </w:r>
-            <w:r>
-              <w:rPr>
-                <w:rFonts w:ascii="Consolas" w:hAnsi="Consolas"/>
-                <w:b w:val="0"/>
-                <w:i w:val="0"/>
-                <w:color w:val="222222"/>
-                <w:sz w:val="18"/>
-              </w:rPr>
-              <w:t>bc6a56b</w:t>
-            </w:r>
-            <w:r>
-              <w:rPr>
-                <w:rFonts w:ascii="Calibri" w:hAnsi="Calibri"/>
-                <w:b w:val="0"/>
-                <w:i w:val="0"/>
-                <w:color w:val="222222"/>
-                <w:sz w:val="20"/>
-              </w:rPr>
-              <w:t xml:space="preserve"> … this branch</w:t>
+                <w:rFonts w:ascii="Calibri" w:hAnsi="Calibri"/>
+                <w:b w:val="0"/>
+                <w:i w:val="0"/>
+                <w:color w:val="222222"/>
+                <w:sz w:val="20"/>
+              </w:rPr>
+              <w:t>this branch</w:t>
             </w:r>
           </w:p>
         </w:tc>
@@ -20940,6 +21102,525 @@
           <w:sz w:val="21"/>
         </w:rPr>
         <w:t>.</w:t>
+      </w:r>
+    </w:p>
+    <w:p>
+      <w:pPr>
+        <w:keepNext/>
+        <w:spacing w:before="240" w:after="60"/>
+      </w:pPr>
+      <w:r>
+        <w:rPr>
+          <w:rFonts w:ascii="Calibri" w:hAnsi="Calibri"/>
+          <w:b/>
+          <w:i w:val="0"/>
+          <w:color w:val="1F4E79"/>
+          <w:sz w:val="23"/>
+        </w:rPr>
+        <w:t>52. The recalibration figure, redrawn from regenerated simulations; no number changed</w:t>
+      </w:r>
+    </w:p>
+    <w:p>
+      <w:pPr>
+        <w:spacing w:after="120"/>
+      </w:pPr>
+      <w:r>
+        <w:rPr>
+          <w:rFonts w:ascii="Calibri" w:hAnsi="Calibri"/>
+          <w:b/>
+          <w:i w:val="0"/>
+          <w:color w:val="156082"/>
+          <w:sz w:val="21"/>
+        </w:rPr>
+        <w:t>Slide message:</w:t>
+      </w:r>
+      <w:r>
+        <w:rPr>
+          <w:rFonts w:ascii="Calibri" w:hAnsi="Calibri"/>
+          <w:b w:val="0"/>
+          <w:i w:val="0"/>
+          <w:color w:val="222222"/>
+          <w:sz w:val="21"/>
+        </w:rPr>
+        <w:t xml:space="preserve"> </w:t>
+      </w:r>
+      <w:r>
+        <w:rPr>
+          <w:rFonts w:ascii="Calibri" w:hAnsi="Calibri"/>
+          <w:b w:val="0"/>
+          <w:i/>
+          <w:color w:val="222222"/>
+          <w:sz w:val="21"/>
+        </w:rPr>
+        <w:t>The D31 figure's coverage legend no longer covers a panel. It was redrawn from simulations regenerated with the registered seeds, and only after every recorded calibration statistic of the study had been reproduced exactly.</w:t>
+      </w:r>
+    </w:p>
+    <w:p>
+      <w:pPr>
+        <w:spacing w:after="120"/>
+        <w:ind w:left="432" w:hanging="259"/>
+      </w:pPr>
+      <w:r>
+        <w:rPr>
+          <w:rFonts w:ascii="Calibri" w:hAnsi="Calibri"/>
+          <w:b w:val="0"/>
+          <w:i w:val="0"/>
+          <w:color w:val="222222"/>
+          <w:sz w:val="21"/>
+        </w:rPr>
+        <w:t>•</w:t>
+        <w:tab/>
+      </w:r>
+      <w:r>
+        <w:rPr>
+          <w:rFonts w:ascii="Calibri" w:hAnsi="Calibri"/>
+          <w:b/>
+          <w:i w:val="0"/>
+          <w:color w:val="156082"/>
+          <w:sz w:val="21"/>
+        </w:rPr>
+        <w:t>What changed.</w:t>
+      </w:r>
+      <w:r>
+        <w:rPr>
+          <w:rFonts w:ascii="Calibri" w:hAnsi="Calibri"/>
+          <w:b w:val="0"/>
+          <w:i w:val="0"/>
+          <w:color w:val="222222"/>
+          <w:sz w:val="21"/>
+        </w:rPr>
+        <w:t xml:space="preserve"> The coverage row's legend in </w:t>
+      </w:r>
+      <w:r>
+        <w:rPr>
+          <w:rFonts w:ascii="Consolas" w:hAnsi="Consolas"/>
+          <w:b w:val="0"/>
+          <w:i w:val="0"/>
+          <w:color w:val="222222"/>
+          <w:sz w:val="19"/>
+        </w:rPr>
+        <w:t>outputs/twin/hd14b_recalibration_simulated.png</w:t>
+      </w:r>
+      <w:r>
+        <w:rPr>
+          <w:rFonts w:ascii="Calibri" w:hAnsi="Calibri"/>
+          <w:b w:val="0"/>
+          <w:i w:val="0"/>
+          <w:color w:val="222222"/>
+          <w:sz w:val="21"/>
+        </w:rPr>
+        <w:t xml:space="preserve"> sat on the </w:t>
+      </w:r>
+      <w:r>
+        <w:rPr>
+          <w:rFonts w:ascii="Consolas" w:hAnsi="Consolas"/>
+          <w:b w:val="0"/>
+          <w:i w:val="0"/>
+          <w:color w:val="222222"/>
+          <w:sz w:val="19"/>
+        </w:rPr>
+        <w:t>threshold_scale</w:t>
+      </w:r>
+      <w:r>
+        <w:rPr>
+          <w:rFonts w:ascii="Calibri" w:hAnsi="Calibri"/>
+          <w:b w:val="0"/>
+          <w:i w:val="0"/>
+          <w:color w:val="222222"/>
+          <w:sz w:val="21"/>
+        </w:rPr>
+        <w:t xml:space="preserve"> panel; it is now one figure-level legend below the bottom row (same panels, same data, same title). The figure is drawn from ranks that existed only in memory during the run, and the simulation chunks and trained models behind them, git-ignored, had been deleted with a worktree. A new path, </w:t>
+      </w:r>
+      <w:r>
+        <w:rPr>
+          <w:rFonts w:ascii="Consolas" w:hAnsi="Consolas"/>
+          <w:b w:val="0"/>
+          <w:i w:val="0"/>
+          <w:color w:val="222222"/>
+          <w:sz w:val="19"/>
+        </w:rPr>
+        <w:t>python -m neuromps.twin.recalibration --replot</w:t>
+      </w:r>
+      <w:r>
+        <w:rPr>
+          <w:rFonts w:ascii="Calibri" w:hAnsi="Calibri"/>
+          <w:b w:val="0"/>
+          <w:i w:val="0"/>
+          <w:color w:val="222222"/>
+          <w:sz w:val="21"/>
+        </w:rPr>
+        <w:t xml:space="preserve"> (</w:t>
+      </w:r>
+      <w:r>
+        <w:rPr>
+          <w:rFonts w:ascii="Consolas" w:hAnsi="Consolas"/>
+          <w:b w:val="0"/>
+          <w:i w:val="0"/>
+          <w:color w:val="222222"/>
+          <w:sz w:val="19"/>
+        </w:rPr>
+        <w:t>src/neuromps/twin/recalibration_replot.py</w:t>
+      </w:r>
+      <w:r>
+        <w:rPr>
+          <w:rFonts w:ascii="Calibri" w:hAnsi="Calibri"/>
+          <w:b w:val="0"/>
+          <w:i w:val="0"/>
+          <w:color w:val="222222"/>
+          <w:sz w:val="21"/>
+        </w:rPr>
+        <w:t>), simulates only what the record fixes: the registered held-out set (1,000) and exactly the 51 training chunks the run completed, never one beyond. It retrains M1, M2 and M3 with their registered seeds, draws the ranks with the registered evaluation seed, persists them (</w:t>
+      </w:r>
+      <w:r>
+        <w:rPr>
+          <w:rFonts w:ascii="Consolas" w:hAnsi="Consolas"/>
+          <w:b w:val="0"/>
+          <w:i w:val="0"/>
+          <w:color w:val="222222"/>
+          <w:sz w:val="19"/>
+        </w:rPr>
+        <w:t>data/interim/recalibration/ranks_simulated.npz</w:t>
+      </w:r>
+      <w:r>
+        <w:rPr>
+          <w:rFonts w:ascii="Calibri" w:hAnsi="Calibri"/>
+          <w:b w:val="0"/>
+          <w:i w:val="0"/>
+          <w:color w:val="222222"/>
+          <w:sz w:val="21"/>
+        </w:rPr>
+        <w:t xml:space="preserve">, git-ignored) so a later redraw takes seconds, and compares every value under </w:t>
+      </w:r>
+      <w:r>
+        <w:rPr>
+          <w:rFonts w:ascii="Consolas" w:hAnsi="Consolas"/>
+          <w:b w:val="0"/>
+          <w:i w:val="0"/>
+          <w:color w:val="222222"/>
+          <w:sz w:val="19"/>
+        </w:rPr>
+        <w:t>twin_hd14b_recalibration.results</w:t>
+      </w:r>
+      <w:r>
+        <w:rPr>
+          <w:rFonts w:ascii="Calibri" w:hAnsi="Calibri"/>
+          <w:b w:val="0"/>
+          <w:i w:val="0"/>
+          <w:color w:val="222222"/>
+          <w:sz w:val="21"/>
+        </w:rPr>
+        <w:t xml:space="preserve">, </w:t>
+      </w:r>
+      <w:r>
+        <w:rPr>
+          <w:rFonts w:ascii="Consolas" w:hAnsi="Consolas"/>
+          <w:b w:val="0"/>
+          <w:i w:val="0"/>
+          <w:color w:val="222222"/>
+          <w:sz w:val="19"/>
+        </w:rPr>
+        <w:t>near_real</w:t>
+      </w:r>
+      <w:r>
+        <w:rPr>
+          <w:rFonts w:ascii="Calibri" w:hAnsi="Calibri"/>
+          <w:b w:val="0"/>
+          <w:i w:val="0"/>
+          <w:color w:val="222222"/>
+          <w:sz w:val="21"/>
+        </w:rPr>
+        <w:t xml:space="preserve"> and </w:t>
+      </w:r>
+      <w:r>
+        <w:rPr>
+          <w:rFonts w:ascii="Consolas" w:hAnsi="Consolas"/>
+          <w:b w:val="0"/>
+          <w:i w:val="0"/>
+          <w:color w:val="222222"/>
+          <w:sz w:val="19"/>
+        </w:rPr>
+        <w:t>budget</w:t>
+      </w:r>
+      <w:r>
+        <w:rPr>
+          <w:rFonts w:ascii="Calibri" w:hAnsi="Calibri"/>
+          <w:b w:val="0"/>
+          <w:i w:val="0"/>
+          <w:color w:val="222222"/>
+          <w:sz w:val="21"/>
+        </w:rPr>
+        <w:t xml:space="preserve"> with the record. The figure is drawn only if all of them are equal. The path reads </w:t>
+      </w:r>
+      <w:r>
+        <w:rPr>
+          <w:rFonts w:ascii="Consolas" w:hAnsi="Consolas"/>
+          <w:b w:val="0"/>
+          <w:i w:val="0"/>
+          <w:color w:val="222222"/>
+          <w:sz w:val="19"/>
+        </w:rPr>
+        <w:t>outputs/metrics.json</w:t>
+      </w:r>
+      <w:r>
+        <w:rPr>
+          <w:rFonts w:ascii="Calibri" w:hAnsi="Calibri"/>
+          <w:b w:val="0"/>
+          <w:i w:val="0"/>
+          <w:color w:val="222222"/>
+          <w:sz w:val="21"/>
+        </w:rPr>
+        <w:t xml:space="preserve"> and never writes it; the timing is not recomputed.</w:t>
+      </w:r>
+    </w:p>
+    <w:p>
+      <w:pPr>
+        <w:spacing w:after="120"/>
+        <w:ind w:left="432" w:hanging="259"/>
+      </w:pPr>
+      <w:r>
+        <w:rPr>
+          <w:rFonts w:ascii="Calibri" w:hAnsi="Calibri"/>
+          <w:b w:val="0"/>
+          <w:i w:val="0"/>
+          <w:color w:val="222222"/>
+          <w:sz w:val="21"/>
+        </w:rPr>
+        <w:t>•</w:t>
+        <w:tab/>
+      </w:r>
+      <w:r>
+        <w:rPr>
+          <w:rFonts w:ascii="Calibri" w:hAnsi="Calibri"/>
+          <w:b/>
+          <w:i w:val="0"/>
+          <w:color w:val="156082"/>
+          <w:sz w:val="21"/>
+        </w:rPr>
+        <w:t>One guard, relaxed narrowly.</w:t>
+      </w:r>
+      <w:r>
+        <w:rPr>
+          <w:rFonts w:ascii="Calibri" w:hAnsi="Calibri"/>
+          <w:b w:val="0"/>
+          <w:i w:val="0"/>
+          <w:color w:val="222222"/>
+          <w:sz w:val="21"/>
+        </w:rPr>
+        <w:t xml:space="preserve"> HD14's simulation cache carries the summary-code fingerprint the run was made under. Entries 47 and 48 added definition options, off by default, to the feature extractor, which changes that fingerprint without changing a value. The redraw path accepts the cache only if the six rows the study's post hoc check re-simulates come out identical under today's code (they did, with a largest difference of zero); every other cache guard is unchanged.</w:t>
+      </w:r>
+    </w:p>
+    <w:p>
+      <w:pPr>
+        <w:spacing w:after="120"/>
+        <w:ind w:left="432" w:hanging="259"/>
+      </w:pPr>
+      <w:r>
+        <w:rPr>
+          <w:rFonts w:ascii="Calibri" w:hAnsi="Calibri"/>
+          <w:b w:val="0"/>
+          <w:i w:val="0"/>
+          <w:color w:val="222222"/>
+          <w:sz w:val="21"/>
+        </w:rPr>
+        <w:t>•</w:t>
+        <w:tab/>
+      </w:r>
+      <w:r>
+        <w:rPr>
+          <w:rFonts w:ascii="Calibri" w:hAnsi="Calibri"/>
+          <w:b/>
+          <w:i w:val="0"/>
+          <w:color w:val="156082"/>
+          <w:sz w:val="21"/>
+        </w:rPr>
+        <w:t>Effect.</w:t>
+      </w:r>
+      <w:r>
+        <w:rPr>
+          <w:rFonts w:ascii="Calibri" w:hAnsi="Calibri"/>
+          <w:b w:val="0"/>
+          <w:i w:val="0"/>
+          <w:color w:val="222222"/>
+          <w:sz w:val="21"/>
+        </w:rPr>
+        <w:t xml:space="preserve"> None on any result. Every value checked (all of </w:t>
+      </w:r>
+      <w:r>
+        <w:rPr>
+          <w:rFonts w:ascii="Consolas" w:hAnsi="Consolas"/>
+          <w:b w:val="0"/>
+          <w:i w:val="0"/>
+          <w:color w:val="222222"/>
+          <w:sz w:val="19"/>
+        </w:rPr>
+        <w:t>results</w:t>
+      </w:r>
+      <w:r>
+        <w:rPr>
+          <w:rFonts w:ascii="Calibri" w:hAnsi="Calibri"/>
+          <w:b w:val="0"/>
+          <w:i w:val="0"/>
+          <w:color w:val="222222"/>
+          <w:sz w:val="21"/>
+        </w:rPr>
+        <w:t xml:space="preserve">, </w:t>
+      </w:r>
+      <w:r>
+        <w:rPr>
+          <w:rFonts w:ascii="Consolas" w:hAnsi="Consolas"/>
+          <w:b w:val="0"/>
+          <w:i w:val="0"/>
+          <w:color w:val="222222"/>
+          <w:sz w:val="19"/>
+        </w:rPr>
+        <w:t>near_real</w:t>
+      </w:r>
+      <w:r>
+        <w:rPr>
+          <w:rFonts w:ascii="Calibri" w:hAnsi="Calibri"/>
+          <w:b w:val="0"/>
+          <w:i w:val="0"/>
+          <w:color w:val="222222"/>
+          <w:sz w:val="21"/>
+        </w:rPr>
+        <w:t xml:space="preserve"> and </w:t>
+      </w:r>
+      <w:r>
+        <w:rPr>
+          <w:rFonts w:ascii="Consolas" w:hAnsi="Consolas"/>
+          <w:b w:val="0"/>
+          <w:i w:val="0"/>
+          <w:color w:val="222222"/>
+          <w:sz w:val="19"/>
+        </w:rPr>
+        <w:t>budget</w:t>
+      </w:r>
+      <w:r>
+        <w:rPr>
+          <w:rFonts w:ascii="Calibri" w:hAnsi="Calibri"/>
+          <w:b w:val="0"/>
+          <w:i w:val="0"/>
+          <w:color w:val="222222"/>
+          <w:sz w:val="21"/>
+        </w:rPr>
+        <w:t xml:space="preserve">) was reproduced exactly, so training and sampling are bit-reproducible here and no value needed a tolerance; </w:t>
+      </w:r>
+      <w:r>
+        <w:rPr>
+          <w:rFonts w:ascii="Consolas" w:hAnsi="Consolas"/>
+          <w:b w:val="0"/>
+          <w:i w:val="0"/>
+          <w:color w:val="222222"/>
+          <w:sz w:val="19"/>
+        </w:rPr>
+        <w:t>outputs/metrics.json</w:t>
+      </w:r>
+      <w:r>
+        <w:rPr>
+          <w:rFonts w:ascii="Calibri" w:hAnsi="Calibri"/>
+          <w:b w:val="0"/>
+          <w:i w:val="0"/>
+          <w:color w:val="222222"/>
+          <w:sz w:val="21"/>
+        </w:rPr>
+        <w:t xml:space="preserve"> is byte-identical. Appendix G gains one sentence.</w:t>
+      </w:r>
+    </w:p>
+    <w:p>
+      <w:pPr>
+        <w:spacing w:after="120"/>
+        <w:ind w:left="432" w:hanging="259"/>
+      </w:pPr>
+      <w:r>
+        <w:rPr>
+          <w:rFonts w:ascii="Calibri" w:hAnsi="Calibri"/>
+          <w:b w:val="0"/>
+          <w:i w:val="0"/>
+          <w:color w:val="222222"/>
+          <w:sz w:val="21"/>
+        </w:rPr>
+        <w:t>•</w:t>
+        <w:tab/>
+      </w:r>
+      <w:r>
+        <w:rPr>
+          <w:rFonts w:ascii="Calibri" w:hAnsi="Calibri"/>
+          <w:b/>
+          <w:i w:val="0"/>
+          <w:color w:val="156082"/>
+          <w:sz w:val="21"/>
+        </w:rPr>
+        <w:t>Evidence.</w:t>
+      </w:r>
+      <w:r>
+        <w:rPr>
+          <w:rFonts w:ascii="Calibri" w:hAnsi="Calibri"/>
+          <w:b w:val="0"/>
+          <w:i w:val="0"/>
+          <w:color w:val="222222"/>
+          <w:sz w:val="21"/>
+        </w:rPr>
+        <w:t xml:space="preserve"> </w:t>
+      </w:r>
+      <w:r>
+        <w:rPr>
+          <w:rFonts w:ascii="Consolas" w:hAnsi="Consolas"/>
+          <w:b w:val="0"/>
+          <w:i w:val="0"/>
+          <w:color w:val="222222"/>
+          <w:sz w:val="19"/>
+        </w:rPr>
+        <w:t>outputs/twin/hd14b_recalibration_simulated.png</w:t>
+      </w:r>
+      <w:r>
+        <w:rPr>
+          <w:rFonts w:ascii="Calibri" w:hAnsi="Calibri"/>
+          <w:b w:val="0"/>
+          <w:i w:val="0"/>
+          <w:color w:val="222222"/>
+          <w:sz w:val="21"/>
+        </w:rPr>
+        <w:t xml:space="preserve">; the check is printed by </w:t>
+      </w:r>
+      <w:r>
+        <w:rPr>
+          <w:rFonts w:ascii="Consolas" w:hAnsi="Consolas"/>
+          <w:b w:val="0"/>
+          <w:i w:val="0"/>
+          <w:color w:val="222222"/>
+          <w:sz w:val="19"/>
+        </w:rPr>
+        <w:t>python -m neuromps.twin.recalibration --replot</w:t>
+      </w:r>
+      <w:r>
+        <w:rPr>
+          <w:rFonts w:ascii="Calibri" w:hAnsi="Calibri"/>
+          <w:b w:val="0"/>
+          <w:i w:val="0"/>
+          <w:color w:val="222222"/>
+          <w:sz w:val="21"/>
+        </w:rPr>
+        <w:t xml:space="preserve">; tests </w:t>
+      </w:r>
+      <w:r>
+        <w:rPr>
+          <w:rFonts w:ascii="Consolas" w:hAnsi="Consolas"/>
+          <w:b w:val="0"/>
+          <w:i w:val="0"/>
+          <w:color w:val="222222"/>
+          <w:sz w:val="19"/>
+        </w:rPr>
+        <w:t>tests/test_twin_recalibration_replot.py</w:t>
+      </w:r>
+      <w:r>
+        <w:rPr>
+          <w:rFonts w:ascii="Calibri" w:hAnsi="Calibri"/>
+          <w:b w:val="0"/>
+          <w:i w:val="0"/>
+          <w:color w:val="222222"/>
+          <w:sz w:val="21"/>
+        </w:rPr>
+        <w:t xml:space="preserve"> (the comparison, the ranks file, the cache rule, and a legend that overlaps no panel).</w:t>
       </w:r>
     </w:p>
     <w:p>

</xml_diff>

<commit_message>
describe the twin's pathway as directional, not one-way
The report called the twin's inter-chamber wiring a "one-way axon diode"
(the §12 figure caption) and a directional "axon diode" (executive
summary). network.py builds both a forward and a backward connection
probability from forward_ratio, which defaults to symmetric, and the
inversion samples log10_forward_ratio, so the backward pathway is never
closed. Both passages now say "a directional pathway with an adjustable
forward-to-backward ratio".

The architecture diagram's "axon diode" label becomes "directional
pathway", with "ratio adjustable" under the arrows; the figure is
redrawn (the other two diagrams redraw byte-identical). Change-log
entry 54; the technical report and change log are rebuilt. No number
or result changed.

Co-Authored-By: Claude Opus 5.5 <noreply@anthropic.com>
</commit_message>
<xml_diff>
--- a/report/POST_SUBMISSION_CHANGES.docx
+++ b/report/POST_SUBMISSION_CHANGES.docx
@@ -7273,7 +7273,7 @@
           </w:tcPr>
           <w:p>
             <w:pPr>
-              <w:keepNext w:val="0"/>
+              <w:keepNext/>
               <w:spacing w:after="0"/>
               <w:jc w:val="center"/>
             </w:pPr>
@@ -7297,7 +7297,7 @@
           </w:tcPr>
           <w:p>
             <w:pPr>
-              <w:keepNext w:val="0"/>
+              <w:keepNext/>
               <w:spacing w:after="0"/>
               <w:jc w:val="center"/>
             </w:pPr>
@@ -7321,7 +7321,7 @@
           </w:tcPr>
           <w:p>
             <w:pPr>
-              <w:keepNext w:val="0"/>
+              <w:keepNext/>
               <w:spacing w:after="0"/>
             </w:pPr>
             <w:r>
@@ -7344,7 +7344,7 @@
           </w:tcPr>
           <w:p>
             <w:pPr>
-              <w:keepNext w:val="0"/>
+              <w:keepNext/>
               <w:spacing w:after="0"/>
             </w:pPr>
             <w:r>
@@ -7367,39 +7367,158 @@
           </w:tcPr>
           <w:p>
             <w:pPr>
+              <w:keepNext/>
+              <w:spacing w:after="0"/>
+            </w:pPr>
+            <w:r>
+              <w:rPr>
+                <w:rFonts w:ascii="Consolas" w:hAnsi="Consolas"/>
+                <w:b w:val="0"/>
+                <w:i w:val="0"/>
+                <w:color w:val="222222"/>
+                <w:sz w:val="18"/>
+              </w:rPr>
+              <w:t>3c2e43e</w:t>
+            </w:r>
+            <w:r>
+              <w:rPr>
+                <w:rFonts w:ascii="Calibri" w:hAnsi="Calibri"/>
+                <w:b w:val="0"/>
+                <w:i w:val="0"/>
+                <w:color w:val="222222"/>
+                <w:sz w:val="20"/>
+              </w:rPr>
+              <w:t xml:space="preserve">, </w:t>
+            </w:r>
+            <w:r>
+              <w:rPr>
+                <w:rFonts w:ascii="Consolas" w:hAnsi="Consolas"/>
+                <w:b w:val="0"/>
+                <w:i w:val="0"/>
+                <w:color w:val="222222"/>
+                <w:sz w:val="18"/>
+              </w:rPr>
+              <w:t>c3a7d3a</w:t>
+            </w:r>
+            <w:r>
+              <w:rPr>
+                <w:rFonts w:ascii="Calibri" w:hAnsi="Calibri"/>
+                <w:b w:val="0"/>
+                <w:i w:val="0"/>
+                <w:color w:val="222222"/>
+                <w:sz w:val="20"/>
+              </w:rPr>
+              <w:t xml:space="preserve">, </w:t>
+            </w:r>
+            <w:r>
+              <w:rPr>
+                <w:rFonts w:ascii="Consolas" w:hAnsi="Consolas"/>
+                <w:b w:val="0"/>
+                <w:i w:val="0"/>
+                <w:color w:val="222222"/>
+                <w:sz w:val="18"/>
+              </w:rPr>
+              <w:t>44f78f1</w:t>
+            </w:r>
+            <w:r>
+              <w:rPr>
+                <w:rFonts w:ascii="Calibri" w:hAnsi="Calibri"/>
+                <w:b w:val="0"/>
+                <w:i w:val="0"/>
+                <w:color w:val="222222"/>
+                <w:sz w:val="20"/>
+              </w:rPr>
+              <w:t xml:space="preserve"> … this branch</w:t>
+            </w:r>
+          </w:p>
+        </w:tc>
+      </w:tr>
+      <w:tr>
+        <w:trPr>
+          <w:cantSplit/>
+        </w:trPr>
+        <w:tc>
+          <w:tcPr>
+            <w:tcW w:type="dxa" w:w="406"/>
+            <w:shd w:val="clear" w:color="auto" w:fill="F7F9FB"/>
+            <w:vAlign w:val="center"/>
+          </w:tcPr>
+          <w:p>
+            <w:pPr>
+              <w:keepNext w:val="0"/>
+              <w:spacing w:after="0"/>
+              <w:jc w:val="center"/>
+            </w:pPr>
+            <w:r>
+              <w:rPr>
+                <w:rFonts w:ascii="Calibri" w:hAnsi="Calibri"/>
+                <w:b/>
+                <w:i w:val="0"/>
+                <w:color w:val="222222"/>
+                <w:sz w:val="20"/>
+              </w:rPr>
+              <w:t>54</w:t>
+            </w:r>
+          </w:p>
+        </w:tc>
+        <w:tc>
+          <w:tcPr>
+            <w:tcW w:type="dxa" w:w="1532"/>
+            <w:shd w:val="clear" w:color="auto" w:fill="F7F9FB"/>
+            <w:vAlign w:val="center"/>
+          </w:tcPr>
+          <w:p>
+            <w:pPr>
+              <w:keepNext w:val="0"/>
+              <w:spacing w:after="0"/>
+              <w:jc w:val="center"/>
+            </w:pPr>
+            <w:r>
+              <w:rPr>
+                <w:rFonts w:ascii="Calibri" w:hAnsi="Calibri"/>
+                <w:b w:val="0"/>
+                <w:i w:val="0"/>
+                <w:color w:val="222222"/>
+                <w:sz w:val="20"/>
+              </w:rPr>
+              <w:t>2026-10-29</w:t>
+            </w:r>
+          </w:p>
+        </w:tc>
+        <w:tc>
+          <w:tcPr>
+            <w:tcW w:type="dxa" w:w="2824"/>
+            <w:shd w:val="clear" w:color="auto" w:fill="F7F9FB"/>
+            <w:vAlign w:val="center"/>
+          </w:tcPr>
+          <w:p>
+            <w:pPr>
               <w:keepNext w:val="0"/>
               <w:spacing w:after="0"/>
             </w:pPr>
             <w:r>
               <w:rPr>
-                <w:rFonts w:ascii="Consolas" w:hAnsi="Consolas"/>
-                <w:b w:val="0"/>
-                <w:i w:val="0"/>
-                <w:color w:val="222222"/>
-                <w:sz w:val="18"/>
-              </w:rPr>
-              <w:t>3c2e43e</w:t>
-            </w:r>
-            <w:r>
-              <w:rPr>
                 <w:rFonts w:ascii="Calibri" w:hAnsi="Calibri"/>
                 <w:b w:val="0"/>
                 <w:i w:val="0"/>
                 <w:color w:val="222222"/>
                 <w:sz w:val="20"/>
               </w:rPr>
-              <w:t xml:space="preserve">, </w:t>
-            </w:r>
-            <w:r>
-              <w:rPr>
-                <w:rFonts w:ascii="Consolas" w:hAnsi="Consolas"/>
-                <w:b w:val="0"/>
-                <w:i w:val="0"/>
-                <w:color w:val="222222"/>
-                <w:sz w:val="18"/>
-              </w:rPr>
-              <w:t>c3a7d3a</w:t>
-            </w:r>
+              <w:t>The twin's inter-chamber pathway described as directional with an adjustable forward-to-backward ratio, not as a one-way axon diode; the architecture figure relabelled</w:t>
+            </w:r>
+          </w:p>
+        </w:tc>
+        <w:tc>
+          <w:tcPr>
+            <w:tcW w:type="dxa" w:w="2563"/>
+            <w:shd w:val="clear" w:color="auto" w:fill="F7F9FB"/>
+            <w:vAlign w:val="center"/>
+          </w:tcPr>
+          <w:p>
+            <w:pPr>
+              <w:keepNext w:val="0"/>
+              <w:spacing w:after="0"/>
+            </w:pPr>
             <w:r>
               <w:rPr>
                 <w:rFonts w:ascii="Calibri" w:hAnsi="Calibri"/>
@@ -7408,18 +7527,21 @@
                 <w:color w:val="222222"/>
                 <w:sz w:val="20"/>
               </w:rPr>
-              <w:t xml:space="preserve">, </w:t>
-            </w:r>
-            <w:r>
-              <w:rPr>
-                <w:rFonts w:ascii="Consolas" w:hAnsi="Consolas"/>
-                <w:b w:val="0"/>
-                <w:i w:val="0"/>
-                <w:color w:val="222222"/>
-                <w:sz w:val="18"/>
-              </w:rPr>
-              <w:t>44f78f1</w:t>
-            </w:r>
+              <w:t>none; wording and one figure label only</w:t>
+            </w:r>
+          </w:p>
+        </w:tc>
+        <w:tc>
+          <w:tcPr>
+            <w:tcW w:type="dxa" w:w="1171"/>
+            <w:shd w:val="clear" w:color="auto" w:fill="F7F9FB"/>
+            <w:vAlign w:val="center"/>
+          </w:tcPr>
+          <w:p>
+            <w:pPr>
+              <w:keepNext w:val="0"/>
+              <w:spacing w:after="0"/>
+            </w:pPr>
             <w:r>
               <w:rPr>
                 <w:rFonts w:ascii="Calibri" w:hAnsi="Calibri"/>
@@ -7428,7 +7550,7 @@
                 <w:color w:val="222222"/>
                 <w:sz w:val="20"/>
               </w:rPr>
-              <w:t xml:space="preserve"> … this branch</w:t>
+              <w:t>this branch</w:t>
             </w:r>
           </w:p>
         </w:tc>
@@ -24002,6 +24124,582 @@
           <w:sz w:val="21"/>
         </w:rPr>
         <w:t>.</w:t>
+      </w:r>
+    </w:p>
+    <w:p>
+      <w:pPr>
+        <w:keepNext/>
+        <w:spacing w:before="240" w:after="60"/>
+      </w:pPr>
+      <w:r>
+        <w:rPr>
+          <w:rFonts w:ascii="Calibri" w:hAnsi="Calibri"/>
+          <w:b/>
+          <w:i w:val="0"/>
+          <w:color w:val="1F4E79"/>
+          <w:sz w:val="23"/>
+        </w:rPr>
+        <w:t>54. The twin's pathway is directional, not one-way</w:t>
+      </w:r>
+    </w:p>
+    <w:p>
+      <w:pPr>
+        <w:spacing w:after="120"/>
+      </w:pPr>
+      <w:r>
+        <w:rPr>
+          <w:rFonts w:ascii="Calibri" w:hAnsi="Calibri"/>
+          <w:b/>
+          <w:i w:val="0"/>
+          <w:color w:val="156082"/>
+          <w:sz w:val="21"/>
+        </w:rPr>
+        <w:t>Slide message:</w:t>
+      </w:r>
+      <w:r>
+        <w:rPr>
+          <w:rFonts w:ascii="Calibri" w:hAnsi="Calibri"/>
+          <w:b w:val="0"/>
+          <w:i w:val="0"/>
+          <w:color w:val="222222"/>
+          <w:sz w:val="21"/>
+        </w:rPr>
+        <w:t xml:space="preserve"> </w:t>
+      </w:r>
+      <w:r>
+        <w:rPr>
+          <w:rFonts w:ascii="Calibri" w:hAnsi="Calibri"/>
+          <w:b w:val="0"/>
+          <w:i/>
+          <w:color w:val="222222"/>
+          <w:sz w:val="21"/>
+        </w:rPr>
+        <w:t>The twin's two chambers are joined by a directional pathway with an adjustable forward-to-backward ratio, not a one-way axon diode: signals cross both ways, and how much more one way than the other is what the inversion estimates.</w:t>
+      </w:r>
+    </w:p>
+    <w:p>
+      <w:pPr>
+        <w:spacing w:after="120"/>
+        <w:ind w:left="432" w:hanging="259"/>
+      </w:pPr>
+      <w:r>
+        <w:rPr>
+          <w:rFonts w:ascii="Calibri" w:hAnsi="Calibri"/>
+          <w:b w:val="0"/>
+          <w:i w:val="0"/>
+          <w:color w:val="222222"/>
+          <w:sz w:val="21"/>
+        </w:rPr>
+        <w:t>•</w:t>
+        <w:tab/>
+      </w:r>
+      <w:r>
+        <w:rPr>
+          <w:rFonts w:ascii="Calibri" w:hAnsi="Calibri"/>
+          <w:b/>
+          <w:i w:val="0"/>
+          <w:color w:val="156082"/>
+          <w:sz w:val="21"/>
+        </w:rPr>
+        <w:t>What changed.</w:t>
+      </w:r>
+      <w:r>
+        <w:rPr>
+          <w:rFonts w:ascii="Calibri" w:hAnsi="Calibri"/>
+          <w:b w:val="0"/>
+          <w:i w:val="0"/>
+          <w:color w:val="222222"/>
+          <w:sz w:val="21"/>
+        </w:rPr>
+        <w:t xml:space="preserve"> The technical report called the twin's inter-chamber wiring a "one-way axon diode" (the caption of the §12 architecture figure) and a directional "axon diode" (the twin's line in the executive summary). The code does not build a one-way pathway. </w:t>
+      </w:r>
+      <w:r>
+        <w:rPr>
+          <w:rFonts w:ascii="Consolas" w:hAnsi="Consolas"/>
+          <w:b w:val="0"/>
+          <w:i w:val="0"/>
+          <w:color w:val="222222"/>
+          <w:sz w:val="19"/>
+        </w:rPr>
+        <w:t>forward_ratio</w:t>
+      </w:r>
+      <w:r>
+        <w:rPr>
+          <w:rFonts w:ascii="Calibri" w:hAnsi="Calibri"/>
+          <w:b w:val="0"/>
+          <w:i w:val="0"/>
+          <w:color w:val="222222"/>
+          <w:sz w:val="21"/>
+        </w:rPr>
+        <w:t xml:space="preserve"> in </w:t>
+      </w:r>
+      <w:r>
+        <w:rPr>
+          <w:rFonts w:ascii="Consolas" w:hAnsi="Consolas"/>
+          <w:b w:val="0"/>
+          <w:i w:val="0"/>
+          <w:color w:val="222222"/>
+          <w:sz w:val="19"/>
+        </w:rPr>
+        <w:t>src/neuromps/twin/network.py</w:t>
+      </w:r>
+      <w:r>
+        <w:rPr>
+          <w:rFonts w:ascii="Calibri" w:hAnsi="Calibri"/>
+          <w:b w:val="0"/>
+          <w:i w:val="0"/>
+          <w:color w:val="222222"/>
+          <w:sz w:val="21"/>
+        </w:rPr>
+        <w:t xml:space="preserve"> defaults to a symmetric pathway, and </w:t>
+      </w:r>
+      <w:r>
+        <w:rPr>
+          <w:rFonts w:ascii="Consolas" w:hAnsi="Consolas"/>
+          <w:b w:val="0"/>
+          <w:i w:val="0"/>
+          <w:color w:val="222222"/>
+          <w:sz w:val="19"/>
+        </w:rPr>
+        <w:t>_inter_probabilities</w:t>
+      </w:r>
+      <w:r>
+        <w:rPr>
+          <w:rFonts w:ascii="Calibri" w:hAnsi="Calibri"/>
+          <w:b w:val="0"/>
+          <w:i w:val="0"/>
+          <w:color w:val="222222"/>
+          <w:sz w:val="21"/>
+        </w:rPr>
+        <w:t xml:space="preserve"> turns it into a forward and a backward connection probability, so the backward pathway is never closed. The inversion samples </w:t>
+      </w:r>
+      <w:r>
+        <w:rPr>
+          <w:rFonts w:ascii="Consolas" w:hAnsi="Consolas"/>
+          <w:b w:val="0"/>
+          <w:i w:val="0"/>
+          <w:color w:val="222222"/>
+          <w:sz w:val="19"/>
+        </w:rPr>
+        <w:t>log10_forward_ratio</w:t>
+      </w:r>
+      <w:r>
+        <w:rPr>
+          <w:rFonts w:ascii="Calibri" w:hAnsi="Calibri"/>
+          <w:b w:val="0"/>
+          <w:i w:val="0"/>
+          <w:color w:val="222222"/>
+          <w:sz w:val="21"/>
+        </w:rPr>
+        <w:t xml:space="preserve"> from 0.0 to 1.3, and the wider prior of entry 53 from -1.3, where the backward pathway is the stronger. Both passages now say "a directional pathway with an adjustable forward-to-backward ratio".</w:t>
+      </w:r>
+    </w:p>
+    <w:p>
+      <w:pPr>
+        <w:spacing w:after="120"/>
+        <w:ind w:left="432" w:hanging="259"/>
+      </w:pPr>
+      <w:r>
+        <w:rPr>
+          <w:rFonts w:ascii="Calibri" w:hAnsi="Calibri"/>
+          <w:b w:val="0"/>
+          <w:i w:val="0"/>
+          <w:color w:val="222222"/>
+          <w:sz w:val="21"/>
+        </w:rPr>
+        <w:t>•</w:t>
+        <w:tab/>
+      </w:r>
+      <w:r>
+        <w:rPr>
+          <w:rFonts w:ascii="Calibri" w:hAnsi="Calibri"/>
+          <w:b/>
+          <w:i w:val="0"/>
+          <w:color w:val="156082"/>
+          <w:sz w:val="21"/>
+        </w:rPr>
+        <w:t>The figure.</w:t>
+      </w:r>
+      <w:r>
+        <w:rPr>
+          <w:rFonts w:ascii="Calibri" w:hAnsi="Calibri"/>
+          <w:b w:val="0"/>
+          <w:i w:val="0"/>
+          <w:color w:val="222222"/>
+          <w:sz w:val="21"/>
+        </w:rPr>
+        <w:t xml:space="preserve"> </w:t>
+      </w:r>
+      <w:r>
+        <w:rPr>
+          <w:rFonts w:ascii="Consolas" w:hAnsi="Consolas"/>
+          <w:b w:val="0"/>
+          <w:i w:val="0"/>
+          <w:color w:val="222222"/>
+          <w:sz w:val="19"/>
+        </w:rPr>
+        <w:t>draw_twin</w:t>
+      </w:r>
+      <w:r>
+        <w:rPr>
+          <w:rFonts w:ascii="Calibri" w:hAnsi="Calibri"/>
+          <w:b w:val="0"/>
+          <w:i w:val="0"/>
+          <w:color w:val="222222"/>
+          <w:sz w:val="21"/>
+        </w:rPr>
+        <w:t xml:space="preserve"> in </w:t>
+      </w:r>
+      <w:r>
+        <w:rPr>
+          <w:rFonts w:ascii="Consolas" w:hAnsi="Consolas"/>
+          <w:b w:val="0"/>
+          <w:i w:val="0"/>
+          <w:color w:val="222222"/>
+          <w:sz w:val="19"/>
+        </w:rPr>
+        <w:t>src/neuromps/report/diagrams.py</w:t>
+      </w:r>
+      <w:r>
+        <w:rPr>
+          <w:rFonts w:ascii="Calibri" w:hAnsi="Calibri"/>
+          <w:b w:val="0"/>
+          <w:i w:val="0"/>
+          <w:color w:val="222222"/>
+          <w:sz w:val="21"/>
+        </w:rPr>
+        <w:t xml:space="preserve"> labelled the pathway "axon diode". It now reads "directional pathway", with "ratio adjustable" under the forward and back arrows, and </w:t>
+      </w:r>
+      <w:r>
+        <w:rPr>
+          <w:rFonts w:ascii="Consolas" w:hAnsi="Consolas"/>
+          <w:b w:val="0"/>
+          <w:i w:val="0"/>
+          <w:color w:val="222222"/>
+          <w:sz w:val="19"/>
+        </w:rPr>
+        <w:t>outputs/figures/twin_architecture_simulated.png</w:t>
+      </w:r>
+      <w:r>
+        <w:rPr>
+          <w:rFonts w:ascii="Calibri" w:hAnsi="Calibri"/>
+          <w:b w:val="0"/>
+          <w:i w:val="0"/>
+          <w:color w:val="222222"/>
+          <w:sz w:val="21"/>
+        </w:rPr>
+        <w:t xml:space="preserve"> was redrawn with </w:t>
+      </w:r>
+      <w:r>
+        <w:rPr>
+          <w:rFonts w:ascii="Consolas" w:hAnsi="Consolas"/>
+          <w:b w:val="0"/>
+          <w:i w:val="0"/>
+          <w:color w:val="222222"/>
+          <w:sz w:val="19"/>
+        </w:rPr>
+        <w:t>python -m neuromps.report.diagrams</w:t>
+      </w:r>
+      <w:r>
+        <w:rPr>
+          <w:rFonts w:ascii="Calibri" w:hAnsi="Calibri"/>
+          <w:b w:val="0"/>
+          <w:i w:val="0"/>
+          <w:color w:val="222222"/>
+          <w:sz w:val="21"/>
+        </w:rPr>
+        <w:t>. The other two diagrams that command draws came out byte-identical.</w:t>
+      </w:r>
+    </w:p>
+    <w:p>
+      <w:pPr>
+        <w:spacing w:after="120"/>
+        <w:ind w:left="432" w:hanging="259"/>
+      </w:pPr>
+      <w:r>
+        <w:rPr>
+          <w:rFonts w:ascii="Calibri" w:hAnsi="Calibri"/>
+          <w:b w:val="0"/>
+          <w:i w:val="0"/>
+          <w:color w:val="222222"/>
+          <w:sz w:val="21"/>
+        </w:rPr>
+        <w:t>•</w:t>
+        <w:tab/>
+      </w:r>
+      <w:r>
+        <w:rPr>
+          <w:rFonts w:ascii="Calibri" w:hAnsi="Calibri"/>
+          <w:b/>
+          <w:i w:val="0"/>
+          <w:color w:val="156082"/>
+          <w:sz w:val="21"/>
+        </w:rPr>
+        <w:t>Left as written.</w:t>
+      </w:r>
+      <w:r>
+        <w:rPr>
+          <w:rFonts w:ascii="Calibri" w:hAnsi="Calibri"/>
+          <w:b w:val="0"/>
+          <w:i w:val="0"/>
+          <w:color w:val="222222"/>
+          <w:sz w:val="21"/>
+        </w:rPr>
+        <w:t xml:space="preserve"> Three passages about real chips, not the twin, keep their wording: a chip designer's aim of showing that a microchannel makes signals flow one way (§1), the "axon diode" idea that microchannel geometry biases which way axons grow (§15), and the advice that showing axons conduct one way needs electrodes inside the microchannels (§20). </w:t>
+      </w:r>
+      <w:r>
+        <w:rPr>
+          <w:rFonts w:ascii="Consolas" w:hAnsi="Consolas"/>
+          <w:b w:val="0"/>
+          <w:i w:val="0"/>
+          <w:color w:val="222222"/>
+          <w:sz w:val="19"/>
+        </w:rPr>
+        <w:t>axon_diode</w:t>
+      </w:r>
+      <w:r>
+        <w:rPr>
+          <w:rFonts w:ascii="Calibri" w:hAnsi="Calibri"/>
+          <w:b w:val="0"/>
+          <w:i w:val="0"/>
+          <w:color w:val="222222"/>
+          <w:sz w:val="21"/>
+        </w:rPr>
+        <w:t xml:space="preserve"> stays the name of the source asset.</w:t>
+      </w:r>
+    </w:p>
+    <w:p>
+      <w:pPr>
+        <w:spacing w:after="120"/>
+        <w:ind w:left="432" w:hanging="259"/>
+      </w:pPr>
+      <w:r>
+        <w:rPr>
+          <w:rFonts w:ascii="Calibri" w:hAnsi="Calibri"/>
+          <w:b w:val="0"/>
+          <w:i w:val="0"/>
+          <w:color w:val="222222"/>
+          <w:sz w:val="21"/>
+        </w:rPr>
+        <w:t>•</w:t>
+        <w:tab/>
+      </w:r>
+      <w:r>
+        <w:rPr>
+          <w:rFonts w:ascii="Calibri" w:hAnsi="Calibri"/>
+          <w:b/>
+          <w:i w:val="0"/>
+          <w:color w:val="156082"/>
+          <w:sz w:val="21"/>
+        </w:rPr>
+        <w:t>Effect.</w:t>
+      </w:r>
+      <w:r>
+        <w:rPr>
+          <w:rFonts w:ascii="Calibri" w:hAnsi="Calibri"/>
+          <w:b w:val="0"/>
+          <w:i w:val="0"/>
+          <w:color w:val="222222"/>
+          <w:sz w:val="21"/>
+        </w:rPr>
+        <w:t xml:space="preserve"> None on any result; </w:t>
+      </w:r>
+      <w:r>
+        <w:rPr>
+          <w:rFonts w:ascii="Consolas" w:hAnsi="Consolas"/>
+          <w:b w:val="0"/>
+          <w:i w:val="0"/>
+          <w:color w:val="222222"/>
+          <w:sz w:val="19"/>
+        </w:rPr>
+        <w:t>outputs/metrics.json</w:t>
+      </w:r>
+      <w:r>
+        <w:rPr>
+          <w:rFonts w:ascii="Calibri" w:hAnsi="Calibri"/>
+          <w:b w:val="0"/>
+          <w:i w:val="0"/>
+          <w:color w:val="222222"/>
+          <w:sz w:val="21"/>
+        </w:rPr>
+        <w:t xml:space="preserve"> is unchanged.</w:t>
+      </w:r>
+    </w:p>
+    <w:p>
+      <w:pPr>
+        <w:spacing w:after="120"/>
+        <w:ind w:left="432" w:hanging="259"/>
+      </w:pPr>
+      <w:r>
+        <w:rPr>
+          <w:rFonts w:ascii="Calibri" w:hAnsi="Calibri"/>
+          <w:b w:val="0"/>
+          <w:i w:val="0"/>
+          <w:color w:val="222222"/>
+          <w:sz w:val="21"/>
+        </w:rPr>
+        <w:t>•</w:t>
+        <w:tab/>
+      </w:r>
+      <w:r>
+        <w:rPr>
+          <w:rFonts w:ascii="Calibri" w:hAnsi="Calibri"/>
+          <w:b/>
+          <w:i w:val="0"/>
+          <w:color w:val="156082"/>
+          <w:sz w:val="21"/>
+        </w:rPr>
+        <w:t>Evidence.</w:t>
+      </w:r>
+      <w:r>
+        <w:rPr>
+          <w:rFonts w:ascii="Calibri" w:hAnsi="Calibri"/>
+          <w:b w:val="0"/>
+          <w:i w:val="0"/>
+          <w:color w:val="222222"/>
+          <w:sz w:val="21"/>
+        </w:rPr>
+        <w:t xml:space="preserve"> Report executive summary and §12 (figure and caption); </w:t>
+      </w:r>
+      <w:r>
+        <w:rPr>
+          <w:rFonts w:ascii="Consolas" w:hAnsi="Consolas"/>
+          <w:b w:val="0"/>
+          <w:i w:val="0"/>
+          <w:color w:val="222222"/>
+          <w:sz w:val="19"/>
+        </w:rPr>
+        <w:t>outputs/figures/twin_architecture_simulated.png</w:t>
+      </w:r>
+      <w:r>
+        <w:rPr>
+          <w:rFonts w:ascii="Calibri" w:hAnsi="Calibri"/>
+          <w:b w:val="0"/>
+          <w:i w:val="0"/>
+          <w:color w:val="222222"/>
+          <w:sz w:val="21"/>
+        </w:rPr>
+        <w:t xml:space="preserve">; </w:t>
+      </w:r>
+      <w:r>
+        <w:rPr>
+          <w:rFonts w:ascii="Consolas" w:hAnsi="Consolas"/>
+          <w:b w:val="0"/>
+          <w:i w:val="0"/>
+          <w:color w:val="222222"/>
+          <w:sz w:val="19"/>
+        </w:rPr>
+        <w:t>src/neuromps/report/diagrams.py</w:t>
+      </w:r>
+      <w:r>
+        <w:rPr>
+          <w:rFonts w:ascii="Calibri" w:hAnsi="Calibri"/>
+          <w:b w:val="0"/>
+          <w:i w:val="0"/>
+          <w:color w:val="222222"/>
+          <w:sz w:val="21"/>
+        </w:rPr>
+        <w:t xml:space="preserve">; </w:t>
+      </w:r>
+      <w:r>
+        <w:rPr>
+          <w:rFonts w:ascii="Consolas" w:hAnsi="Consolas"/>
+          <w:b w:val="0"/>
+          <w:i w:val="0"/>
+          <w:color w:val="222222"/>
+          <w:sz w:val="19"/>
+        </w:rPr>
+        <w:t>src/neuromps/twin/network.py</w:t>
+      </w:r>
+      <w:r>
+        <w:rPr>
+          <w:rFonts w:ascii="Calibri" w:hAnsi="Calibri"/>
+          <w:b w:val="0"/>
+          <w:i w:val="0"/>
+          <w:color w:val="222222"/>
+          <w:sz w:val="21"/>
+        </w:rPr>
+        <w:t xml:space="preserve"> (</w:t>
+      </w:r>
+      <w:r>
+        <w:rPr>
+          <w:rFonts w:ascii="Consolas" w:hAnsi="Consolas"/>
+          <w:b w:val="0"/>
+          <w:i w:val="0"/>
+          <w:color w:val="222222"/>
+          <w:sz w:val="19"/>
+        </w:rPr>
+        <w:t>forward_ratio</w:t>
+      </w:r>
+      <w:r>
+        <w:rPr>
+          <w:rFonts w:ascii="Calibri" w:hAnsi="Calibri"/>
+          <w:b w:val="0"/>
+          <w:i w:val="0"/>
+          <w:color w:val="222222"/>
+          <w:sz w:val="21"/>
+        </w:rPr>
+        <w:t xml:space="preserve">, </w:t>
+      </w:r>
+      <w:r>
+        <w:rPr>
+          <w:rFonts w:ascii="Consolas" w:hAnsi="Consolas"/>
+          <w:b w:val="0"/>
+          <w:i w:val="0"/>
+          <w:color w:val="222222"/>
+          <w:sz w:val="19"/>
+        </w:rPr>
+        <w:t>_inter_probabilities</w:t>
+      </w:r>
+      <w:r>
+        <w:rPr>
+          <w:rFonts w:ascii="Calibri" w:hAnsi="Calibri"/>
+          <w:b w:val="0"/>
+          <w:i w:val="0"/>
+          <w:color w:val="222222"/>
+          <w:sz w:val="21"/>
+        </w:rPr>
+        <w:t xml:space="preserve">); </w:t>
+      </w:r>
+      <w:r>
+        <w:rPr>
+          <w:rFonts w:ascii="Consolas" w:hAnsi="Consolas"/>
+          <w:b w:val="0"/>
+          <w:i w:val="0"/>
+          <w:color w:val="222222"/>
+          <w:sz w:val="19"/>
+        </w:rPr>
+        <w:t>src/neuromps/twin/inference.py</w:t>
+      </w:r>
+      <w:r>
+        <w:rPr>
+          <w:rFonts w:ascii="Calibri" w:hAnsi="Calibri"/>
+          <w:b w:val="0"/>
+          <w:i w:val="0"/>
+          <w:color w:val="222222"/>
+          <w:sz w:val="21"/>
+        </w:rPr>
+        <w:t xml:space="preserve"> (the prior on </w:t>
+      </w:r>
+      <w:r>
+        <w:rPr>
+          <w:rFonts w:ascii="Consolas" w:hAnsi="Consolas"/>
+          <w:b w:val="0"/>
+          <w:i w:val="0"/>
+          <w:color w:val="222222"/>
+          <w:sz w:val="19"/>
+        </w:rPr>
+        <w:t>log10_forward_ratio</w:t>
+      </w:r>
+      <w:r>
+        <w:rPr>
+          <w:rFonts w:ascii="Calibri" w:hAnsi="Calibri"/>
+          <w:b w:val="0"/>
+          <w:i w:val="0"/>
+          <w:color w:val="222222"/>
+          <w:sz w:val="21"/>
+        </w:rPr>
+        <w:t>).</w:t>
       </w:r>
     </w:p>
     <w:p>

</xml_diff>